<commit_message>
Redraw Figures 1-3 and S2 from the workbook
The October figure code read local CSV exports that are not in the
repository, so the figures are now drawn by a portable script that reads
only Supplementary_Dataset.xlsx. In-image titles are gone (the legends carry
them), gene symbols and P are italic, Figure 1's chromosome labels and
threshold note no longer collide with points or labels, Figure S2's IGF1R
axis is legible, and Figure 2 marks P < 0.05/2,544 with a dagger, now
defined in its legend. Every value printed in Figure 2 matches Table 2
string for string. Figure S1 needs the IRB sample data and is unchanged.

Co-Authored-By: Claude Opus 5.5 <noreply@anthropic.com>
Claude-Session: https://claude.ai/code/session_01TiAKffYKtUstdRZFkwtJA9
</commit_message>
<xml_diff>
--- a/submission/candidate_20261011_review/Manuscript.docx
+++ b/submission/candidate_20261011_review/Manuscript.docx
@@ -6833,7 +6833,7 @@
         <w:rPr>
           <w:color w:val="000000"/>
         </w:rPr>
-        <w:t xml:space="preserve">are labelled. This is a gene-level MR plot, not a SNP GWAS Manhattan plot. The threshold adjusts the original discovery screen, not every later exploratory analysis.</w:t>
+        <w:t xml:space="preserve">are labeled. This is a gene-level MR plot, not a SNP GWAS Manhattan plot. The threshold adjusts the original discovery screen, not every later exploratory analysis.</w:t>
       </w:r>
     </w:p>
     <w:p>
@@ -7012,7 +7012,33 @@
         <w:rPr>
           <w:color w:val="000000"/>
         </w:rPr>
-        <w:t xml:space="preserve">&lt; 0.05, not Bonferroni significance. ORs describe reconstructed blood expression, not a treatment intervention. (B) Aligned colocalization probabilities under p1 = p2 = 10⁻⁴ and p12 = 10⁻⁵. H0/H1 denotes no association or disease association only; H2 expression only; H3 distinct variants; H4 a shared variant. Bold H4 numbers indicate ≥0.80. MR</w:t>
+        <w:t xml:space="preserve">&lt; 0.05; a dagger additionally marks the screen threshold</w:t>
+      </w:r>
+      <w:r>
+        <w:rPr>
+          <w:color w:val="000000"/>
+        </w:rPr>
+        <w:t xml:space="preserve"> </w:t>
+      </w:r>
+      <w:r>
+        <w:rPr>
+          <w:iCs/>
+          <w:i/>
+          <w:color w:val="000000"/>
+        </w:rPr>
+        <w:t xml:space="preserve">P</w:t>
+      </w:r>
+      <w:r>
+        <w:rPr>
+          <w:color w:val="000000"/>
+        </w:rPr>
+        <w:t xml:space="preserve"> </w:t>
+      </w:r>
+      <w:r>
+        <w:rPr>
+          <w:color w:val="000000"/>
+        </w:rPr>
+        <w:t xml:space="preserve">&lt; 0.05/2,544. ORs describe reconstructed blood expression, not a treatment intervention. (B) Aligned colocalization probabilities under p1 = p2 = 10⁻⁴ and p12 = 10⁻⁵. H0/H1 denotes no association or disease association only; H2 expression only; H3 distinct variants; H4 a shared variant. Bold H4 numbers indicate ≥0.80. MR</w:t>
       </w:r>
       <w:r>
         <w:rPr>

</xml_diff>

<commit_message>
Tighten the Results to findings only
Author-approved second pass: interpretation and caveats removed (they remain
in the Discussion, Limitations, footnotes and legends); numbers shown in a
table or figure are cited rather than repeated, except the TSHR/IGF1R
headline OR/CI/P; workbook-only values are kept. Two scope errors introduced
by compression were fixed before approval. One MR-Egger power sentence moved
to the Supplementary Methods; five derived-value checks for numbers no longer
displayed were removed (61 guards).

Results 1,379 -> 1,019 words; main text 4,213 of 5,000 with sub-headings.

Co-Authored-By: Claude Opus 5.5 <noreply@anthropic.com>
Claude-Session: https://claude.ai/code/session_01TiAKffYKtUstdRZFkwtJA9
</commit_message>
<xml_diff>
--- a/submission/candidate_20261011_review/Manuscript.docx
+++ b/submission/candidate_20261011_review/Manuscript.docx
@@ -1742,47 +1742,53 @@
         <w:rPr>
           <w:color w:val="000000"/>
         </w:rPr>
-        <w:t xml:space="preserve">Of 2,544 instrumented genes, 2,234 were estimable in BBJ, 2,505 in UKB and 2,480 in each FinnGen endpoint. Unavailable estimates were not counted as negative findings. Thirteen genes met the BBJ discovery threshold (Figure 1):</w:t>
-      </w:r>
-      <w:r>
-        <w:rPr>
-          <w:color w:val="000000"/>
-        </w:rPr>
-        <w:t xml:space="preserve"> </w:t>
-      </w:r>
-      <w:r>
-        <w:rPr>
-          <w:iCs/>
-          <w:i/>
-          <w:color w:val="000000"/>
-        </w:rPr>
-        <w:t xml:space="preserve">HLA-A</w:t>
-      </w:r>
-      <w:r>
-        <w:rPr>
-          <w:color w:val="000000"/>
-        </w:rPr>
-        <w:t xml:space="preserve">,</w:t>
-      </w:r>
-      <w:r>
-        <w:rPr>
-          <w:color w:val="000000"/>
-        </w:rPr>
-        <w:t xml:space="preserve"> </w:t>
-      </w:r>
-      <w:r>
-        <w:rPr>
-          <w:iCs/>
-          <w:i/>
-          <w:color w:val="000000"/>
-        </w:rPr>
-        <w:t xml:space="preserve">HLA-DQA2</w:t>
-      </w:r>
-      <w:r>
-        <w:rPr>
-          <w:color w:val="000000"/>
-        </w:rPr>
-        <w:t xml:space="preserve">,</w:t>
+        <w:t xml:space="preserve">Of the 2,544 instrumented genes, 2,234 were estimable in BBJ, 2,505 in UKB and 2,480 in each FinnGen endpoint. Thirteen genes passed the BBJ screen threshold (</w:t>
+      </w:r>
+      <w:r>
+        <w:rPr>
+          <w:iCs/>
+          <w:i/>
+          <w:color w:val="000000"/>
+        </w:rPr>
+        <w:t xml:space="preserve">P</w:t>
+      </w:r>
+      <w:r>
+        <w:rPr>
+          <w:color w:val="000000"/>
+        </w:rPr>
+        <w:t xml:space="preserve"> </w:t>
+      </w:r>
+      <w:r>
+        <w:rPr>
+          <w:color w:val="000000"/>
+        </w:rPr>
+        <w:t xml:space="preserve">&lt; 0.05/2,544), including</w:t>
+      </w:r>
+      <w:r>
+        <w:rPr>
+          <w:color w:val="000000"/>
+        </w:rPr>
+        <w:t xml:space="preserve"> </w:t>
+      </w:r>
+      <w:r>
+        <w:rPr>
+          <w:iCs/>
+          <w:i/>
+          <w:color w:val="000000"/>
+        </w:rPr>
+        <w:t xml:space="preserve">TSHR</w:t>
+      </w:r>
+      <w:r>
+        <w:rPr>
+          <w:color w:val="000000"/>
+        </w:rPr>
+        <w:t xml:space="preserve"> </w:t>
+      </w:r>
+      <w:r>
+        <w:rPr>
+          <w:color w:val="000000"/>
+        </w:rPr>
+        <w:t xml:space="preserve">and</w:t>
       </w:r>
       <w:r>
         <w:rPr>
@@ -1802,213 +1808,39 @@
         <w:rPr>
           <w:color w:val="000000"/>
         </w:rPr>
-        <w:t xml:space="preserve">,</w:t>
-      </w:r>
-      <w:r>
-        <w:rPr>
-          <w:color w:val="000000"/>
-        </w:rPr>
-        <w:t xml:space="preserve"> </w:t>
-      </w:r>
-      <w:r>
-        <w:rPr>
-          <w:iCs/>
-          <w:i/>
-          <w:color w:val="000000"/>
-        </w:rPr>
-        <w:t xml:space="preserve">TSHR</w:t>
-      </w:r>
-      <w:r>
-        <w:rPr>
-          <w:color w:val="000000"/>
-        </w:rPr>
-        <w:t xml:space="preserve">,</w:t>
-      </w:r>
-      <w:r>
-        <w:rPr>
-          <w:color w:val="000000"/>
-        </w:rPr>
-        <w:t xml:space="preserve"> </w:t>
-      </w:r>
-      <w:r>
-        <w:rPr>
-          <w:iCs/>
-          <w:i/>
-          <w:color w:val="000000"/>
-        </w:rPr>
-        <w:t xml:space="preserve">C4A</w:t>
-      </w:r>
-      <w:r>
-        <w:rPr>
-          <w:color w:val="000000"/>
-        </w:rPr>
-        <w:t xml:space="preserve">,</w:t>
-      </w:r>
-      <w:r>
-        <w:rPr>
-          <w:color w:val="000000"/>
-        </w:rPr>
-        <w:t xml:space="preserve"> </w:t>
-      </w:r>
-      <w:r>
-        <w:rPr>
-          <w:iCs/>
-          <w:i/>
-          <w:color w:val="000000"/>
-        </w:rPr>
-        <w:t xml:space="preserve">HSD3B7</w:t>
-      </w:r>
-      <w:r>
-        <w:rPr>
-          <w:color w:val="000000"/>
-        </w:rPr>
-        <w:t xml:space="preserve">,</w:t>
-      </w:r>
-      <w:r>
-        <w:rPr>
-          <w:color w:val="000000"/>
-        </w:rPr>
-        <w:t xml:space="preserve"> </w:t>
-      </w:r>
-      <w:r>
-        <w:rPr>
-          <w:iCs/>
-          <w:i/>
-          <w:color w:val="000000"/>
-        </w:rPr>
-        <w:t xml:space="preserve">TUBB</w:t>
-      </w:r>
-      <w:r>
-        <w:rPr>
-          <w:color w:val="000000"/>
-        </w:rPr>
-        <w:t xml:space="preserve">,</w:t>
-      </w:r>
-      <w:r>
-        <w:rPr>
-          <w:color w:val="000000"/>
-        </w:rPr>
-        <w:t xml:space="preserve"> </w:t>
-      </w:r>
-      <w:r>
-        <w:rPr>
-          <w:iCs/>
-          <w:i/>
-          <w:color w:val="000000"/>
-        </w:rPr>
-        <w:t xml:space="preserve">VKORC1</w:t>
-      </w:r>
-      <w:r>
-        <w:rPr>
-          <w:color w:val="000000"/>
-        </w:rPr>
-        <w:t xml:space="preserve">,</w:t>
-      </w:r>
-      <w:r>
-        <w:rPr>
-          <w:color w:val="000000"/>
-        </w:rPr>
-        <w:t xml:space="preserve"> </w:t>
-      </w:r>
-      <w:r>
-        <w:rPr>
-          <w:iCs/>
-          <w:i/>
-          <w:color w:val="000000"/>
-        </w:rPr>
-        <w:t xml:space="preserve">TNFSF14</w:t>
-      </w:r>
-      <w:r>
-        <w:rPr>
-          <w:color w:val="000000"/>
-        </w:rPr>
-        <w:t xml:space="preserve">,</w:t>
-      </w:r>
-      <w:r>
-        <w:rPr>
-          <w:color w:val="000000"/>
-        </w:rPr>
-        <w:t xml:space="preserve"> </w:t>
-      </w:r>
-      <w:r>
-        <w:rPr>
-          <w:iCs/>
-          <w:i/>
-          <w:color w:val="000000"/>
-        </w:rPr>
-        <w:t xml:space="preserve">PRSS36</w:t>
-      </w:r>
-      <w:r>
-        <w:rPr>
-          <w:color w:val="000000"/>
-        </w:rPr>
-        <w:t xml:space="preserve">,</w:t>
-      </w:r>
-      <w:r>
-        <w:rPr>
-          <w:color w:val="000000"/>
-        </w:rPr>
-        <w:t xml:space="preserve"> </w:t>
-      </w:r>
-      <w:r>
-        <w:rPr>
-          <w:iCs/>
-          <w:i/>
-          <w:color w:val="000000"/>
-        </w:rPr>
-        <w:t xml:space="preserve">MAPKAPK5</w:t>
-      </w:r>
-      <w:r>
-        <w:rPr>
-          <w:color w:val="000000"/>
-        </w:rPr>
-        <w:t xml:space="preserve">,</w:t>
-      </w:r>
-      <w:r>
-        <w:rPr>
-          <w:color w:val="000000"/>
-        </w:rPr>
-        <w:t xml:space="preserve"> </w:t>
-      </w:r>
-      <w:r>
-        <w:rPr>
-          <w:iCs/>
-          <w:i/>
-          <w:color w:val="000000"/>
-        </w:rPr>
-        <w:t xml:space="preserve">PSMB8</w:t>
-      </w:r>
-      <w:r>
-        <w:rPr>
-          <w:color w:val="000000"/>
-        </w:rPr>
-        <w:t xml:space="preserve"> </w:t>
-      </w:r>
-      <w:r>
-        <w:rPr>
-          <w:color w:val="000000"/>
-        </w:rPr>
-        <w:t xml:space="preserve">and</w:t>
-      </w:r>
-      <w:r>
-        <w:rPr>
-          <w:color w:val="000000"/>
-        </w:rPr>
-        <w:t xml:space="preserve"> </w:t>
-      </w:r>
-      <w:r>
-        <w:rPr>
-          <w:iCs/>
-          <w:i/>
-          <w:color w:val="000000"/>
-        </w:rPr>
-        <w:t xml:space="preserve">IFNGR1</w:t>
-      </w:r>
-      <w:r>
-        <w:rPr>
-          <w:color w:val="000000"/>
-        </w:rPr>
-        <w:t xml:space="preserve">. At the discovery threshold, 14.6% and 35.6% of estimable BBJ genes had 80% power to detect ORs of 1.5 and 2.0 under a normal-approximation benchmark; the corresponding FinnGen GD proportions were 24.8% and 52.2% (BBJ: Supplementary Dataset, Detection_original; FinnGen GD: Supplementary Methods).</w:t>
+        <w:t xml:space="preserve"> </w:t>
+      </w:r>
+      <w:r>
+        <w:rPr>
+          <w:color w:val="000000"/>
+        </w:rPr>
+        <w:t xml:space="preserve">but not</w:t>
+      </w:r>
+      <w:r>
+        <w:rPr>
+          <w:color w:val="000000"/>
+        </w:rPr>
+        <w:t xml:space="preserve"> </w:t>
+      </w:r>
+      <w:r>
+        <w:rPr>
+          <w:iCs/>
+          <w:i/>
+          <w:color w:val="000000"/>
+        </w:rPr>
+        <w:t xml:space="preserve">IGF1R</w:t>
+      </w:r>
+      <w:r>
+        <w:rPr>
+          <w:color w:val="000000"/>
+        </w:rPr>
+        <w:t xml:space="preserve"> </w:t>
+      </w:r>
+      <w:r>
+        <w:rPr>
+          <w:color w:val="000000"/>
+        </w:rPr>
+        <w:t xml:space="preserve">(Figure 1). At this threshold, 14.6% and 35.6% of estimable BBJ genes had 80% power to detect ORs of 1.5 and 2.0, respectively (Supplementary Dataset, Detection_original).</w:t>
       </w:r>
     </w:p>
     <w:bookmarkEnd w:id="28"/>
@@ -2058,7 +1890,7 @@
         <w:rPr>
           <w:color w:val="000000"/>
         </w:rPr>
-        <w:t xml:space="preserve">expression was associated with lower odds of BBJ GD (OR 0.12, 95% CI 0.07–0.21;</w:t>
+        <w:t xml:space="preserve">expression was associated with lower odds of GD in BBJ (OR 0.12, 95% CI 0.07–0.21;</w:t>
       </w:r>
       <w:r>
         <w:rPr>
@@ -2097,7 +1929,7 @@
         <w:rPr>
           <w:color w:val="000000"/>
         </w:rPr>
-        <w:t xml:space="preserve">) and FinnGen GD (OR 0.08, 95% CI 0.05–0.12;</w:t>
+        <w:t xml:space="preserve">) and FinnGen (OR 0.08, 95% CI 0.05–0.12;</w:t>
       </w:r>
       <w:r>
         <w:rPr>
@@ -2136,7 +1968,70 @@
         <w:rPr>
           <w:color w:val="000000"/>
         </w:rPr>
-        <w:t xml:space="preserve">). The same direction was observed for UKB hyperthyroidism (OR 0.09, 95% CI 0.06–0.14;</w:t>
+        <w:t xml:space="preserve">). ORs were also below 1 for UKB hyperthyroidism and both ophthalmopathy endpoints, and all estimates except strict ophthalmopathy passed the screen threshold (Table 2; Figure 2). Each estimate used the single instrument rs179252. Its expression-increasing G allele had per-allele disease ORs of 0.77–0.82 across datasets and was correlated with rs179247-G (European r = 0.978; East Asian r = 0.996), which also increased blood</w:t>
+      </w:r>
+      <w:r>
+        <w:rPr>
+          <w:color w:val="000000"/>
+        </w:rPr>
+        <w:t xml:space="preserve"> </w:t>
+      </w:r>
+      <w:r>
+        <w:rPr>
+          <w:iCs/>
+          <w:i/>
+          <w:color w:val="000000"/>
+        </w:rPr>
+        <w:t xml:space="preserve">TSHR</w:t>
+      </w:r>
+      <w:r>
+        <w:rPr>
+          <w:color w:val="000000"/>
+        </w:rPr>
+        <w:t xml:space="preserve"> </w:t>
+      </w:r>
+      <w:r>
+        <w:rPr>
+          <w:color w:val="000000"/>
+        </w:rPr>
+        <w:t xml:space="preserve">expression. Allele-aligned recalculation reproduced the MR estimates (Supplementary Dataset, TSHR_allele_audit).</w:t>
+      </w:r>
+    </w:p>
+    <w:p>
+      <w:pPr>
+        <w:pStyle w:val="BodyText"/>
+      </w:pPr>
+      <w:r>
+        <w:rPr>
+          <w:color w:val="000000"/>
+        </w:rPr>
+        <w:t xml:space="preserve">All five</w:t>
+      </w:r>
+      <w:r>
+        <w:rPr>
+          <w:color w:val="000000"/>
+        </w:rPr>
+        <w:t xml:space="preserve"> </w:t>
+      </w:r>
+      <w:r>
+        <w:rPr>
+          <w:iCs/>
+          <w:i/>
+          <w:color w:val="000000"/>
+        </w:rPr>
+        <w:t xml:space="preserve">IGF1R</w:t>
+      </w:r>
+      <w:r>
+        <w:rPr>
+          <w:color w:val="000000"/>
+        </w:rPr>
+        <w:t xml:space="preserve"> </w:t>
+      </w:r>
+      <w:r>
+        <w:rPr>
+          <w:color w:val="000000"/>
+        </w:rPr>
+        <w:t xml:space="preserve">ORs exceeded 1, and none passed the screen threshold. Nominal associations (uncorrected</w:t>
       </w:r>
       <w:r>
         <w:rPr>
@@ -2162,20 +2057,7 @@
         <w:rPr>
           <w:color w:val="000000"/>
         </w:rPr>
-        <w:t xml:space="preserve">= 8.77×10</w:t>
-      </w:r>
-      <w:r>
-        <w:rPr>
-          <w:color w:val="000000"/>
-          <w:vertAlign w:val="superscript"/>
-        </w:rPr>
-        <w:t xml:space="preserve">−28</w:t>
-      </w:r>
-      <w:r>
-        <w:rPr>
-          <w:color w:val="000000"/>
-        </w:rPr>
-        <w:t xml:space="preserve">), FinnGen ophthalmopathy (OR 0.10, 95% CI 0.04–0.24;</w:t>
+        <w:t xml:space="preserve">&lt; 0.05) were found only in BBJ GD (OR 1.56, 95% CI 1.07–2.28;</w:t>
       </w:r>
       <w:r>
         <w:rPr>
@@ -2201,20 +2083,7 @@
         <w:rPr>
           <w:color w:val="000000"/>
         </w:rPr>
-        <w:t xml:space="preserve">= 2.82×10</w:t>
-      </w:r>
-      <w:r>
-        <w:rPr>
-          <w:color w:val="000000"/>
-          <w:vertAlign w:val="superscript"/>
-        </w:rPr>
-        <w:t xml:space="preserve">−7</w:t>
-      </w:r>
-      <w:r>
-        <w:rPr>
-          <w:color w:val="000000"/>
-        </w:rPr>
-        <w:t xml:space="preserve">) and strict ophthalmopathy (OR 0.15, 95% CI 0.06–0.39;</w:t>
+        <w:t xml:space="preserve">= 0.0212) and UKB hyperthyroidism (OR 1.35, 95% CI 1.07–1.70;</w:t>
       </w:r>
       <w:r>
         <w:rPr>
@@ -2240,107 +2109,7 @@
         <w:rPr>
           <w:color w:val="000000"/>
         </w:rPr>
-        <w:t xml:space="preserve">= 9.02×10</w:t>
-      </w:r>
-      <w:r>
-        <w:rPr>
-          <w:color w:val="000000"/>
-          <w:vertAlign w:val="superscript"/>
-        </w:rPr>
-        <w:t xml:space="preserve">−5</w:t>
-      </w:r>
-      <w:r>
-        <w:rPr>
-          <w:color w:val="000000"/>
-        </w:rPr>
-        <w:t xml:space="preserve">). All five estimates used rs179252 as the single instrument (Table 2; Figure 2). Only the strict ophthalmopathy estimate missed the full-screen threshold (1.965×10</w:t>
-      </w:r>
-      <w:r>
-        <w:rPr>
-          <w:color w:val="000000"/>
-          <w:vertAlign w:val="superscript"/>
-        </w:rPr>
-        <w:t xml:space="preserve">−5</w:t>
-      </w:r>
-      <w:r>
-        <w:rPr>
-          <w:color w:val="000000"/>
-        </w:rPr>
-        <w:t xml:space="preserve">).</w:t>
-      </w:r>
-    </w:p>
-    <w:p>
-      <w:pPr>
-        <w:pStyle w:val="BodyText"/>
-      </w:pPr>
-      <w:r>
-        <w:rPr>
-          <w:color w:val="000000"/>
-        </w:rPr>
-        <w:t xml:space="preserve">The expression-increasing rs179252-G allele was associated with lower odds in all five disease datasets (per-allele ORs 0.77–0.82) and was positively correlated with rs179247-G in European (r = 0.978; n = 503) and East Asian (r = 0.996; n = 504) reference samples. The latter allele also increased blood</w:t>
-      </w:r>
-      <w:r>
-        <w:rPr>
-          <w:color w:val="000000"/>
-        </w:rPr>
-        <w:t xml:space="preserve"> </w:t>
-      </w:r>
-      <w:r>
-        <w:rPr>
-          <w:iCs/>
-          <w:i/>
-          <w:color w:val="000000"/>
-        </w:rPr>
-        <w:t xml:space="preserve">TSHR</w:t>
-      </w:r>
-      <w:r>
-        <w:rPr>
-          <w:color w:val="000000"/>
-        </w:rPr>
-        <w:t xml:space="preserve"> </w:t>
-      </w:r>
-      <w:r>
-        <w:rPr>
-          <w:color w:val="000000"/>
-        </w:rPr>
-        <w:t xml:space="preserve">expression. Allele-aligned recalculation reproduced the original MR estimates (Supplementary Dataset, TSHR_allele_audit).</w:t>
-      </w:r>
-    </w:p>
-    <w:p>
-      <w:pPr>
-        <w:pStyle w:val="BodyText"/>
-      </w:pPr>
-      <w:r>
-        <w:rPr>
-          <w:color w:val="000000"/>
-        </w:rPr>
-        <w:t xml:space="preserve">All five</w:t>
-      </w:r>
-      <w:r>
-        <w:rPr>
-          <w:color w:val="000000"/>
-        </w:rPr>
-        <w:t xml:space="preserve"> </w:t>
-      </w:r>
-      <w:r>
-        <w:rPr>
-          <w:iCs/>
-          <w:i/>
-          <w:color w:val="000000"/>
-        </w:rPr>
-        <w:t xml:space="preserve">IGF1R</w:t>
-      </w:r>
-      <w:r>
-        <w:rPr>
-          <w:color w:val="000000"/>
-        </w:rPr>
-        <w:t xml:space="preserve"> </w:t>
-      </w:r>
-      <w:r>
-        <w:rPr>
-          <w:color w:val="000000"/>
-        </w:rPr>
-        <w:t xml:space="preserve">ORs exceeded 1, but no association met the full-screen threshold. BBJ GD (OR 1.56, 95% CI 1.07–2.28;</w:t>
+        <w:t xml:space="preserve">= 0.0117). The most precise estimate, FinnGen GD, was OR 1.07 (95% CI 0.86–1.33;</w:t>
       </w:r>
       <w:r>
         <w:rPr>
@@ -2366,7 +2135,7 @@
         <w:rPr>
           <w:color w:val="000000"/>
         </w:rPr>
-        <w:t xml:space="preserve">= 0.0212) and UKB hyperthyroidism (OR 1.35, 95% CI 1.07–1.70;</w:t>
+        <w:t xml:space="preserve">= 0.539); this comparison had 80% power to detect an OR of 1.36 at</w:t>
       </w:r>
       <w:r>
         <w:rPr>
@@ -2392,13 +2161,7 @@
         <w:rPr>
           <w:color w:val="000000"/>
         </w:rPr>
-        <w:t xml:space="preserve">= 0.0117) reached nominal significance, meaning uncorrected</w:t>
-      </w:r>
-      <w:r>
-        <w:rPr>
-          <w:color w:val="000000"/>
-        </w:rPr>
-        <w:t xml:space="preserve"> </w:t>
+        <w:t xml:space="preserve">&lt; 0.05 (Supplementary Methods). Weighted-median ORs were 1.56 (</w:t>
       </w:r>
       <w:r>
         <w:rPr>
@@ -2418,13 +2181,7 @@
         <w:rPr>
           <w:color w:val="000000"/>
         </w:rPr>
-        <w:t xml:space="preserve">&lt; 0.05. The FinnGen estimates did not: GD OR 1.07 (95% CI 0.86–1.33;</w:t>
-      </w:r>
-      <w:r>
-        <w:rPr>
-          <w:color w:val="000000"/>
-        </w:rPr>
-        <w:t xml:space="preserve"> </w:t>
+        <w:t xml:space="preserve">= 0.0288) in BBJ, 1.42 (</w:t>
       </w:r>
       <w:r>
         <w:rPr>
@@ -2444,13 +2201,7 @@
         <w:rPr>
           <w:color w:val="000000"/>
         </w:rPr>
-        <w:t xml:space="preserve">= 0.539), ophthalmopathy OR 1.41 (95% CI 0.85–2.33;</w:t>
-      </w:r>
-      <w:r>
-        <w:rPr>
-          <w:color w:val="000000"/>
-        </w:rPr>
-        <w:t xml:space="preserve"> </w:t>
+        <w:t xml:space="preserve">= 0.00244) in UKB and 1.46 (</w:t>
       </w:r>
       <w:r>
         <w:rPr>
@@ -2470,7 +2221,7 @@
         <w:rPr>
           <w:color w:val="000000"/>
         </w:rPr>
-        <w:t xml:space="preserve">= 0.182) and strict ophthalmopathy OR 1.52 (95% CI 0.92–2.49;</w:t>
+        <w:t xml:space="preserve">= 0.124) in FinnGen ophthalmopathy. In these three datasets, MR-Egger and weighted-mode estimates had</w:t>
       </w:r>
       <w:r>
         <w:rPr>
@@ -2496,7 +2247,7 @@
         <w:rPr>
           <w:color w:val="000000"/>
         </w:rPr>
-        <w:t xml:space="preserve">= 0.0996). The most precise estimate, FinnGen GD, lay close to the null (80% power to detect OR 1.36 at</w:t>
+        <w:t xml:space="preserve">≥ 0.32, and MR-Egger intercept</w:t>
       </w:r>
       <w:r>
         <w:rPr>
@@ -2522,125 +2273,7 @@
         <w:rPr>
           <w:color w:val="000000"/>
         </w:rPr>
-        <w:t xml:space="preserve">&lt; 0.05; Supplementary Methods). Weighted-median ORs resembled the IVW results (BBJ 1.56,</w:t>
-      </w:r>
-      <w:r>
-        <w:rPr>
-          <w:color w:val="000000"/>
-        </w:rPr>
-        <w:t xml:space="preserve"> </w:t>
-      </w:r>
-      <w:r>
-        <w:rPr>
-          <w:iCs/>
-          <w:i/>
-          <w:color w:val="000000"/>
-        </w:rPr>
-        <w:t xml:space="preserve">P</w:t>
-      </w:r>
-      <w:r>
-        <w:rPr>
-          <w:color w:val="000000"/>
-        </w:rPr>
-        <w:t xml:space="preserve"> </w:t>
-      </w:r>
-      <w:r>
-        <w:rPr>
-          <w:color w:val="000000"/>
-        </w:rPr>
-        <w:t xml:space="preserve">= 0.0288; UKB 1.42,</w:t>
-      </w:r>
-      <w:r>
-        <w:rPr>
-          <w:color w:val="000000"/>
-        </w:rPr>
-        <w:t xml:space="preserve"> </w:t>
-      </w:r>
-      <w:r>
-        <w:rPr>
-          <w:iCs/>
-          <w:i/>
-          <w:color w:val="000000"/>
-        </w:rPr>
-        <w:t xml:space="preserve">P</w:t>
-      </w:r>
-      <w:r>
-        <w:rPr>
-          <w:color w:val="000000"/>
-        </w:rPr>
-        <w:t xml:space="preserve"> </w:t>
-      </w:r>
-      <w:r>
-        <w:rPr>
-          <w:color w:val="000000"/>
-        </w:rPr>
-        <w:t xml:space="preserve">= 0.00244; FinnGen ophthalmopathy 1.46,</w:t>
-      </w:r>
-      <w:r>
-        <w:rPr>
-          <w:color w:val="000000"/>
-        </w:rPr>
-        <w:t xml:space="preserve"> </w:t>
-      </w:r>
-      <w:r>
-        <w:rPr>
-          <w:iCs/>
-          <w:i/>
-          <w:color w:val="000000"/>
-        </w:rPr>
-        <w:t xml:space="preserve">P</w:t>
-      </w:r>
-      <w:r>
-        <w:rPr>
-          <w:color w:val="000000"/>
-        </w:rPr>
-        <w:t xml:space="preserve"> </w:t>
-      </w:r>
-      <w:r>
-        <w:rPr>
-          <w:color w:val="000000"/>
-        </w:rPr>
-        <w:t xml:space="preserve">= 0.124), whereas MR-Egger and weighted-mode estimates were imprecise (</w:t>
-      </w:r>
-      <w:r>
-        <w:rPr>
-          <w:iCs/>
-          <w:i/>
-          <w:color w:val="000000"/>
-        </w:rPr>
-        <w:t xml:space="preserve">P</w:t>
-      </w:r>
-      <w:r>
-        <w:rPr>
-          <w:color w:val="000000"/>
-        </w:rPr>
-        <w:t xml:space="preserve"> </w:t>
-      </w:r>
-      <w:r>
-        <w:rPr>
-          <w:color w:val="000000"/>
-        </w:rPr>
-        <w:t xml:space="preserve">≥ 0.32), and MR-Egger intercepts were non-significant (</w:t>
-      </w:r>
-      <w:r>
-        <w:rPr>
-          <w:iCs/>
-          <w:i/>
-          <w:color w:val="000000"/>
-        </w:rPr>
-        <w:t xml:space="preserve">P</w:t>
-      </w:r>
-      <w:r>
-        <w:rPr>
-          <w:color w:val="000000"/>
-        </w:rPr>
-        <w:t xml:space="preserve"> </w:t>
-      </w:r>
-      <w:r>
-        <w:rPr>
-          <w:color w:val="000000"/>
-        </w:rPr>
-        <w:t xml:space="preserve">= 0.66, 0.56 and 0.43 in BBJ, UKB and FinnGen ophthalmopathy), although these tests have little power with three or four instruments (Supplementary Dataset, MR_estimators_original). Non-significant FinnGen estimates do not establish absence of an association.</w:t>
+        <w:t xml:space="preserve">values were 0.66, 0.56 and 0.43, respectively (Supplementary Dataset, MR_estimators_original).</w:t>
       </w:r>
     </w:p>
     <w:bookmarkEnd w:id="29"/>
@@ -2664,7 +2297,7 @@
         <w:rPr>
           <w:color w:val="000000"/>
         </w:rPr>
-        <w:t xml:space="preserve">Four genes passed the full-screen threshold in both GD datasets:</w:t>
+        <w:t xml:space="preserve">Four genes passed the screen threshold in both GD datasets:</w:t>
       </w:r>
       <w:r>
         <w:rPr>
@@ -2756,7 +2389,7 @@
         <w:rPr>
           <w:color w:val="000000"/>
         </w:rPr>
-        <w:t xml:space="preserve">(Table 3). In FinnGen GD,</w:t>
+        <w:t xml:space="preserve">(Table 3).</w:t>
       </w:r>
       <w:r>
         <w:rPr>
@@ -2782,13 +2415,131 @@
         <w:rPr>
           <w:color w:val="000000"/>
         </w:rPr>
-        <w:t xml:space="preserve">was associated with lower odds (OR 0.17, 95% CI 0.08–0.36;</w:t>
-      </w:r>
-      <w:r>
-        <w:rPr>
-          <w:color w:val="000000"/>
-        </w:rPr>
-        <w:t xml:space="preserve"> </w:t>
+        <w:t xml:space="preserve">was associated with lower odds, and</w:t>
+      </w:r>
+      <w:r>
+        <w:rPr>
+          <w:color w:val="000000"/>
+        </w:rPr>
+        <w:t xml:space="preserve"> </w:t>
+      </w:r>
+      <w:r>
+        <w:rPr>
+          <w:iCs/>
+          <w:i/>
+          <w:color w:val="000000"/>
+        </w:rPr>
+        <w:t xml:space="preserve">HLA-DQA2</w:t>
+      </w:r>
+      <w:r>
+        <w:rPr>
+          <w:color w:val="000000"/>
+        </w:rPr>
+        <w:t xml:space="preserve"> </w:t>
+      </w:r>
+      <w:r>
+        <w:rPr>
+          <w:color w:val="000000"/>
+        </w:rPr>
+        <w:t xml:space="preserve">and</w:t>
+      </w:r>
+      <w:r>
+        <w:rPr>
+          <w:color w:val="000000"/>
+        </w:rPr>
+        <w:t xml:space="preserve"> </w:t>
+      </w:r>
+      <w:r>
+        <w:rPr>
+          <w:iCs/>
+          <w:i/>
+          <w:color w:val="000000"/>
+        </w:rPr>
+        <w:t xml:space="preserve">TUBB</w:t>
+      </w:r>
+      <w:r>
+        <w:rPr>
+          <w:color w:val="000000"/>
+        </w:rPr>
+        <w:t xml:space="preserve">, both in the major histocompatibility complex (MHC) region, with higher odds.</w:t>
+      </w:r>
+      <w:r>
+        <w:rPr>
+          <w:color w:val="000000"/>
+        </w:rPr>
+        <w:t xml:space="preserve"> </w:t>
+      </w:r>
+      <w:r>
+        <w:rPr>
+          <w:iCs/>
+          <w:i/>
+          <w:color w:val="000000"/>
+        </w:rPr>
+        <w:t xml:space="preserve">CTLA4</w:t>
+      </w:r>
+      <w:r>
+        <w:rPr>
+          <w:color w:val="000000"/>
+        </w:rPr>
+        <w:t xml:space="preserve"> </w:t>
+      </w:r>
+      <w:r>
+        <w:rPr>
+          <w:color w:val="000000"/>
+        </w:rPr>
+        <w:t xml:space="preserve">and</w:t>
+      </w:r>
+      <w:r>
+        <w:rPr>
+          <w:color w:val="000000"/>
+        </w:rPr>
+        <w:t xml:space="preserve"> </w:t>
+      </w:r>
+      <w:r>
+        <w:rPr>
+          <w:iCs/>
+          <w:i/>
+          <w:color w:val="000000"/>
+        </w:rPr>
+        <w:t xml:space="preserve">TUBB</w:t>
+      </w:r>
+      <w:r>
+        <w:rPr>
+          <w:color w:val="000000"/>
+        </w:rPr>
+        <w:t xml:space="preserve"> </w:t>
+      </w:r>
+      <w:r>
+        <w:rPr>
+          <w:color w:val="000000"/>
+        </w:rPr>
+        <w:t xml:space="preserve">had direction-consistent nominal associations in all five datasets;</w:t>
+      </w:r>
+      <w:r>
+        <w:rPr>
+          <w:color w:val="000000"/>
+        </w:rPr>
+        <w:t xml:space="preserve"> </w:t>
+      </w:r>
+      <w:r>
+        <w:rPr>
+          <w:iCs/>
+          <w:i/>
+          <w:color w:val="000000"/>
+        </w:rPr>
+        <w:t xml:space="preserve">HLA-DQA2</w:t>
+      </w:r>
+      <w:r>
+        <w:rPr>
+          <w:color w:val="000000"/>
+        </w:rPr>
+        <w:t xml:space="preserve"> </w:t>
+      </w:r>
+      <w:r>
+        <w:rPr>
+          <w:color w:val="000000"/>
+        </w:rPr>
+        <w:t xml:space="preserve">did in four, but its two-instrument UKB estimate was non-significant and below 1 (Supplementary Dataset, MR_primary). At the focused FinnGen GD threshold (</w:t>
       </w:r>
       <w:r>
         <w:rPr>
@@ -2808,46 +2559,93 @@
         <w:rPr>
           <w:color w:val="000000"/>
         </w:rPr>
-        <w:t xml:space="preserve">= 2.15×10</w:t>
-      </w:r>
-      <w:r>
-        <w:rPr>
-          <w:color w:val="000000"/>
-          <w:vertAlign w:val="superscript"/>
-        </w:rPr>
-        <w:t xml:space="preserve">−6</w:t>
-      </w:r>
-      <w:r>
-        <w:rPr>
-          <w:color w:val="000000"/>
-        </w:rPr>
-        <w:t xml:space="preserve">), whereas</w:t>
-      </w:r>
-      <w:r>
-        <w:rPr>
-          <w:color w:val="000000"/>
-        </w:rPr>
-        <w:t xml:space="preserve"> </w:t>
-      </w:r>
-      <w:r>
-        <w:rPr>
-          <w:iCs/>
-          <w:i/>
-          <w:color w:val="000000"/>
-        </w:rPr>
-        <w:t xml:space="preserve">HLA-DQA2</w:t>
-      </w:r>
-      <w:r>
-        <w:rPr>
-          <w:color w:val="000000"/>
-        </w:rPr>
-        <w:t xml:space="preserve"> </w:t>
-      </w:r>
-      <w:r>
-        <w:rPr>
-          <w:color w:val="000000"/>
-        </w:rPr>
-        <w:t xml:space="preserve">(OR 1.90, 95% CI 1.64–2.20;</w:t>
+        <w:t xml:space="preserve">&lt; 0.05/13 = 0.00385), seven of the 13 BBJ discoveries had direction-consistent associations: these four genes plus</w:t>
+      </w:r>
+      <w:r>
+        <w:rPr>
+          <w:color w:val="000000"/>
+        </w:rPr>
+        <w:t xml:space="preserve"> </w:t>
+      </w:r>
+      <w:r>
+        <w:rPr>
+          <w:iCs/>
+          <w:i/>
+          <w:color w:val="000000"/>
+        </w:rPr>
+        <w:t xml:space="preserve">C4A</w:t>
+      </w:r>
+      <w:r>
+        <w:rPr>
+          <w:color w:val="000000"/>
+        </w:rPr>
+        <w:t xml:space="preserve">,</w:t>
+      </w:r>
+      <w:r>
+        <w:rPr>
+          <w:color w:val="000000"/>
+        </w:rPr>
+        <w:t xml:space="preserve"> </w:t>
+      </w:r>
+      <w:r>
+        <w:rPr>
+          <w:iCs/>
+          <w:i/>
+          <w:color w:val="000000"/>
+        </w:rPr>
+        <w:t xml:space="preserve">TNFSF14</w:t>
+      </w:r>
+      <w:r>
+        <w:rPr>
+          <w:color w:val="000000"/>
+        </w:rPr>
+        <w:t xml:space="preserve"> </w:t>
+      </w:r>
+      <w:r>
+        <w:rPr>
+          <w:color w:val="000000"/>
+        </w:rPr>
+        <w:t xml:space="preserve">and</w:t>
+      </w:r>
+      <w:r>
+        <w:rPr>
+          <w:color w:val="000000"/>
+        </w:rPr>
+        <w:t xml:space="preserve"> </w:t>
+      </w:r>
+      <w:r>
+        <w:rPr>
+          <w:iCs/>
+          <w:i/>
+          <w:color w:val="000000"/>
+        </w:rPr>
+        <w:t xml:space="preserve">IFNGR1</w:t>
+      </w:r>
+      <w:r>
+        <w:rPr>
+          <w:color w:val="000000"/>
+        </w:rPr>
+        <w:t xml:space="preserve">.</w:t>
+      </w:r>
+      <w:r>
+        <w:rPr>
+          <w:color w:val="000000"/>
+        </w:rPr>
+        <w:t xml:space="preserve"> </w:t>
+      </w:r>
+      <w:r>
+        <w:rPr>
+          <w:iCs/>
+          <w:i/>
+          <w:color w:val="000000"/>
+        </w:rPr>
+        <w:t xml:space="preserve">HLA-A</w:t>
+      </w:r>
+      <w:r>
+        <w:rPr>
+          <w:color w:val="000000"/>
+        </w:rPr>
+        <w:t xml:space="preserve">, which had the smallest BBJ</w:t>
       </w:r>
       <w:r>
         <w:rPr>
@@ -2873,215 +2671,7 @@
         <w:rPr>
           <w:color w:val="000000"/>
         </w:rPr>
-        <w:t xml:space="preserve">= 1.41×10</w:t>
-      </w:r>
-      <w:r>
-        <w:rPr>
-          <w:color w:val="000000"/>
-          <w:vertAlign w:val="superscript"/>
-        </w:rPr>
-        <w:t xml:space="preserve">−17</w:t>
-      </w:r>
-      <w:r>
-        <w:rPr>
-          <w:color w:val="000000"/>
-        </w:rPr>
-        <w:t xml:space="preserve">) and</w:t>
-      </w:r>
-      <w:r>
-        <w:rPr>
-          <w:color w:val="000000"/>
-        </w:rPr>
-        <w:t xml:space="preserve"> </w:t>
-      </w:r>
-      <w:r>
-        <w:rPr>
-          <w:iCs/>
-          <w:i/>
-          <w:color w:val="000000"/>
-        </w:rPr>
-        <w:t xml:space="preserve">TUBB</w:t>
-      </w:r>
-      <w:r>
-        <w:rPr>
-          <w:color w:val="000000"/>
-        </w:rPr>
-        <w:t xml:space="preserve"> </w:t>
-      </w:r>
-      <w:r>
-        <w:rPr>
-          <w:color w:val="000000"/>
-        </w:rPr>
-        <w:t xml:space="preserve">(OR 3.28, 95% CI 2.09–5.17;</w:t>
-      </w:r>
-      <w:r>
-        <w:rPr>
-          <w:color w:val="000000"/>
-        </w:rPr>
-        <w:t xml:space="preserve"> </w:t>
-      </w:r>
-      <w:r>
-        <w:rPr>
-          <w:iCs/>
-          <w:i/>
-          <w:color w:val="000000"/>
-        </w:rPr>
-        <w:t xml:space="preserve">P</w:t>
-      </w:r>
-      <w:r>
-        <w:rPr>
-          <w:color w:val="000000"/>
-        </w:rPr>
-        <w:t xml:space="preserve"> </w:t>
-      </w:r>
-      <w:r>
-        <w:rPr>
-          <w:color w:val="000000"/>
-        </w:rPr>
-        <w:t xml:space="preserve">= 2.68×10</w:t>
-      </w:r>
-      <w:r>
-        <w:rPr>
-          <w:color w:val="000000"/>
-          <w:vertAlign w:val="superscript"/>
-        </w:rPr>
-        <w:t xml:space="preserve">−7</w:t>
-      </w:r>
-      <w:r>
-        <w:rPr>
-          <w:color w:val="000000"/>
-        </w:rPr>
-        <w:t xml:space="preserve">) were associated with higher odds.</w:t>
-      </w:r>
-      <w:r>
-        <w:rPr>
-          <w:color w:val="000000"/>
-        </w:rPr>
-        <w:t xml:space="preserve"> </w:t>
-      </w:r>
-      <w:r>
-        <w:rPr>
-          <w:iCs/>
-          <w:i/>
-          <w:color w:val="000000"/>
-        </w:rPr>
-        <w:t xml:space="preserve">HLA-DQA2</w:t>
-      </w:r>
-      <w:r>
-        <w:rPr>
-          <w:color w:val="000000"/>
-        </w:rPr>
-        <w:t xml:space="preserve"> </w:t>
-      </w:r>
-      <w:r>
-        <w:rPr>
-          <w:color w:val="000000"/>
-        </w:rPr>
-        <w:t xml:space="preserve">and</w:t>
-      </w:r>
-      <w:r>
-        <w:rPr>
-          <w:color w:val="000000"/>
-        </w:rPr>
-        <w:t xml:space="preserve"> </w:t>
-      </w:r>
-      <w:r>
-        <w:rPr>
-          <w:iCs/>
-          <w:i/>
-          <w:color w:val="000000"/>
-        </w:rPr>
-        <w:t xml:space="preserve">TUBB</w:t>
-      </w:r>
-      <w:r>
-        <w:rPr>
-          <w:color w:val="000000"/>
-        </w:rPr>
-        <w:t xml:space="preserve"> </w:t>
-      </w:r>
-      <w:r>
-        <w:rPr>
-          <w:color w:val="000000"/>
-        </w:rPr>
-        <w:t xml:space="preserve">lie in the major histocompatibility complex (MHC) region.</w:t>
-      </w:r>
-      <w:r>
-        <w:rPr>
-          <w:color w:val="000000"/>
-        </w:rPr>
-        <w:t xml:space="preserve"> </w:t>
-      </w:r>
-      <w:r>
-        <w:rPr>
-          <w:iCs/>
-          <w:i/>
-          <w:color w:val="000000"/>
-        </w:rPr>
-        <w:t xml:space="preserve">CTLA4</w:t>
-      </w:r>
-      <w:r>
-        <w:rPr>
-          <w:color w:val="000000"/>
-        </w:rPr>
-        <w:t xml:space="preserve"> </w:t>
-      </w:r>
-      <w:r>
-        <w:rPr>
-          <w:color w:val="000000"/>
-        </w:rPr>
-        <w:t xml:space="preserve">and</w:t>
-      </w:r>
-      <w:r>
-        <w:rPr>
-          <w:color w:val="000000"/>
-        </w:rPr>
-        <w:t xml:space="preserve"> </w:t>
-      </w:r>
-      <w:r>
-        <w:rPr>
-          <w:iCs/>
-          <w:i/>
-          <w:color w:val="000000"/>
-        </w:rPr>
-        <w:t xml:space="preserve">TUBB</w:t>
-      </w:r>
-      <w:r>
-        <w:rPr>
-          <w:color w:val="000000"/>
-        </w:rPr>
-        <w:t xml:space="preserve"> </w:t>
-      </w:r>
-      <w:r>
-        <w:rPr>
-          <w:color w:val="000000"/>
-        </w:rPr>
-        <w:t xml:space="preserve">had direction-consistent nominal associations across all five datasets.</w:t>
-      </w:r>
-      <w:r>
-        <w:rPr>
-          <w:color w:val="000000"/>
-        </w:rPr>
-        <w:t xml:space="preserve"> </w:t>
-      </w:r>
-      <w:r>
-        <w:rPr>
-          <w:iCs/>
-          <w:i/>
-          <w:color w:val="000000"/>
-        </w:rPr>
-        <w:t xml:space="preserve">HLA-DQA2</w:t>
-      </w:r>
-      <w:r>
-        <w:rPr>
-          <w:color w:val="000000"/>
-        </w:rPr>
-        <w:t xml:space="preserve"> </w:t>
-      </w:r>
-      <w:r>
-        <w:rPr>
-          <w:color w:val="000000"/>
-        </w:rPr>
-        <w:t xml:space="preserve">also showed higher-odds associations in both ophthalmopathy endpoints, but the two-instrument UKB estimate was non-significant and in the opposite direction (Supplementary Dataset, MR_primary).</w:t>
+        <w:t xml:space="preserve">value, had a non-significant FinnGen GD estimate.</w:t>
       </w:r>
     </w:p>
     <w:p>
@@ -3092,610 +2682,7 @@
         <w:rPr>
           <w:color w:val="000000"/>
         </w:rPr>
-        <w:t xml:space="preserve">Using the focused FinnGen GD threshold of</w:t>
-      </w:r>
-      <w:r>
-        <w:rPr>
-          <w:color w:val="000000"/>
-        </w:rPr>
-        <w:t xml:space="preserve"> </w:t>
-      </w:r>
-      <w:r>
-        <w:rPr>
-          <w:iCs/>
-          <w:i/>
-          <w:color w:val="000000"/>
-        </w:rPr>
-        <w:t xml:space="preserve">P</w:t>
-      </w:r>
-      <w:r>
-        <w:rPr>
-          <w:color w:val="000000"/>
-        </w:rPr>
-        <w:t xml:space="preserve"> </w:t>
-      </w:r>
-      <w:r>
-        <w:rPr>
-          <w:color w:val="000000"/>
-        </w:rPr>
-        <w:t xml:space="preserve">&lt; 0.05/13 (0.00385), seven of the 13 BBJ discoveries had direction-consistent associations: the four genes above plus</w:t>
-      </w:r>
-      <w:r>
-        <w:rPr>
-          <w:color w:val="000000"/>
-        </w:rPr>
-        <w:t xml:space="preserve"> </w:t>
-      </w:r>
-      <w:r>
-        <w:rPr>
-          <w:iCs/>
-          <w:i/>
-          <w:color w:val="000000"/>
-        </w:rPr>
-        <w:t xml:space="preserve">C4A</w:t>
-      </w:r>
-      <w:r>
-        <w:rPr>
-          <w:color w:val="000000"/>
-        </w:rPr>
-        <w:t xml:space="preserve"> </w:t>
-      </w:r>
-      <w:r>
-        <w:rPr>
-          <w:color w:val="000000"/>
-        </w:rPr>
-        <w:t xml:space="preserve">(</w:t>
-      </w:r>
-      <w:r>
-        <w:rPr>
-          <w:iCs/>
-          <w:i/>
-          <w:color w:val="000000"/>
-        </w:rPr>
-        <w:t xml:space="preserve">P</w:t>
-      </w:r>
-      <w:r>
-        <w:rPr>
-          <w:color w:val="000000"/>
-        </w:rPr>
-        <w:t xml:space="preserve"> </w:t>
-      </w:r>
-      <w:r>
-        <w:rPr>
-          <w:color w:val="000000"/>
-        </w:rPr>
-        <w:t xml:space="preserve">= 4.97×10</w:t>
-      </w:r>
-      <w:r>
-        <w:rPr>
-          <w:color w:val="000000"/>
-          <w:vertAlign w:val="superscript"/>
-        </w:rPr>
-        <w:t xml:space="preserve">−5</w:t>
-      </w:r>
-      <w:r>
-        <w:rPr>
-          <w:color w:val="000000"/>
-        </w:rPr>
-        <w:t xml:space="preserve">),</w:t>
-      </w:r>
-      <w:r>
-        <w:rPr>
-          <w:color w:val="000000"/>
-        </w:rPr>
-        <w:t xml:space="preserve"> </w:t>
-      </w:r>
-      <w:r>
-        <w:rPr>
-          <w:iCs/>
-          <w:i/>
-          <w:color w:val="000000"/>
-        </w:rPr>
-        <w:t xml:space="preserve">TNFSF14</w:t>
-      </w:r>
-      <w:r>
-        <w:rPr>
-          <w:color w:val="000000"/>
-        </w:rPr>
-        <w:t xml:space="preserve"> </w:t>
-      </w:r>
-      <w:r>
-        <w:rPr>
-          <w:color w:val="000000"/>
-        </w:rPr>
-        <w:t xml:space="preserve">(</w:t>
-      </w:r>
-      <w:r>
-        <w:rPr>
-          <w:iCs/>
-          <w:i/>
-          <w:color w:val="000000"/>
-        </w:rPr>
-        <w:t xml:space="preserve">P</w:t>
-      </w:r>
-      <w:r>
-        <w:rPr>
-          <w:color w:val="000000"/>
-        </w:rPr>
-        <w:t xml:space="preserve"> </w:t>
-      </w:r>
-      <w:r>
-        <w:rPr>
-          <w:color w:val="000000"/>
-        </w:rPr>
-        <w:t xml:space="preserve">= 0.00361) and</w:t>
-      </w:r>
-      <w:r>
-        <w:rPr>
-          <w:color w:val="000000"/>
-        </w:rPr>
-        <w:t xml:space="preserve"> </w:t>
-      </w:r>
-      <w:r>
-        <w:rPr>
-          <w:iCs/>
-          <w:i/>
-          <w:color w:val="000000"/>
-        </w:rPr>
-        <w:t xml:space="preserve">IFNGR1</w:t>
-      </w:r>
-      <w:r>
-        <w:rPr>
-          <w:color w:val="000000"/>
-        </w:rPr>
-        <w:t xml:space="preserve"> </w:t>
-      </w:r>
-      <w:r>
-        <w:rPr>
-          <w:color w:val="000000"/>
-        </w:rPr>
-        <w:t xml:space="preserve">(</w:t>
-      </w:r>
-      <w:r>
-        <w:rPr>
-          <w:iCs/>
-          <w:i/>
-          <w:color w:val="000000"/>
-        </w:rPr>
-        <w:t xml:space="preserve">P</w:t>
-      </w:r>
-      <w:r>
-        <w:rPr>
-          <w:color w:val="000000"/>
-        </w:rPr>
-        <w:t xml:space="preserve"> </w:t>
-      </w:r>
-      <w:r>
-        <w:rPr>
-          <w:color w:val="000000"/>
-        </w:rPr>
-        <w:t xml:space="preserve">= 0.00330).</w:t>
-      </w:r>
-      <w:r>
-        <w:rPr>
-          <w:color w:val="000000"/>
-        </w:rPr>
-        <w:t xml:space="preserve"> </w:t>
-      </w:r>
-      <w:r>
-        <w:rPr>
-          <w:iCs/>
-          <w:i/>
-          <w:color w:val="000000"/>
-        </w:rPr>
-        <w:t xml:space="preserve">VKORC1</w:t>
-      </w:r>
-      <w:r>
-        <w:rPr>
-          <w:color w:val="000000"/>
-        </w:rPr>
-        <w:t xml:space="preserve"> </w:t>
-      </w:r>
-      <w:r>
-        <w:rPr>
-          <w:color w:val="000000"/>
-        </w:rPr>
-        <w:t xml:space="preserve">was not estimable in FinnGen GD; the denominator remained 13. Although</w:t>
-      </w:r>
-      <w:r>
-        <w:rPr>
-          <w:color w:val="000000"/>
-        </w:rPr>
-        <w:t xml:space="preserve"> </w:t>
-      </w:r>
-      <w:r>
-        <w:rPr>
-          <w:iCs/>
-          <w:i/>
-          <w:color w:val="000000"/>
-        </w:rPr>
-        <w:t xml:space="preserve">HLA-A</w:t>
-      </w:r>
-      <w:r>
-        <w:rPr>
-          <w:color w:val="000000"/>
-        </w:rPr>
-        <w:t xml:space="preserve"> </w:t>
-      </w:r>
-      <w:r>
-        <w:rPr>
-          <w:color w:val="000000"/>
-        </w:rPr>
-        <w:t xml:space="preserve">had the smallest BBJ</w:t>
-      </w:r>
-      <w:r>
-        <w:rPr>
-          <w:color w:val="000000"/>
-        </w:rPr>
-        <w:t xml:space="preserve"> </w:t>
-      </w:r>
-      <w:r>
-        <w:rPr>
-          <w:iCs/>
-          <w:i/>
-          <w:color w:val="000000"/>
-        </w:rPr>
-        <w:t xml:space="preserve">P</w:t>
-      </w:r>
-      <w:r>
-        <w:rPr>
-          <w:color w:val="000000"/>
-        </w:rPr>
-        <w:t xml:space="preserve"> </w:t>
-      </w:r>
-      <w:r>
-        <w:rPr>
-          <w:color w:val="000000"/>
-        </w:rPr>
-        <w:t xml:space="preserve">value (2.60×10</w:t>
-      </w:r>
-      <w:r>
-        <w:rPr>
-          <w:color w:val="000000"/>
-          <w:vertAlign w:val="superscript"/>
-        </w:rPr>
-        <w:t xml:space="preserve">−23</w:t>
-      </w:r>
-      <w:r>
-        <w:rPr>
-          <w:color w:val="000000"/>
-        </w:rPr>
-        <w:t xml:space="preserve">), its FinnGen GD association was non-significant (</w:t>
-      </w:r>
-      <w:r>
-        <w:rPr>
-          <w:iCs/>
-          <w:i/>
-          <w:color w:val="000000"/>
-        </w:rPr>
-        <w:t xml:space="preserve">P</w:t>
-      </w:r>
-      <w:r>
-        <w:rPr>
-          <w:color w:val="000000"/>
-        </w:rPr>
-        <w:t xml:space="preserve"> </w:t>
-      </w:r>
-      <w:r>
-        <w:rPr>
-          <w:color w:val="000000"/>
-        </w:rPr>
-        <w:t xml:space="preserve">= 0.648).</w:t>
-      </w:r>
-    </w:p>
-    <w:p>
-      <w:pPr>
-        <w:pStyle w:val="BodyText"/>
-      </w:pPr>
-      <w:r>
-        <w:rPr>
-          <w:color w:val="000000"/>
-        </w:rPr>
-        <w:t xml:space="preserve">The exploratory full FinnGen GD screen identified 13 genes, nine outside the BBJ discovery set:</w:t>
-      </w:r>
-      <w:r>
-        <w:rPr>
-          <w:color w:val="000000"/>
-        </w:rPr>
-        <w:t xml:space="preserve"> </w:t>
-      </w:r>
-      <w:r>
-        <w:rPr>
-          <w:iCs/>
-          <w:i/>
-          <w:color w:val="000000"/>
-        </w:rPr>
-        <w:t xml:space="preserve">APOM</w:t>
-      </w:r>
-      <w:r>
-        <w:rPr>
-          <w:color w:val="000000"/>
-        </w:rPr>
-        <w:t xml:space="preserve">,</w:t>
-      </w:r>
-      <w:r>
-        <w:rPr>
-          <w:color w:val="000000"/>
-        </w:rPr>
-        <w:t xml:space="preserve"> </w:t>
-      </w:r>
-      <w:r>
-        <w:rPr>
-          <w:iCs/>
-          <w:i/>
-          <w:color w:val="000000"/>
-        </w:rPr>
-        <w:t xml:space="preserve">NEU1</w:t>
-      </w:r>
-      <w:r>
-        <w:rPr>
-          <w:color w:val="000000"/>
-        </w:rPr>
-        <w:t xml:space="preserve">,</w:t>
-      </w:r>
-      <w:r>
-        <w:rPr>
-          <w:color w:val="000000"/>
-        </w:rPr>
-        <w:t xml:space="preserve"> </w:t>
-      </w:r>
-      <w:r>
-        <w:rPr>
-          <w:iCs/>
-          <w:i/>
-          <w:color w:val="000000"/>
-        </w:rPr>
-        <w:t xml:space="preserve">IGLV2-18</w:t>
-      </w:r>
-      <w:r>
-        <w:rPr>
-          <w:color w:val="000000"/>
-        </w:rPr>
-        <w:t xml:space="preserve">,</w:t>
-      </w:r>
-      <w:r>
-        <w:rPr>
-          <w:color w:val="000000"/>
-        </w:rPr>
-        <w:t xml:space="preserve"> </w:t>
-      </w:r>
-      <w:r>
-        <w:rPr>
-          <w:iCs/>
-          <w:i/>
-          <w:color w:val="000000"/>
-        </w:rPr>
-        <w:t xml:space="preserve">IGLV3-12</w:t>
-      </w:r>
-      <w:r>
-        <w:rPr>
-          <w:color w:val="000000"/>
-        </w:rPr>
-        <w:t xml:space="preserve">,</w:t>
-      </w:r>
-      <w:r>
-        <w:rPr>
-          <w:color w:val="000000"/>
-        </w:rPr>
-        <w:t xml:space="preserve"> </w:t>
-      </w:r>
-      <w:r>
-        <w:rPr>
-          <w:iCs/>
-          <w:i/>
-          <w:color w:val="000000"/>
-        </w:rPr>
-        <w:t xml:space="preserve">TNF</w:t>
-      </w:r>
-      <w:r>
-        <w:rPr>
-          <w:color w:val="000000"/>
-        </w:rPr>
-        <w:t xml:space="preserve">,</w:t>
-      </w:r>
-      <w:r>
-        <w:rPr>
-          <w:color w:val="000000"/>
-        </w:rPr>
-        <w:t xml:space="preserve"> </w:t>
-      </w:r>
-      <w:r>
-        <w:rPr>
-          <w:iCs/>
-          <w:i/>
-          <w:color w:val="000000"/>
-        </w:rPr>
-        <w:t xml:space="preserve">HIST1H4E</w:t>
-      </w:r>
-      <w:r>
-        <w:rPr>
-          <w:color w:val="000000"/>
-        </w:rPr>
-        <w:t xml:space="preserve">,</w:t>
-      </w:r>
-      <w:r>
-        <w:rPr>
-          <w:color w:val="000000"/>
-        </w:rPr>
-        <w:t xml:space="preserve"> </w:t>
-      </w:r>
-      <w:r>
-        <w:rPr>
-          <w:iCs/>
-          <w:i/>
-          <w:color w:val="000000"/>
-        </w:rPr>
-        <w:t xml:space="preserve">LTA</w:t>
-      </w:r>
-      <w:r>
-        <w:rPr>
-          <w:color w:val="000000"/>
-        </w:rPr>
-        <w:t xml:space="preserve">,</w:t>
-      </w:r>
-      <w:r>
-        <w:rPr>
-          <w:color w:val="000000"/>
-        </w:rPr>
-        <w:t xml:space="preserve"> </w:t>
-      </w:r>
-      <w:r>
-        <w:rPr>
-          <w:iCs/>
-          <w:i/>
-          <w:color w:val="000000"/>
-        </w:rPr>
-        <w:t xml:space="preserve">LTB</w:t>
-      </w:r>
-      <w:r>
-        <w:rPr>
-          <w:color w:val="000000"/>
-        </w:rPr>
-        <w:t xml:space="preserve"> </w:t>
-      </w:r>
-      <w:r>
-        <w:rPr>
-          <w:color w:val="000000"/>
-        </w:rPr>
-        <w:t xml:space="preserve">and</w:t>
-      </w:r>
-      <w:r>
-        <w:rPr>
-          <w:color w:val="000000"/>
-        </w:rPr>
-        <w:t xml:space="preserve"> </w:t>
-      </w:r>
-      <w:r>
-        <w:rPr>
-          <w:iCs/>
-          <w:i/>
-          <w:color w:val="000000"/>
-        </w:rPr>
-        <w:t xml:space="preserve">C4B</w:t>
-      </w:r>
-      <w:r>
-        <w:rPr>
-          <w:color w:val="000000"/>
-        </w:rPr>
-        <w:t xml:space="preserve"> </w:t>
-      </w:r>
-      <w:r>
-        <w:rPr>
-          <w:color w:val="000000"/>
-        </w:rPr>
-        <w:t xml:space="preserve">(Table S1). Two gene pairs each shared one instrument (</w:t>
-      </w:r>
-      <w:r>
-        <w:rPr>
-          <w:iCs/>
-          <w:i/>
-          <w:color w:val="000000"/>
-        </w:rPr>
-        <w:t xml:space="preserve">APOM</w:t>
-      </w:r>
-      <w:r>
-        <w:rPr>
-          <w:color w:val="000000"/>
-        </w:rPr>
-        <w:t xml:space="preserve"> </w:t>
-      </w:r>
-      <w:r>
-        <w:rPr>
-          <w:color w:val="000000"/>
-        </w:rPr>
-        <w:t xml:space="preserve">and</w:t>
-      </w:r>
-      <w:r>
-        <w:rPr>
-          <w:color w:val="000000"/>
-        </w:rPr>
-        <w:t xml:space="preserve"> </w:t>
-      </w:r>
-      <w:r>
-        <w:rPr>
-          <w:iCs/>
-          <w:i/>
-          <w:color w:val="000000"/>
-        </w:rPr>
-        <w:t xml:space="preserve">NEU1</w:t>
-      </w:r>
-      <w:r>
-        <w:rPr>
-          <w:color w:val="000000"/>
-        </w:rPr>
-        <w:t xml:space="preserve">, rs3101018;</w:t>
-      </w:r>
-      <w:r>
-        <w:rPr>
-          <w:color w:val="000000"/>
-        </w:rPr>
-        <w:t xml:space="preserve"> </w:t>
-      </w:r>
-      <w:r>
-        <w:rPr>
-          <w:iCs/>
-          <w:i/>
-          <w:color w:val="000000"/>
-        </w:rPr>
-        <w:t xml:space="preserve">IGLV2-18</w:t>
-      </w:r>
-      <w:r>
-        <w:rPr>
-          <w:color w:val="000000"/>
-        </w:rPr>
-        <w:t xml:space="preserve"> </w:t>
-      </w:r>
-      <w:r>
-        <w:rPr>
-          <w:color w:val="000000"/>
-        </w:rPr>
-        <w:t xml:space="preserve">and</w:t>
-      </w:r>
-      <w:r>
-        <w:rPr>
-          <w:color w:val="000000"/>
-        </w:rPr>
-        <w:t xml:space="preserve"> </w:t>
-      </w:r>
-      <w:r>
-        <w:rPr>
-          <w:iCs/>
-          <w:i/>
-          <w:color w:val="000000"/>
-        </w:rPr>
-        <w:t xml:space="preserve">IGLV3-12</w:t>
-      </w:r>
-      <w:r>
-        <w:rPr>
-          <w:color w:val="000000"/>
-        </w:rPr>
-        <w:t xml:space="preserve">, rs5759410) and are not independent findings. All but the two</w:t>
-      </w:r>
-      <w:r>
-        <w:rPr>
-          <w:color w:val="000000"/>
-        </w:rPr>
-        <w:t xml:space="preserve"> </w:t>
-      </w:r>
-      <w:r>
-        <w:rPr>
-          <w:iCs/>
-          <w:i/>
-          <w:color w:val="000000"/>
-        </w:rPr>
-        <w:t xml:space="preserve">IGLV</w:t>
-      </w:r>
-      <w:r>
-        <w:rPr>
-          <w:color w:val="000000"/>
-        </w:rPr>
-        <w:t xml:space="preserve"> </w:t>
-      </w:r>
-      <w:r>
-        <w:rPr>
-          <w:color w:val="000000"/>
-        </w:rPr>
-        <w:t xml:space="preserve">genes were instrumented within the extended MHC region on chromosome 6, which was not excluded from the screen.</w:t>
+        <w:t xml:space="preserve">The exploratory full FinnGen GD screen identified 13 genes, nine of them outside the BBJ discovery set (Table S1). Seven of the nine were instrumented in the extended MHC region, which was not excluded from the screen, and two pairs each shared one instrument.</w:t>
       </w:r>
     </w:p>
     <w:bookmarkEnd w:id="30"/>
@@ -3719,7 +2706,7 @@
         <w:rPr>
           <w:color w:val="000000"/>
         </w:rPr>
-        <w:t xml:space="preserve">The two-instrument</w:t>
+        <w:t xml:space="preserve">Omitting rs13030124 left non-significant</w:t>
       </w:r>
       <w:r>
         <w:rPr>
@@ -3745,7 +2732,7 @@
         <w:rPr>
           <w:color w:val="000000"/>
         </w:rPr>
-        <w:t xml:space="preserve">estimates depended largely on rs13030124. Omitting it left imprecise estimates in UKB and all three FinnGen endpoints (</w:t>
+        <w:t xml:space="preserve">estimates in UKB and all three FinnGen endpoints (</w:t>
       </w:r>
       <w:r>
         <w:rPr>
@@ -3765,7 +2752,59 @@
         <w:rPr>
           <w:color w:val="000000"/>
         </w:rPr>
-        <w:t xml:space="preserve">= 0.323–0.972). Heterogeneity was present in FinnGen GD for</w:t>
+        <w:t xml:space="preserve">= 0.323–0.972; Figure S2). In BBJ and UKB, where</w:t>
+      </w:r>
+      <w:r>
+        <w:rPr>
+          <w:color w:val="000000"/>
+        </w:rPr>
+        <w:t xml:space="preserve"> </w:t>
+      </w:r>
+      <w:r>
+        <w:rPr>
+          <w:iCs/>
+          <w:i/>
+          <w:color w:val="000000"/>
+        </w:rPr>
+        <w:t xml:space="preserve">IGF1R</w:t>
+      </w:r>
+      <w:r>
+        <w:rPr>
+          <w:color w:val="000000"/>
+        </w:rPr>
+        <w:t xml:space="preserve"> </w:t>
+      </w:r>
+      <w:r>
+        <w:rPr>
+          <w:color w:val="000000"/>
+        </w:rPr>
+        <w:t xml:space="preserve">had four instruments, omitting each in turn gave</w:t>
+      </w:r>
+      <w:r>
+        <w:rPr>
+          <w:color w:val="000000"/>
+        </w:rPr>
+        <w:t xml:space="preserve"> </w:t>
+      </w:r>
+      <w:r>
+        <w:rPr>
+          <w:iCs/>
+          <w:i/>
+          <w:color w:val="000000"/>
+        </w:rPr>
+        <w:t xml:space="preserve">P</w:t>
+      </w:r>
+      <w:r>
+        <w:rPr>
+          <w:color w:val="000000"/>
+        </w:rPr>
+        <w:t xml:space="preserve"> </w:t>
+      </w:r>
+      <w:r>
+        <w:rPr>
+          <w:color w:val="000000"/>
+        </w:rPr>
+        <w:t xml:space="preserve">&gt; 0.05 in two of the four estimates; omitting rs2654980 in UKB also lowered the OR from 1.35 to 1.16 (Figure S2). Among the BBJ discoveries, Cochran’s Q test in FinnGen GD indicated heterogeneity among instruments for</w:t>
       </w:r>
       <w:r>
         <w:rPr>
@@ -3791,13 +2830,7 @@
         <w:rPr>
           <w:color w:val="000000"/>
         </w:rPr>
-        <w:t xml:space="preserve">(Q-test</w:t>
-      </w:r>
-      <w:r>
-        <w:rPr>
-          <w:color w:val="000000"/>
-        </w:rPr>
-        <w:t xml:space="preserve"> </w:t>
+        <w:t xml:space="preserve">(</w:t>
       </w:r>
       <w:r>
         <w:rPr>
@@ -3903,6 +2936,52 @@
           <w:i/>
           <w:color w:val="000000"/>
         </w:rPr>
+        <w:t xml:space="preserve">HLA-A</w:t>
+      </w:r>
+      <w:r>
+        <w:rPr>
+          <w:color w:val="000000"/>
+        </w:rPr>
+        <w:t xml:space="preserve"> </w:t>
+      </w:r>
+      <w:r>
+        <w:rPr>
+          <w:color w:val="000000"/>
+        </w:rPr>
+        <w:t xml:space="preserve">(</w:t>
+      </w:r>
+      <w:r>
+        <w:rPr>
+          <w:iCs/>
+          <w:i/>
+          <w:color w:val="000000"/>
+        </w:rPr>
+        <w:t xml:space="preserve">P</w:t>
+      </w:r>
+      <w:r>
+        <w:rPr>
+          <w:color w:val="000000"/>
+        </w:rPr>
+        <w:t xml:space="preserve"> </w:t>
+      </w:r>
+      <w:r>
+        <w:rPr>
+          <w:color w:val="000000"/>
+        </w:rPr>
+        <w:t xml:space="preserve">= 0.0387) and</w:t>
+      </w:r>
+      <w:r>
+        <w:rPr>
+          <w:color w:val="000000"/>
+        </w:rPr>
+        <w:t xml:space="preserve"> </w:t>
+      </w:r>
+      <w:r>
+        <w:rPr>
+          <w:iCs/>
+          <w:i/>
+          <w:color w:val="000000"/>
+        </w:rPr>
         <w:t xml:space="preserve">CTLA4</w:t>
       </w:r>
       <w:r>
@@ -3915,7 +2994,41 @@
         <w:rPr>
           <w:color w:val="000000"/>
         </w:rPr>
-        <w:t xml:space="preserve">(</w:t>
+        <w:t xml:space="preserve">(Table 2). Omitting rs149543464 (</w:t>
+      </w:r>
+      <w:r>
+        <w:rPr>
+          <w:iCs/>
+          <w:i/>
+          <w:color w:val="000000"/>
+        </w:rPr>
+        <w:t xml:space="preserve">TUBB</w:t>
+      </w:r>
+      <w:r>
+        <w:rPr>
+          <w:color w:val="000000"/>
+        </w:rPr>
+        <w:t xml:space="preserve">) or rs1269852 (</w:t>
+      </w:r>
+      <w:r>
+        <w:rPr>
+          <w:iCs/>
+          <w:i/>
+          <w:color w:val="000000"/>
+        </w:rPr>
+        <w:t xml:space="preserve">C4A</w:t>
+      </w:r>
+      <w:r>
+        <w:rPr>
+          <w:color w:val="000000"/>
+        </w:rPr>
+        <w:t xml:space="preserve">) raised the FinnGen GD</w:t>
+      </w:r>
+      <w:r>
+        <w:rPr>
+          <w:color w:val="000000"/>
+        </w:rPr>
+        <w:t xml:space="preserve"> </w:t>
       </w:r>
       <w:r>
         <w:rPr>
@@ -3935,33 +3048,38 @@
         <w:rPr>
           <w:color w:val="000000"/>
         </w:rPr>
-        <w:t xml:space="preserve">= 0.0275) and</w:t>
-      </w:r>
-      <w:r>
-        <w:rPr>
-          <w:color w:val="000000"/>
-        </w:rPr>
-        <w:t xml:space="preserve"> </w:t>
-      </w:r>
-      <w:r>
-        <w:rPr>
-          <w:iCs/>
-          <w:i/>
-          <w:color w:val="000000"/>
-        </w:rPr>
-        <w:t xml:space="preserve">HLA-A</w:t>
-      </w:r>
-      <w:r>
-        <w:rPr>
-          <w:color w:val="000000"/>
-        </w:rPr>
-        <w:t xml:space="preserve"> </w:t>
-      </w:r>
-      <w:r>
-        <w:rPr>
-          <w:color w:val="000000"/>
-        </w:rPr>
-        <w:t xml:space="preserve">(</w:t>
+        <w:t xml:space="preserve">value to 0.0262 and 0.0471, respectively (Supplementary Dataset, LOO_new_fixed14).</w:t>
+      </w:r>
+    </w:p>
+    <w:p>
+      <w:pPr>
+        <w:pStyle w:val="BodyText"/>
+      </w:pPr>
+      <w:r>
+        <w:rPr>
+          <w:color w:val="000000"/>
+        </w:rPr>
+        <w:t xml:space="preserve">With eQTLGen cohort allele frequencies, all 13 BBJ discoveries still passed the screen threshold,</w:t>
+      </w:r>
+      <w:r>
+        <w:rPr>
+          <w:color w:val="000000"/>
+        </w:rPr>
+        <w:t xml:space="preserve"> </w:t>
+      </w:r>
+      <w:r>
+        <w:rPr>
+          <w:iCs/>
+          <w:i/>
+          <w:color w:val="000000"/>
+        </w:rPr>
+        <w:t xml:space="preserve">TSHR</w:t>
+      </w:r>
+      <w:r>
+        <w:rPr>
+          <w:color w:val="000000"/>
+        </w:rPr>
+        <w:t xml:space="preserve"> </w:t>
       </w:r>
       <w:r>
         <w:rPr>
@@ -3981,35 +3099,21 @@
         <w:rPr>
           <w:color w:val="000000"/>
         </w:rPr>
-        <w:t xml:space="preserve">= 0.0387). Omitting rs149543464 (</w:t>
-      </w:r>
-      <w:r>
-        <w:rPr>
-          <w:iCs/>
-          <w:i/>
-          <w:color w:val="000000"/>
-        </w:rPr>
-        <w:t xml:space="preserve">TUBB</w:t>
-      </w:r>
-      <w:r>
-        <w:rPr>
-          <w:color w:val="000000"/>
-        </w:rPr>
-        <w:t xml:space="preserve">) or rs1269852 (</w:t>
-      </w:r>
-      <w:r>
-        <w:rPr>
-          <w:iCs/>
-          <w:i/>
-          <w:color w:val="000000"/>
-        </w:rPr>
-        <w:t xml:space="preserve">C4A</w:t>
-      </w:r>
-      <w:r>
-        <w:rPr>
-          <w:color w:val="000000"/>
-        </w:rPr>
-        <w:t xml:space="preserve">) raised FinnGen GD</w:t>
+        <w:t xml:space="preserve">values were unchanged and no</w:t>
+      </w:r>
+      <w:r>
+        <w:rPr>
+          <w:color w:val="000000"/>
+        </w:rPr>
+        <w:t xml:space="preserve"> </w:t>
+      </w:r>
+      <w:r>
+        <w:rPr>
+          <w:iCs/>
+          <w:i/>
+          <w:color w:val="000000"/>
+        </w:rPr>
+        <w:t xml:space="preserve">IGF1R</w:t>
       </w:r>
       <w:r>
         <w:rPr>
@@ -4035,156 +3139,7 @@
         <w:rPr>
           <w:color w:val="000000"/>
         </w:rPr>
-        <w:t xml:space="preserve">to 0.0262 and 0.0471, respectively (Supplementary Dataset, LOO_new_fixed14). In BBJ and UKB, two of the four single-variant omissions removed nominal</w:t>
-      </w:r>
-      <w:r>
-        <w:rPr>
-          <w:color w:val="000000"/>
-        </w:rPr>
-        <w:t xml:space="preserve"> </w:t>
-      </w:r>
-      <w:r>
-        <w:rPr>
-          <w:iCs/>
-          <w:i/>
-          <w:color w:val="000000"/>
-        </w:rPr>
-        <w:t xml:space="preserve">IGF1R</w:t>
-      </w:r>
-      <w:r>
-        <w:rPr>
-          <w:color w:val="000000"/>
-        </w:rPr>
-        <w:t xml:space="preserve"> </w:t>
-      </w:r>
-      <w:r>
-        <w:rPr>
-          <w:color w:val="000000"/>
-        </w:rPr>
-        <w:t xml:space="preserve">significance: rs2654980 in both (</w:t>
-      </w:r>
-      <w:r>
-        <w:rPr>
-          <w:iCs/>
-          <w:i/>
-          <w:color w:val="000000"/>
-        </w:rPr>
-        <w:t xml:space="preserve">P</w:t>
-      </w:r>
-      <w:r>
-        <w:rPr>
-          <w:color w:val="000000"/>
-        </w:rPr>
-        <w:t xml:space="preserve"> </w:t>
-      </w:r>
-      <w:r>
-        <w:rPr>
-          <w:color w:val="000000"/>
-        </w:rPr>
-        <w:t xml:space="preserve">= 0.0751 and 0.468), rs59467480 in BBJ (</w:t>
-      </w:r>
-      <w:r>
-        <w:rPr>
-          <w:iCs/>
-          <w:i/>
-          <w:color w:val="000000"/>
-        </w:rPr>
-        <w:t xml:space="preserve">P</w:t>
-      </w:r>
-      <w:r>
-        <w:rPr>
-          <w:color w:val="000000"/>
-        </w:rPr>
-        <w:t xml:space="preserve"> </w:t>
-      </w:r>
-      <w:r>
-        <w:rPr>
-          <w:color w:val="000000"/>
-        </w:rPr>
-        <w:t xml:space="preserve">= 0.0503) and rs117212126 in UKB (</w:t>
-      </w:r>
-      <w:r>
-        <w:rPr>
-          <w:iCs/>
-          <w:i/>
-          <w:color w:val="000000"/>
-        </w:rPr>
-        <w:t xml:space="preserve">P</w:t>
-      </w:r>
-      <w:r>
-        <w:rPr>
-          <w:color w:val="000000"/>
-        </w:rPr>
-        <w:t xml:space="preserve"> </w:t>
-      </w:r>
-      <w:r>
-        <w:rPr>
-          <w:color w:val="000000"/>
-        </w:rPr>
-        <w:t xml:space="preserve">= 0.0529). Apart from rs2654980 in UKB (OR 1.16), these omissions left ORs close to the full estimates, with wider intervals (Figure S2; Supplementary Dataset).</w:t>
-      </w:r>
-    </w:p>
-    <w:p>
-      <w:pPr>
-        <w:pStyle w:val="BodyText"/>
-      </w:pPr>
-      <w:r>
-        <w:rPr>
-          <w:color w:val="000000"/>
-        </w:rPr>
-        <w:t xml:space="preserve">Substituting eQTLGen cohort allele frequencies preserved the original 13 BBJ discoveries and the principal</w:t>
-      </w:r>
-      <w:r>
-        <w:rPr>
-          <w:color w:val="000000"/>
-        </w:rPr>
-        <w:t xml:space="preserve"> </w:t>
-      </w:r>
-      <w:r>
-        <w:rPr>
-          <w:iCs/>
-          <w:i/>
-          <w:color w:val="000000"/>
-        </w:rPr>
-        <w:t xml:space="preserve">TSHR</w:t>
-      </w:r>
-      <w:r>
-        <w:rPr>
-          <w:color w:val="000000"/>
-        </w:rPr>
-        <w:t xml:space="preserve"> </w:t>
-      </w:r>
-      <w:r>
-        <w:rPr>
-          <w:color w:val="000000"/>
-        </w:rPr>
-        <w:t xml:space="preserve">and</w:t>
-      </w:r>
-      <w:r>
-        <w:rPr>
-          <w:color w:val="000000"/>
-        </w:rPr>
-        <w:t xml:space="preserve"> </w:t>
-      </w:r>
-      <w:r>
-        <w:rPr>
-          <w:iCs/>
-          <w:i/>
-          <w:color w:val="000000"/>
-        </w:rPr>
-        <w:t xml:space="preserve">IGF1R</w:t>
-      </w:r>
-      <w:r>
-        <w:rPr>
-          <w:color w:val="000000"/>
-        </w:rPr>
-        <w:t xml:space="preserve"> </w:t>
-      </w:r>
-      <w:r>
-        <w:rPr>
-          <w:color w:val="000000"/>
-        </w:rPr>
-        <w:t xml:space="preserve">interpretation (Supplementary Dataset, MR_original_freq and MR_new_freq), but not every exploratory FinnGen classification (Table S2). For</w:t>
+        <w:t xml:space="preserve">value crossed 0.05 (Supplementary Dataset, MR_original_freq and MR_new_freq). Screen classification changed only in FinnGen GD:</w:t>
       </w:r>
       <w:r>
         <w:rPr>
@@ -4210,104 +3165,7 @@
         <w:rPr>
           <w:color w:val="000000"/>
         </w:rPr>
-        <w:t xml:space="preserve">in FinnGen GD, the MR</w:t>
-      </w:r>
-      <w:r>
-        <w:rPr>
-          <w:color w:val="000000"/>
-        </w:rPr>
-        <w:t xml:space="preserve"> </w:t>
-      </w:r>
-      <w:r>
-        <w:rPr>
-          <w:iCs/>
-          <w:i/>
-          <w:color w:val="000000"/>
-        </w:rPr>
-        <w:t xml:space="preserve">P</w:t>
-      </w:r>
-      <w:r>
-        <w:rPr>
-          <w:color w:val="000000"/>
-        </w:rPr>
-        <w:t xml:space="preserve"> </w:t>
-      </w:r>
-      <w:r>
-        <w:rPr>
-          <w:color w:val="000000"/>
-        </w:rPr>
-        <w:t xml:space="preserve">value changed from 1.10×10</w:t>
-      </w:r>
-      <w:r>
-        <w:rPr>
-          <w:color w:val="000000"/>
-          <w:vertAlign w:val="superscript"/>
-        </w:rPr>
-        <w:t xml:space="preserve">−5</w:t>
-      </w:r>
-      <w:r>
-        <w:rPr>
-          <w:color w:val="000000"/>
-        </w:rPr>
-        <w:t xml:space="preserve"> </w:t>
-      </w:r>
-      <w:r>
-        <w:rPr>
-          <w:color w:val="000000"/>
-        </w:rPr>
-        <w:t xml:space="preserve">to 1.48×10</w:t>
-      </w:r>
-      <w:r>
-        <w:rPr>
-          <w:color w:val="000000"/>
-          <w:vertAlign w:val="superscript"/>
-        </w:rPr>
-        <w:t xml:space="preserve">−4</w:t>
-      </w:r>
-      <w:r>
-        <w:rPr>
-          <w:color w:val="000000"/>
-        </w:rPr>
-        <w:t xml:space="preserve">, crossing the full-screen threshold; both versions had Q-test</w:t>
-      </w:r>
-      <w:r>
-        <w:rPr>
-          <w:color w:val="000000"/>
-        </w:rPr>
-        <w:t xml:space="preserve"> </w:t>
-      </w:r>
-      <w:r>
-        <w:rPr>
-          <w:iCs/>
-          <w:i/>
-          <w:color w:val="000000"/>
-        </w:rPr>
-        <w:t xml:space="preserve">P</w:t>
-      </w:r>
-      <w:r>
-        <w:rPr>
-          <w:color w:val="000000"/>
-        </w:rPr>
-        <w:t xml:space="preserve"> </w:t>
-      </w:r>
-      <w:r>
-        <w:rPr>
-          <w:color w:val="000000"/>
-        </w:rPr>
-        <w:t xml:space="preserve">&lt; 10</w:t>
-      </w:r>
-      <w:r>
-        <w:rPr>
-          <w:color w:val="000000"/>
-          <w:vertAlign w:val="superscript"/>
-        </w:rPr>
-        <w:t xml:space="preserve">−6</w:t>
-      </w:r>
-      <w:r>
-        <w:rPr>
-          <w:color w:val="000000"/>
-        </w:rPr>
-        <w:t xml:space="preserve">. For</w:t>
+        <w:t xml:space="preserve">no longer passed, and</w:t>
       </w:r>
       <w:r>
         <w:rPr>
@@ -4327,52 +3185,39 @@
         <w:rPr>
           <w:color w:val="000000"/>
         </w:rPr>
-        <w:t xml:space="preserve">,</w:t>
-      </w:r>
-      <w:r>
-        <w:rPr>
-          <w:color w:val="000000"/>
-        </w:rPr>
-        <w:t xml:space="preserve"> </w:t>
-      </w:r>
-      <w:r>
-        <w:rPr>
-          <w:iCs/>
-          <w:i/>
-          <w:color w:val="000000"/>
-        </w:rPr>
-        <w:t xml:space="preserve">P</w:t>
-      </w:r>
-      <w:r>
-        <w:rPr>
-          <w:color w:val="000000"/>
-        </w:rPr>
-        <w:t xml:space="preserve"> </w:t>
-      </w:r>
-      <w:r>
-        <w:rPr>
-          <w:color w:val="000000"/>
-        </w:rPr>
-        <w:t xml:space="preserve">changed from 0.107 to 1.72×10</w:t>
-      </w:r>
-      <w:r>
-        <w:rPr>
-          <w:color w:val="000000"/>
-          <w:vertAlign w:val="superscript"/>
-        </w:rPr>
-        <w:t xml:space="preserve">−5</w:t>
-      </w:r>
-      <w:r>
-        <w:rPr>
-          <w:color w:val="000000"/>
-        </w:rPr>
-        <w:t xml:space="preserve"> </w:t>
-      </w:r>
-      <w:r>
-        <w:rPr>
-          <w:color w:val="000000"/>
-        </w:rPr>
-        <w:t xml:space="preserve">as the IVW weight of rs150254595 increased from 21.3% to 58.9%. Omitting this variant left non-significant estimates under either frequency source.</w:t>
+        <w:t xml:space="preserve"> </w:t>
+      </w:r>
+      <w:r>
+        <w:rPr>
+          <w:color w:val="000000"/>
+        </w:rPr>
+        <w:t xml:space="preserve">newly passed; the IVW weight of rs150254595 in its estimate rose from 21.3% to 58.9% (Table S2; Supplementary Dataset, Instrument_weights). Omitting this variant left non-significant</w:t>
+      </w:r>
+      <w:r>
+        <w:rPr>
+          <w:color w:val="000000"/>
+        </w:rPr>
+        <w:t xml:space="preserve"> </w:t>
+      </w:r>
+      <w:r>
+        <w:rPr>
+          <w:iCs/>
+          <w:i/>
+          <w:color w:val="000000"/>
+        </w:rPr>
+        <w:t xml:space="preserve">HLA-G</w:t>
+      </w:r>
+      <w:r>
+        <w:rPr>
+          <w:color w:val="000000"/>
+        </w:rPr>
+        <w:t xml:space="preserve"> </w:t>
+      </w:r>
+      <w:r>
+        <w:rPr>
+          <w:color w:val="000000"/>
+        </w:rPr>
+        <w:t xml:space="preserve">estimates under either frequency source (Supplementary Dataset, LOO_frequency).</w:t>
       </w:r>
     </w:p>
     <w:bookmarkEnd w:id="31"/>
@@ -4394,18 +3239,6 @@
       </w:pPr>
       <w:r>
         <w:rPr>
-          <w:color w:val="000000"/>
-        </w:rPr>
-        <w:t xml:space="preserve">Regional analyses assessed whether expression and disease signals shared a causal variant (Figures 2 and 3; Table S3). For</w:t>
-      </w:r>
-      <w:r>
-        <w:rPr>
-          <w:color w:val="000000"/>
-        </w:rPr>
-        <w:t xml:space="preserve"> </w:t>
-      </w:r>
-      <w:r>
-        <w:rPr>
           <w:iCs/>
           <w:i/>
           <w:color w:val="000000"/>
@@ -4416,33 +3249,13 @@
         <w:rPr>
           <w:color w:val="000000"/>
         </w:rPr>
-        <w:t xml:space="preserve">, PP.H4 was 0.951 in BBJ, 0.986 in FinnGen ophthalmopathy and 0.891 in strict ophthalmopathy under the primary prior. It was lower in UKB (0.226) and FinnGen GD (0.264), where PP.H3 was 0.774 and 0.736, respectively. The latter patterns favored distinct variants under the fitted model despite very small MR</w:t>
-      </w:r>
-      <w:r>
-        <w:rPr>
-          <w:color w:val="000000"/>
-        </w:rPr>
-        <w:t xml:space="preserve"> </w:t>
-      </w:r>
-      <w:r>
-        <w:rPr>
-          <w:iCs/>
-          <w:i/>
-          <w:color w:val="000000"/>
-        </w:rPr>
-        <w:t xml:space="preserve">P</w:t>
-      </w:r>
-      <w:r>
-        <w:rPr>
-          <w:color w:val="000000"/>
-        </w:rPr>
-        <w:t xml:space="preserve"> </w:t>
-      </w:r>
-      <w:r>
-        <w:rPr>
-          <w:color w:val="000000"/>
-        </w:rPr>
-        <w:t xml:space="preserve">values. This discordance persisted in narrower regions and a common five-outcome variant set. The matched analyses retained the regional disease peaks, and all three FinnGen comparisons shared 6,579 variants in the full cis-region. Lowering the shared-variant prior p12 from 10</w:t>
+        <w:t xml:space="preserve"> </w:t>
+      </w:r>
+      <w:r>
+        <w:rPr>
+          <w:color w:val="000000"/>
+        </w:rPr>
+        <w:t xml:space="preserve">PP.H4 (probability of one shared causal variant) was 0.951 in BBJ, 0.986 in FinnGen ophthalmopathy and 0.891 in strict ophthalmopathy, but 0.226 in UKB and 0.264 in FinnGen GD, where PP.H3 (distinct variants) was highest (Table 2; Figures 2 and 3). The UKB and FinnGen GD values were unchanged in narrower regions and in a variant set common to all five datasets, and the matched variants included the strongest regional disease variant in each dataset (Table S3). Lowering the prior probability of a shared variant (p12) from 10</w:t>
       </w:r>
       <w:r>
         <w:rPr>
@@ -4480,7 +3293,7 @@
         <w:rPr>
           <w:color w:val="000000"/>
         </w:rPr>
-        <w:t xml:space="preserve">reduced PP.H4 to 0.875 in FinnGen ophthalmopathy but below 0.80 in BBJ (0.661) and strict ophthalmopathy (0.451).</w:t>
+        <w:t xml:space="preserve">gave PP.H4 of 0.875 in FinnGen ophthalmopathy, 0.661 in BBJ and 0.451 in strict ophthalmopathy.</w:t>
       </w:r>
     </w:p>
     <w:p>
@@ -4505,7 +3318,7 @@
         <w:rPr>
           <w:color w:val="000000"/>
         </w:rPr>
-        <w:t xml:space="preserve">PP.H4 ranged from 0.010 to 0.404 (UKB); elsewhere, expression-only PP.H2 predominated (0.571–0.731), consistent with weak regional disease signals.</w:t>
+        <w:t xml:space="preserve">PP.H4 ranged from 0.010 to 0.404 (UKB); in the other four datasets, PP.H2 (expression signal only) was highest (0.571–0.731).</w:t>
       </w:r>
       <w:r>
         <w:rPr>
@@ -4531,7 +3344,7 @@
         <w:rPr>
           <w:color w:val="000000"/>
         </w:rPr>
-        <w:t xml:space="preserve">PP.H4 was 0.201 in BBJ and 0.254 in FinnGen GD, compared with 0.953 in UKB and 0.978 and 0.979 in the two ophthalmopathy endpoints. Neither</w:t>
+        <w:t xml:space="preserve">PP.H4 was ≥ 0.80 in UKB and both ophthalmopathy endpoints but not in BBJ or FinnGen GD. None of the 24 genes reached PP.H4 ≥ 0.80 in FinnGen GD, and</w:t>
       </w:r>
       <w:r>
         <w:rPr>
@@ -4557,7 +3370,7 @@
         <w:rPr>
           <w:color w:val="000000"/>
         </w:rPr>
-        <w:t xml:space="preserve">nor</w:t>
+        <w:t xml:space="preserve">and</w:t>
       </w:r>
       <w:r>
         <w:rPr>
@@ -4583,7 +3396,53 @@
         <w:rPr>
           <w:color w:val="000000"/>
         </w:rPr>
-        <w:t xml:space="preserve">reached PP.H4 of 0.001 in any dataset. None of the 24 assessed genes reached PP.H4 ≥ 0.80 in FinnGen GD.</w:t>
+        <w:t xml:space="preserve">had PP.H4 &lt; 0.001 in every dataset. Apart from</w:t>
+      </w:r>
+      <w:r>
+        <w:rPr>
+          <w:color w:val="000000"/>
+        </w:rPr>
+        <w:t xml:space="preserve"> </w:t>
+      </w:r>
+      <w:r>
+        <w:rPr>
+          <w:iCs/>
+          <w:i/>
+          <w:color w:val="000000"/>
+        </w:rPr>
+        <w:t xml:space="preserve">TSHR</w:t>
+      </w:r>
+      <w:r>
+        <w:rPr>
+          <w:color w:val="000000"/>
+        </w:rPr>
+        <w:t xml:space="preserve"> </w:t>
+      </w:r>
+      <w:r>
+        <w:rPr>
+          <w:color w:val="000000"/>
+        </w:rPr>
+        <w:t xml:space="preserve">and</w:t>
+      </w:r>
+      <w:r>
+        <w:rPr>
+          <w:color w:val="000000"/>
+        </w:rPr>
+        <w:t xml:space="preserve"> </w:t>
+      </w:r>
+      <w:r>
+        <w:rPr>
+          <w:iCs/>
+          <w:i/>
+          <w:color w:val="000000"/>
+        </w:rPr>
+        <w:t xml:space="preserve">CTLA4</w:t>
+      </w:r>
+      <w:r>
+        <w:rPr>
+          <w:color w:val="000000"/>
+        </w:rPr>
+        <w:t xml:space="preserve">, only</w:t>
       </w:r>
       <w:r>
         <w:rPr>
@@ -4635,93 +3494,7 @@
         <w:rPr>
           <w:color w:val="000000"/>
         </w:rPr>
-        <w:t xml:space="preserve">had strong BBJ support (0.994 and 0.989) but PP.H4 ≤ 0.313 elsewhere. The nine additional FinnGen discoveries and frequency-sensitive</w:t>
-      </w:r>
-      <w:r>
-        <w:rPr>
-          <w:color w:val="000000"/>
-        </w:rPr>
-        <w:t xml:space="preserve"> </w:t>
-      </w:r>
-      <w:r>
-        <w:rPr>
-          <w:iCs/>
-          <w:i/>
-          <w:color w:val="000000"/>
-        </w:rPr>
-        <w:t xml:space="preserve">HLA-G</w:t>
-      </w:r>
-      <w:r>
-        <w:rPr>
-          <w:color w:val="000000"/>
-        </w:rPr>
-        <w:t xml:space="preserve"> </w:t>
-      </w:r>
-      <w:r>
-        <w:rPr>
-          <w:color w:val="000000"/>
-        </w:rPr>
-        <w:t xml:space="preserve">lacked strong support in any dataset. Conditional analysis found the three chromosome 16p11.2 discoveries (</w:t>
-      </w:r>
-      <w:r>
-        <w:rPr>
-          <w:iCs/>
-          <w:i/>
-          <w:color w:val="000000"/>
-        </w:rPr>
-        <w:t xml:space="preserve">HSD3B7</w:t>
-      </w:r>
-      <w:r>
-        <w:rPr>
-          <w:color w:val="000000"/>
-        </w:rPr>
-        <w:t xml:space="preserve">,</w:t>
-      </w:r>
-      <w:r>
-        <w:rPr>
-          <w:color w:val="000000"/>
-        </w:rPr>
-        <w:t xml:space="preserve"> </w:t>
-      </w:r>
-      <w:r>
-        <w:rPr>
-          <w:iCs/>
-          <w:i/>
-          <w:color w:val="000000"/>
-        </w:rPr>
-        <w:t xml:space="preserve">VKORC1</w:t>
-      </w:r>
-      <w:r>
-        <w:rPr>
-          <w:color w:val="000000"/>
-        </w:rPr>
-        <w:t xml:space="preserve"> </w:t>
-      </w:r>
-      <w:r>
-        <w:rPr>
-          <w:color w:val="000000"/>
-        </w:rPr>
-        <w:t xml:space="preserve">and</w:t>
-      </w:r>
-      <w:r>
-        <w:rPr>
-          <w:color w:val="000000"/>
-        </w:rPr>
-        <w:t xml:space="preserve"> </w:t>
-      </w:r>
-      <w:r>
-        <w:rPr>
-          <w:iCs/>
-          <w:i/>
-          <w:color w:val="000000"/>
-        </w:rPr>
-        <w:t xml:space="preserve">PRSS36</w:t>
-      </w:r>
-      <w:r>
-        <w:rPr>
-          <w:color w:val="000000"/>
-        </w:rPr>
-        <w:t xml:space="preserve">) compatible with one regional association (Supplementary Methods).</w:t>
+        <w:t xml:space="preserve">reached PP.H4 ≥ 0.80 in any dataset, both in BBJ only (Figure 3).</w:t>
       </w:r>
     </w:p>
     <w:bookmarkEnd w:id="32"/>
@@ -4745,7 +3518,7 @@
         <w:rPr>
           <w:color w:val="000000"/>
         </w:rPr>
-        <w:t xml:space="preserve">Four of ten gene–tissue combinations provided a qualifying instrument, each retaining one SNP after clumping (F = 32.1–61.1). Higher genetically proxied</w:t>
+        <w:t xml:space="preserve">Four of the ten gene–tissue combinations had a qualifying instrument, each a single SNP:</w:t>
       </w:r>
       <w:r>
         <w:rPr>
@@ -4771,7 +3544,111 @@
         <w:rPr>
           <w:color w:val="000000"/>
         </w:rPr>
-        <w:t xml:space="preserve">expression in subcutaneous and visceral adipose was associated with lower FinnGen GD odds (OR 0.36, 95% CI 0.31–0.43;</w:t>
+        <w:t xml:space="preserve">in subcutaneous and visceral adipose and</w:t>
+      </w:r>
+      <w:r>
+        <w:rPr>
+          <w:color w:val="000000"/>
+        </w:rPr>
+        <w:t xml:space="preserve"> </w:t>
+      </w:r>
+      <w:r>
+        <w:rPr>
+          <w:iCs/>
+          <w:i/>
+          <w:color w:val="000000"/>
+        </w:rPr>
+        <w:t xml:space="preserve">IGF1R</w:t>
+      </w:r>
+      <w:r>
+        <w:rPr>
+          <w:color w:val="000000"/>
+        </w:rPr>
+        <w:t xml:space="preserve"> </w:t>
+      </w:r>
+      <w:r>
+        <w:rPr>
+          <w:color w:val="000000"/>
+        </w:rPr>
+        <w:t xml:space="preserve">in thyroid and cultured fibroblasts. Thus, 20 of the 50 planned comparisons were estimable and 30 were not (Table S4). All ten adipose</w:t>
+      </w:r>
+      <w:r>
+        <w:rPr>
+          <w:color w:val="000000"/>
+        </w:rPr>
+        <w:t xml:space="preserve"> </w:t>
+      </w:r>
+      <w:r>
+        <w:rPr>
+          <w:iCs/>
+          <w:i/>
+          <w:color w:val="000000"/>
+        </w:rPr>
+        <w:t xml:space="preserve">TSHR</w:t>
+      </w:r>
+      <w:r>
+        <w:rPr>
+          <w:color w:val="000000"/>
+        </w:rPr>
+        <w:t xml:space="preserve"> </w:t>
+      </w:r>
+      <w:r>
+        <w:rPr>
+          <w:color w:val="000000"/>
+        </w:rPr>
+        <w:t xml:space="preserve">ORs were below 1, and eight, including both primary FinnGen GD comparisons, passed the multiple-testing threshold of their test family. The adipose instruments, rs12101255 (subcutaneous) and rs74064796 (visceral), lie 50 bp apart in</w:t>
+      </w:r>
+      <w:r>
+        <w:rPr>
+          <w:color w:val="000000"/>
+        </w:rPr>
+        <w:t xml:space="preserve"> </w:t>
+      </w:r>
+      <w:r>
+        <w:rPr>
+          <w:iCs/>
+          <w:i/>
+          <w:color w:val="000000"/>
+        </w:rPr>
+        <w:t xml:space="preserve">TSHR</w:t>
+      </w:r>
+      <w:r>
+        <w:rPr>
+          <w:color w:val="000000"/>
+        </w:rPr>
+        <w:t xml:space="preserve"> </w:t>
+      </w:r>
+      <w:r>
+        <w:rPr>
+          <w:color w:val="000000"/>
+        </w:rPr>
+        <w:t xml:space="preserve">intron 1, about 15 kb from rs179252 (European r² 0.46 for rs12101255), and both are blood</w:t>
+      </w:r>
+      <w:r>
+        <w:rPr>
+          <w:color w:val="000000"/>
+        </w:rPr>
+        <w:t xml:space="preserve"> </w:t>
+      </w:r>
+      <w:r>
+        <w:rPr>
+          <w:iCs/>
+          <w:i/>
+          <w:color w:val="000000"/>
+        </w:rPr>
+        <w:t xml:space="preserve">TSHR</w:t>
+      </w:r>
+      <w:r>
+        <w:rPr>
+          <w:color w:val="000000"/>
+        </w:rPr>
+        <w:t xml:space="preserve"> </w:t>
+      </w:r>
+      <w:r>
+        <w:rPr>
+          <w:color w:val="000000"/>
+        </w:rPr>
+        <w:t xml:space="preserve">eQTLs (eQTLGen</w:t>
       </w:r>
       <w:r>
         <w:rPr>
@@ -4797,7 +3674,7 @@
         <w:rPr>
           <w:color w:val="000000"/>
         </w:rPr>
-        <w:t xml:space="preserve">= 1.28×10</w:t>
+        <w:t xml:space="preserve">= 4.1×10</w:t>
       </w:r>
       <w:r>
         <w:rPr>
@@ -4816,7 +3693,20 @@
         <w:rPr>
           <w:color w:val="000000"/>
         </w:rPr>
-        <w:t xml:space="preserve">and OR 0.50, 95% CI 0.43–0.58;</w:t>
+        <w:t xml:space="preserve">and 6.5×10</w:t>
+      </w:r>
+      <w:r>
+        <w:rPr>
+          <w:color w:val="000000"/>
+          <w:vertAlign w:val="superscript"/>
+        </w:rPr>
+        <w:t xml:space="preserve">−34</w:t>
+      </w:r>
+      <w:r>
+        <w:rPr>
+          <w:color w:val="000000"/>
+        </w:rPr>
+        <w:t xml:space="preserve">). With one instrument, each tissue</w:t>
       </w:r>
       <w:r>
         <w:rPr>
@@ -4842,20 +3732,13 @@
         <w:rPr>
           <w:color w:val="000000"/>
         </w:rPr>
-        <w:t xml:space="preserve">= 4.09×10</w:t>
-      </w:r>
-      <w:r>
-        <w:rPr>
-          <w:color w:val="000000"/>
-          <w:vertAlign w:val="superscript"/>
-        </w:rPr>
-        <w:t xml:space="preserve">−19</w:t>
-      </w:r>
-      <w:r>
-        <w:rPr>
-          <w:color w:val="000000"/>
-        </w:rPr>
-        <w:t xml:space="preserve">, respectively); BBJ and UKB estimates passed correction. Subcutaneous estimates also passed correction in both ophthalmopathy datasets; visceral estimates did not (</w:t>
+        <w:t xml:space="preserve">value equals that variant’s disease-association z-test</w:t>
+      </w:r>
+      <w:r>
+        <w:rPr>
+          <w:color w:val="000000"/>
+        </w:rPr>
+        <w:t xml:space="preserve"> </w:t>
       </w:r>
       <w:r>
         <w:rPr>
@@ -4875,7 +3758,7 @@
         <w:rPr>
           <w:color w:val="000000"/>
         </w:rPr>
-        <w:t xml:space="preserve">= 0.0368 and 0.186). The two</w:t>
+        <w:t xml:space="preserve">value, so the adipose estimates re-express the regional</w:t>
       </w:r>
       <w:r>
         <w:rPr>
@@ -4901,59 +3784,33 @@
         <w:rPr>
           <w:color w:val="000000"/>
         </w:rPr>
-        <w:t xml:space="preserve">instruments, rs12101255 and rs74064796, lie 50 bp apart in</w:t>
-      </w:r>
-      <w:r>
-        <w:rPr>
-          <w:color w:val="000000"/>
-        </w:rPr>
-        <w:t xml:space="preserve"> </w:t>
-      </w:r>
-      <w:r>
-        <w:rPr>
-          <w:iCs/>
-          <w:i/>
-          <w:color w:val="000000"/>
-        </w:rPr>
-        <w:t xml:space="preserve">TSHR</w:t>
-      </w:r>
-      <w:r>
-        <w:rPr>
-          <w:color w:val="000000"/>
-        </w:rPr>
-        <w:t xml:space="preserve"> </w:t>
-      </w:r>
-      <w:r>
-        <w:rPr>
-          <w:color w:val="000000"/>
-        </w:rPr>
-        <w:t xml:space="preserve">intron 1, about 15 kb from rs179252 (European r² 0.46 for rs12101255), and both are themselves blood</w:t>
-      </w:r>
-      <w:r>
-        <w:rPr>
-          <w:color w:val="000000"/>
-        </w:rPr>
-        <w:t xml:space="preserve"> </w:t>
-      </w:r>
-      <w:r>
-        <w:rPr>
-          <w:iCs/>
-          <w:i/>
-          <w:color w:val="000000"/>
-        </w:rPr>
-        <w:t xml:space="preserve">TSHR</w:t>
-      </w:r>
-      <w:r>
-        <w:rPr>
-          <w:color w:val="000000"/>
-        </w:rPr>
-        <w:t xml:space="preserve"> </w:t>
-      </w:r>
-      <w:r>
-        <w:rPr>
-          <w:color w:val="000000"/>
-        </w:rPr>
-        <w:t xml:space="preserve">eQTLs (eQTLGen</w:t>
+        <w:t xml:space="preserve">association. No thyroid or cultured-fibroblast</w:t>
+      </w:r>
+      <w:r>
+        <w:rPr>
+          <w:color w:val="000000"/>
+        </w:rPr>
+        <w:t xml:space="preserve"> </w:t>
+      </w:r>
+      <w:r>
+        <w:rPr>
+          <w:iCs/>
+          <w:i/>
+          <w:color w:val="000000"/>
+        </w:rPr>
+        <w:t xml:space="preserve">IGF1R</w:t>
+      </w:r>
+      <w:r>
+        <w:rPr>
+          <w:color w:val="000000"/>
+        </w:rPr>
+        <w:t xml:space="preserve"> </w:t>
+      </w:r>
+      <w:r>
+        <w:rPr>
+          <w:color w:val="000000"/>
+        </w:rPr>
+        <w:t xml:space="preserve">estimate reached</w:t>
       </w:r>
       <w:r>
         <w:rPr>
@@ -4979,221 +3836,7 @@
         <w:rPr>
           <w:color w:val="000000"/>
         </w:rPr>
-        <w:t xml:space="preserve">= 4.1×10</w:t>
-      </w:r>
-      <w:r>
-        <w:rPr>
-          <w:color w:val="000000"/>
-          <w:vertAlign w:val="superscript"/>
-        </w:rPr>
-        <w:t xml:space="preserve">−34</w:t>
-      </w:r>
-      <w:r>
-        <w:rPr>
-          <w:color w:val="000000"/>
-        </w:rPr>
-        <w:t xml:space="preserve"> </w:t>
-      </w:r>
-      <w:r>
-        <w:rPr>
-          <w:color w:val="000000"/>
-        </w:rPr>
-        <w:t xml:space="preserve">and 6.5×10</w:t>
-      </w:r>
-      <w:r>
-        <w:rPr>
-          <w:color w:val="000000"/>
-          <w:vertAlign w:val="superscript"/>
-        </w:rPr>
-        <w:t xml:space="preserve">−34</w:t>
-      </w:r>
-      <w:r>
-        <w:rPr>
-          <w:color w:val="000000"/>
-        </w:rPr>
-        <w:t xml:space="preserve">). With one instrument, each tissue</w:t>
-      </w:r>
-      <w:r>
-        <w:rPr>
-          <w:color w:val="000000"/>
-        </w:rPr>
-        <w:t xml:space="preserve"> </w:t>
-      </w:r>
-      <w:r>
-        <w:rPr>
-          <w:iCs/>
-          <w:i/>
-          <w:color w:val="000000"/>
-        </w:rPr>
-        <w:t xml:space="preserve">P</w:t>
-      </w:r>
-      <w:r>
-        <w:rPr>
-          <w:color w:val="000000"/>
-        </w:rPr>
-        <w:t xml:space="preserve"> </w:t>
-      </w:r>
-      <w:r>
-        <w:rPr>
-          <w:color w:val="000000"/>
-        </w:rPr>
-        <w:t xml:space="preserve">value equals that variant’s disease-association z-test</w:t>
-      </w:r>
-      <w:r>
-        <w:rPr>
-          <w:color w:val="000000"/>
-        </w:rPr>
-        <w:t xml:space="preserve"> </w:t>
-      </w:r>
-      <w:r>
-        <w:rPr>
-          <w:iCs/>
-          <w:i/>
-          <w:color w:val="000000"/>
-        </w:rPr>
-        <w:t xml:space="preserve">P</w:t>
-      </w:r>
-      <w:r>
-        <w:rPr>
-          <w:color w:val="000000"/>
-        </w:rPr>
-        <w:t xml:space="preserve"> </w:t>
-      </w:r>
-      <w:r>
-        <w:rPr>
-          <w:color w:val="000000"/>
-        </w:rPr>
-        <w:t xml:space="preserve">value, so these estimates re-express the regional</w:t>
-      </w:r>
-      <w:r>
-        <w:rPr>
-          <w:color w:val="000000"/>
-        </w:rPr>
-        <w:t xml:space="preserve"> </w:t>
-      </w:r>
-      <w:r>
-        <w:rPr>
-          <w:iCs/>
-          <w:i/>
-          <w:color w:val="000000"/>
-        </w:rPr>
-        <w:t xml:space="preserve">TSHR</w:t>
-      </w:r>
-      <w:r>
-        <w:rPr>
-          <w:color w:val="000000"/>
-        </w:rPr>
-        <w:t xml:space="preserve"> </w:t>
-      </w:r>
-      <w:r>
-        <w:rPr>
-          <w:color w:val="000000"/>
-        </w:rPr>
-        <w:t xml:space="preserve">association rather than providing independent evidence. Neither thyroid nor cultured-fibroblast</w:t>
-      </w:r>
-      <w:r>
-        <w:rPr>
-          <w:color w:val="000000"/>
-        </w:rPr>
-        <w:t xml:space="preserve"> </w:t>
-      </w:r>
-      <w:r>
-        <w:rPr>
-          <w:iCs/>
-          <w:i/>
-          <w:color w:val="000000"/>
-        </w:rPr>
-        <w:t xml:space="preserve">IGF1R</w:t>
-      </w:r>
-      <w:r>
-        <w:rPr>
-          <w:color w:val="000000"/>
-        </w:rPr>
-        <w:t xml:space="preserve"> </w:t>
-      </w:r>
-      <w:r>
-        <w:rPr>
-          <w:color w:val="000000"/>
-        </w:rPr>
-        <w:t xml:space="preserve">estimates reached</w:t>
-      </w:r>
-      <w:r>
-        <w:rPr>
-          <w:color w:val="000000"/>
-        </w:rPr>
-        <w:t xml:space="preserve"> </w:t>
-      </w:r>
-      <w:r>
-        <w:rPr>
-          <w:iCs/>
-          <w:i/>
-          <w:color w:val="000000"/>
-        </w:rPr>
-        <w:t xml:space="preserve">P</w:t>
-      </w:r>
-      <w:r>
-        <w:rPr>
-          <w:color w:val="000000"/>
-        </w:rPr>
-        <w:t xml:space="preserve"> </w:t>
-      </w:r>
-      <w:r>
-        <w:rPr>
-          <w:color w:val="000000"/>
-        </w:rPr>
-        <w:t xml:space="preserve">&lt; 0.05 in any dataset. Their FinnGen GD estimates were OR 0.76 (thyroid; 95% CI 0.56–1.02;</w:t>
-      </w:r>
-      <w:r>
-        <w:rPr>
-          <w:color w:val="000000"/>
-        </w:rPr>
-        <w:t xml:space="preserve"> </w:t>
-      </w:r>
-      <w:r>
-        <w:rPr>
-          <w:iCs/>
-          <w:i/>
-          <w:color w:val="000000"/>
-        </w:rPr>
-        <w:t xml:space="preserve">P</w:t>
-      </w:r>
-      <w:r>
-        <w:rPr>
-          <w:color w:val="000000"/>
-        </w:rPr>
-        <w:t xml:space="preserve"> </w:t>
-      </w:r>
-      <w:r>
-        <w:rPr>
-          <w:color w:val="000000"/>
-        </w:rPr>
-        <w:t xml:space="preserve">= 0.0692) and OR 1.11 (fibroblasts; 95% CI 0.89–1.38;</w:t>
-      </w:r>
-      <w:r>
-        <w:rPr>
-          <w:color w:val="000000"/>
-        </w:rPr>
-        <w:t xml:space="preserve"> </w:t>
-      </w:r>
-      <w:r>
-        <w:rPr>
-          <w:iCs/>
-          <w:i/>
-          <w:color w:val="000000"/>
-        </w:rPr>
-        <w:t xml:space="preserve">P</w:t>
-      </w:r>
-      <w:r>
-        <w:rPr>
-          <w:color w:val="000000"/>
-        </w:rPr>
-        <w:t xml:space="preserve"> </w:t>
-      </w:r>
-      <w:r>
-        <w:rPr>
-          <w:color w:val="000000"/>
-        </w:rPr>
-        <w:t xml:space="preserve">= 0.359); directions were inconsistent across datasets. All 20 estimates and 30 unestimable comparisons are reported (Table S4; Supplementary Dataset, Tissue_extension).</w:t>
+        <w:t xml:space="preserve">&lt; 0.05, and directions were inconsistent across datasets.</w:t>
       </w:r>
     </w:p>
     <w:bookmarkEnd w:id="33"/>
@@ -5289,7 +3932,7 @@
         <w:rPr>
           <w:color w:val="000000"/>
         </w:rPr>
-        <w:t xml:space="preserve">transcript levels in four patients with inactive TED exceeded those in the single control (Figure S1). With one control from a different fat depot and no significance testing, these observations do not establish differential expression or explain the genetic associations.</w:t>
+        <w:t xml:space="preserve">transcript levels in four patients with inactive TED exceeded those in the single control, whose sample came from a different fat depot; no significance testing was performed (Figure S1).</w:t>
       </w:r>
     </w:p>
     <w:bookmarkEnd w:id="34"/>

</xml_diff>

<commit_message>
Rewrite the Discussion to the approved outline
Author-approved step 3: the Discussion, Limitations and Conclusions were
rewritten to the outline approved on 18 October (findings-only Conclusions
without numbers). Two references were added after reading them in PubMed:
Zuber 2022 (MR estimates without colocalization; abstract) and Douglas 2024
(randomized trial in long-duration, low-activity TED; proptosis). Old
references 29-33 were renumbered; 35 references are cited in first-citation
order and the audit's reference-count guard is updated to 35.

Discussion 1,427 -> 1,162 words; main text 3,948 of 5,000 with sub-headings.

Co-Authored-By: Claude Opus 5.5 <noreply@anthropic.com>
Claude-Session: https://claude.ai/code/session_01TiAKffYKtUstdRZFkwtJA9
</commit_message>
<xml_diff>
--- a/submission/candidate_20261011_review/Manuscript.docx
+++ b/submission/candidate_20261011_review/Manuscript.docx
@@ -3983,7 +3983,7 @@
         <w:rPr>
           <w:color w:val="000000"/>
         </w:rPr>
-        <w:t xml:space="preserve">expression was associated with lower GD odds in BBJ and FinnGen GD, with concordant directions for UKB hyperthyroidism and both ophthalmopathy endpoints. All</w:t>
+        <w:t xml:space="preserve">expression was associated with lower GD odds in BBJ and FinnGen GD, with concordant directions for UKB hyperthyroidism and both ophthalmopathy endpoints. All five</w:t>
       </w:r>
       <w:r>
         <w:rPr>
@@ -4009,7 +4009,192 @@
         <w:rPr>
           <w:color w:val="000000"/>
         </w:rPr>
-        <w:t xml:space="preserve">ORs exceeded 1, but only the BBJ and UKB estimates reached uncorrected</w:t>
+        <w:t xml:space="preserve">ORs exceeded 1, but only BBJ and UKB were nominally significant, none passed the screen threshold, and FinnGen GD, the most precise, lay close to the null. Under the primary prior, colocalization favored a shared</w:t>
+      </w:r>
+      <w:r>
+        <w:rPr>
+          <w:color w:val="000000"/>
+        </w:rPr>
+        <w:t xml:space="preserve"> </w:t>
+      </w:r>
+      <w:r>
+        <w:rPr>
+          <w:iCs/>
+          <w:i/>
+          <w:color w:val="000000"/>
+        </w:rPr>
+        <w:t xml:space="preserve">TSHR</w:t>
+      </w:r>
+      <w:r>
+        <w:rPr>
+          <w:color w:val="000000"/>
+        </w:rPr>
+        <w:t xml:space="preserve"> </w:t>
+      </w:r>
+      <w:r>
+        <w:rPr>
+          <w:color w:val="000000"/>
+        </w:rPr>
+        <w:t xml:space="preserve">variant except in UKB and FinnGen GD. Significance for one gene but not the other is not a formal test of different effects.</w:t>
+      </w:r>
+    </w:p>
+    <w:p>
+      <w:pPr>
+        <w:pStyle w:val="BodyText"/>
+      </w:pPr>
+      <w:r>
+        <w:rPr>
+          <w:color w:val="000000"/>
+        </w:rPr>
+        <w:t xml:space="preserve">Ji and colleagues linked blood</w:t>
+      </w:r>
+      <w:r>
+        <w:rPr>
+          <w:color w:val="000000"/>
+        </w:rPr>
+        <w:t xml:space="preserve"> </w:t>
+      </w:r>
+      <w:r>
+        <w:rPr>
+          <w:iCs/>
+          <w:i/>
+          <w:color w:val="000000"/>
+        </w:rPr>
+        <w:t xml:space="preserve">TSHR</w:t>
+      </w:r>
+      <w:r>
+        <w:rPr>
+          <w:color w:val="000000"/>
+        </w:rPr>
+        <w:t xml:space="preserve"> </w:t>
+      </w:r>
+      <w:r>
+        <w:rPr>
+          <w:color w:val="000000"/>
+        </w:rPr>
+        <w:t xml:space="preserve">expression to GD and strict ophthalmopathy in an earlier FinnGen release [9], and integrative work also investigated</w:t>
+      </w:r>
+      <w:r>
+        <w:rPr>
+          <w:color w:val="000000"/>
+        </w:rPr>
+        <w:t xml:space="preserve"> </w:t>
+      </w:r>
+      <w:r>
+        <w:rPr>
+          <w:iCs/>
+          <w:i/>
+          <w:color w:val="000000"/>
+        </w:rPr>
+        <w:t xml:space="preserve">TSHR</w:t>
+      </w:r>
+      <w:r>
+        <w:rPr>
+          <w:color w:val="000000"/>
+        </w:rPr>
+        <w:t xml:space="preserve"> </w:t>
+      </w:r>
+      <w:r>
+        <w:rPr>
+          <w:color w:val="000000"/>
+        </w:rPr>
+        <w:t xml:space="preserve">[11]. We add an</w:t>
+      </w:r>
+      <w:r>
+        <w:rPr>
+          <w:color w:val="000000"/>
+        </w:rPr>
+        <w:t xml:space="preserve"> </w:t>
+      </w:r>
+      <w:r>
+        <w:rPr>
+          <w:iCs/>
+          <w:i/>
+          <w:color w:val="000000"/>
+        </w:rPr>
+        <w:t xml:space="preserve">IGF1R</w:t>
+      </w:r>
+      <w:r>
+        <w:rPr>
+          <w:color w:val="000000"/>
+        </w:rPr>
+        <w:t xml:space="preserve"> </w:t>
+      </w:r>
+      <w:r>
+        <w:rPr>
+          <w:color w:val="000000"/>
+        </w:rPr>
+        <w:t xml:space="preserve">comparison, GD in two populations and a druggable-gene screen. Both studies used eQTLGen and FinnGen, so agreement is not fully independent. Ji and colleagues accepted PP.H4 above 0.50 [9], whereas we used PP.H4 ≥ 0.80 with p12 = 10</w:t>
+      </w:r>
+      <w:r>
+        <w:rPr>
+          <w:color w:val="000000"/>
+          <w:vertAlign w:val="superscript"/>
+        </w:rPr>
+        <w:t xml:space="preserve">−5</w:t>
+      </w:r>
+      <w:r>
+        <w:rPr>
+          <w:color w:val="000000"/>
+        </w:rPr>
+        <w:t xml:space="preserve">; with different methods and releases, the labels are not directly comparable and differences are not contradictions.</w:t>
+      </w:r>
+    </w:p>
+    <w:p>
+      <w:pPr>
+        <w:pStyle w:val="BodyText"/>
+      </w:pPr>
+      <w:r>
+        <w:rPr>
+          <w:color w:val="000000"/>
+        </w:rPr>
+        <w:t xml:space="preserve">The multi-instrument FinnGen and UKB</w:t>
+      </w:r>
+      <w:r>
+        <w:rPr>
+          <w:color w:val="000000"/>
+        </w:rPr>
+        <w:t xml:space="preserve"> </w:t>
+      </w:r>
+      <w:r>
+        <w:rPr>
+          <w:iCs/>
+          <w:i/>
+          <w:color w:val="000000"/>
+        </w:rPr>
+        <w:t xml:space="preserve">CTLA4</w:t>
+      </w:r>
+      <w:r>
+        <w:rPr>
+          <w:color w:val="000000"/>
+        </w:rPr>
+        <w:t xml:space="preserve"> </w:t>
+      </w:r>
+      <w:r>
+        <w:rPr>
+          <w:color w:val="000000"/>
+        </w:rPr>
+        <w:t xml:space="preserve">estimates relied heavily on rs13030124; with that caveat, its direction-consistent associations across all five datasets support it as an autoimmune comparator [26].</w:t>
+      </w:r>
+      <w:r>
+        <w:rPr>
+          <w:color w:val="000000"/>
+        </w:rPr>
+        <w:t xml:space="preserve"> </w:t>
+      </w:r>
+      <w:r>
+        <w:rPr>
+          <w:iCs/>
+          <w:i/>
+          <w:color w:val="000000"/>
+        </w:rPr>
+        <w:t xml:space="preserve">HLA-A</w:t>
+      </w:r>
+      <w:r>
+        <w:rPr>
+          <w:color w:val="000000"/>
+        </w:rPr>
+        <w:t xml:space="preserve">, the strongest BBJ association, was non-significant in FinnGen GD, so the smallest discovery</w:t>
       </w:r>
       <w:r>
         <w:rPr>
@@ -4035,7 +4220,142 @@
         <w:rPr>
           <w:color w:val="000000"/>
         </w:rPr>
-        <w:t xml:space="preserve">&lt; 0.05, none met the discovery threshold, and the most precise estimate lay close to the null. Under the primary prior, colocalization supported a shared variant for</w:t>
+        <w:t xml:space="preserve">value need not transfer best.</w:t>
+      </w:r>
+      <w:r>
+        <w:rPr>
+          <w:color w:val="000000"/>
+        </w:rPr>
+        <w:t xml:space="preserve"> </w:t>
+      </w:r>
+      <w:r>
+        <w:rPr>
+          <w:iCs/>
+          <w:i/>
+          <w:color w:val="000000"/>
+        </w:rPr>
+        <w:t xml:space="preserve">HLA-DQA2</w:t>
+      </w:r>
+      <w:r>
+        <w:rPr>
+          <w:color w:val="000000"/>
+        </w:rPr>
+        <w:t xml:space="preserve"> </w:t>
+      </w:r>
+      <w:r>
+        <w:rPr>
+          <w:color w:val="000000"/>
+        </w:rPr>
+        <w:t xml:space="preserve">was discordant only in its one two-instrument estimate, UKB, whose instruments were strongly heterogeneous (Supplementary Dataset, MR_estimators_original). With shared instruments, MHC linkage, single-variant dependence of the FinnGen GD</w:t>
+      </w:r>
+      <w:r>
+        <w:rPr>
+          <w:color w:val="000000"/>
+        </w:rPr>
+        <w:t xml:space="preserve"> </w:t>
+      </w:r>
+      <w:r>
+        <w:rPr>
+          <w:iCs/>
+          <w:i/>
+          <w:color w:val="000000"/>
+        </w:rPr>
+        <w:t xml:space="preserve">TUBB</w:t>
+      </w:r>
+      <w:r>
+        <w:rPr>
+          <w:color w:val="000000"/>
+        </w:rPr>
+        <w:t xml:space="preserve"> </w:t>
+      </w:r>
+      <w:r>
+        <w:rPr>
+          <w:color w:val="000000"/>
+        </w:rPr>
+        <w:t xml:space="preserve">and</w:t>
+      </w:r>
+      <w:r>
+        <w:rPr>
+          <w:color w:val="000000"/>
+        </w:rPr>
+        <w:t xml:space="preserve"> </w:t>
+      </w:r>
+      <w:r>
+        <w:rPr>
+          <w:iCs/>
+          <w:i/>
+          <w:color w:val="000000"/>
+        </w:rPr>
+        <w:t xml:space="preserve">C4A</w:t>
+      </w:r>
+      <w:r>
+        <w:rPr>
+          <w:color w:val="000000"/>
+        </w:rPr>
+        <w:t xml:space="preserve"> </w:t>
+      </w:r>
+      <w:r>
+        <w:rPr>
+          <w:color w:val="000000"/>
+        </w:rPr>
+        <w:t xml:space="preserve">estimates, one regional association behind the three chromosome 16p11.2 genes, and no shared-variant support for</w:t>
+      </w:r>
+      <w:r>
+        <w:rPr>
+          <w:color w:val="000000"/>
+        </w:rPr>
+        <w:t xml:space="preserve"> </w:t>
+      </w:r>
+      <w:r>
+        <w:rPr>
+          <w:iCs/>
+          <w:i/>
+          <w:color w:val="000000"/>
+        </w:rPr>
+        <w:t xml:space="preserve">HLA-DQA2</w:t>
+      </w:r>
+      <w:r>
+        <w:rPr>
+          <w:color w:val="000000"/>
+        </w:rPr>
+        <w:t xml:space="preserve"> </w:t>
+      </w:r>
+      <w:r>
+        <w:rPr>
+          <w:color w:val="000000"/>
+        </w:rPr>
+        <w:t xml:space="preserve">or</w:t>
+      </w:r>
+      <w:r>
+        <w:rPr>
+          <w:color w:val="000000"/>
+        </w:rPr>
+        <w:t xml:space="preserve"> </w:t>
+      </w:r>
+      <w:r>
+        <w:rPr>
+          <w:iCs/>
+          <w:i/>
+          <w:color w:val="000000"/>
+        </w:rPr>
+        <w:t xml:space="preserve">TUBB</w:t>
+      </w:r>
+      <w:r>
+        <w:rPr>
+          <w:color w:val="000000"/>
+        </w:rPr>
+        <w:t xml:space="preserve">, these associations cannot each be counted as an independent causal target.</w:t>
+      </w:r>
+    </w:p>
+    <w:p>
+      <w:pPr>
+        <w:pStyle w:val="BodyText"/>
+      </w:pPr>
+      <w:r>
+        <w:rPr>
+          <w:color w:val="000000"/>
+        </w:rPr>
+        <w:t xml:space="preserve">The lower-odds direction need not contradict stimulating-antibody pathogenesis: blood transcript abundance, tissue expression and receptor activation are different exposures with tissue-dependent regulatory effects [25]. The expression-increasing rs179252-G allele is linked to rs179247-G, the GD-protective allele associated with greater intrathymic</w:t>
       </w:r>
       <w:r>
         <w:rPr>
@@ -4061,7 +4381,33 @@
         <w:rPr>
           <w:color w:val="000000"/>
         </w:rPr>
-        <w:t xml:space="preserve">in BBJ and both ophthalmopathy endpoints but favored distinct variants in UKB and FinnGen GD. These results do not establish a difference in biological importance between the receptors, and statistical significance in one gene but not another is not a formal test of different effects.</w:t>
+        <w:t xml:space="preserve">transcription [27, 28]; this fits central tolerance, though the thymic step was untested and neither variant is a proven causal regulator. Each rs179252-G allele raises blood expression by 0.105 standard deviation, and its per-allele disease ORs were 0.80 (BBJ), 0.77 (UKB), 0.78 (FinnGen ophthalmopathy), 0.77 (FinnGen GD) and 0.82 (strict ophthalmopathy); rescaled to one standard deviation, these moderate effects give the reported odds ratios, which describe lifelong inherited differences, not raised</w:t>
+      </w:r>
+      <w:r>
+        <w:rPr>
+          <w:color w:val="000000"/>
+        </w:rPr>
+        <w:t xml:space="preserve"> </w:t>
+      </w:r>
+      <w:r>
+        <w:rPr>
+          <w:iCs/>
+          <w:i/>
+          <w:color w:val="000000"/>
+        </w:rPr>
+        <w:t xml:space="preserve">TSHR</w:t>
+      </w:r>
+      <w:r>
+        <w:rPr>
+          <w:color w:val="000000"/>
+        </w:rPr>
+        <w:t xml:space="preserve"> </w:t>
+      </w:r>
+      <w:r>
+        <w:rPr>
+          <w:color w:val="000000"/>
+        </w:rPr>
+        <w:t xml:space="preserve">expression or TSHR-directed treatment.</w:t>
       </w:r>
     </w:p>
     <w:p>
@@ -4072,7 +4418,7 @@
         <w:rPr>
           <w:color w:val="000000"/>
         </w:rPr>
-        <w:t xml:space="preserve">Our findings extend an existing body of genetic evidence. Ji and colleagues had already linked blood</w:t>
+        <w:t xml:space="preserve">Very small</w:t>
       </w:r>
       <w:r>
         <w:rPr>
@@ -4098,7 +4444,59 @@
         <w:rPr>
           <w:color w:val="000000"/>
         </w:rPr>
-        <w:t xml:space="preserve">expression to GD and strict ophthalmopathy in an earlier FinnGen release [9]; recent integrative work has also investigated</w:t>
+        <w:t xml:space="preserve">MR</w:t>
+      </w:r>
+      <w:r>
+        <w:rPr>
+          <w:color w:val="000000"/>
+        </w:rPr>
+        <w:t xml:space="preserve"> </w:t>
+      </w:r>
+      <w:r>
+        <w:rPr>
+          <w:iCs/>
+          <w:i/>
+          <w:color w:val="000000"/>
+        </w:rPr>
+        <w:t xml:space="preserve">P</w:t>
+      </w:r>
+      <w:r>
+        <w:rPr>
+          <w:color w:val="000000"/>
+        </w:rPr>
+        <w:t xml:space="preserve"> </w:t>
+      </w:r>
+      <w:r>
+        <w:rPr>
+          <w:color w:val="000000"/>
+        </w:rPr>
+        <w:t xml:space="preserve">values in UKB and FinnGen GD coexisted with distinct-variant patterns, as for</w:t>
+      </w:r>
+      <w:r>
+        <w:rPr>
+          <w:color w:val="000000"/>
+        </w:rPr>
+        <w:t xml:space="preserve"> </w:t>
+      </w:r>
+      <w:r>
+        <w:rPr>
+          <w:iCs/>
+          <w:i/>
+          <w:color w:val="000000"/>
+        </w:rPr>
+        <w:t xml:space="preserve">CTLA4</w:t>
+      </w:r>
+      <w:r>
+        <w:rPr>
+          <w:color w:val="000000"/>
+        </w:rPr>
+        <w:t xml:space="preserve"> </w:t>
+      </w:r>
+      <w:r>
+        <w:rPr>
+          <w:color w:val="000000"/>
+        </w:rPr>
+        <w:t xml:space="preserve">in BBJ and FinnGen GD, so association strength and shared-variant evidence are not interchangeable: a non-zero MR estimate can arise from distinct but correlated variants [29]. These two datasets had the most cases, and their strongest regional disease variant was more strongly associated than rs179252 (Table S3); regional checks excluded a missing-peak explanation but did not identify the causal variant. Support in BBJ and strict ophthalmopathy fell below 0.80 only at the lowest prior tested (Figure 3B). The adipose instruments are themselves blood</w:t>
       </w:r>
       <w:r>
         <w:rPr>
@@ -4124,7 +4522,29 @@
         <w:rPr>
           <w:color w:val="000000"/>
         </w:rPr>
-        <w:t xml:space="preserve">in GD and ophthalmopathy [11]. We add a focused comparison with</w:t>
+        <w:t xml:space="preserve">eQTLs, so their estimates re-express the regional association and cannot resolve the pattern or establish an adipose mechanism. These data establish association, not expression-mediated causality.</w:t>
+      </w:r>
+    </w:p>
+    <w:p>
+      <w:pPr>
+        <w:pStyle w:val="BodyText"/>
+      </w:pPr>
+      <w:r>
+        <w:rPr>
+          <w:color w:val="000000"/>
+        </w:rPr>
+        <w:t xml:space="preserve">In mice, the shed TSHR A-subunit induced more thyroid-stimulating autoimmunity than a minimally cleaving receptor [30]; plasmid immunization reproduced orbital adipogenesis, fibrosis and muscle pathology [31], and orbital fibroblasts from immunized mice showed enhanced inflammatory and hyaluronan responses to TNFα [32]. Ophthalmopathy also occurs in euthyroid and hypothyroid patients [33]. Our instruments measure neither receptor cleavage nor antibody activity. Because most patients with TED have GD, the controls included people with GD but no recorded eye disease, and the ophthalmopathy per-allele ORs resembled those for GD (Table S3), these estimates may mostly reflect GD susceptibility; their higher PP.H4 values, from the two smallest, weakest-signal datasets, do not establish a TED-specific effect.</w:t>
+      </w:r>
+    </w:p>
+    <w:p>
+      <w:pPr>
+        <w:pStyle w:val="BodyText"/>
+      </w:pPr>
+      <w:r>
+        <w:rPr>
+          <w:color w:val="000000"/>
+        </w:rPr>
+        <w:t xml:space="preserve">For</w:t>
       </w:r>
       <w:r>
         <w:rPr>
@@ -4144,7 +4564,33 @@
         <w:rPr>
           <w:color w:val="000000"/>
         </w:rPr>
-        <w:t xml:space="preserve">, a GD comparison spanning BBJ and FinnGen, and an assessment of both genes alongside the wider druggable-gene screen. Because Ji and colleagues also used eQTLGen and FinnGen, agreement is not wholly independent replication. Different MR methods, FinnGen releases and colocalization settings also preclude interpreting differences between reports as direct contradictions.</w:t>
+        <w:t xml:space="preserve">, blood expression-related evidence was limited: colocalization mostly favored an expression-only signal, consistent with weak regional disease signals, and some single-variant omissions removed nominal significance, though most left ORs close to the full estimates (Figure S2). The near-null FinnGen GD estimate argues against large, but not modest, effects; non-significance is not evidence of no inherited role. Single-instrument tissue estimates and absent orbital eQTL data leave tissue effects open. Weaker genetic evidence for</w:t>
+      </w:r>
+      <w:r>
+        <w:rPr>
+          <w:color w:val="000000"/>
+        </w:rPr>
+        <w:t xml:space="preserve"> </w:t>
+      </w:r>
+      <w:r>
+        <w:rPr>
+          <w:iCs/>
+          <w:i/>
+          <w:color w:val="000000"/>
+        </w:rPr>
+        <w:t xml:space="preserve">IGF1R</w:t>
+      </w:r>
+      <w:r>
+        <w:rPr>
+          <w:color w:val="000000"/>
+        </w:rPr>
+        <w:t xml:space="preserve"> </w:t>
+      </w:r>
+      <w:r>
+        <w:rPr>
+          <w:color w:val="000000"/>
+        </w:rPr>
+        <w:t xml:space="preserve">does not argue against IGF-1R blockade: teprotumumab reduced proptosis in a randomized trial in active TED [3] and in long-duration, low-activity TED [34], and TSHR–IGF-1R crosstalk [5] concerns receptor signaling, not inherited susceptibility.</w:t>
       </w:r>
     </w:p>
     <w:p>
@@ -4155,223 +4601,82 @@
         <w:rPr>
           <w:color w:val="000000"/>
         </w:rPr>
-        <w:t xml:space="preserve">Among the other associated genes, the multi-instrument FinnGen and UKB</w:t>
-      </w:r>
-      <w:r>
-        <w:rPr>
-          <w:color w:val="000000"/>
-        </w:rPr>
-        <w:t xml:space="preserve"> </w:t>
-      </w:r>
-      <w:r>
-        <w:rPr>
-          <w:iCs/>
-          <w:i/>
-          <w:color w:val="000000"/>
-        </w:rPr>
-        <w:t xml:space="preserve">CTLA4</w:t>
-      </w:r>
-      <w:r>
-        <w:rPr>
-          <w:color w:val="000000"/>
-        </w:rPr>
-        <w:t xml:space="preserve"> </w:t>
-      </w:r>
-      <w:r>
-        <w:rPr>
-          <w:color w:val="000000"/>
-        </w:rPr>
-        <w:t xml:space="preserve">estimates relied heavily on rs13030124; with that caveat,</w:t>
-      </w:r>
-      <w:r>
-        <w:rPr>
-          <w:color w:val="000000"/>
-        </w:rPr>
-        <w:t xml:space="preserve"> </w:t>
-      </w:r>
-      <w:r>
-        <w:rPr>
-          <w:iCs/>
-          <w:i/>
-          <w:color w:val="000000"/>
-        </w:rPr>
-        <w:t xml:space="preserve">CTLA4</w:t>
-      </w:r>
-      <w:r>
-        <w:rPr>
-          <w:color w:val="000000"/>
-        </w:rPr>
-        <w:t xml:space="preserve">’s direction-consistent associations across all five outcomes support its use as an autoimmune comparator [26].</w:t>
-      </w:r>
-      <w:r>
-        <w:rPr>
-          <w:color w:val="000000"/>
-        </w:rPr>
-        <w:t xml:space="preserve"> </w:t>
-      </w:r>
-      <w:r>
-        <w:rPr>
-          <w:iCs/>
-          <w:i/>
-          <w:color w:val="000000"/>
-        </w:rPr>
-        <w:t xml:space="preserve">HLA-DQA2</w:t>
-      </w:r>
-      <w:r>
-        <w:rPr>
-          <w:color w:val="000000"/>
-        </w:rPr>
-        <w:t xml:space="preserve"> </w:t>
-      </w:r>
-      <w:r>
-        <w:rPr>
-          <w:color w:val="000000"/>
-        </w:rPr>
-        <w:t xml:space="preserve">was discordant only in UKB, where its two instruments disagreed, while FinnGen GD</w:t>
-      </w:r>
-      <w:r>
-        <w:rPr>
-          <w:color w:val="000000"/>
-        </w:rPr>
-        <w:t xml:space="preserve"> </w:t>
-      </w:r>
-      <w:r>
-        <w:rPr>
-          <w:iCs/>
-          <w:i/>
-          <w:color w:val="000000"/>
-        </w:rPr>
-        <w:t xml:space="preserve">TUBB</w:t>
-      </w:r>
-      <w:r>
-        <w:rPr>
-          <w:color w:val="000000"/>
-        </w:rPr>
-        <w:t xml:space="preserve"> </w:t>
-      </w:r>
-      <w:r>
-        <w:rPr>
-          <w:color w:val="000000"/>
-        </w:rPr>
-        <w:t xml:space="preserve">and</w:t>
-      </w:r>
-      <w:r>
-        <w:rPr>
-          <w:color w:val="000000"/>
-        </w:rPr>
-        <w:t xml:space="preserve"> </w:t>
-      </w:r>
-      <w:r>
-        <w:rPr>
-          <w:iCs/>
-          <w:i/>
-          <w:color w:val="000000"/>
-        </w:rPr>
-        <w:t xml:space="preserve">C4A</w:t>
-      </w:r>
-      <w:r>
-        <w:rPr>
-          <w:color w:val="000000"/>
-        </w:rPr>
-        <w:t xml:space="preserve"> </w:t>
-      </w:r>
-      <w:r>
-        <w:rPr>
-          <w:color w:val="000000"/>
-        </w:rPr>
-        <w:t xml:space="preserve">estimates each depended largely on one variant. The strongest BBJ association,</w:t>
-      </w:r>
-      <w:r>
-        <w:rPr>
-          <w:color w:val="000000"/>
-        </w:rPr>
-        <w:t xml:space="preserve"> </w:t>
-      </w:r>
-      <w:r>
-        <w:rPr>
-          <w:iCs/>
-          <w:i/>
-          <w:color w:val="000000"/>
-        </w:rPr>
-        <w:t xml:space="preserve">HLA-A</w:t>
-      </w:r>
-      <w:r>
-        <w:rPr>
-          <w:color w:val="000000"/>
-        </w:rPr>
-        <w:t xml:space="preserve">, did not persist in FinnGen GD, so the smallest discovery</w:t>
-      </w:r>
-      <w:r>
-        <w:rPr>
-          <w:color w:val="000000"/>
-        </w:rPr>
-        <w:t xml:space="preserve"> </w:t>
-      </w:r>
-      <w:r>
-        <w:rPr>
-          <w:iCs/>
-          <w:i/>
-          <w:color w:val="000000"/>
-        </w:rPr>
-        <w:t xml:space="preserve">P</w:t>
-      </w:r>
-      <w:r>
-        <w:rPr>
-          <w:color w:val="000000"/>
-        </w:rPr>
-        <w:t xml:space="preserve"> </w:t>
-      </w:r>
-      <w:r>
-        <w:rPr>
-          <w:color w:val="000000"/>
-        </w:rPr>
-        <w:t xml:space="preserve">value need not identify the most transferable association. Shared instruments, complex MHC linkage and, for</w:t>
-      </w:r>
-      <w:r>
-        <w:rPr>
-          <w:color w:val="000000"/>
-        </w:rPr>
-        <w:t xml:space="preserve"> </w:t>
-      </w:r>
-      <w:r>
-        <w:rPr>
-          <w:iCs/>
-          <w:i/>
-          <w:color w:val="000000"/>
-        </w:rPr>
-        <w:t xml:space="preserve">HLA-DQA2</w:t>
-      </w:r>
-      <w:r>
-        <w:rPr>
-          <w:color w:val="000000"/>
-        </w:rPr>
-        <w:t xml:space="preserve"> </w:t>
-      </w:r>
-      <w:r>
-        <w:rPr>
-          <w:color w:val="000000"/>
-        </w:rPr>
-        <w:t xml:space="preserve">and</w:t>
-      </w:r>
-      <w:r>
-        <w:rPr>
-          <w:color w:val="000000"/>
-        </w:rPr>
-        <w:t xml:space="preserve"> </w:t>
-      </w:r>
-      <w:r>
-        <w:rPr>
-          <w:iCs/>
-          <w:i/>
-          <w:color w:val="000000"/>
-        </w:rPr>
-        <w:t xml:space="preserve">TUBB</w:t>
-      </w:r>
-      <w:r>
-        <w:rPr>
-          <w:color w:val="000000"/>
-        </w:rPr>
-        <w:t xml:space="preserve">, absent shared-variant support further prevent counting every associated expression trait as an independent causal target.</w:t>
+        <w:t xml:space="preserve">These results inform research rather than treatment selection, leaving unresolved the tissue mediating the</w:t>
+      </w:r>
+      <w:r>
+        <w:rPr>
+          <w:color w:val="000000"/>
+        </w:rPr>
+        <w:t xml:space="preserve"> </w:t>
+      </w:r>
+      <w:r>
+        <w:rPr>
+          <w:iCs/>
+          <w:i/>
+          <w:color w:val="000000"/>
+        </w:rPr>
+        <w:t xml:space="preserve">TSHR</w:t>
+      </w:r>
+      <w:r>
+        <w:rPr>
+          <w:color w:val="000000"/>
+        </w:rPr>
+        <w:t xml:space="preserve"> </w:t>
+      </w:r>
+      <w:r>
+        <w:rPr>
+          <w:color w:val="000000"/>
+        </w:rPr>
+        <w:t xml:space="preserve">association and any inherited</w:t>
+      </w:r>
+      <w:r>
+        <w:rPr>
+          <w:color w:val="000000"/>
+        </w:rPr>
+        <w:t xml:space="preserve"> </w:t>
+      </w:r>
+      <w:r>
+        <w:rPr>
+          <w:iCs/>
+          <w:i/>
+          <w:color w:val="000000"/>
+        </w:rPr>
+        <w:t xml:space="preserve">IGF1R</w:t>
+      </w:r>
+      <w:r>
+        <w:rPr>
+          <w:color w:val="000000"/>
+        </w:rPr>
+        <w:t xml:space="preserve"> </w:t>
+      </w:r>
+      <w:r>
+        <w:rPr>
+          <w:color w:val="000000"/>
+        </w:rPr>
+        <w:t xml:space="preserve">contribution, which independent instruments, thymic and orbital regulatory data and multi-signal colocalization could address. Orbital susceptibility requires comparing GD patients with and without TED, accounting for follow-up and selection into GD.</w:t>
+      </w:r>
+    </w:p>
+    <w:bookmarkStart w:id="36" w:name="limitations"/>
+    <w:p>
+      <w:pPr>
+        <w:pStyle w:val="Heading3"/>
+      </w:pPr>
+      <w:r>
+        <w:rPr>
+          <w:color w:val="000000"/>
+        </w:rPr>
+        <w:t xml:space="preserve">Limitations</w:t>
+      </w:r>
+    </w:p>
+    <w:p>
+      <w:pPr>
+        <w:pStyle w:val="FirstParagraph"/>
+      </w:pPr>
+      <w:r>
+        <w:rPr>
+          <w:color w:val="000000"/>
+        </w:rPr>
+        <w:t xml:space="preserve">BBJ analyses assumed that predominantly European eQTLGen effects and LD transfer to East Asians, in both the MR and colocalization. UKB self-reported hyperthyroidism is broader than GD and was not established as exclusively European. The three overlapping, population-controlled FinnGen endpoints are not independent replications, do not compare GD patients with and without TED, and cannot separate cohort from phenotype differences; participant overlap with eQTLGen was unquantified. Blood is neither thymus nor orbit: the predominantly European GTEx extension had four single-instrument gene–tissue combinations, reused the disease data and lacked colocalization, and adipose and cultured fibroblasts are not orbital tissue, with 30 unestimable comparisons that are not negative findings. The orbital series (inactive TED; one control from a different fat depot) is descriptive only.</w:t>
       </w:r>
     </w:p>
     <w:p>
@@ -4382,7 +4687,7 @@
         <w:rPr>
           <w:color w:val="000000"/>
         </w:rPr>
-        <w:t xml:space="preserve">The lower-odds direction for</w:t>
+        <w:t xml:space="preserve">The FinnGen extensions, candidate expansion and colocalization emphasis were post hoc, and only the discovery and focused thresholds address specified test families. The single</w:t>
       </w:r>
       <w:r>
         <w:rPr>
@@ -4408,189 +4713,7 @@
         <w:rPr>
           <w:color w:val="000000"/>
         </w:rPr>
-        <w:t xml:space="preserve">need not contradict the pathogenic role of receptor-stimulating antibodies. Blood transcript abundance, tissue-specific expression and receptor activation are different exposures, and genetic regulatory effects can differ across tissues [25]. Our audit linked the blood expression-increasing rs179252-G allele to rs179247-G, the GD-protective allele associated with greater thymic transcription in published studies [27, 28]. This directional consistency is compatible with a central-tolerance explanation, but the thymic step was not tested here, and neither linked variant is a proven causal regulator. The marked departure of the MR ORs from 1 reflects scaling: rs179252 shifts reconstructed blood expression by only about 0.11 SD, and its per-allele disease ORs were 0.80 (BBJ), 0.77 (UKB), 0.78 (FinnGen ophthalmopathy), 0.77 (FinnGen GD) and 0.82 (strict ophthalmopathy). Rescaling these moderate per-allele effects to one SD of expression yields the per-SD ORs, which describe lifelong inherited differences, not the effect of raising</w:t>
-      </w:r>
-      <w:r>
-        <w:rPr>
-          <w:color w:val="000000"/>
-        </w:rPr>
-        <w:t xml:space="preserve"> </w:t>
-      </w:r>
-      <w:r>
-        <w:rPr>
-          <w:iCs/>
-          <w:i/>
-          <w:color w:val="000000"/>
-        </w:rPr>
-        <w:t xml:space="preserve">TSHR</w:t>
-      </w:r>
-      <w:r>
-        <w:rPr>
-          <w:color w:val="000000"/>
-        </w:rPr>
-        <w:t xml:space="preserve"> </w:t>
-      </w:r>
-      <w:r>
-        <w:rPr>
-          <w:color w:val="000000"/>
-        </w:rPr>
-        <w:t xml:space="preserve">expression or of TSHR-directed treatment. Because the adipose instruments tag the same intron-1 region as rs179252 and are themselves blood eQTLs, their concordant estimates re-express the regional association; they cannot resolve the distinct-variant pattern in UKB and FinnGen GD or establish an adipose-mediated mechanism, and neither depot is orbital fat.</w:t>
-      </w:r>
-    </w:p>
-    <w:p>
-      <w:pPr>
-        <w:pStyle w:val="BodyText"/>
-      </w:pPr>
-      <w:r>
-        <w:rPr>
-          <w:color w:val="000000"/>
-        </w:rPr>
-        <w:t xml:space="preserve">Colocalization does not replace the MR associations, but it constrains causal wording. Strong</w:t>
-      </w:r>
-      <w:r>
-        <w:rPr>
-          <w:color w:val="000000"/>
-        </w:rPr>
-        <w:t xml:space="preserve"> </w:t>
-      </w:r>
-      <w:r>
-        <w:rPr>
-          <w:iCs/>
-          <w:i/>
-          <w:color w:val="000000"/>
-        </w:rPr>
-        <w:t xml:space="preserve">TSHR</w:t>
-      </w:r>
-      <w:r>
-        <w:rPr>
-          <w:color w:val="000000"/>
-        </w:rPr>
-        <w:t xml:space="preserve"> </w:t>
-      </w:r>
-      <w:r>
-        <w:rPr>
-          <w:color w:val="000000"/>
-        </w:rPr>
-        <w:t xml:space="preserve">associations in UKB and FinnGen GD coexisted with distinct-variant regional patterns, and BBJ and strict ophthalmopathy support weakened under a lower shared-variant prior. Thus, association strength and shared-variant evidence were not interchangeable, as also seen for the comparator</w:t>
-      </w:r>
-      <w:r>
-        <w:rPr>
-          <w:color w:val="000000"/>
-        </w:rPr>
-        <w:t xml:space="preserve"> </w:t>
-      </w:r>
-      <w:r>
-        <w:rPr>
-          <w:iCs/>
-          <w:i/>
-          <w:color w:val="000000"/>
-        </w:rPr>
-        <w:t xml:space="preserve">CTLA4</w:t>
-      </w:r>
-      <w:r>
-        <w:rPr>
-          <w:color w:val="000000"/>
-        </w:rPr>
-        <w:t xml:space="preserve"> </w:t>
-      </w:r>
-      <w:r>
-        <w:rPr>
-          <w:color w:val="000000"/>
-        </w:rPr>
-        <w:t xml:space="preserve">in BBJ and FinnGen GD. UKB and FinnGen GD had the most cases of the five datasets; their distinct-variant</w:t>
-      </w:r>
-      <w:r>
-        <w:rPr>
-          <w:color w:val="000000"/>
-        </w:rPr>
-        <w:t xml:space="preserve"> </w:t>
-      </w:r>
-      <w:r>
-        <w:rPr>
-          <w:iCs/>
-          <w:i/>
-          <w:color w:val="000000"/>
-        </w:rPr>
-        <w:t xml:space="preserve">TSHR</w:t>
-      </w:r>
-      <w:r>
-        <w:rPr>
-          <w:color w:val="000000"/>
-        </w:rPr>
-        <w:t xml:space="preserve"> </w:t>
-      </w:r>
-      <w:r>
-        <w:rPr>
-          <w:color w:val="000000"/>
-        </w:rPr>
-        <w:t xml:space="preserve">patterns could reflect finer resolution of a complex regional architecture, but this was not tested. Ji and colleagues chose a shared-variant prior intended to allow weaker signals to colocalize and accepted PP.H4 above 0.50 [9], whereas our primary settings used p12 = 10</w:t>
-      </w:r>
-      <w:r>
-        <w:rPr>
-          <w:color w:val="000000"/>
-          <w:vertAlign w:val="superscript"/>
-        </w:rPr>
-        <w:t xml:space="preserve">−5</w:t>
-      </w:r>
-      <w:r>
-        <w:rPr>
-          <w:color w:val="000000"/>
-        </w:rPr>
-        <w:t xml:space="preserve"> </w:t>
-      </w:r>
-      <w:r>
-        <w:rPr>
-          <w:color w:val="000000"/>
-        </w:rPr>
-        <w:t xml:space="preserve">and PP.H4 ≥ 0.80, so colocalization labels are not directly comparable between the studies. The regional checks excluded a simple missing-peak explanation for</w:t>
-      </w:r>
-      <w:r>
-        <w:rPr>
-          <w:color w:val="000000"/>
-        </w:rPr>
-        <w:t xml:space="preserve"> </w:t>
-      </w:r>
-      <w:r>
-        <w:rPr>
-          <w:iCs/>
-          <w:i/>
-          <w:color w:val="000000"/>
-        </w:rPr>
-        <w:t xml:space="preserve">TSHR</w:t>
-      </w:r>
-      <w:r>
-        <w:rPr>
-          <w:color w:val="000000"/>
-        </w:rPr>
-        <w:t xml:space="preserve"> </w:t>
-      </w:r>
-      <w:r>
-        <w:rPr>
-          <w:color w:val="000000"/>
-        </w:rPr>
-        <w:t xml:space="preserve">but did not establish the correct causal architecture.</w:t>
-      </w:r>
-    </w:p>
-    <w:p>
-      <w:pPr>
-        <w:pStyle w:val="BodyText"/>
-      </w:pPr>
-      <w:r>
-        <w:rPr>
-          <w:color w:val="000000"/>
-        </w:rPr>
-        <w:t xml:space="preserve">Experimental and clinical studies provide context for relating TSHR-directed immunity to orbital disease. TSHR can undergo cleavage and release its extracellular A-subunit. Expression of this subunit in an adenoviral immunization model induced greater thyroid-stimulating autoimmunity than a minimally cleaving receptor [29]; plasmid immunization subsequently reproduced orbital adipogenesis, fibrosis and muscle pathology in mice [30]. Daser and colleagues further reported enhanced inflammatory and hyaluronan responses to TNFα in orbital fibroblasts from TSHR-immunized mice [31]. Graves ophthalmopathy has also been documented in primarily euthyroid and hypothyroid patients [32], supporting a distinction between thyroid functional status and orbital immune activity. These observations make the ophthalmopathy associations biologically plausible, but our instruments do not measure receptor cleavage or antibody activity. Because most patients with TED have GD and the ophthalmopathy endpoints used population controls, their MR estimates may largely reflect GD susceptibility rather than a TED-specific effect, and higher colocalization probabilities do not establish one.</w:t>
-      </w:r>
-    </w:p>
-    <w:p>
-      <w:pPr>
-        <w:pStyle w:val="BodyText"/>
-      </w:pPr>
-      <w:r>
-        <w:rPr>
-          <w:color w:val="000000"/>
-        </w:rPr>
-        <w:t xml:space="preserve">For</w:t>
+        <w:t xml:space="preserve">instrument precludes pleiotropy and omission tests and cannot exclude neighboring or correlated variants; other genes have few or heterogeneous instruments, MR-Egger has little power with three or four</w:t>
       </w:r>
       <w:r>
         <w:rPr>
@@ -4610,222 +4733,13 @@
         <w:rPr>
           <w:color w:val="000000"/>
         </w:rPr>
-        <w:t xml:space="preserve">, blood expression-related genetic evidence was limited: ORs above 1, two nominal associations, imprecise ophthalmopathy estimates and mostly weak regional disease signals do not establish a susceptibility effect. Some single-variant omissions removed nominal significance, although most left ORs close to the full estimates. The near-null FinnGen GD estimate argues against large, but not modest, blood-expression effects. Thyroid and cultured-fibroblast</w:t>
-      </w:r>
-      <w:r>
-        <w:rPr>
-          <w:color w:val="000000"/>
-        </w:rPr>
-        <w:t xml:space="preserve"> </w:t>
-      </w:r>
-      <w:r>
-        <w:rPr>
-          <w:iCs/>
-          <w:i/>
-          <w:color w:val="000000"/>
-        </w:rPr>
-        <w:t xml:space="preserve">IGF1R</w:t>
-      </w:r>
-      <w:r>
-        <w:rPr>
-          <w:color w:val="000000"/>
-        </w:rPr>
-        <w:t xml:space="preserve"> </w:t>
-      </w:r>
-      <w:r>
-        <w:rPr>
-          <w:color w:val="000000"/>
-        </w:rPr>
-        <w:t xml:space="preserve">estimates were non-significant and directions were inconsistent across datasets, but single instruments, wide intervals and absent orbital eQTLs leave tissue-specific effects open. Cultured fibroblasts are not orbital fibroblasts, and unestimable combinations are not negative findings. Weaker genetic evidence for</w:t>
-      </w:r>
-      <w:r>
-        <w:rPr>
-          <w:color w:val="000000"/>
-        </w:rPr>
-        <w:t xml:space="preserve"> </w:t>
-      </w:r>
-      <w:r>
-        <w:rPr>
-          <w:iCs/>
-          <w:i/>
-          <w:color w:val="000000"/>
-        </w:rPr>
-        <w:t xml:space="preserve">IGF1R</w:t>
-      </w:r>
-      <w:r>
-        <w:rPr>
-          <w:color w:val="000000"/>
-        </w:rPr>
-        <w:t xml:space="preserve"> </w:t>
-      </w:r>
-      <w:r>
-        <w:rPr>
-          <w:color w:val="000000"/>
-        </w:rPr>
-        <w:t xml:space="preserve">does not argue against IGF-1R blockade: teprotumumab efficacy rests on a randomized trial in active TED [3], and experimental TSHR–IGF-1R crosstalk [5] concerns receptor signaling rather than inherited susceptibility.</w:t>
-      </w:r>
-    </w:p>
-    <w:p>
-      <w:pPr>
-        <w:pStyle w:val="BodyText"/>
-      </w:pPr>
-      <w:r>
-        <w:rPr>
-          <w:color w:val="000000"/>
-        </w:rPr>
-        <w:t xml:space="preserve">Frequency substitution preserved the principal findings and changed full-screen classifications only for exploratory</w:t>
-      </w:r>
-      <w:r>
-        <w:rPr>
-          <w:color w:val="000000"/>
-        </w:rPr>
-        <w:t xml:space="preserve"> </w:t>
-      </w:r>
-      <w:r>
-        <w:rPr>
-          <w:iCs/>
-          <w:i/>
-          <w:color w:val="000000"/>
-        </w:rPr>
-        <w:t xml:space="preserve">C4B</w:t>
-      </w:r>
-      <w:r>
-        <w:rPr>
-          <w:color w:val="000000"/>
-        </w:rPr>
-        <w:t xml:space="preserve"> </w:t>
-      </w:r>
-      <w:r>
-        <w:rPr>
-          <w:color w:val="000000"/>
-        </w:rPr>
-        <w:t xml:space="preserve">and</w:t>
-      </w:r>
-      <w:r>
-        <w:rPr>
-          <w:color w:val="000000"/>
-        </w:rPr>
-        <w:t xml:space="preserve"> </w:t>
-      </w:r>
-      <w:r>
-        <w:rPr>
-          <w:iCs/>
-          <w:i/>
-          <w:color w:val="000000"/>
-        </w:rPr>
-        <w:t xml:space="preserve">HLA-G</w:t>
-      </w:r>
-      <w:r>
-        <w:rPr>
-          <w:color w:val="000000"/>
-        </w:rPr>
-        <w:t xml:space="preserve">; like instrument omission, it reused the same data and is not independent replication. For research on TSHR and IGF-1R, blood expression-related associations are more consistently supported for</w:t>
-      </w:r>
-      <w:r>
-        <w:rPr>
-          <w:color w:val="000000"/>
-        </w:rPr>
-        <w:t xml:space="preserve"> </w:t>
-      </w:r>
-      <w:r>
-        <w:rPr>
-          <w:iCs/>
-          <w:i/>
-          <w:color w:val="000000"/>
-        </w:rPr>
-        <w:t xml:space="preserve">TSHR</w:t>
-      </w:r>
-      <w:r>
-        <w:rPr>
-          <w:color w:val="000000"/>
-        </w:rPr>
-        <w:t xml:space="preserve">, while its tissue mechanism and the extent of an inherited</w:t>
-      </w:r>
-      <w:r>
-        <w:rPr>
-          <w:color w:val="000000"/>
-        </w:rPr>
-        <w:t xml:space="preserve"> </w:t>
-      </w:r>
-      <w:r>
-        <w:rPr>
-          <w:iCs/>
-          <w:i/>
-          <w:color w:val="000000"/>
-        </w:rPr>
-        <w:t xml:space="preserve">IGF1R</w:t>
-      </w:r>
-      <w:r>
-        <w:rPr>
-          <w:color w:val="000000"/>
-        </w:rPr>
-        <w:t xml:space="preserve"> </w:t>
-      </w:r>
-      <w:r>
-        <w:rPr>
-          <w:color w:val="000000"/>
-        </w:rPr>
-        <w:t xml:space="preserve">contribution remain unresolved. Independent expression instruments and tissue-relevant regulatory data would help address these uncertainties. Comparing GD patients with and without TED, while accounting for follow-up and selection into the GD group, would address orbital susceptibility directly. The present results inform interpretation and follow-up research, but do not guide treatment selection.</w:t>
-      </w:r>
-    </w:p>
-    <w:bookmarkStart w:id="36" w:name="limitations"/>
-    <w:p>
-      <w:pPr>
-        <w:pStyle w:val="Heading3"/>
-      </w:pPr>
-      <w:r>
-        <w:rPr>
-          <w:color w:val="000000"/>
-        </w:rPr>
-        <w:t xml:space="preserve">Limitations</w:t>
-      </w:r>
-    </w:p>
-    <w:p>
-      <w:pPr>
-        <w:pStyle w:val="FirstParagraph"/>
-      </w:pPr>
-      <w:r>
-        <w:rPr>
-          <w:color w:val="000000"/>
-        </w:rPr>
-        <w:t xml:space="preserve">The principal limitations involve the exposure and phenotype definitions. Predominantly European blood eQTL effects were applied to BBJ, requiring expression associations and LD patterns to transfer across ancestries. UKB self-reported hyperthyroidism is broader than GD, and an exclusively European source sample was not established. FinnGen’s overlapping, population-controlled endpoints do not directly compare GD patients with and without TED; cohort differences and phenotype differences cannot be separated cleanly. Participant overlap with eQTLGen could not be quantified. Cohort-frequency replacement, using a release excluding Framingham participants, addresses only part of expression reconstruction and does not remove LD-reference limitations or independently validate rare-variant effects. The orbital series, from inactive TED, has a single control and no inferential role. The GTEx extension, also predominantly European, had four estimable combinations, each with one instrument. It reused the disease datasets and lacked tissue-specific regional colocalization.</w:t>
-      </w:r>
-    </w:p>
-    <w:p>
-      <w:pPr>
-        <w:pStyle w:val="BodyText"/>
-      </w:pPr>
-      <w:r>
-        <w:rPr>
-          <w:color w:val="000000"/>
-        </w:rPr>
-        <w:t xml:space="preserve">The analytical limitations include post hoc selection, few instruments and a single-causal-variant colocalization model.</w:t>
-      </w:r>
-      <w:r>
-        <w:rPr>
-          <w:color w:val="000000"/>
-        </w:rPr>
-        <w:t xml:space="preserve"> </w:t>
-      </w:r>
-      <w:r>
-        <w:rPr>
-          <w:iCs/>
-          <w:i/>
-          <w:color w:val="000000"/>
-        </w:rPr>
-        <w:t xml:space="preserve">TSHR</w:t>
-      </w:r>
-      <w:r>
-        <w:rPr>
-          <w:color w:val="000000"/>
-        </w:rPr>
-        <w:t xml:space="preserve"> </w:t>
-      </w:r>
-      <w:r>
-        <w:rPr>
-          <w:color w:val="000000"/>
-        </w:rPr>
-        <w:t xml:space="preserve">has one retained European-reference instrument, precluding multi-instrument pleiotropy tests; several other genes have few variants or heterogeneous estimates. MHC analyses are particularly vulnerable to complex LD and correlated expression, and low PP.H4 can reflect model mismatch or limited signal coverage. Multi-signal colocalization [33], directionality testing and formal between-phenotype effect tests were not performed. Only 24 selected genes underwent colocalization; therefore its negative classifications cannot be generalized to the entire screen. Discovery and focused follow-up thresholds address specified families of tests, while the expanded scans and sensitivity analyses remain exploratory. At the discovery threshold, most BBJ genes lacked 80% power for an OR of 1.5, and neither a non-significant MR result nor a posterior below 0.80 establishes absence of an effect.</w:t>
+        <w:t xml:space="preserve"> </w:t>
+      </w:r>
+      <w:r>
+        <w:rPr>
+          <w:color w:val="000000"/>
+        </w:rPr>
+        <w:t xml:space="preserve">instruments, and frequency substitution and omission reused the same data. Under the single-causal-variant model, a low PP.H4 can reflect model mismatch or complex MHC LD; multi-signal colocalization [35], directionality and formal between-phenotype or between-gene tests were not performed, and only 24 genes were assessed. At the screen threshold, most BBJ genes lacked 80% power for an OR of 1.5, so a non-significant MR result, a PP.H4 below 0.80 or an unestimable comparison does not establish absence of an effect.</w:t>
       </w:r>
     </w:p>
     <w:bookmarkEnd w:id="36"/>
@@ -4849,7 +4763,7 @@
         <w:rPr>
           <w:color w:val="000000"/>
         </w:rPr>
-        <w:t xml:space="preserve">Genetically proxied blood</w:t>
+        <w:t xml:space="preserve">Higher genetically proxied blood</w:t>
       </w:r>
       <w:r>
         <w:rPr>
@@ -4875,7 +4789,7 @@
         <w:rPr>
           <w:color w:val="000000"/>
         </w:rPr>
-        <w:t xml:space="preserve">expression showed strong, directionally consistent associations with lower odds of GD and related phenotypes, whereas</w:t>
+        <w:t xml:space="preserve">expression was associated with lower odds of GD, hyperthyroidism and ophthalmopathy in every dataset.</w:t>
       </w:r>
       <w:r>
         <w:rPr>
@@ -4901,7 +4815,7 @@
         <w:rPr>
           <w:color w:val="000000"/>
         </w:rPr>
-        <w:t xml:space="preserve">evidence was weaker, with the most precise estimate near the null. Colocalization supported a shared</w:t>
+        <w:t xml:space="preserve">odds ratios exceeded 1 in every dataset but nominally significant only in BBJ and UKB, and the most precise estimate, FinnGen GD, lay close to the null. Colocalization supported a shared</w:t>
       </w:r>
       <w:r>
         <w:rPr>
@@ -4927,7 +4841,7 @@
         <w:rPr>
           <w:color w:val="000000"/>
         </w:rPr>
-        <w:t xml:space="preserve">variant in FinnGen ophthalmopathy and, depending on the prior, in BBJ and strict ophthalmopathy, but not in UKB or FinnGen GD, so these data establish association rather than expression-mediated causality. Weaker genetic evidence for</w:t>
+        <w:t xml:space="preserve">variant in FinnGen ophthalmopathy and, except at the lowest prior tested, in BBJ and strict ophthalmopathy, but favored distinct variants in UKB and FinnGen GD. These analyses addressed disease susceptibility, not treatment response, and the</w:t>
       </w:r>
       <w:r>
         <w:rPr>
@@ -4953,7 +4867,7 @@
         <w:rPr>
           <w:color w:val="000000"/>
         </w:rPr>
-        <w:t xml:space="preserve">does not argue against the therapeutic relevance of IGF-1R blockade. The population-controlled ophthalmopathy analyses do not estimate TED susceptibility among patients with GD or predict treatment response.</w:t>
+        <w:t xml:space="preserve">evidence does not argue against IGF-1R blockade. The ophthalmopathy analyses used population controls and did not estimate TED susceptibility among patients with GD.</w:t>
       </w:r>
     </w:p>
     <w:bookmarkEnd w:id="37"/>
@@ -5582,7 +5496,7 @@
         <w:rPr>
           <w:color w:val="000000"/>
         </w:rPr>
-        <w:t xml:space="preserve">Chen CR, Pichurin P, Nagayama Y, Latrofa F, Rapoport B, McLachlan SM. The thyrotropin receptor autoantigen in Graves disease is the culprit as well as the victim. J Clin Invest. 2003;111:1897-1904. doi:10.1172/JCI17069.</w:t>
+        <w:t xml:space="preserve">Zuber V, Grinberg NF, Gill D, Manipur I, Slob EAW, Patel A, Wallace C, Burgess S. Combining evidence from Mendelian randomization and colocalization: Review and comparison of approaches. Am J Hum Genet. 2022;109:767-782. doi:10.1016/j.ajhg.2022.04.001.</w:t>
       </w:r>
     </w:p>
     <w:p>
@@ -5596,7 +5510,7 @@
         <w:rPr>
           <w:color w:val="000000"/>
         </w:rPr>
-        <w:t xml:space="preserve">Berchner-Pfannschmidt U, Moshkelgosha S, Diaz-Cano S, Edelmann B, Görtz GE, Horstmann M, Noble A, Hansen W, Eckstein A, Banga JP. Comparative Assessment of Female Mouse Model of Graves’ Orbitopathy Under Different Environments, Accompanied by Proinflammatory Cytokine and T-Cell Responses to Thyrotropin Hormone Receptor Antigen. Endocrinology. 2016;157:1673-1682. doi:10.1210/en.2015-1829.</w:t>
+        <w:t xml:space="preserve">Chen CR, Pichurin P, Nagayama Y, Latrofa F, Rapoport B, McLachlan SM. The thyrotropin receptor autoantigen in Graves disease is the culprit as well as the victim. J Clin Invest. 2003;111:1897-1904. doi:10.1172/JCI17069.</w:t>
       </w:r>
     </w:p>
     <w:p>
@@ -5610,7 +5524,7 @@
         <w:rPr>
           <w:color w:val="000000"/>
         </w:rPr>
-        <w:t xml:space="preserve">Daser A, Gulbins A, Horstmann M, Kalisch J, Nolte I, Hashemi Arani F, Lang S, Mattheis S, Bechrakis NE, Banga JP, et al. TNFα drives disease-specific chemokine networks and orbital tissue remodeling in a preclinical model of thyroid eye disease. Eur Thyroid J. 2026;15:ETJ250407. doi:10.1530/ETJ-25-0407.</w:t>
+        <w:t xml:space="preserve">Berchner-Pfannschmidt U, Moshkelgosha S, Diaz-Cano S, Edelmann B, Görtz GE, Horstmann M, Noble A, Hansen W, Eckstein A, Banga JP. Comparative Assessment of Female Mouse Model of Graves’ Orbitopathy Under Different Environments, Accompanied by Proinflammatory Cytokine and T-Cell Responses to Thyrotropin Hormone Receptor Antigen. Endocrinology. 2016;157:1673-1682. doi:10.1210/en.2015-1829.</w:t>
       </w:r>
     </w:p>
     <w:p>
@@ -5624,7 +5538,35 @@
         <w:rPr>
           <w:color w:val="000000"/>
         </w:rPr>
+        <w:t xml:space="preserve">Daser A, Gulbins A, Horstmann M, Kalisch J, Nolte I, Hashemi Arani F, Lang S, Mattheis S, Bechrakis NE, Banga JP, et al. TNFα drives disease-specific chemokine networks and orbital tissue remodeling in a preclinical model of thyroid eye disease. Eur Thyroid J. 2026;15:ETJ250407. doi:10.1530/ETJ-25-0407.</w:t>
+      </w:r>
+    </w:p>
+    <w:p>
+      <w:pPr>
+        <w:numPr>
+          <w:ilvl w:val="0"/>
+          <w:numId w:val="1001"/>
+        </w:numPr>
+      </w:pPr>
+      <w:r>
+        <w:rPr>
+          <w:color w:val="000000"/>
+        </w:rPr>
         <w:t xml:space="preserve">Eckstein AK, Lösch C, Glowacka D, Schott M, Mann K, Esser J, Morgenthaler NG. Euthyroid and primarily hypothyroid patients develop milder and significantly more asymmetrical Graves ophthalmopathy. Br J Ophthalmol. 2009;93:1052-1056. doi:10.1136/bjo.2007.137265.</w:t>
+      </w:r>
+    </w:p>
+    <w:p>
+      <w:pPr>
+        <w:numPr>
+          <w:ilvl w:val="0"/>
+          <w:numId w:val="1001"/>
+        </w:numPr>
+      </w:pPr>
+      <w:r>
+        <w:rPr>
+          <w:color w:val="000000"/>
+        </w:rPr>
+        <w:t xml:space="preserve">Douglas RS, Couch S, Wester ST, Fowler BT, Liu CY, Subramanian PS, Tang R, Nguyen QT, Maamari RN, Ugradar S, et al. Efficacy and Safety of Teprotumumab in Patients With Thyroid Eye Disease of Long Duration and Low Disease Activity. J Clin Endocrinol Metab. 2024;109:25-35. doi:10.1210/clinem/dgad637.</w:t>
       </w:r>
     </w:p>
     <w:p>

</xml_diff>

<commit_message>
Revise the Methods after the four-reviewer check
Author-approved step 4. The Methods now follow the Results order and use the
same terms as the Results and tables; they add the detectable-OR method, the
single-causal-variant colocalization assumption, the p1/p2/p12 priors, MHC
retention and the orbital tissue sources, and drop methods the paper no
longer reports (combined BBJ-ophthalmopathy filter, colocalization frequency
scenarios) and interpretive sentences. Technical detail moved to or was
added in the Supplementary Methods (BBJ case definition, druggable-gene
mapping, GCTA-COJO for 16p11.2, frequency-scenario result, RNA-seq tools),
which stay within five pages. Two companion edits keep the Results and
Limitations consistent with the Methods.

Methods 1,170 -> about 1,021 words; main text 3,793 of 5,000 with sub-headings.

Co-Authored-By: Claude Opus 5.5 <noreply@anthropic.com>
Claude-Session: https://claude.ai/code/session_01TiAKffYKtUstdRZFkwtJA9
</commit_message>
<xml_diff>
--- a/submission/candidate_20261011_review/Manuscript.docx
+++ b/submission/candidate_20261011_review/Manuscript.docx
@@ -1106,7 +1106,7 @@
         <w:rPr>
           <w:color w:val="000000"/>
         </w:rPr>
-        <w:t xml:space="preserve">This two-sample MR study used public association summary statistics and followed STROBE-MR reporting guidance [12]. The exposure used whole-blood expression quantitative trait locus (eQTL) statistics from eQTLGen, comprising up to 31,684 participants, predominantly of European ancestry [13]. The original outcome hierarchy comprised BBJ GD, UKB self-reported hyperthyroidism or thyrotoxicosis, and FinnGen R12 Graves ophthalmopathy [14, 15, 16]. We subsequently added FinnGen R12 E4_GRAVES_STRICT and E4_GRAVES_OPHT_STRICT. The five datasets and their case and control counts are shown in Table 1. The UKB source did not establish an exclusively European analysis sample, so ancestry was not inferred from the reference panel used in its source study.</w:t>
+        <w:t xml:space="preserve">This two-sample MR study used public association summary statistics and followed STROBE-MR reporting guidance [12]. Exposure data were whole-blood expression quantitative trait locus (eQTL; a variant associated with gene expression) statistics from predominantly European eQTLGen participants [13]. The original outcomes were BBJ GD, UKB self-reported hyperthyroidism or thyrotoxicosis, and Graves ophthalmopathy in FinnGen release 12 (FinnGen ophthalmopathy) [14, 15, 16]. We later added two FinnGen endpoints: E4_GRAVES_STRICT (FinnGen GD) and E4_GRAVES_OPHT_STRICT (strict ophthalmopathy). Table 1 gives case and control counts. UKB ancestry was not established as exclusively European.</w:t>
       </w:r>
     </w:p>
     <w:p>
@@ -1117,7 +1117,7 @@
         <w:rPr>
           <w:color w:val="000000"/>
         </w:rPr>
-        <w:t xml:space="preserve">BBJ remained the discovery dataset. FinnGen GD provided a same-disease comparison, UKB a broader-phenotype comparison, and the two ophthalmopathy endpoints sensitivity analyses of a TED-enriched phenotype. The three FinnGen endpoints contain overlapping participants and were not treated as independent replications or combined by meta-analysis. Their controls were population non-cases for the respective endpoint, not GD patients without TED. The FinnGen extensions, expanded candidate assessment and instrument diagnostics were post hoc; no prospective registration was available.</w:t>
+        <w:t xml:space="preserve">BBJ was the discovery dataset, FinnGen GD a same-disease comparison, UKB a broader-phenotype comparison, FinnGen ophthalmopathy a TED-enriched comparison and strict ophthalmopathy a definition sensitivity analysis. The three FinnGen endpoints share participants and were neither treated as independent replications nor meta-analyzed. Their controls were all other participants, not GD patients without TED. The FinnGen extensions, expanded candidate assessment and instrument diagnostics were post hoc; the study was not prospectively registered. Analyses used R 4.3.3, TwoSampleMR 0.7.4, coloc 5.2.3 and PLINK 1.9, with independent numerical verification in Python.</w:t>
       </w:r>
     </w:p>
     <w:bookmarkEnd w:id="22"/>
@@ -1141,7 +1141,13 @@
         <w:rPr>
           <w:color w:val="000000"/>
         </w:rPr>
-        <w:t xml:space="preserve">From 4,462 potentially druggable genes [17], instruments were selected from significant blood cis-eQTLs (</w:t>
+        <w:t xml:space="preserve">For 4,462 potentially druggable genes [17], instruments (variants used to represent a gene’s expression) were blood eQTLs with</w:t>
+      </w:r>
+      <w:r>
+        <w:rPr>
+          <w:color w:val="000000"/>
+        </w:rPr>
+        <w:t xml:space="preserve"> </w:t>
       </w:r>
       <w:r>
         <w:rPr>
@@ -1174,7 +1180,13 @@
         <w:rPr>
           <w:color w:val="000000"/>
         </w:rPr>
-        <w:t xml:space="preserve">) within 1 Mb of the gene. PLINK clumping used a linkage disequilibrium (LD) threshold of r² &lt; 0.001 within 10 Mb and 503 European participants from 1000 Genomes Phase 3 [18, 19]. This produced 6,135 single-nucleotide polymorphism (SNP)–gene records for 2,544 genes. The minimum F statistic was 29.7; the median variant-specific expression sample size was 28,092, with a range of 232–31,684. Exposure coefficients and standard errors were reconstructed from Z statistics, sample sizes and reference allele frequencies under unit expression variance [20]. Alleles were aligned with TwoSampleMR; ambiguous palindromic or unavailable variants were excluded. UKB linear-model coefficients and standard errors were divided by μ(1−μ), where μ = 3,731/484,598, to approximate a log-odds scale. BBJ and FinnGen coefficients already used log odds.</w:t>
+        <w:t xml:space="preserve"> </w:t>
+      </w:r>
+      <w:r>
+        <w:rPr>
+          <w:color w:val="000000"/>
+        </w:rPr>
+        <w:t xml:space="preserve">within 1 Mb of the gene (cis-eQTLs). PLINK clumping kept only uncorrelated variants (linkage disequilibrium [LD] r² &lt; 0.001 within 10 Mb, in 503 European participants from 1000 Genomes Phase 3) [18, 19]. This gave 6,135 single-nucleotide polymorphism (SNP)–gene pairs for 2,544 genes (minimum F statistic 29.7; F &gt; 10 is the usual threshold for adequate instrument strength), and the extended major histocompatibility complex region was not excluded. Variant effects on expression, in standard deviation units, were derived from eQTLGen Z statistics, sample sizes and 1000 Genomes European allele frequencies [20]. TwoSampleMR aligned exposure and disease effects to the same allele, excluding unavailable and strand-ambiguous (palindromic) variants. UKB linear-model estimates were rescaled using the case proportion to approximate the log-odds scale of BBJ and FinnGen (Supplementary Methods).</w:t>
       </w:r>
     </w:p>
     <w:p>
@@ -1185,7 +1197,7 @@
         <w:rPr>
           <w:color w:val="000000"/>
         </w:rPr>
-        <w:t xml:space="preserve">We used Wald ratios for single-instrument genes and multiplicative random-effects inverse-variance weighting (IVW), with correction for under-dispersion, for multiple instruments [21]. An instrumental variable (IV) is a genetic variant used to represent variation in expression. Results are reported as ORs per approximately one standard deviation higher blood expression, with 95% CIs and two-sided</w:t>
+        <w:t xml:space="preserve">For each gene and dataset, MR used the Wald ratio (disease effect divided by expression effect) for one instrument and, for several, multiplicative random-effects inverse-variance weighting (IVW), a precision-weighted average [21]. Estimates are ORs per approximately one standard deviation higher genetically proxied blood expression, with 95% CIs and two-sided</w:t>
       </w:r>
       <w:r>
         <w:rPr>
@@ -1211,13 +1223,7 @@
         <w:rPr>
           <w:color w:val="000000"/>
         </w:rPr>
-        <w:t xml:space="preserve">values. This scale describes reconstructed expression effects, not a drug dose or an intervention. Primary discovery required</w:t>
-      </w:r>
-      <w:r>
-        <w:rPr>
-          <w:color w:val="000000"/>
-        </w:rPr>
-        <w:t xml:space="preserve"> </w:t>
+        <w:t xml:space="preserve">values. The BBJ screen threshold was Bonferroni-corrected for all 2,544 instrumented genes, estimable or not (</w:t>
       </w:r>
       <w:r>
         <w:rPr>
@@ -1237,7 +1243,7 @@
         <w:rPr>
           <w:color w:val="000000"/>
         </w:rPr>
-        <w:t xml:space="preserve">&lt; 0.05/2,544 (1.965×10</w:t>
+        <w:t xml:space="preserve">&lt; 0.05/2,544 = 1.965×10</w:t>
       </w:r>
       <w:r>
         <w:rPr>
@@ -1250,13 +1256,7 @@
         <w:rPr>
           <w:color w:val="000000"/>
         </w:rPr>
-        <w:t xml:space="preserve">), retaining all eligible genes in the denominator even when an outcome estimate was unavailable. The 13 BBJ discoveries were assessed in FinnGen GD using a focused threshold of 0.05/13 and concordant effect direction. A separate full FinnGen screen used 0.05/2,544 and was exploratory. Nominal</w:t>
-      </w:r>
-      <w:r>
-        <w:rPr>
-          <w:color w:val="000000"/>
-        </w:rPr>
-        <w:t xml:space="preserve"> </w:t>
+        <w:t xml:space="preserve">); it was applied descriptively to the other datasets and in an exploratory full FinnGen GD screen. The 13 BBJ discoveries were assessed at a focused FinnGen GD threshold (</w:t>
       </w:r>
       <w:r>
         <w:rPr>
@@ -1276,7 +1276,33 @@
         <w:rPr>
           <w:color w:val="000000"/>
         </w:rPr>
-        <w:t xml:space="preserve">&lt; 0.05 was reported descriptively and was not equated with discovery significance.</w:t>
+        <w:t xml:space="preserve">&lt; 0.05/13 and the same direction). Nominal (uncorrected)</w:t>
+      </w:r>
+      <w:r>
+        <w:rPr>
+          <w:color w:val="000000"/>
+        </w:rPr>
+        <w:t xml:space="preserve"> </w:t>
+      </w:r>
+      <w:r>
+        <w:rPr>
+          <w:iCs/>
+          <w:i/>
+          <w:color w:val="000000"/>
+        </w:rPr>
+        <w:t xml:space="preserve">P</w:t>
+      </w:r>
+      <w:r>
+        <w:rPr>
+          <w:color w:val="000000"/>
+        </w:rPr>
+        <w:t xml:space="preserve"> </w:t>
+      </w:r>
+      <w:r>
+        <w:rPr>
+          <w:color w:val="000000"/>
+        </w:rPr>
+        <w:t xml:space="preserve">&lt; 0.05 was reported descriptively. ORs detectable with 80% power were approximated from observed standard errors (Supplementary Methods).</w:t>
       </w:r>
     </w:p>
     <w:p>
@@ -1287,33 +1313,7 @@
         <w:rPr>
           <w:color w:val="000000"/>
         </w:rPr>
-        <w:t xml:space="preserve">MR interpretation assumes that instruments predict expression, are not associated with exposure–disease confounders, and influence disease only through the modeled exposure. A small</w:t>
-      </w:r>
-      <w:r>
-        <w:rPr>
-          <w:color w:val="000000"/>
-        </w:rPr>
-        <w:t xml:space="preserve"> </w:t>
-      </w:r>
-      <w:r>
-        <w:rPr>
-          <w:iCs/>
-          <w:i/>
-          <w:color w:val="000000"/>
-        </w:rPr>
-        <w:t xml:space="preserve">P</w:t>
-      </w:r>
-      <w:r>
-        <w:rPr>
-          <w:color w:val="000000"/>
-        </w:rPr>
-        <w:t xml:space="preserve"> </w:t>
-      </w:r>
-      <w:r>
-        <w:rPr>
-          <w:color w:val="000000"/>
-        </w:rPr>
-        <w:t xml:space="preserve">value or high PP.H4 cannot by itself establish these assumptions.</w:t>
+        <w:t xml:space="preserve">MR assumes that instruments predict expression, are unrelated to confounders of expression and disease, and affect disease only through that gene’s expression.</w:t>
       </w:r>
     </w:p>
     <w:p>
@@ -1324,7 +1324,64 @@
         <w:rPr>
           <w:color w:val="000000"/>
         </w:rPr>
-        <w:t xml:space="preserve">Where applicable, sensitivity assessment included Cochran’s Q, alternative MR estimators and omission of individual instruments [22, 23]. Previously completed alternative-estimator results (MR-Egger, weighted median and weighted mode) for the original three outcomes were retained (Supplementary Dataset, MR_estimators_original); they were not represented as new analyses of every endpoint. Post hoc leave-one-out results assessed dependence on individual variants, not independent replication. Single-instrument</w:t>
+        <w:t xml:space="preserve">For estimates with several instruments, Cochran’s Q test assessed heterogeneity among instruments and, for selected genes, post hoc omission of each instrument in turn (leave-one-out) assessed dependence on single variants. MR-Egger regression, whose intercept tests whether instruments affect disease through other pathways (directional pleiotropy), and weighted-median and weighted-mode estimators [22, 23] were applied only in the original three datasets (Supplementary Dataset, MR_estimators_original). Analyses were repeated with exposure effects reconstructed from eQTLGen cohort allele frequencies; for</w:t>
+      </w:r>
+      <w:r>
+        <w:rPr>
+          <w:color w:val="000000"/>
+        </w:rPr>
+        <w:t xml:space="preserve"> </w:t>
+      </w:r>
+      <w:r>
+        <w:rPr>
+          <w:iCs/>
+          <w:i/>
+          <w:color w:val="000000"/>
+        </w:rPr>
+        <w:t xml:space="preserve">C4B</w:t>
+      </w:r>
+      <w:r>
+        <w:rPr>
+          <w:color w:val="000000"/>
+        </w:rPr>
+        <w:t xml:space="preserve"> </w:t>
+      </w:r>
+      <w:r>
+        <w:rPr>
+          <w:color w:val="000000"/>
+        </w:rPr>
+        <w:t xml:space="preserve">and</w:t>
+      </w:r>
+      <w:r>
+        <w:rPr>
+          <w:color w:val="000000"/>
+        </w:rPr>
+        <w:t xml:space="preserve"> </w:t>
+      </w:r>
+      <w:r>
+        <w:rPr>
+          <w:iCs/>
+          <w:i/>
+          <w:color w:val="000000"/>
+        </w:rPr>
+        <w:t xml:space="preserve">HLA-G</w:t>
+      </w:r>
+      <w:r>
+        <w:rPr>
+          <w:color w:val="000000"/>
+        </w:rPr>
+        <w:t xml:space="preserve">, whose FinnGen GD screen result changed, instrument weights and omissions were compared between frequency sources (Supplementary Methods).</w:t>
+      </w:r>
+    </w:p>
+    <w:p>
+      <w:pPr>
+        <w:pStyle w:val="BodyText"/>
+      </w:pPr>
+      <w:r>
+        <w:rPr>
+          <w:color w:val="000000"/>
+        </w:rPr>
+        <w:t xml:space="preserve">In a post hoc audit, rs179252 and rs179247 (the variant examined in published thymic</w:t>
       </w:r>
       <w:r>
         <w:rPr>
@@ -1350,7 +1407,154 @@
         <w:rPr>
           <w:color w:val="000000"/>
         </w:rPr>
-        <w:t xml:space="preserve">results could not undergo these omission or multi-instrument pleiotropy tests.</w:t>
+        <w:t xml:space="preserve">studies) were re-extracted from the original expression and disease files. Disease effects were aligned to the blood expression-increasing allele to give per-allele ORs and recalculate the MR estimates, and the correlation between the two variants’ G-allele counts was calculated in European and East Asian 1000 Genomes genotypes. The audit checked allele direction, not thymic mediation (Supplementary Dataset, TSHR_allele_audit).</w:t>
+      </w:r>
+    </w:p>
+    <w:bookmarkEnd w:id="23"/>
+    <w:bookmarkStart w:id="24" w:name="colocalization"/>
+    <w:p>
+      <w:pPr>
+        <w:pStyle w:val="Heading3"/>
+      </w:pPr>
+      <w:r>
+        <w:rPr>
+          <w:color w:val="000000"/>
+        </w:rPr>
+        <w:t xml:space="preserve">Colocalization</w:t>
+      </w:r>
+    </w:p>
+    <w:p>
+      <w:pPr>
+        <w:pStyle w:val="FirstParagraph"/>
+      </w:pPr>
+      <w:r>
+        <w:rPr>
+          <w:color w:val="000000"/>
+        </w:rPr>
+        <w:t xml:space="preserve">MR associations are the main findings, and colocalization was used to interpret them; the original analysis reported both in parallel, and this emphasis was adopted post hoc without prospective registration. We used coloc.abf, which assumes at most one causal variant per trait, with all available eQTLGen cis-eQTL statistics for each gene, significant or not, matched to each disease dataset [8]. It was applied to 24 genes: the 13 BBJ discoveries,</w:t>
+      </w:r>
+      <w:r>
+        <w:rPr>
+          <w:color w:val="000000"/>
+        </w:rPr>
+        <w:t xml:space="preserve"> </w:t>
+      </w:r>
+      <w:r>
+        <w:rPr>
+          <w:iCs/>
+          <w:i/>
+          <w:color w:val="000000"/>
+        </w:rPr>
+        <w:t xml:space="preserve">IGF1R</w:t>
+      </w:r>
+      <w:r>
+        <w:rPr>
+          <w:color w:val="000000"/>
+        </w:rPr>
+        <w:t xml:space="preserve">, the nine additional FinnGen GD screen discoveries and</w:t>
+      </w:r>
+      <w:r>
+        <w:rPr>
+          <w:color w:val="000000"/>
+        </w:rPr>
+        <w:t xml:space="preserve"> </w:t>
+      </w:r>
+      <w:r>
+        <w:rPr>
+          <w:iCs/>
+          <w:i/>
+          <w:color w:val="000000"/>
+        </w:rPr>
+        <w:t xml:space="preserve">HLA-G</w:t>
+      </w:r>
+      <w:r>
+        <w:rPr>
+          <w:color w:val="000000"/>
+        </w:rPr>
+        <w:t xml:space="preserve">, added because its MR result changed with the allele-frequency source. Posterior probabilities (PP.H0–PP.H4) were estimated for five hypotheses: neither trait associated (H0), disease only (H1), expression only (H2), distinct causal variants (H3) and one shared causal variant (H4). Prior probabilities that a variant is associated with disease (p1), expression (p2) or both (p12) were 10</w:t>
+      </w:r>
+      <w:r>
+        <w:rPr>
+          <w:color w:val="000000"/>
+          <w:vertAlign w:val="superscript"/>
+        </w:rPr>
+        <w:t xml:space="preserve">−4</w:t>
+      </w:r>
+      <w:r>
+        <w:rPr>
+          <w:color w:val="000000"/>
+        </w:rPr>
+        <w:t xml:space="preserve">, 10</w:t>
+      </w:r>
+      <w:r>
+        <w:rPr>
+          <w:color w:val="000000"/>
+          <w:vertAlign w:val="superscript"/>
+        </w:rPr>
+        <w:t xml:space="preserve">−4</w:t>
+      </w:r>
+      <w:r>
+        <w:rPr>
+          <w:color w:val="000000"/>
+        </w:rPr>
+        <w:t xml:space="preserve"> </w:t>
+      </w:r>
+      <w:r>
+        <w:rPr>
+          <w:color w:val="000000"/>
+        </w:rPr>
+        <w:t xml:space="preserve">and 10</w:t>
+      </w:r>
+      <w:r>
+        <w:rPr>
+          <w:color w:val="000000"/>
+          <w:vertAlign w:val="superscript"/>
+        </w:rPr>
+        <w:t xml:space="preserve">−5</w:t>
+      </w:r>
+      <w:r>
+        <w:rPr>
+          <w:color w:val="000000"/>
+        </w:rPr>
+        <w:t xml:space="preserve">, with p12 also set to 5×10</w:t>
+      </w:r>
+      <w:r>
+        <w:rPr>
+          <w:color w:val="000000"/>
+          <w:vertAlign w:val="superscript"/>
+        </w:rPr>
+        <w:t xml:space="preserve">−6</w:t>
+      </w:r>
+      <w:r>
+        <w:rPr>
+          <w:color w:val="000000"/>
+        </w:rPr>
+        <w:t xml:space="preserve"> </w:t>
+      </w:r>
+      <w:r>
+        <w:rPr>
+          <w:color w:val="000000"/>
+        </w:rPr>
+        <w:t xml:space="preserve">and 10</w:t>
+      </w:r>
+      <w:r>
+        <w:rPr>
+          <w:color w:val="000000"/>
+          <w:vertAlign w:val="superscript"/>
+        </w:rPr>
+        <w:t xml:space="preserve">−6</w:t>
+      </w:r>
+      <w:r>
+        <w:rPr>
+          <w:color w:val="000000"/>
+        </w:rPr>
+        <w:t xml:space="preserve"> </w:t>
+      </w:r>
+      <w:r>
+        <w:rPr>
+          <w:color w:val="000000"/>
+        </w:rPr>
+        <w:t xml:space="preserve">[24]. PP.H4 ≥ 0.80 was a descriptive reporting threshold.</w:t>
       </w:r>
     </w:p>
     <w:p>
@@ -1361,152 +1565,7 @@
         <w:rPr>
           <w:color w:val="000000"/>
         </w:rPr>
-        <w:t xml:space="preserve">In a post hoc allele-direction audit, we re-extracted rs179252 and rs179247 from the original expression and disease files. Disease effects were aligned to the blood expression-increasing allele, and G-allele correlations were calculated in European and East Asian reference genotypes and independently checked with PLINK. This audit assessed allele alignment and consistency with published thymus findings, rather than thymic mediation (Supplementary Dataset, TSHR_allele_audit).</w:t>
-      </w:r>
-    </w:p>
-    <w:bookmarkEnd w:id="23"/>
-    <w:bookmarkStart w:id="24" w:name="colocalization-and-robustness-assessment"/>
-    <w:p>
-      <w:pPr>
-        <w:pStyle w:val="Heading3"/>
-      </w:pPr>
-      <w:r>
-        <w:rPr>
-          <w:color w:val="000000"/>
-        </w:rPr>
-        <w:t xml:space="preserve">Colocalization and robustness assessment</w:t>
-      </w:r>
-    </w:p>
-    <w:p>
-      <w:pPr>
-        <w:pStyle w:val="FirstParagraph"/>
-      </w:pPr>
-      <w:r>
-        <w:rPr>
-          <w:color w:val="000000"/>
-        </w:rPr>
-        <w:t xml:space="preserve">We report MR associations as the main findings and use colocalization to assess their interpretation. In the original analysis, colocalization was reported alongside MR as a parallel evidence layer; the present emphasis was adopted during post hoc reappraisal and was not a prospectively registered hierarchy. Colocalization used complete available regional cis-eQTL statistics, including non-significant variants, matched to each disease dataset [8]. The expanded set included all 13 BBJ discoveries,</w:t>
-      </w:r>
-      <w:r>
-        <w:rPr>
-          <w:color w:val="000000"/>
-        </w:rPr>
-        <w:t xml:space="preserve"> </w:t>
-      </w:r>
-      <w:r>
-        <w:rPr>
-          <w:iCs/>
-          <w:i/>
-          <w:color w:val="000000"/>
-        </w:rPr>
-        <w:t xml:space="preserve">IGF1R</w:t>
-      </w:r>
-      <w:r>
-        <w:rPr>
-          <w:color w:val="000000"/>
-        </w:rPr>
-        <w:t xml:space="preserve">, nine additional FinnGen GD discoveries and</w:t>
-      </w:r>
-      <w:r>
-        <w:rPr>
-          <w:color w:val="000000"/>
-        </w:rPr>
-        <w:t xml:space="preserve"> </w:t>
-      </w:r>
-      <w:r>
-        <w:rPr>
-          <w:iCs/>
-          <w:i/>
-          <w:color w:val="000000"/>
-        </w:rPr>
-        <w:t xml:space="preserve">HLA-G</w:t>
-      </w:r>
-      <w:r>
-        <w:rPr>
-          <w:color w:val="000000"/>
-        </w:rPr>
-        <w:t xml:space="preserve">, which was selected because its MR significance changed after frequency substitution: 24 genes in total. We used coloc.abf with disease as dataset 1 and expression as dataset 2. Posterior probability of hypothesis 4 (PP.H4) measures support for a shared causal variant under the fitted model. PP.H3 instead supports distinct variants. We used PP.H4 ≥ 0.80 as a descriptive strong-support threshold, with priors p1 = p2 = 10</w:t>
-      </w:r>
-      <w:r>
-        <w:rPr>
-          <w:color w:val="000000"/>
-          <w:vertAlign w:val="superscript"/>
-        </w:rPr>
-        <w:t xml:space="preserve">−4</w:t>
-      </w:r>
-      <w:r>
-        <w:rPr>
-          <w:color w:val="000000"/>
-        </w:rPr>
-        <w:t xml:space="preserve"> </w:t>
-      </w:r>
-      <w:r>
-        <w:rPr>
-          <w:color w:val="000000"/>
-        </w:rPr>
-        <w:t xml:space="preserve">and p12 = 10</w:t>
-      </w:r>
-      <w:r>
-        <w:rPr>
-          <w:color w:val="000000"/>
-          <w:vertAlign w:val="superscript"/>
-        </w:rPr>
-        <w:t xml:space="preserve">−5</w:t>
-      </w:r>
-      <w:r>
-        <w:rPr>
-          <w:color w:val="000000"/>
-        </w:rPr>
-        <w:t xml:space="preserve">, and repeated analyses at p12 = 5×10</w:t>
-      </w:r>
-      <w:r>
-        <w:rPr>
-          <w:color w:val="000000"/>
-          <w:vertAlign w:val="superscript"/>
-        </w:rPr>
-        <w:t xml:space="preserve">−6</w:t>
-      </w:r>
-      <w:r>
-        <w:rPr>
-          <w:color w:val="000000"/>
-        </w:rPr>
-        <w:t xml:space="preserve"> </w:t>
-      </w:r>
-      <w:r>
-        <w:rPr>
-          <w:color w:val="000000"/>
-        </w:rPr>
-        <w:t xml:space="preserve">and 10</w:t>
-      </w:r>
-      <w:r>
-        <w:rPr>
-          <w:color w:val="000000"/>
-          <w:vertAlign w:val="superscript"/>
-        </w:rPr>
-        <w:t xml:space="preserve">−6</w:t>
-      </w:r>
-      <w:r>
-        <w:rPr>
-          <w:color w:val="000000"/>
-        </w:rPr>
-        <w:t xml:space="preserve"> </w:t>
-      </w:r>
-      <w:r>
-        <w:rPr>
-          <w:color w:val="000000"/>
-        </w:rPr>
-        <w:t xml:space="preserve">[24]. All five hypotheses are defined in Supplementary Methods. Low PP.H4 alone does not establish no disease association, and H3 does not prove multiple independent signals.</w:t>
-      </w:r>
-    </w:p>
-    <w:p>
-      <w:pPr>
-        <w:pStyle w:val="BodyText"/>
-      </w:pPr>
-      <w:r>
-        <w:rPr>
-          <w:color w:val="000000"/>
-        </w:rPr>
-        <w:t xml:space="preserve">We evaluated reference and eQTLGen cohort frequencies, distinguishing changes in effect scaling from changes in variant availability and harmonization. The 24-gene colocalization dataset contains 1,440 settings: 24 genes × five outcomes × four frequency/availability scenarios × three priors. For</w:t>
+        <w:t xml:space="preserve">For</w:t>
       </w:r>
       <w:r>
         <w:rPr>
@@ -1526,59 +1585,7 @@
         <w:rPr>
           <w:color w:val="000000"/>
         </w:rPr>
-        <w:t xml:space="preserve">, we additionally examined narrower windows, a common five-outcome variant set, raw regional disease peaks and all available source cis-eQTLs. For newly evaluated candidates, we checked marginal signal coverage, shared instruments and variant aliases.</w:t>
-      </w:r>
-      <w:r>
-        <w:rPr>
-          <w:color w:val="000000"/>
-        </w:rPr>
-        <w:t xml:space="preserve"> </w:t>
-      </w:r>
-      <w:r>
-        <w:rPr>
-          <w:iCs/>
-          <w:i/>
-          <w:color w:val="000000"/>
-        </w:rPr>
-        <w:t xml:space="preserve">C4B</w:t>
-      </w:r>
-      <w:r>
-        <w:rPr>
-          <w:color w:val="000000"/>
-        </w:rPr>
-        <w:t xml:space="preserve"> </w:t>
-      </w:r>
-      <w:r>
-        <w:rPr>
-          <w:color w:val="000000"/>
-        </w:rPr>
-        <w:t xml:space="preserve">and</w:t>
-      </w:r>
-      <w:r>
-        <w:rPr>
-          <w:color w:val="000000"/>
-        </w:rPr>
-        <w:t xml:space="preserve"> </w:t>
-      </w:r>
-      <w:r>
-        <w:rPr>
-          <w:iCs/>
-          <w:i/>
-          <w:color w:val="000000"/>
-        </w:rPr>
-        <w:t xml:space="preserve">HLA-G</w:t>
-      </w:r>
-      <w:r>
-        <w:rPr>
-          <w:color w:val="000000"/>
-        </w:rPr>
-        <w:t xml:space="preserve"> </w:t>
-      </w:r>
-      <w:r>
-        <w:rPr>
-          <w:color w:val="000000"/>
-        </w:rPr>
-        <w:t xml:space="preserve">underwent instrument-level frequency, weighting, heterogeneity and omission checks. Full-precision results are supplied in one Supplementary Dataset workbook. The original BBJ–ophthalmopathy combined filter is retained as a historical descriptive comparison, not promoted to a prospectively specified validation rule or the primary conclusion of this reappraisal.</w:t>
+        <w:t xml:space="preserve">, colocalization was repeated in narrower regions and in a variant set common to all five datasets, and we checked whether the matched variants included each dataset’s strongest regional disease variant (Supplementary Methods).</w:t>
       </w:r>
     </w:p>
     <w:bookmarkEnd w:id="24"/>
@@ -1602,7 +1609,59 @@
         <w:rPr>
           <w:color w:val="000000"/>
         </w:rPr>
-        <w:t xml:space="preserve">In a post hoc extension, we assessed both genes in a fixed panel of five GTEx v8 tissues: thyroid, cultured fibroblasts, subcutaneous adipose, visceral adipose and whole blood [25]. The extension plan was fixed before retrieving these tissue results, after the blood analysis was known. GTEx participants were predominantly of European ancestry, not exclusively European. Instruments required cis-eQTL</w:t>
+        <w:t xml:space="preserve">In a post hoc extension, we assessed</w:t>
+      </w:r>
+      <w:r>
+        <w:rPr>
+          <w:color w:val="000000"/>
+        </w:rPr>
+        <w:t xml:space="preserve"> </w:t>
+      </w:r>
+      <w:r>
+        <w:rPr>
+          <w:iCs/>
+          <w:i/>
+          <w:color w:val="000000"/>
+        </w:rPr>
+        <w:t xml:space="preserve">TSHR</w:t>
+      </w:r>
+      <w:r>
+        <w:rPr>
+          <w:color w:val="000000"/>
+        </w:rPr>
+        <w:t xml:space="preserve"> </w:t>
+      </w:r>
+      <w:r>
+        <w:rPr>
+          <w:color w:val="000000"/>
+        </w:rPr>
+        <w:t xml:space="preserve">and</w:t>
+      </w:r>
+      <w:r>
+        <w:rPr>
+          <w:color w:val="000000"/>
+        </w:rPr>
+        <w:t xml:space="preserve"> </w:t>
+      </w:r>
+      <w:r>
+        <w:rPr>
+          <w:iCs/>
+          <w:i/>
+          <w:color w:val="000000"/>
+        </w:rPr>
+        <w:t xml:space="preserve">IGF1R</w:t>
+      </w:r>
+      <w:r>
+        <w:rPr>
+          <w:color w:val="000000"/>
+        </w:rPr>
+        <w:t xml:space="preserve"> </w:t>
+      </w:r>
+      <w:r>
+        <w:rPr>
+          <w:color w:val="000000"/>
+        </w:rPr>
+        <w:t xml:space="preserve">in a fixed panel of five Genotype-Tissue Expression (GTEx) v8 tissues: thyroid, cultured skin fibroblasts, subcutaneous adipose, visceral adipose and whole blood [25]. The plan was fixed after the blood results were known but before tissue results were retrieved. GTEx donors were predominantly European. Instruments required cis-eQTL</w:t>
       </w:r>
       <w:r>
         <w:rPr>
@@ -1681,11 +1740,11 @@
         <w:rPr>
           <w:color w:val="000000"/>
         </w:rPr>
-        <w:t xml:space="preserve">&lt; 0.00125). Unestimable combinations remained in the correction denominators. Effects used the original slopes and standard errors for inverse-normal-transformed expression. Complete regional summaries were not obtained for this extension, so tissue colocalization was not performed; significant-only pairs were used solely for instrument selection. All planned combinations are reported in the Supplementary Dataset.</w:t>
+        <w:t xml:space="preserve">&lt; 0.00125). Unestimable combinations remained in the correction denominators. Effects used GTEx slopes and standard errors for inverse-normal-transformed expression. Tissue colocalization was not performed because complete regional statistics were not obtained.</w:t>
       </w:r>
     </w:p>
     <w:bookmarkEnd w:id="25"/>
-    <w:bookmarkStart w:id="26" w:name="orbital-expression-and-implementation"/>
+    <w:bookmarkStart w:id="26" w:name="descriptive-orbital-expression"/>
     <w:p>
       <w:pPr>
         <w:pStyle w:val="Heading3"/>
@@ -1694,7 +1753,7 @@
         <w:rPr>
           <w:color w:val="000000"/>
         </w:rPr>
-        <w:t xml:space="preserve">Orbital expression and implementation</w:t>
+        <w:t xml:space="preserve">Descriptive orbital expression</w:t>
       </w:r>
     </w:p>
     <w:p>
@@ -1705,7 +1764,7 @@
         <w:rPr>
           <w:color w:val="000000"/>
         </w:rPr>
-        <w:t xml:space="preserve">An in-house orbital RNA-sequencing series of four patients with inactive TED and one control provided descriptive context only (Supplementary Methods). Technical replicates were combined by biological sample, and transcript abundance was displayed without differential-expression significance testing (Figure S1). These observations were not used to select genes or validate the genetic findings. Analyses used R 4.3.3, TwoSampleMR 0.7.4, coloc 5.2.3 and PLINK 1.9, with independent numerical verification in Python. No age- or sex-stratified patient analyses, individual-level multivariable regression, Steiger directionality test or multi-signal colocalization was performed.</w:t>
+        <w:t xml:space="preserve">In-house RNA sequencing of orbital adipose tissue from four patients with inactive TED and of an upper-eyelid nasal fat pad from one control without thyroid disease was descriptive only (Supplementary Methods). Transcript abundance was displayed without significance testing (Figure S1) and was not used to select genes or validate the genetic findings.</w:t>
       </w:r>
     </w:p>
     <w:bookmarkEnd w:id="26"/>
@@ -2682,7 +2741,7 @@
         <w:rPr>
           <w:color w:val="000000"/>
         </w:rPr>
-        <w:t xml:space="preserve">The exploratory full FinnGen GD screen identified 13 genes, nine of them outside the BBJ discovery set (Table S1). Seven of the nine were instrumented in the extended MHC region, which was not excluded from the screen, and two pairs each shared one instrument.</w:t>
+        <w:t xml:space="preserve">The exploratory full FinnGen GD screen identified 13 genes, nine of them outside the BBJ discovery set (Table S1). Seven of the nine were instrumented in the extended MHC region, and two pairs each shared one instrument.</w:t>
       </w:r>
     </w:p>
     <w:bookmarkEnd w:id="30"/>
@@ -3221,7 +3280,7 @@
       </w:r>
     </w:p>
     <w:bookmarkEnd w:id="31"/>
-    <w:bookmarkStart w:id="32" w:name="colocalization"/>
+    <w:bookmarkStart w:id="32" w:name="colocalization-1"/>
     <w:p>
       <w:pPr>
         <w:pStyle w:val="Heading3"/>
@@ -3840,7 +3899,7 @@
       </w:r>
     </w:p>
     <w:bookmarkEnd w:id="33"/>
-    <w:bookmarkStart w:id="34" w:name="descriptive-orbital-expression"/>
+    <w:bookmarkStart w:id="34" w:name="descriptive-orbital-expression-1"/>
     <w:p>
       <w:pPr>
         <w:pStyle w:val="Heading3"/>
@@ -4687,7 +4746,7 @@
         <w:rPr>
           <w:color w:val="000000"/>
         </w:rPr>
-        <w:t xml:space="preserve">The FinnGen extensions, candidate expansion and colocalization emphasis were post hoc, and only the discovery and focused thresholds address specified test families. The single</w:t>
+        <w:t xml:space="preserve">The FinnGen extensions, candidate expansion and colocalization emphasis were post hoc, and only the screen, focused and tissue-family thresholds address specified test families. The single</w:t>
       </w:r>
       <w:r>
         <w:rPr>

</xml_diff>

<commit_message>
Record co-first-author contributions and acknowledge the orbital data provider
Co-Authored-By: Claude Opus 5.5 <noreply@anthropic.com>
Claude-Session: https://claude.ai/code/session_01TiAKffYKtUstdRZFkwtJA9
</commit_message>
<xml_diff>
--- a/submission/candidate_20261011_review/Manuscript.docx
+++ b/submission/candidate_20261011_review/Manuscript.docx
@@ -5084,7 +5084,7 @@
         <w:rPr>
           <w:color w:val="000000"/>
         </w:rPr>
-        <w:t xml:space="preserve">J.P. and M.-S.K. contributed equally to this work. J.P. conceived and designed the study, performed the analyses, and drafted the manuscript. M.-S.K. contributed to data collection and interpretation. S.-W.Y. supervised the study and revised the manuscript.</w:t>
+        <w:t xml:space="preserve">J.P. and M.-S.K. contributed equally to this work; both performed the analyses and drafted the manuscript. J.P. conceived and designed the study. M.-S.K. contributed to data collection and interpretation. S.-W.Y. supervised the study and revised the manuscript.</w:t>
       </w:r>
     </w:p>
     <w:p>
@@ -5109,7 +5109,7 @@
         <w:rPr>
           <w:color w:val="000000"/>
         </w:rPr>
-        <w:t xml:space="preserve">We thank the eQTLGen Consortium, the GTEx Consortium, Biobank Japan, the UK Biobank, and the FinnGen study and its participants for making their summary statistics publicly available. We acknowledge the GWAS Catalog for hosting and distributing the genome-wide association summary statistics used as outcome data.</w:t>
+        <w:t xml:space="preserve">We thank Kyung-Hwa Shin (Department of Laboratory Medicine, Pusan National University Hospital) for providing the orbital tissue RNA-sequencing data. We thank the eQTLGen Consortium, the GTEx Consortium, Biobank Japan, the UK Biobank, and the FinnGen study and its participants for making their summary statistics publicly available. We acknowledge the GWAS Catalog for hosting and distributing the genome-wide association summary statistics used as outcome data.</w:t>
       </w:r>
     </w:p>
     <w:bookmarkEnd w:id="39"/>

</xml_diff>

<commit_message>
Rewrite the Introduction to the approved plan
Author-approved steps 5 and 6. The Introduction now has four paragraphs
(clinical problem and question; MR and colocalization in plain words; prior
studies and gap; aim, design and scope) and discloses, without numbers, that
Zhang 2026 reported the same TSHR colocalization pattern on the same FinnGen
R12 endpoints. Three references cited only in the old Introduction were
removed and eleven PubMed-checked references added; all citations were
renumbered in first-citation order (43 references), with sentences outside
the Introduction unchanged. The audit's reference-count guard is now 43.

Introduction 597 -> 481 words; main text 3,677 of 5,000 with sub-headings.

Co-Authored-By: Claude Opus 5.5 <noreply@anthropic.com>
Claude-Session: https://claude.ai/code/session_01TiAKffYKtUstdRZFkwtJA9
</commit_message>
<xml_diff>
--- a/submission/candidate_20261011_review/Manuscript.docx
+++ b/submission/candidate_20261011_review/Manuscript.docx
@@ -694,7 +694,33 @@
         <w:rPr>
           <w:color w:val="000000"/>
         </w:rPr>
-        <w:t xml:space="preserve">Thyroid eye disease (TED) can cause proptosis, diplopia and visual impairment in patients with Graves disease (GD) [1, 2]. Teprotumumab, which blocks the insulin-like growth factor 1 receptor (IGF-1R), improves clinical outcomes in active TED [3]. Its efficacy raises a related but distinct question: does inherited variation influencing</w:t>
+        <w:t xml:space="preserve">Thyroid eye disease (TED), or Graves ophthalmopathy, can cause proptosis, diplopia and visual loss in patients with Graves disease (GD) [1, 2]; a meta-analysis estimated that it affects about 40% of them [3]. In GD, autoantibodies that stimulate the thyroid-stimulating hormone receptor (TSHR) cause hyperthyroidism [2]. Common</w:t>
+      </w:r>
+      <w:r>
+        <w:rPr>
+          <w:color w:val="000000"/>
+        </w:rPr>
+        <w:t xml:space="preserve"> </w:t>
+      </w:r>
+      <w:r>
+        <w:rPr>
+          <w:iCs/>
+          <w:i/>
+          <w:color w:val="000000"/>
+        </w:rPr>
+        <w:t xml:space="preserve">TSHR</w:t>
+      </w:r>
+      <w:r>
+        <w:rPr>
+          <w:color w:val="000000"/>
+        </w:rPr>
+        <w:t xml:space="preserve"> </w:t>
+      </w:r>
+      <w:r>
+        <w:rPr>
+          <w:color w:val="000000"/>
+        </w:rPr>
+        <w:t xml:space="preserve">variants are established GD risk factors in European and East Asian populations [4, 5], but no TED-specific risk variant is known [6]. In orbital fibroblasts, TSHR forms a signaling complex with the insulin-like growth factor 1 receptor (IGF-1R) [7, 8], and the IGF-1R–blocking antibody teprotumumab reduced proptosis in randomized trials in active TED [9, 10]. Genetically supported drug targets succeed more often, but most approved drug mechanisms lack such support [11, 12], so an effective target need not be a susceptibility gene. Whether inherited variation in</w:t>
       </w:r>
       <w:r>
         <w:rPr>
@@ -720,7 +746,7 @@
         <w:rPr>
           <w:color w:val="000000"/>
         </w:rPr>
-        <w:t xml:space="preserve">expression contribute to disease susceptibility in the same way as variation at</w:t>
+        <w:t xml:space="preserve">expression, like</w:t>
       </w:r>
       <w:r>
         <w:rPr>
@@ -740,7 +766,13 @@
         <w:rPr>
           <w:color w:val="000000"/>
         </w:rPr>
-        <w:t xml:space="preserve">, the established GD autoantigen and susceptibility locus?</w:t>
+        <w:t xml:space="preserve"> </w:t>
+      </w:r>
+      <w:r>
+        <w:rPr>
+          <w:color w:val="000000"/>
+        </w:rPr>
+        <w:t xml:space="preserve">variation, is associated with GD or TED is unclear.</w:t>
       </w:r>
     </w:p>
     <w:p>
@@ -751,7 +783,33 @@
         <w:rPr>
           <w:color w:val="000000"/>
         </w:rPr>
-        <w:t xml:space="preserve">TSHR and IGF-1R interact in experimental models of orbital disease [4, 5, 6]. However, treatment response, inherited gene regulation and gene expression in inflamed tissue address different biological questions. A receptor may be a useful treatment target without equally strong genetic evidence linking its expression to disease onset. Distinguishing these forms of evidence helps clinicians interpret genetic studies of therapeutic targets.</w:t>
+        <w:t xml:space="preserve">Mendelian randomization (MR) treats inherited variants as a natural experiment: because alleles are allocated at conception, comparing people whose variants raise or lower a gene’s expression is less prone to confounding and reverse causation than other observational comparisons, provided the variants affect disease only through that expression [13]. Their effects are lifelong, unlike a drug’s, and can differ between tissues [14]. Here, genetically proxied expression means blood expression predicted from inherited variants rather than measured directly, and the outcomes are diagnoses, not treatment responses. MR reports odds ratios (ORs) with 95% confidence intervals (CIs). Colocalization asks whether expression and disease signals in a region share one causal variant and reports probabilities, not</w:t>
+      </w:r>
+      <w:r>
+        <w:rPr>
+          <w:color w:val="000000"/>
+        </w:rPr>
+        <w:t xml:space="preserve"> </w:t>
+      </w:r>
+      <w:r>
+        <w:rPr>
+          <w:iCs/>
+          <w:i/>
+          <w:color w:val="000000"/>
+        </w:rPr>
+        <w:t xml:space="preserve">P</w:t>
+      </w:r>
+      <w:r>
+        <w:rPr>
+          <w:color w:val="000000"/>
+        </w:rPr>
+        <w:t xml:space="preserve"> </w:t>
+      </w:r>
+      <w:r>
+        <w:rPr>
+          <w:color w:val="000000"/>
+        </w:rPr>
+        <w:t xml:space="preserve">values [15]. Because nearby variants are often inherited together, an MR association can be highly significant even when the two signals come from distinct variants [16, 17].</w:t>
       </w:r>
     </w:p>
     <w:p>
@@ -762,59 +820,105 @@
         <w:rPr>
           <w:color w:val="000000"/>
         </w:rPr>
-        <w:t xml:space="preserve">Mendelian randomization (MR) uses variants associated with an exposure to investigate its relationship with the disease phenotype being studied, termed the outcome [7]. Here, the exposure is blood gene expression and the outcomes are disease diagnoses, not responses to treatment. Because alleles are allocated at conception, MR is less prone than ordinary observational studies to confounding and reverse causation, but it supports causal interpretation only when its instrumental-variable assumptions hold. Colocalization asks whether expression and disease associations in a genomic region are consistent with the same causal variant [8]. Distinct nearby variants can appear connected because they are inherited together. Thus, an MR association may be highly significant even when the regional signals do not support a shared variant. MR reports odds ratios (ORs), confidence intervals (CIs) and</w:t>
-      </w:r>
-      <w:r>
-        <w:rPr>
-          <w:color w:val="000000"/>
-        </w:rPr>
-        <w:t xml:space="preserve"> </w:t>
-      </w:r>
-      <w:r>
-        <w:rPr>
-          <w:iCs/>
-          <w:i/>
-          <w:color w:val="000000"/>
-        </w:rPr>
-        <w:t xml:space="preserve">P</w:t>
-      </w:r>
-      <w:r>
-        <w:rPr>
-          <w:color w:val="000000"/>
-        </w:rPr>
-        <w:t xml:space="preserve"> </w:t>
-      </w:r>
-      <w:r>
-        <w:rPr>
-          <w:color w:val="000000"/>
-        </w:rPr>
-        <w:t xml:space="preserve">values; colocalization reports model-based posterior probabilities, which are not</w:t>
-      </w:r>
-      <w:r>
-        <w:rPr>
-          <w:color w:val="000000"/>
-        </w:rPr>
-        <w:t xml:space="preserve"> </w:t>
-      </w:r>
-      <w:r>
-        <w:rPr>
-          <w:iCs/>
-          <w:i/>
-          <w:color w:val="000000"/>
-        </w:rPr>
-        <w:t xml:space="preserve">P</w:t>
-      </w:r>
-      <w:r>
-        <w:rPr>
-          <w:color w:val="000000"/>
-        </w:rPr>
-        <w:t xml:space="preserve"> </w:t>
-      </w:r>
-      <w:r>
-        <w:rPr>
-          <w:color w:val="000000"/>
-        </w:rPr>
-        <w:t xml:space="preserve">values.</w:t>
+        <w:t xml:space="preserve">In FinnGen release 10, Ji and colleagues linked higher genetically proxied blood</w:t>
+      </w:r>
+      <w:r>
+        <w:rPr>
+          <w:color w:val="000000"/>
+        </w:rPr>
+        <w:t xml:space="preserve"> </w:t>
+      </w:r>
+      <w:r>
+        <w:rPr>
+          <w:iCs/>
+          <w:i/>
+          <w:color w:val="000000"/>
+        </w:rPr>
+        <w:t xml:space="preserve">TSHR</w:t>
+      </w:r>
+      <w:r>
+        <w:rPr>
+          <w:color w:val="000000"/>
+        </w:rPr>
+        <w:t xml:space="preserve"> </w:t>
+      </w:r>
+      <w:r>
+        <w:rPr>
+          <w:color w:val="000000"/>
+        </w:rPr>
+        <w:t xml:space="preserve">expression to lower odds of GD and strict ophthalmopathy [18]. Using release 12 endpoints also analyzed here, Zhang and colleagues reported shared-variant support for</w:t>
+      </w:r>
+      <w:r>
+        <w:rPr>
+          <w:color w:val="000000"/>
+        </w:rPr>
+        <w:t xml:space="preserve"> </w:t>
+      </w:r>
+      <w:r>
+        <w:rPr>
+          <w:iCs/>
+          <w:i/>
+          <w:color w:val="000000"/>
+        </w:rPr>
+        <w:t xml:space="preserve">TSHR</w:t>
+      </w:r>
+      <w:r>
+        <w:rPr>
+          <w:color w:val="000000"/>
+        </w:rPr>
+        <w:t xml:space="preserve"> </w:t>
+      </w:r>
+      <w:r>
+        <w:rPr>
+          <w:color w:val="000000"/>
+        </w:rPr>
+        <w:t xml:space="preserve">with the broader ophthalmopathy endpoint but weak support with GD [19]. A proteome-wide MR study of GD and ophthalmopathy prioritized other proteins [20]. None of these studies compared</w:t>
+      </w:r>
+      <w:r>
+        <w:rPr>
+          <w:color w:val="000000"/>
+        </w:rPr>
+        <w:t xml:space="preserve"> </w:t>
+      </w:r>
+      <w:r>
+        <w:rPr>
+          <w:iCs/>
+          <w:i/>
+          <w:color w:val="000000"/>
+        </w:rPr>
+        <w:t xml:space="preserve">IGF1R</w:t>
+      </w:r>
+      <w:r>
+        <w:rPr>
+          <w:color w:val="000000"/>
+        </w:rPr>
+        <w:t xml:space="preserve"> </w:t>
+      </w:r>
+      <w:r>
+        <w:rPr>
+          <w:color w:val="000000"/>
+        </w:rPr>
+        <w:t xml:space="preserve">with</w:t>
+      </w:r>
+      <w:r>
+        <w:rPr>
+          <w:color w:val="000000"/>
+        </w:rPr>
+        <w:t xml:space="preserve"> </w:t>
+      </w:r>
+      <w:r>
+        <w:rPr>
+          <w:iCs/>
+          <w:i/>
+          <w:color w:val="000000"/>
+        </w:rPr>
+        <w:t xml:space="preserve">TSHR</w:t>
+      </w:r>
+      <w:r>
+        <w:rPr>
+          <w:color w:val="000000"/>
+        </w:rPr>
+        <w:t xml:space="preserve">, and all relied mainly on FinnGen.</w:t>
       </w:r>
     </w:p>
     <w:p>
@@ -825,7 +929,7 @@
         <w:rPr>
           <w:color w:val="000000"/>
         </w:rPr>
-        <w:t xml:space="preserve">Previous genetic studies have already implicated</w:t>
+        <w:t xml:space="preserve">Within an MR screen of potentially druggable genes [21], we therefore compared genetic evidence linking blood</w:t>
       </w:r>
       <w:r>
         <w:rPr>
@@ -851,59 +955,7 @@
         <w:rPr>
           <w:color w:val="000000"/>
         </w:rPr>
-        <w:t xml:space="preserve">in GD and Graves ophthalmopathy. Ji and colleagues integrated blood methylation, expression and protein associations with GD, reporting</w:t>
-      </w:r>
-      <w:r>
-        <w:rPr>
-          <w:color w:val="000000"/>
-        </w:rPr>
-        <w:t xml:space="preserve"> </w:t>
-      </w:r>
-      <w:r>
-        <w:rPr>
-          <w:iCs/>
-          <w:i/>
-          <w:color w:val="000000"/>
-        </w:rPr>
-        <w:t xml:space="preserve">TSHR</w:t>
-      </w:r>
-      <w:r>
-        <w:rPr>
-          <w:color w:val="000000"/>
-        </w:rPr>
-        <w:t xml:space="preserve"> </w:t>
-      </w:r>
-      <w:r>
-        <w:rPr>
-          <w:color w:val="000000"/>
-        </w:rPr>
-        <w:t xml:space="preserve">among the expression-associated genes also supported in a strict FinnGen ophthalmopathy dataset [9]. Other MR work has examined inflammatory proteins in ophthalmopathy [10], and recent integrative research has investigated</w:t>
-      </w:r>
-      <w:r>
-        <w:rPr>
-          <w:color w:val="000000"/>
-        </w:rPr>
-        <w:t xml:space="preserve"> </w:t>
-      </w:r>
-      <w:r>
-        <w:rPr>
-          <w:iCs/>
-          <w:i/>
-          <w:color w:val="000000"/>
-        </w:rPr>
-        <w:t xml:space="preserve">TSHR</w:t>
-      </w:r>
-      <w:r>
-        <w:rPr>
-          <w:color w:val="000000"/>
-        </w:rPr>
-        <w:t xml:space="preserve"> </w:t>
-      </w:r>
-      <w:r>
-        <w:rPr>
-          <w:color w:val="000000"/>
-        </w:rPr>
-        <w:t xml:space="preserve">across genetic and transcriptomic data in GD and ophthalmopathy [11]. These findings establish a basis for comparing clinically relevant receptors, but do not determine whether evidence for their blood expression is consistently supported across disease definitions under the same analysis framework. In particular, limited evidence for</w:t>
+        <w:t xml:space="preserve">and</w:t>
       </w:r>
       <w:r>
         <w:rPr>
@@ -929,96 +981,7 @@
         <w:rPr>
           <w:color w:val="000000"/>
         </w:rPr>
-        <w:t xml:space="preserve">could reflect imprecision or dependence on particular instruments, while a strong MR association for</w:t>
-      </w:r>
-      <w:r>
-        <w:rPr>
-          <w:color w:val="000000"/>
-        </w:rPr>
-        <w:t xml:space="preserve"> </w:t>
-      </w:r>
-      <w:r>
-        <w:rPr>
-          <w:iCs/>
-          <w:i/>
-          <w:color w:val="000000"/>
-        </w:rPr>
-        <w:t xml:space="preserve">TSHR</w:t>
-      </w:r>
-      <w:r>
-        <w:rPr>
-          <w:color w:val="000000"/>
-        </w:rPr>
-        <w:t xml:space="preserve"> </w:t>
-      </w:r>
-      <w:r>
-        <w:rPr>
-          <w:color w:val="000000"/>
-        </w:rPr>
-        <w:t xml:space="preserve">does not by itself establish that expression and disease share a causal variant. The remaining question is how robustly these two expression traits are associated with GD and related phenotypes, and how far those associations support biological interpretation.</w:t>
-      </w:r>
-    </w:p>
-    <w:p>
-      <w:pPr>
-        <w:pStyle w:val="BodyText"/>
-      </w:pPr>
-      <w:r>
-        <w:rPr>
-          <w:color w:val="000000"/>
-        </w:rPr>
-        <w:t xml:space="preserve">To address this question, we compared genetically proxied blood expression of</w:t>
-      </w:r>
-      <w:r>
-        <w:rPr>
-          <w:color w:val="000000"/>
-        </w:rPr>
-        <w:t xml:space="preserve"> </w:t>
-      </w:r>
-      <w:r>
-        <w:rPr>
-          <w:iCs/>
-          <w:i/>
-          <w:color w:val="000000"/>
-        </w:rPr>
-        <w:t xml:space="preserve">TSHR</w:t>
-      </w:r>
-      <w:r>
-        <w:rPr>
-          <w:color w:val="000000"/>
-        </w:rPr>
-        <w:t xml:space="preserve"> </w:t>
-      </w:r>
-      <w:r>
-        <w:rPr>
-          <w:color w:val="000000"/>
-        </w:rPr>
-        <w:t xml:space="preserve">and</w:t>
-      </w:r>
-      <w:r>
-        <w:rPr>
-          <w:color w:val="000000"/>
-        </w:rPr>
-        <w:t xml:space="preserve"> </w:t>
-      </w:r>
-      <w:r>
-        <w:rPr>
-          <w:iCs/>
-          <w:i/>
-          <w:color w:val="000000"/>
-        </w:rPr>
-        <w:t xml:space="preserve">IGF1R</w:t>
-      </w:r>
-      <w:r>
-        <w:rPr>
-          <w:color w:val="000000"/>
-        </w:rPr>
-        <w:t xml:space="preserve"> </w:t>
-      </w:r>
-      <w:r>
-        <w:rPr>
-          <w:color w:val="000000"/>
-        </w:rPr>
-        <w:t xml:space="preserve">— expression predicted from inherited variants rather than measured directly — within a screen of genes encoding potentially druggable proteins, using</w:t>
+        <w:t xml:space="preserve">expression with GD in Biobank Japan (BBJ; discovery) and FinnGen, hyperthyroidism in UK Biobank (UKB) and two ophthalmopathy endpoints in FinnGen.</w:t>
       </w:r>
       <w:r>
         <w:rPr>
@@ -1038,13 +1001,7 @@
         <w:rPr>
           <w:color w:val="000000"/>
         </w:rPr>
-        <w:t xml:space="preserve"> </w:t>
-      </w:r>
-      <w:r>
-        <w:rPr>
-          <w:color w:val="000000"/>
-        </w:rPr>
-        <w:t xml:space="preserve">and other associated genes as context. We used Biobank Japan (BBJ) GD for discovery, compared the original findings with UK Biobank (UKB) hyperthyroidism and FinnGen ophthalmopathy, and subsequently added FinnGen GD and a stricter ophthalmopathy definition. We evaluated effect direction, precision and statistical support across these datasets, then examined dependence on individual instruments, allele frequencies and colocalization assumptions. A later fixed-panel tissue extension evaluated whether these patterns extended beyond the original blood instruments. Our aim was to characterize the consistency and limits of expression-related genetic evidence for the two receptors. The analyses distinguish GD from broader hyperthyroidism and population-controlled ophthalmopathy; they do not directly estimate TED susceptibility among patients who already have GD or predict treatment response. A small in-house orbital RNA-sequencing series (four TED samples and one control) is reported only as descriptive context.</w:t>
+        <w:t xml:space="preserve">, an established autoimmune susceptibility gene, served as comparator [5, 22]. The three FinnGen endpoints overlap and are not independent replications. We examined colocalization and sensitivity to single variants, allele frequencies and colocalization assumptions; FinnGen GD, strict ophthalmopathy, tissue-specific and several sensitivity analyses were post hoc. Because the ophthalmopathy endpoints used population controls, they cannot estimate TED risk among patients with GD, and no analysis predicts treatment response. Orbital RNA-sequencing data (four TED samples, one control) are descriptive only.</w:t>
       </w:r>
     </w:p>
     <w:bookmarkEnd w:id="21"/>
@@ -1080,7 +1037,7 @@
         <w:rPr>
           <w:color w:val="000000"/>
         </w:rPr>
-        <w:t xml:space="preserve">This two-sample MR study used public association summary statistics and followed STROBE-MR reporting guidance [12]. Exposure data were whole-blood expression quantitative trait locus (eQTL; a variant associated with gene expression) statistics from predominantly European eQTLGen participants [13]. The original outcomes were BBJ GD, UKB self-reported hyperthyroidism or thyrotoxicosis, and Graves ophthalmopathy in FinnGen release 12 (FinnGen ophthalmopathy) [14, 15, 16]. We later added two FinnGen endpoints: E4_GRAVES_STRICT (FinnGen GD) and E4_GRAVES_OPHT_STRICT (strict ophthalmopathy). Table 1 gives case and control counts. UKB ancestry was not established as exclusively European.</w:t>
+        <w:t xml:space="preserve">This two-sample MR study used public association summary statistics and followed STROBE-MR reporting guidance [23]. Exposure data were whole-blood expression quantitative trait locus (eQTL; a variant associated with gene expression) statistics from predominantly European eQTLGen participants [24]. The original outcomes were BBJ GD, UKB self-reported hyperthyroidism or thyrotoxicosis, and Graves ophthalmopathy in FinnGen release 12 (FinnGen ophthalmopathy) [25, 26, 27]. We later added two FinnGen endpoints: E4_GRAVES_STRICT (FinnGen GD) and E4_GRAVES_OPHT_STRICT (strict ophthalmopathy). Table 1 gives case and control counts. UKB ancestry was not established as exclusively European.</w:t>
       </w:r>
     </w:p>
     <w:p>
@@ -1115,7 +1072,7 @@
         <w:rPr>
           <w:color w:val="000000"/>
         </w:rPr>
-        <w:t xml:space="preserve">For 4,462 potentially druggable genes [17], instruments (variants used to represent a gene’s expression) were blood eQTLs with</w:t>
+        <w:t xml:space="preserve">For 4,462 potentially druggable genes [21], instruments (variants used to represent a gene’s expression) were blood eQTLs with</w:t>
       </w:r>
       <w:r>
         <w:rPr>
@@ -1160,7 +1117,7 @@
         <w:rPr>
           <w:color w:val="000000"/>
         </w:rPr>
-        <w:t xml:space="preserve">within 1 Mb of the gene (cis-eQTLs). PLINK clumping kept only uncorrelated variants (linkage disequilibrium [LD] r² &lt; 0.001 within 10 Mb, in 503 European participants from 1000 Genomes Phase 3) [18, 19]. This gave 6,135 single-nucleotide polymorphism (SNP)–gene pairs for 2,544 genes (minimum F statistic 29.7; F &gt; 10 is the usual threshold for adequate instrument strength), and the extended major histocompatibility complex region was not excluded. Variant effects on expression, in standard deviation units, were derived from eQTLGen Z statistics, sample sizes and 1000 Genomes European allele frequencies [20]. TwoSampleMR aligned exposure and disease effects to the same allele, excluding unavailable and strand-ambiguous (palindromic) variants. UKB linear-model estimates were rescaled using the case proportion to approximate the log-odds scale of BBJ and FinnGen (Supplementary Methods).</w:t>
+        <w:t xml:space="preserve">within 1 Mb of the gene (cis-eQTLs). PLINK clumping kept only uncorrelated variants (linkage disequilibrium [LD] r² &lt; 0.001 within 10 Mb, in 503 European participants from 1000 Genomes Phase 3) [28, 29]. This gave 6,135 single-nucleotide polymorphism (SNP)–gene pairs for 2,544 genes (minimum F statistic 29.7; F &gt; 10 is the usual threshold for adequate instrument strength), and the extended major histocompatibility complex region was not excluded. Variant effects on expression, in standard deviation units, were derived from eQTLGen Z statistics, sample sizes and 1000 Genomes European allele frequencies [30]. TwoSampleMR aligned exposure and disease effects to the same allele, excluding unavailable and strand-ambiguous (palindromic) variants. UKB linear-model estimates were rescaled using the case proportion to approximate the log-odds scale of BBJ and FinnGen (Supplementary Methods).</w:t>
       </w:r>
     </w:p>
     <w:p>
@@ -1171,7 +1128,7 @@
         <w:rPr>
           <w:color w:val="000000"/>
         </w:rPr>
-        <w:t xml:space="preserve">For each gene and dataset, MR used the Wald ratio (disease effect divided by expression effect) for one instrument and, for several, multiplicative random-effects inverse-variance weighting (IVW), a precision-weighted average [21]. Estimates are ORs per approximately one standard deviation higher genetically proxied blood expression, with 95% CIs and two-sided</w:t>
+        <w:t xml:space="preserve">For each gene and dataset, MR used the Wald ratio (disease effect divided by expression effect) for one instrument and, for several, multiplicative random-effects inverse-variance weighting (IVW), a precision-weighted average [31]. Estimates are ORs per approximately one standard deviation higher genetically proxied blood expression, with 95% CIs and two-sided</w:t>
       </w:r>
       <w:r>
         <w:rPr>
@@ -1298,7 +1255,7 @@
         <w:rPr>
           <w:color w:val="000000"/>
         </w:rPr>
-        <w:t xml:space="preserve">For estimates with several instruments, Cochran’s Q test assessed heterogeneity among instruments and, for selected genes, post hoc omission of each instrument in turn (leave-one-out) assessed dependence on single variants. MR-Egger regression, whose intercept tests whether instruments affect disease through other pathways (directional pleiotropy), and weighted-median and weighted-mode estimators [22, 23] were applied only in the original three datasets (Supplementary Dataset, MR_estimators_original). Analyses were repeated with exposure effects reconstructed from eQTLGen cohort allele frequencies; for</w:t>
+        <w:t xml:space="preserve">For estimates with several instruments, Cochran’s Q test assessed heterogeneity among instruments and, for selected genes, post hoc omission of each instrument in turn (leave-one-out) assessed dependence on single variants. MR-Egger regression, whose intercept tests whether instruments affect disease through other pathways (directional pleiotropy), and weighted-median and weighted-mode estimators [32, 33] were applied only in the original three datasets (Supplementary Dataset, MR_estimators_original). Analyses were repeated with exposure effects reconstructed from eQTLGen cohort allele frequencies; for</w:t>
       </w:r>
       <w:r>
         <w:rPr>
@@ -1405,7 +1362,7 @@
         <w:rPr>
           <w:color w:val="000000"/>
         </w:rPr>
-        <w:t xml:space="preserve">MR associations are the main findings, and colocalization was used to interpret them; the original analysis reported both in parallel, and this emphasis was adopted post hoc without prospective registration. We used coloc.abf, which assumes at most one causal variant per trait, with all available eQTLGen cis-eQTL statistics for each gene, significant or not, matched to each disease dataset [8]. It was applied to 24 genes: the 13 BBJ discoveries,</w:t>
+        <w:t xml:space="preserve">MR associations are the main findings, and colocalization was used to interpret them; the original analysis reported both in parallel, and this emphasis was adopted post hoc without prospective registration. We used coloc.abf, which assumes at most one causal variant per trait, with all available eQTLGen cis-eQTL statistics for each gene, significant or not, matched to each disease dataset [15]. It was applied to 24 genes: the 13 BBJ discoveries,</w:t>
       </w:r>
       <w:r>
         <w:rPr>
@@ -1528,7 +1485,7 @@
         <w:rPr>
           <w:color w:val="000000"/>
         </w:rPr>
-        <w:t xml:space="preserve">[24]. PP.H4 ≥ 0.80 was a descriptive reporting threshold.</w:t>
+        <w:t xml:space="preserve">[34]. PP.H4 ≥ 0.80 was a descriptive reporting threshold.</w:t>
       </w:r>
     </w:p>
     <w:p>
@@ -1635,7 +1592,7 @@
         <w:rPr>
           <w:color w:val="000000"/>
         </w:rPr>
-        <w:t xml:space="preserve">in a fixed panel of five Genotype-Tissue Expression (GTEx) v8 tissues: thyroid, cultured skin fibroblasts, subcutaneous adipose, visceral adipose and whole blood [25]. The plan was fixed after the blood results were known but before tissue results were retrieved. GTEx donors were predominantly European. Instruments required cis-eQTL</w:t>
+        <w:t xml:space="preserve">in a fixed panel of five Genotype-Tissue Expression (GTEx) v8 tissues: thyroid, cultured skin fibroblasts, subcutaneous adipose, visceral adipose and whole blood [35]. The plan was fixed after the blood results were known but before tissue results were retrieved. GTEx donors were predominantly European. Instruments required cis-eQTL</w:t>
       </w:r>
       <w:r>
         <w:rPr>
@@ -4105,7 +4062,7 @@
         <w:rPr>
           <w:color w:val="000000"/>
         </w:rPr>
-        <w:t xml:space="preserve">expression to GD and strict ophthalmopathy in an earlier FinnGen release [9], and integrative work also investigated</w:t>
+        <w:t xml:space="preserve">expression to GD and strict ophthalmopathy in an earlier FinnGen release [18], and integrative work also investigated</w:t>
       </w:r>
       <w:r>
         <w:rPr>
@@ -4131,7 +4088,7 @@
         <w:rPr>
           <w:color w:val="000000"/>
         </w:rPr>
-        <w:t xml:space="preserve">[11]. We add an</w:t>
+        <w:t xml:space="preserve">[19]. We add an</w:t>
       </w:r>
       <w:r>
         <w:rPr>
@@ -4157,7 +4114,7 @@
         <w:rPr>
           <w:color w:val="000000"/>
         </w:rPr>
-        <w:t xml:space="preserve">comparison, GD in two populations and a druggable-gene screen. Both studies used eQTLGen and FinnGen, so agreement is not fully independent. Ji and colleagues accepted PP.H4 above 0.50 [9], whereas we used PP.H4 ≥ 0.80 with p12 = 10</w:t>
+        <w:t xml:space="preserve">comparison, GD in two populations and a druggable-gene screen. Both studies used eQTLGen and FinnGen, so agreement is not fully independent. Ji and colleagues accepted PP.H4 above 0.50 [18], whereas we used PP.H4 ≥ 0.80 with p12 = 10</w:t>
       </w:r>
       <w:r>
         <w:rPr>
@@ -4207,7 +4164,7 @@
         <w:rPr>
           <w:color w:val="000000"/>
         </w:rPr>
-        <w:t xml:space="preserve">estimates relied heavily on rs13030124; with that caveat, its direction-consistent associations across all five datasets support it as an autoimmune comparator [26].</w:t>
+        <w:t xml:space="preserve">estimates relied heavily on rs13030124; with that caveat, its direction-consistent associations across all five datasets support it as an autoimmune comparator [22].</w:t>
       </w:r>
       <w:r>
         <w:rPr>
@@ -4388,7 +4345,7 @@
         <w:rPr>
           <w:color w:val="000000"/>
         </w:rPr>
-        <w:t xml:space="preserve">The lower-odds direction need not contradict stimulating-antibody pathogenesis: blood transcript abundance, tissue expression and receptor activation are different exposures with tissue-dependent regulatory effects [25]. The expression-increasing rs179252-G allele is linked to rs179247-G, the GD-protective allele associated with greater intrathymic</w:t>
+        <w:t xml:space="preserve">The lower-odds direction need not contradict stimulating-antibody pathogenesis: blood transcript abundance, tissue expression and receptor activation are different exposures with tissue-dependent regulatory effects [35]. The expression-increasing rs179252-G allele is linked to rs179247-G, the GD-protective allele associated with greater intrathymic</w:t>
       </w:r>
       <w:r>
         <w:rPr>
@@ -4414,7 +4371,7 @@
         <w:rPr>
           <w:color w:val="000000"/>
         </w:rPr>
-        <w:t xml:space="preserve">transcription [27, 28]; this fits central tolerance, though the thymic step was untested and neither variant is a proven causal regulator. Each rs179252-G allele raises blood expression by 0.105 standard deviation, and its per-allele disease ORs were 0.80 (BBJ), 0.77 (UKB), 0.78 (FinnGen ophthalmopathy), 0.77 (FinnGen GD) and 0.82 (strict ophthalmopathy); rescaled to one standard deviation, these moderate effects give the reported odds ratios, which describe lifelong inherited differences, not raised</w:t>
+        <w:t xml:space="preserve">transcription [36, 37]; this fits central tolerance, though the thymic step was untested and neither variant is a proven causal regulator. Each rs179252-G allele raises blood expression by 0.105 standard deviation, and its per-allele disease ORs were 0.80 (BBJ), 0.77 (UKB), 0.78 (FinnGen ophthalmopathy), 0.77 (FinnGen GD) and 0.82 (strict ophthalmopathy); rescaled to one standard deviation, these moderate effects give the reported odds ratios, which describe lifelong inherited differences, not raised</w:t>
       </w:r>
       <w:r>
         <w:rPr>
@@ -4529,7 +4486,7 @@
         <w:rPr>
           <w:color w:val="000000"/>
         </w:rPr>
-        <w:t xml:space="preserve">in BBJ and FinnGen GD, so association strength and shared-variant evidence are not interchangeable: a non-zero MR estimate can arise from distinct but correlated variants [29]. These two datasets had the most cases, and their strongest regional disease variant was more strongly associated than rs179252 (Table S3); regional checks excluded a missing-peak explanation but did not identify the causal variant. Support in BBJ and strict ophthalmopathy fell below 0.80 only at the lowest prior tested (Figure 3B). The adipose instruments are themselves blood</w:t>
+        <w:t xml:space="preserve">in BBJ and FinnGen GD, so association strength and shared-variant evidence are not interchangeable: a non-zero MR estimate can arise from distinct but correlated variants [16]. These two datasets had the most cases, and their strongest regional disease variant was more strongly associated than rs179252 (Table S3); regional checks excluded a missing-peak explanation but did not identify the causal variant. Support in BBJ and strict ophthalmopathy fell below 0.80 only at the lowest prior tested (Figure 3B). The adipose instruments are themselves blood</w:t>
       </w:r>
       <w:r>
         <w:rPr>
@@ -4566,7 +4523,7 @@
         <w:rPr>
           <w:color w:val="000000"/>
         </w:rPr>
-        <w:t xml:space="preserve">In mice, the shed TSHR A-subunit induced more thyroid-stimulating autoimmunity than a minimally cleaving receptor [30]; plasmid immunization reproduced orbital adipogenesis, fibrosis and muscle pathology [31], and orbital fibroblasts from immunized mice showed enhanced inflammatory and hyaluronan responses to TNFα [32]. Ophthalmopathy also occurs in euthyroid and hypothyroid patients [33]. Our instruments measure neither receptor cleavage nor antibody activity. Because most patients with TED have GD, the controls included people with GD but no recorded eye disease, and the ophthalmopathy per-allele ORs resembled those for GD (Table S3), these estimates may mostly reflect GD susceptibility; their higher PP.H4 values, from the two smallest, weakest-signal datasets, do not establish a TED-specific effect.</w:t>
+        <w:t xml:space="preserve">In mice, the shed TSHR A-subunit induced more thyroid-stimulating autoimmunity than a minimally cleaving receptor [38]; plasmid immunization reproduced orbital adipogenesis, fibrosis and muscle pathology [39], and orbital fibroblasts from immunized mice showed enhanced inflammatory and hyaluronan responses to TNFα [40]. Ophthalmopathy also occurs in euthyroid and hypothyroid patients [41]. Our instruments measure neither receptor cleavage nor antibody activity. Because most patients with TED have GD, the controls included people with GD but no recorded eye disease, and the ophthalmopathy per-allele ORs resembled those for GD (Table S3), these estimates may mostly reflect GD susceptibility; their higher PP.H4 values, from the two smallest, weakest-signal datasets, do not establish a TED-specific effect.</w:t>
       </w:r>
     </w:p>
     <w:p>
@@ -4623,7 +4580,7 @@
         <w:rPr>
           <w:color w:val="000000"/>
         </w:rPr>
-        <w:t xml:space="preserve">does not argue against IGF-1R blockade: teprotumumab reduced proptosis in a randomized trial in active TED [3] and in long-duration, low-activity TED [34], and TSHR–IGF-1R crosstalk [5] concerns receptor signaling, not inherited susceptibility.</w:t>
+        <w:t xml:space="preserve">does not argue against IGF-1R blockade: teprotumumab reduced proptosis in a randomized trial in active TED [10] and in long-duration, low-activity TED [42], and TSHR–IGF-1R crosstalk [8] concerns receptor signaling, not inherited susceptibility.</w:t>
       </w:r>
     </w:p>
     <w:p>
@@ -4772,7 +4729,7 @@
         <w:rPr>
           <w:color w:val="000000"/>
         </w:rPr>
-        <w:t xml:space="preserve">instruments, and frequency substitution and omission reused the same data. Under the single-causal-variant model, a low PP.H4 can reflect model mismatch or complex MHC LD; multi-signal colocalization [35], directionality and formal between-phenotype or between-gene tests were not performed, and only 24 genes were assessed. At the screen threshold, most BBJ genes lacked 80% power for an OR of 1.5, so a non-significant MR result, a PP.H4 below 0.80 or an unestimable comparison does not establish absence of an effect.</w:t>
+        <w:t xml:space="preserve">instruments, and frequency substitution and omission reused the same data. Under the single-causal-variant model, a low PP.H4 can reflect model mismatch or complex MHC LD; multi-signal colocalization [43], directionality and formal between-phenotype or between-gene tests were not performed, and only 24 genes were assessed. At the screen threshold, most BBJ genes lacked 80% power for an OR of 1.5, so a non-significant MR result, a PP.H4 below 0.80 or an unestimable comparison does not establish absence of an effect.</w:t>
       </w:r>
     </w:p>
     <w:bookmarkEnd w:id="36"/>
@@ -5165,7 +5122,7 @@
         <w:rPr>
           <w:color w:val="000000"/>
         </w:rPr>
-        <w:t xml:space="preserve">Douglas RS, Kahaly GJ, Patel A, Sile S, Thompson EHZ, Perdok R, Fleming JC, Fowler BT, Marcocci C, Marinò M, et al. Teprotumumab for the Treatment of Active Thyroid Eye Disease. N Engl J Med. 2020;382:341-352. doi:10.1056/nejmoa1910434.</w:t>
+        <w:t xml:space="preserve">Chin YH, Ng CH, Lee MH, Koh JWH, Kiew J, Yang SP, Sundar G, Khoo CM. Prevalence of thyroid eye disease in Graves’ disease: A meta-analysis and systematic review. Clin Endocrinol (Oxf). 2020;93:363-374. doi:10.1111/cen.14296.</w:t>
       </w:r>
     </w:p>
     <w:p>
@@ -5179,7 +5136,7 @@
         <w:rPr>
           <w:color w:val="000000"/>
         </w:rPr>
-        <w:t xml:space="preserve">Smith TJ. The insulin-like growth factor-I receptor and its role in thyroid-associated ophthalmopathy. Eye (Lond). 2019;33:200-205. doi:10.1038/s41433-018-0265-2.</w:t>
+        <w:t xml:space="preserve">Brand OJ, Barrett JC, Simmonds MJ, Newby PR, McCabe CJ, Bruce CK, Kysela B, Carr-Smith JD, Brix T, Hunt PJ, et al. Association of the thyroid stimulating hormone receptor gene (TSHR) with Graves’ disease. Hum Mol Genet. 2009;18:1704-1713. doi:10.1093/hmg/ddp087.</w:t>
       </w:r>
     </w:p>
     <w:p>
@@ -5193,7 +5150,7 @@
         <w:rPr>
           <w:color w:val="000000"/>
         </w:rPr>
-        <w:t xml:space="preserve">Krieger CC, Boutin A, Jang D, Morgan SJ, Banga JP, Kahaly GJ, Klubo-Gwiezdzinska J, Neumann S, Gershengorn MC. Arrestin-β-1 Physically Scaffolds TSH and IGF1 Receptors to Enable Crosstalk. Endocrinology. 2019;160:1468-1479. doi:10.1210/en.2019-00055.</w:t>
+        <w:t xml:space="preserve">Chu X, Pan CM, Zhao SX, Liang J, Gao GQ, Zhang XM, Yuan GY, Li CG, Xue LQ, Shen M, et al. A genome-wide association study identifies two new risk loci for Graves’ disease. Nat Genet. 2011;43:897-901. doi:10.1038/ng.898.</w:t>
       </w:r>
     </w:p>
     <w:p>
@@ -5207,7 +5164,7 @@
         <w:rPr>
           <w:color w:val="000000"/>
         </w:rPr>
-        <w:t xml:space="preserve">Smith TJ. Potential Roles of CD34+ Fibrocytes Masquerading as Orbital Fibroblasts in Thyroid-Associated Ophthalmopathy. J Clin Endocrinol Metab. 2019;104:581-594. doi:10.1210/jc.2018-01493.</w:t>
+        <w:t xml:space="preserve">Marinò M, Rotondo Dottore G, Menconi F, Comi S, Cosentino G, Rocchi R, Latrofa F, Figus M, Santini F. Role of genetics and epigenetics in Graves’ orbitopathy. Eur Thyroid J. 2024;13:e240179. doi:10.1530/ETJ-24-0179.</w:t>
       </w:r>
     </w:p>
     <w:p>
@@ -5221,7 +5178,7 @@
         <w:rPr>
           <w:color w:val="000000"/>
         </w:rPr>
-        <w:t xml:space="preserve">Sanderson E, Glymour MM, Holmes MV, Kang H, Morrison J, Munafò MR, Palmer T, Schooling CM, Wallace C, Zhao Q, et al. Mendelian randomization. Nat Rev Methods Primers. 2022;2:6. doi:10.1038/s43586-021-00092-5.</w:t>
+        <w:t xml:space="preserve">Tsui S, Naik V, Hoa N, Hwang CJ, Afifiyan NF, Sinha Hikim A, Gianoukakis AG, Douglas RS, Smith TJ. Evidence for an association between thyroid-stimulating hormone and insulin-like growth factor 1 receptors: a tale of two antigens implicated in Graves’ disease. J Immunol. 2008;181:4397-4405. doi:10.4049/jimmunol.181.6.4397.</w:t>
       </w:r>
     </w:p>
     <w:p>
@@ -5235,7 +5192,7 @@
         <w:rPr>
           <w:color w:val="000000"/>
         </w:rPr>
-        <w:t xml:space="preserve">Giambartolomei C, Vukcevic D, Schadt EE, Franke L, Hingorani AD, Wallace C, Plagnol V. Bayesian test for colocalisation between pairs of genetic association studies using summary statistics. PLoS Genet. 2014;10:e1004383. doi:10.1371/journal.pgen.1004383.</w:t>
+        <w:t xml:space="preserve">Krieger CC, Boutin A, Jang D, Morgan SJ, Banga JP, Kahaly GJ, Klubo-Gwiezdzinska J, Neumann S, Gershengorn MC. Arrestin-β-1 Physically Scaffolds TSH and IGF1 Receptors to Enable Crosstalk. Endocrinology. 2019;160:1468-1479. doi:10.1210/en.2019-00055.</w:t>
       </w:r>
     </w:p>
     <w:p>
@@ -5249,7 +5206,7 @@
         <w:rPr>
           <w:color w:val="000000"/>
         </w:rPr>
-        <w:t xml:space="preserve">Ji Q, Xu H, Chen H, Chen X, Wang S, Zou J. Pathogenic genes associated with immune-related genes in graves’ disease: a multi-omics Mendelian randomization analysis. Sci Rep. 2025;15:37875. doi:10.1038/s41598-025-21754-4.</w:t>
+        <w:t xml:space="preserve">Smith TJ, Kahaly GJ, Ezra DG, Fleming JC, Dailey RA, Tang RA, Harris GJ, Antonelli A, Salvi M, Goldberg RA, et al. Teprotumumab for Thyroid-Associated Ophthalmopathy. N Engl J Med. 2017;376:1748-1761. doi:10.1056/NEJMoa1614949.</w:t>
       </w:r>
     </w:p>
     <w:p>
@@ -5263,7 +5220,7 @@
         <w:rPr>
           <w:color w:val="000000"/>
         </w:rPr>
-        <w:t xml:space="preserve">Li Y, Chen L, Lin S, An W, Miao L, Wan M, Zhang B. Inflammatory Proteins Mediate the Effect of Gut Microbiota on Graves’ Ophthalmopathy: A Mendelian Randomization Study. Transl Vis Sci Technol. 2025;14:34. doi:10.1167/tvst.14.6.34.</w:t>
+        <w:t xml:space="preserve">Douglas RS, Kahaly GJ, Patel A, Sile S, Thompson EHZ, Perdok R, Fleming JC, Fowler BT, Marcocci C, Marinò M, et al. Teprotumumab for the Treatment of Active Thyroid Eye Disease. N Engl J Med. 2020;382:341-352. doi:10.1056/nejmoa1910434.</w:t>
       </w:r>
     </w:p>
     <w:p>
@@ -5277,7 +5234,7 @@
         <w:rPr>
           <w:color w:val="000000"/>
         </w:rPr>
-        <w:t xml:space="preserve">Zhang H, Jiang S, Zhu T, Liu Y, Li J, Fang S, Li Y, Sun J, He X, Tong C, et al. Thyroid-stimulating hormone receptor mediates peripheral-central neuroimmune crosstalk in autoimmune thyroid diseases. BMC Med. 2026;24:404. doi:10.1186/s12916-026-04957-y.</w:t>
+        <w:t xml:space="preserve">Nelson MR, Tipney H, Painter JL, Shen J, Nicoletti P, Shen Y, Floratos A, Sham PC, Li MJ, Wang J, et al. The support of human genetic evidence for approved drug indications. Nat Genet. 2015;47:856-860. doi:10.1038/ng.3314.</w:t>
       </w:r>
     </w:p>
     <w:p>
@@ -5291,7 +5248,7 @@
         <w:rPr>
           <w:color w:val="000000"/>
         </w:rPr>
-        <w:t xml:space="preserve">Skrivankova VW, Richmond RC, Woolf BAR, Yarmolinsky J, Davies NM, Swanson SA, VanderWeele TJ, Higgins JPT, Timpson NJ, Dimou N, et al. Strengthening the Reporting of Observational Studies in Epidemiology Using Mendelian Randomization: The STROBE-MR Statement. JAMA. 2021;326:1614-1621. doi:10.1001/jama.2021.18236.</w:t>
+        <w:t xml:space="preserve">Minikel EV, Painter JL, Dong CC, Nelson MR. Refining the impact of genetic evidence on clinical success. Nature. 2024;629:624-629. doi:10.1038/s41586-024-07316-0.</w:t>
       </w:r>
     </w:p>
     <w:p>
@@ -5305,7 +5262,7 @@
         <w:rPr>
           <w:color w:val="000000"/>
         </w:rPr>
-        <w:t xml:space="preserve">Võsa U, Claringbould A, Westra HJ, Bonder MJ, Deelen P, Zeng B, Kirsten H, Saha A, Kreuzhuber R, Yazar S, et al. Large-scale cis- and trans-eQTL analyses identify thousands of genetic loci and polygenic scores that regulate blood gene expression. Nat Genet. 2021;53:1300-1310. doi:10.1038/s41588-021-00913-z.</w:t>
+        <w:t xml:space="preserve">Sanderson E, Glymour MM, Holmes MV, Kang H, Morrison J, Munafò MR, Palmer T, Schooling CM, Wallace C, Zhao Q, et al. Mendelian randomization. Nat Rev Methods Primers. 2022;2:6. doi:10.1038/s43586-021-00092-5.</w:t>
       </w:r>
     </w:p>
     <w:p>
@@ -5319,7 +5276,7 @@
         <w:rPr>
           <w:color w:val="000000"/>
         </w:rPr>
-        <w:t xml:space="preserve">Sakaue S, Kanai M, Tanigawa Y, Karjalainen J, Kurki M, Koshiba S, Narita A, Konuma T, Yamamoto K, Akiyama M, et al. A cross-population atlas of genetic associations for 220 human phenotypes. Nat Genet. 2021;53:1415-1424. doi:10.1038/s41588-021-00931-x.</w:t>
+        <w:t xml:space="preserve">Gill D, Georgakis MK, Walker VM, Schmidt AF, Gkatzionis A, Freitag DF, Finan C, Hingorani AD, Howson JMM, Burgess S, et al. Mendelian randomization for studying the effects of perturbing drug targets. Wellcome Open Res. 2021;6:16. doi:10.12688/wellcomeopenres.16544.2.</w:t>
       </w:r>
     </w:p>
     <w:p>
@@ -5333,7 +5290,7 @@
         <w:rPr>
           <w:color w:val="000000"/>
         </w:rPr>
-        <w:t xml:space="preserve">Dönertaş HM, Fabian DK, Valenzuela MF, Partridge L, Thornton JM. Common genetic associations between age-related diseases. Nat Aging. 2021;1:400-412. doi:10.1038/s43587-021-00051-5.</w:t>
+        <w:t xml:space="preserve">Giambartolomei C, Vukcevic D, Schadt EE, Franke L, Hingorani AD, Wallace C, Plagnol V. Bayesian test for colocalisation between pairs of genetic association studies using summary statistics. PLoS Genet. 2014;10:e1004383. doi:10.1371/journal.pgen.1004383.</w:t>
       </w:r>
     </w:p>
     <w:p>
@@ -5347,7 +5304,7 @@
         <w:rPr>
           <w:color w:val="000000"/>
         </w:rPr>
-        <w:t xml:space="preserve">Kurki MI, Karjalainen J, Palta P, Sipilä TP, Kristiansson K, Donner KM, Reeve MP, Laivuori H, Aavikko M, Kaunisto MA, et al. FinnGen provides genetic insights from a well-phenotyped isolated population. Nature. 2023;613:508-518. doi:10.1038/s41586-022-05473-8.</w:t>
+        <w:t xml:space="preserve">Zuber V, Grinberg NF, Gill D, Manipur I, Slob EAW, Patel A, Wallace C, Burgess S. Combining evidence from Mendelian randomization and colocalization: Review and comparison of approaches. Am J Hum Genet. 2022;109:767-782. doi:10.1016/j.ajhg.2022.04.001.</w:t>
       </w:r>
     </w:p>
     <w:p>
@@ -5361,7 +5318,7 @@
         <w:rPr>
           <w:color w:val="000000"/>
         </w:rPr>
-        <w:t xml:space="preserve">Finan C, Gaulton A, Kruger FA, Lumbers RT, Shah T, Engmann J, Galver L, Kelley R, Karlsson A, Santos R, et al. The druggable genome and support for target identification and validation in drug development. Sci Transl Med. 2017;9:eaag1166. doi:10.1126/scitranslmed.aag1166.</w:t>
+        <w:t xml:space="preserve">Zheng J, Haberland V, Baird D, Walker V, Haycock PC, Hurle MR, Gutteridge A, Erola P, Liu Y, Luo S, et al. Phenome-wide Mendelian randomization mapping the influence of the plasma proteome on complex diseases. Nat Genet. 2020;52:1122-1131. doi:10.1038/s41588-020-0682-6.</w:t>
       </w:r>
     </w:p>
     <w:p>
@@ -5375,7 +5332,7 @@
         <w:rPr>
           <w:color w:val="000000"/>
         </w:rPr>
-        <w:t xml:space="preserve">Chang CC, Chow CC, Tellier LC, Vattikuti S, Purcell SM, Lee JJ. Second-generation PLINK: rising to the challenge of larger and richer datasets. Gigascience. 2015;4:7. doi:10.1186/s13742-015-0047-8.</w:t>
+        <w:t xml:space="preserve">Ji Q, Xu H, Chen H, Chen X, Wang S, Zou J. Pathogenic genes associated with immune-related genes in graves’ disease: a multi-omics Mendelian randomization analysis. Sci Rep. 2025;15:37875. doi:10.1038/s41598-025-21754-4.</w:t>
       </w:r>
     </w:p>
     <w:p>
@@ -5389,7 +5346,7 @@
         <w:rPr>
           <w:color w:val="000000"/>
         </w:rPr>
-        <w:t xml:space="preserve">1000 Genomes Project Consortium, Auton A, Brooks LD, Durbin RM, Garrison EP, Kang HM, Korbel JO, Marchini JL, McCarthy S, McVean GA, et al. A global reference for human genetic variation. Nature. 2015;526:68-74. doi:10.1038/nature15393.</w:t>
+        <w:t xml:space="preserve">Zhang H, Jiang S, Zhu T, Liu Y, Li J, Fang S, Li Y, Sun J, He X, Tong C, et al. Thyroid-stimulating hormone receptor mediates peripheral-central neuroimmune crosstalk in autoimmune thyroid diseases. BMC Med. 2026;24:404. doi:10.1186/s12916-026-04957-y.</w:t>
       </w:r>
     </w:p>
     <w:p>
@@ -5403,7 +5360,7 @@
         <w:rPr>
           <w:color w:val="000000"/>
         </w:rPr>
-        <w:t xml:space="preserve">Zhu Z, Zhang F, Hu H, Bakshi A, Robinson MR, Powell JE, Montgomery GW, Goddard ME, Wray NR, Visscher PM, et al. Integration of summary data from GWAS and eQTL studies predicts complex trait gene targets. Nat Genet. 2016;48:481-487. doi:10.1038/ng.3538.</w:t>
+        <w:t xml:space="preserve">Ke C, Yu Y, Li J, Yu Y, Sun Y, Wang Y, Wang B, Lu Y, Tang M, Wang N, et al. Genetic and Plasma Proteomic Approaches to Identify Therapeutic Targets for Graves’ Disease and Graves’ Ophthalmopathy. Immunotargets Ther. 2025;14:87-98. doi:10.2147/ITT.S494692.</w:t>
       </w:r>
     </w:p>
     <w:p>
@@ -5417,7 +5374,7 @@
         <w:rPr>
           <w:color w:val="000000"/>
         </w:rPr>
-        <w:t xml:space="preserve">Hemani G, Zheng J, Elsworth B, Wade KH, Haberland V, Baird D, Laurin C, Burgess S, Bowden J, Langdon R, et al. The MR-Base platform supports systematic causal inference across the human phenome. Elife. 2018;7:e34408. doi:10.7554/elife.34408.</w:t>
+        <w:t xml:space="preserve">Finan C, Gaulton A, Kruger FA, Lumbers RT, Shah T, Engmann J, Galver L, Kelley R, Karlsson A, Santos R, et al. The druggable genome and support for target identification and validation in drug development. Sci Transl Med. 2017;9:eaag1166. doi:10.1126/scitranslmed.aag1166.</w:t>
       </w:r>
     </w:p>
     <w:p>
@@ -5431,7 +5388,7 @@
         <w:rPr>
           <w:color w:val="000000"/>
         </w:rPr>
-        <w:t xml:space="preserve">Bowden J, Davey Smith G, Burgess S. Mendelian randomization with invalid instruments: effect estimation and bias detection through Egger regression. Int J Epidemiol. 2015;44:512-525. doi:10.1093/ije/dyv080.</w:t>
+        <w:t xml:space="preserve">Ueda H, Howson JM, Esposito L, Heward J, Snook H, Chamberlain G, Rainbow DB, Hunter KM, Smith AN, Di Genova G, et al. Association of the T-cell regulatory gene CTLA4 with susceptibility to autoimmune disease. Nature. 2003;423:506-511. doi:10.1038/nature01621.</w:t>
       </w:r>
     </w:p>
     <w:p>
@@ -5445,7 +5402,7 @@
         <w:rPr>
           <w:color w:val="000000"/>
         </w:rPr>
-        <w:t xml:space="preserve">Bowden J, Davey Smith G, Haycock PC, Burgess S. Consistent Estimation in Mendelian Randomization with Some Invalid Instruments Using a Weighted Median Estimator. Genet Epidemiol. 2016;40:304-314. doi:10.1002/gepi.21965.</w:t>
+        <w:t xml:space="preserve">Skrivankova VW, Richmond RC, Woolf BAR, Yarmolinsky J, Davies NM, Swanson SA, VanderWeele TJ, Higgins JPT, Timpson NJ, Dimou N, et al. Strengthening the Reporting of Observational Studies in Epidemiology Using Mendelian Randomization: The STROBE-MR Statement. JAMA. 2021;326:1614-1621. doi:10.1001/jama.2021.18236.</w:t>
       </w:r>
     </w:p>
     <w:p>
@@ -5459,7 +5416,7 @@
         <w:rPr>
           <w:color w:val="000000"/>
         </w:rPr>
-        <w:t xml:space="preserve">Wallace C. Eliciting priors and relaxing the single causal variant assumption in colocalisation analyses. PLoS Genet. 2020;16:e1008720. doi:10.1371/journal.pgen.1008720.</w:t>
+        <w:t xml:space="preserve">Võsa U, Claringbould A, Westra HJ, Bonder MJ, Deelen P, Zeng B, Kirsten H, Saha A, Kreuzhuber R, Yazar S, et al. Large-scale cis- and trans-eQTL analyses identify thousands of genetic loci and polygenic scores that regulate blood gene expression. Nat Genet. 2021;53:1300-1310. doi:10.1038/s41588-021-00913-z.</w:t>
       </w:r>
     </w:p>
     <w:p>
@@ -5473,7 +5430,7 @@
         <w:rPr>
           <w:color w:val="000000"/>
         </w:rPr>
-        <w:t xml:space="preserve">GTEx Consortium. The GTEx Consortium atlas of genetic regulatory effects across human tissues. Science. 2020;369:1318-1330. doi:10.1126/science.aaz1776.</w:t>
+        <w:t xml:space="preserve">Sakaue S, Kanai M, Tanigawa Y, Karjalainen J, Kurki M, Koshiba S, Narita A, Konuma T, Yamamoto K, Akiyama M, et al. A cross-population atlas of genetic associations for 220 human phenotypes. Nat Genet. 2021;53:1415-1424. doi:10.1038/s41588-021-00931-x.</w:t>
       </w:r>
     </w:p>
     <w:p>
@@ -5487,7 +5444,7 @@
         <w:rPr>
           <w:color w:val="000000"/>
         </w:rPr>
-        <w:t xml:space="preserve">Ueda H, Howson JM, Esposito L, Heward J, Snook H, Chamberlain G, Rainbow DB, Hunter KM, Smith AN, Di Genova G, et al. Association of the T-cell regulatory gene CTLA4 with susceptibility to autoimmune disease. Nature. 2003;423:506-511. doi:10.1038/nature01621.</w:t>
+        <w:t xml:space="preserve">Dönertaş HM, Fabian DK, Valenzuela MF, Partridge L, Thornton JM. Common genetic associations between age-related diseases. Nat Aging. 2021;1:400-412. doi:10.1038/s43587-021-00051-5.</w:t>
       </w:r>
     </w:p>
     <w:p>
@@ -5501,7 +5458,7 @@
         <w:rPr>
           <w:color w:val="000000"/>
         </w:rPr>
-        <w:t xml:space="preserve">Colobran R, Armengol Mdel P, Faner R, Gärtner M, Tykocinski LO, Lucas A, Ruiz M, Juan M, Kyewski B, Pujol-Borrell R. Association of an SNP with intrathymic transcription of TSHR and Graves’ disease: a role for defective thymic tolerance. Hum Mol Genet. 2011;20:3415-3423. doi:10.1093/hmg/ddr247.</w:t>
+        <w:t xml:space="preserve">Kurki MI, Karjalainen J, Palta P, Sipilä TP, Kristiansson K, Donner KM, Reeve MP, Laivuori H, Aavikko M, Kaunisto MA, et al. FinnGen provides genetic insights from a well-phenotyped isolated population. Nature. 2023;613:508-518. doi:10.1038/s41586-022-05473-8.</w:t>
       </w:r>
     </w:p>
     <w:p>
@@ -5515,7 +5472,7 @@
         <w:rPr>
           <w:color w:val="000000"/>
         </w:rPr>
-        <w:t xml:space="preserve">Marín-Sánchez A, Álvarez-Sierra D, González O, Lucas-Martin A, Sellés-Sánchez A, Rudilla F, Enrich E, Colobran R, Pujol-Borrell R. Regulation of TSHR Expression in the Thyroid and Thymus May Contribute to TSHR Tolerance Failure in Graves’ Disease Patients via Two Distinct Mechanisms. Front Immunol. 2019;10:1695. doi:10.3389/fimmu.2019.01695.</w:t>
+        <w:t xml:space="preserve">Chang CC, Chow CC, Tellier LC, Vattikuti S, Purcell SM, Lee JJ. Second-generation PLINK: rising to the challenge of larger and richer datasets. Gigascience. 2015;4:7. doi:10.1186/s13742-015-0047-8.</w:t>
       </w:r>
     </w:p>
     <w:p>
@@ -5529,7 +5486,119 @@
         <w:rPr>
           <w:color w:val="000000"/>
         </w:rPr>
-        <w:t xml:space="preserve">Zuber V, Grinberg NF, Gill D, Manipur I, Slob EAW, Patel A, Wallace C, Burgess S. Combining evidence from Mendelian randomization and colocalization: Review and comparison of approaches. Am J Hum Genet. 2022;109:767-782. doi:10.1016/j.ajhg.2022.04.001.</w:t>
+        <w:t xml:space="preserve">1000 Genomes Project Consortium, Auton A, Brooks LD, Durbin RM, Garrison EP, Kang HM, Korbel JO, Marchini JL, McCarthy S, McVean GA, et al. A global reference for human genetic variation. Nature. 2015;526:68-74. doi:10.1038/nature15393.</w:t>
+      </w:r>
+    </w:p>
+    <w:p>
+      <w:pPr>
+        <w:numPr>
+          <w:ilvl w:val="0"/>
+          <w:numId w:val="1001"/>
+        </w:numPr>
+      </w:pPr>
+      <w:r>
+        <w:rPr>
+          <w:color w:val="000000"/>
+        </w:rPr>
+        <w:t xml:space="preserve">Zhu Z, Zhang F, Hu H, Bakshi A, Robinson MR, Powell JE, Montgomery GW, Goddard ME, Wray NR, Visscher PM, et al. Integration of summary data from GWAS and eQTL studies predicts complex trait gene targets. Nat Genet. 2016;48:481-487. doi:10.1038/ng.3538.</w:t>
+      </w:r>
+    </w:p>
+    <w:p>
+      <w:pPr>
+        <w:numPr>
+          <w:ilvl w:val="0"/>
+          <w:numId w:val="1001"/>
+        </w:numPr>
+      </w:pPr>
+      <w:r>
+        <w:rPr>
+          <w:color w:val="000000"/>
+        </w:rPr>
+        <w:t xml:space="preserve">Hemani G, Zheng J, Elsworth B, Wade KH, Haberland V, Baird D, Laurin C, Burgess S, Bowden J, Langdon R, et al. The MR-Base platform supports systematic causal inference across the human phenome. Elife. 2018;7:e34408. doi:10.7554/elife.34408.</w:t>
+      </w:r>
+    </w:p>
+    <w:p>
+      <w:pPr>
+        <w:numPr>
+          <w:ilvl w:val="0"/>
+          <w:numId w:val="1001"/>
+        </w:numPr>
+      </w:pPr>
+      <w:r>
+        <w:rPr>
+          <w:color w:val="000000"/>
+        </w:rPr>
+        <w:t xml:space="preserve">Bowden J, Davey Smith G, Burgess S. Mendelian randomization with invalid instruments: effect estimation and bias detection through Egger regression. Int J Epidemiol. 2015;44:512-525. doi:10.1093/ije/dyv080.</w:t>
+      </w:r>
+    </w:p>
+    <w:p>
+      <w:pPr>
+        <w:numPr>
+          <w:ilvl w:val="0"/>
+          <w:numId w:val="1001"/>
+        </w:numPr>
+      </w:pPr>
+      <w:r>
+        <w:rPr>
+          <w:color w:val="000000"/>
+        </w:rPr>
+        <w:t xml:space="preserve">Bowden J, Davey Smith G, Haycock PC, Burgess S. Consistent Estimation in Mendelian Randomization with Some Invalid Instruments Using a Weighted Median Estimator. Genet Epidemiol. 2016;40:304-314. doi:10.1002/gepi.21965.</w:t>
+      </w:r>
+    </w:p>
+    <w:p>
+      <w:pPr>
+        <w:numPr>
+          <w:ilvl w:val="0"/>
+          <w:numId w:val="1001"/>
+        </w:numPr>
+      </w:pPr>
+      <w:r>
+        <w:rPr>
+          <w:color w:val="000000"/>
+        </w:rPr>
+        <w:t xml:space="preserve">Wallace C. Eliciting priors and relaxing the single causal variant assumption in colocalisation analyses. PLoS Genet. 2020;16:e1008720. doi:10.1371/journal.pgen.1008720.</w:t>
+      </w:r>
+    </w:p>
+    <w:p>
+      <w:pPr>
+        <w:numPr>
+          <w:ilvl w:val="0"/>
+          <w:numId w:val="1001"/>
+        </w:numPr>
+      </w:pPr>
+      <w:r>
+        <w:rPr>
+          <w:color w:val="000000"/>
+        </w:rPr>
+        <w:t xml:space="preserve">GTEx Consortium. The GTEx Consortium atlas of genetic regulatory effects across human tissues. Science. 2020;369:1318-1330. doi:10.1126/science.aaz1776.</w:t>
+      </w:r>
+    </w:p>
+    <w:p>
+      <w:pPr>
+        <w:numPr>
+          <w:ilvl w:val="0"/>
+          <w:numId w:val="1001"/>
+        </w:numPr>
+      </w:pPr>
+      <w:r>
+        <w:rPr>
+          <w:color w:val="000000"/>
+        </w:rPr>
+        <w:t xml:space="preserve">Colobran R, Armengol Mdel P, Faner R, Gärtner M, Tykocinski LO, Lucas A, Ruiz M, Juan M, Kyewski B, Pujol-Borrell R. Association of an SNP with intrathymic transcription of TSHR and Graves’ disease: a role for defective thymic tolerance. Hum Mol Genet. 2011;20:3415-3423. doi:10.1093/hmg/ddr247.</w:t>
+      </w:r>
+    </w:p>
+    <w:p>
+      <w:pPr>
+        <w:numPr>
+          <w:ilvl w:val="0"/>
+          <w:numId w:val="1001"/>
+        </w:numPr>
+      </w:pPr>
+      <w:r>
+        <w:rPr>
+          <w:color w:val="000000"/>
+        </w:rPr>
+        <w:t xml:space="preserve">Marín-Sánchez A, Álvarez-Sierra D, González O, Lucas-Martin A, Sellés-Sánchez A, Rudilla F, Enrich E, Colobran R, Pujol-Borrell R. Regulation of TSHR Expression in the Thyroid and Thymus May Contribute to TSHR Tolerance Failure in Graves’ Disease Patients via Two Distinct Mechanisms. Front Immunol. 2019;10:1695. doi:10.3389/fimmu.2019.01695.</w:t>
       </w:r>
     </w:p>
     <w:p>

</xml_diff>

<commit_message>
Finalize the reference list (45 references, Endocrine Connections style)
Author-approved step 7. All entries were checked against PubMed; Hartwig 2017
(weighted mode) and Lloyd-Jones 2018 (UKB log-odds rescaling) were added at
their Methods sentences; Brand 2009 and Colobran/Marin-Sanchez were cited at
existing rs179247 statements. References were renumbered in first-citation
order and converted to the Endocrine Connections style; prose is unchanged
apart from citation brackets. The audit's reference-count guard is now 45.

Co-Authored-By: Claude Opus 5.5 <noreply@anthropic.com>
Claude-Session: https://claude.ai/code/session_01TiAKffYKtUstdRZFkwtJA9
</commit_message>
<xml_diff>
--- a/submission/candidate_20261011_review/Manuscript.docx
+++ b/submission/candidate_20261011_review/Manuscript.docx
@@ -1117,7 +1117,7 @@
         <w:rPr>
           <w:color w:val="000000"/>
         </w:rPr>
-        <w:t xml:space="preserve">within 1 Mb of the gene (cis-eQTLs). PLINK clumping kept only uncorrelated variants (linkage disequilibrium [LD] r² &lt; 0.001 within 10 Mb, in 503 European participants from 1000 Genomes Phase 3) [28, 29]. This gave 6,135 single-nucleotide polymorphism (SNP)–gene pairs for 2,544 genes (minimum F statistic 29.7; F &gt; 10 is the usual threshold for adequate instrument strength), and the extended major histocompatibility complex region was not excluded. Variant effects on expression, in standard deviation units, were derived from eQTLGen Z statistics, sample sizes and 1000 Genomes European allele frequencies [30]. TwoSampleMR aligned exposure and disease effects to the same allele, excluding unavailable and strand-ambiguous (palindromic) variants. UKB linear-model estimates were rescaled using the case proportion to approximate the log-odds scale of BBJ and FinnGen (Supplementary Methods).</w:t>
+        <w:t xml:space="preserve">within 1 Mb of the gene (cis-eQTLs). PLINK clumping kept only uncorrelated variants (linkage disequilibrium [LD] r² &lt; 0.001 within 10 Mb, in 503 European participants from 1000 Genomes Phase 3) [28, 29]. This gave 6,135 single-nucleotide polymorphism (SNP)–gene pairs for 2,544 genes (minimum F statistic 29.7; F &gt; 10 is the usual threshold for adequate instrument strength), and the extended major histocompatibility complex region was not excluded. Variant effects on expression, in standard deviation units, were derived from eQTLGen Z statistics, sample sizes and 1000 Genomes European allele frequencies [30]. TwoSampleMR aligned exposure and disease effects to the same allele, excluding unavailable and strand-ambiguous (palindromic) variants. UKB linear-model estimates were rescaled using the case proportion to approximate the log-odds scale of BBJ and FinnGen [31] (Supplementary Methods).</w:t>
       </w:r>
     </w:p>
     <w:p>
@@ -1128,7 +1128,7 @@
         <w:rPr>
           <w:color w:val="000000"/>
         </w:rPr>
-        <w:t xml:space="preserve">For each gene and dataset, MR used the Wald ratio (disease effect divided by expression effect) for one instrument and, for several, multiplicative random-effects inverse-variance weighting (IVW), a precision-weighted average [31]. Estimates are ORs per approximately one standard deviation higher genetically proxied blood expression, with 95% CIs and two-sided</w:t>
+        <w:t xml:space="preserve">For each gene and dataset, MR used the Wald ratio (disease effect divided by expression effect) for one instrument and, for several, multiplicative random-effects inverse-variance weighting (IVW), a precision-weighted average [32]. Estimates are ORs per approximately one standard deviation higher genetically proxied blood expression, with 95% CIs and two-sided</w:t>
       </w:r>
       <w:r>
         <w:rPr>
@@ -1255,7 +1255,7 @@
         <w:rPr>
           <w:color w:val="000000"/>
         </w:rPr>
-        <w:t xml:space="preserve">For estimates with several instruments, Cochran’s Q test assessed heterogeneity among instruments and, for selected genes, post hoc omission of each instrument in turn (leave-one-out) assessed dependence on single variants. MR-Egger regression, whose intercept tests whether instruments affect disease through other pathways (directional pleiotropy), and weighted-median and weighted-mode estimators [32, 33] were applied only in the original three datasets (Supplementary Dataset, MR_estimators_original). Analyses were repeated with exposure effects reconstructed from eQTLGen cohort allele frequencies; for</w:t>
+        <w:t xml:space="preserve">For estimates with several instruments, Cochran’s Q test assessed heterogeneity among instruments and, for selected genes, post hoc omission of each instrument in turn (leave-one-out) assessed dependence on single variants. MR-Egger regression, whose intercept tests whether instruments affect disease through other pathways (directional pleiotropy), and weighted-median and weighted-mode estimators [33, 34, 35] were applied only in the original three datasets (Supplementary Dataset, MR_estimators_original). Analyses were repeated with exposure effects reconstructed from eQTLGen cohort allele frequencies; for</w:t>
       </w:r>
       <w:r>
         <w:rPr>
@@ -1338,7 +1338,7 @@
         <w:rPr>
           <w:color w:val="000000"/>
         </w:rPr>
-        <w:t xml:space="preserve">studies) were re-extracted from the original expression and disease files. Disease effects were aligned to the blood expression-increasing allele to give per-allele ORs and recalculate the MR estimates, and the correlation between the two variants’ G-allele counts was calculated in European and East Asian 1000 Genomes genotypes. The audit checked allele direction, not thymic mediation (Supplementary Dataset, TSHR_allele_audit).</w:t>
+        <w:t xml:space="preserve">studies [36, 37]) were re-extracted from the original expression and disease files. Disease effects were aligned to the blood expression-increasing allele to give per-allele ORs and recalculate the MR estimates, and the correlation between the two variants’ G-allele counts was calculated in European and East Asian 1000 Genomes genotypes. The audit checked allele direction, not thymic mediation (Supplementary Dataset, TSHR_allele_audit).</w:t>
       </w:r>
     </w:p>
     <w:bookmarkEnd w:id="23"/>
@@ -1485,7 +1485,7 @@
         <w:rPr>
           <w:color w:val="000000"/>
         </w:rPr>
-        <w:t xml:space="preserve">[34]. PP.H4 ≥ 0.80 was a descriptive reporting threshold.</w:t>
+        <w:t xml:space="preserve">[38]. PP.H4 ≥ 0.80 was a descriptive reporting threshold.</w:t>
       </w:r>
     </w:p>
     <w:p>
@@ -1592,7 +1592,7 @@
         <w:rPr>
           <w:color w:val="000000"/>
         </w:rPr>
-        <w:t xml:space="preserve">in a fixed panel of five Genotype-Tissue Expression (GTEx) v8 tissues: thyroid, cultured skin fibroblasts, subcutaneous adipose, visceral adipose and whole blood [35]. The plan was fixed after the blood results were known but before tissue results were retrieved. GTEx donors were predominantly European. Instruments required cis-eQTL</w:t>
+        <w:t xml:space="preserve">in a fixed panel of five Genotype-Tissue Expression (GTEx) v8 tissues: thyroid, cultured skin fibroblasts, subcutaneous adipose, visceral adipose and whole blood [39]. The plan was fixed after the blood results were known but before tissue results were retrieved. GTEx donors were predominantly European. Instruments required cis-eQTL</w:t>
       </w:r>
       <w:r>
         <w:rPr>
@@ -4345,7 +4345,7 @@
         <w:rPr>
           <w:color w:val="000000"/>
         </w:rPr>
-        <w:t xml:space="preserve">The lower-odds direction need not contradict stimulating-antibody pathogenesis: blood transcript abundance, tissue expression and receptor activation are different exposures with tissue-dependent regulatory effects [35]. The expression-increasing rs179252-G allele is linked to rs179247-G, the GD-protective allele associated with greater intrathymic</w:t>
+        <w:t xml:space="preserve">The lower-odds direction need not contradict stimulating-antibody pathogenesis: blood transcript abundance, tissue expression and receptor activation are different exposures with tissue-dependent regulatory effects [39]. The expression-increasing rs179252-G allele is linked to rs179247-G, the GD-protective allele associated with greater intrathymic</w:t>
       </w:r>
       <w:r>
         <w:rPr>
@@ -4371,7 +4371,7 @@
         <w:rPr>
           <w:color w:val="000000"/>
         </w:rPr>
-        <w:t xml:space="preserve">transcription [36, 37]; this fits central tolerance, though the thymic step was untested and neither variant is a proven causal regulator. Each rs179252-G allele raises blood expression by 0.105 standard deviation, and its per-allele disease ORs were 0.80 (BBJ), 0.77 (UKB), 0.78 (FinnGen ophthalmopathy), 0.77 (FinnGen GD) and 0.82 (strict ophthalmopathy); rescaled to one standard deviation, these moderate effects give the reported odds ratios, which describe lifelong inherited differences, not raised</w:t>
+        <w:t xml:space="preserve">transcription [4, 36, 37]; this fits central tolerance, though the thymic step was untested and neither variant is a proven causal regulator. Each rs179252-G allele raises blood expression by 0.105 standard deviation, and its per-allele disease ORs were 0.80 (BBJ), 0.77 (UKB), 0.78 (FinnGen ophthalmopathy), 0.77 (FinnGen GD) and 0.82 (strict ophthalmopathy); rescaled to one standard deviation, these moderate effects give the reported odds ratios, which describe lifelong inherited differences, not raised</w:t>
       </w:r>
       <w:r>
         <w:rPr>
@@ -4523,7 +4523,7 @@
         <w:rPr>
           <w:color w:val="000000"/>
         </w:rPr>
-        <w:t xml:space="preserve">In mice, the shed TSHR A-subunit induced more thyroid-stimulating autoimmunity than a minimally cleaving receptor [38]; plasmid immunization reproduced orbital adipogenesis, fibrosis and muscle pathology [39], and orbital fibroblasts from immunized mice showed enhanced inflammatory and hyaluronan responses to TNFα [40]. Ophthalmopathy also occurs in euthyroid and hypothyroid patients [41]. Our instruments measure neither receptor cleavage nor antibody activity. Because most patients with TED have GD, the controls included people with GD but no recorded eye disease, and the ophthalmopathy per-allele ORs resembled those for GD (Table S3), these estimates may mostly reflect GD susceptibility; their higher PP.H4 values, from the two smallest, weakest-signal datasets, do not establish a TED-specific effect.</w:t>
+        <w:t xml:space="preserve">In mice, the shed TSHR A-subunit induced more thyroid-stimulating autoimmunity than a minimally cleaving receptor [40]; plasmid immunization reproduced orbital adipogenesis, fibrosis and muscle pathology [41], and orbital fibroblasts from immunized mice showed enhanced inflammatory and hyaluronan responses to TNFα [42]. Ophthalmopathy also occurs in euthyroid and hypothyroid patients [43]. Our instruments measure neither receptor cleavage nor antibody activity. Because most patients with TED have GD, the controls included people with GD but no recorded eye disease, and the ophthalmopathy per-allele ORs resembled those for GD (Table S3), these estimates may mostly reflect GD susceptibility; their higher PP.H4 values, from the two smallest, weakest-signal datasets, do not establish a TED-specific effect.</w:t>
       </w:r>
     </w:p>
     <w:p>
@@ -4580,7 +4580,7 @@
         <w:rPr>
           <w:color w:val="000000"/>
         </w:rPr>
-        <w:t xml:space="preserve">does not argue against IGF-1R blockade: teprotumumab reduced proptosis in a randomized trial in active TED [10] and in long-duration, low-activity TED [42], and TSHR–IGF-1R crosstalk [8] concerns receptor signaling, not inherited susceptibility.</w:t>
+        <w:t xml:space="preserve">does not argue against IGF-1R blockade: teprotumumab reduced proptosis in a randomized trial in active TED [10] and in long-duration, low-activity TED [44], and TSHR–IGF-1R crosstalk [8] concerns receptor signaling, not inherited susceptibility.</w:t>
       </w:r>
     </w:p>
     <w:p>
@@ -4729,7 +4729,7 @@
         <w:rPr>
           <w:color w:val="000000"/>
         </w:rPr>
-        <w:t xml:space="preserve">instruments, and frequency substitution and omission reused the same data. Under the single-causal-variant model, a low PP.H4 can reflect model mismatch or complex MHC LD; multi-signal colocalization [43], directionality and formal between-phenotype or between-gene tests were not performed, and only 24 genes were assessed. At the screen threshold, most BBJ genes lacked 80% power for an OR of 1.5, so a non-significant MR result, a PP.H4 below 0.80 or an unestimable comparison does not establish absence of an effect.</w:t>
+        <w:t xml:space="preserve">instruments, and frequency substitution and omission reused the same data. Under the single-causal-variant model, a low PP.H4 can reflect model mismatch or complex MHC LD; multi-signal colocalization [45], directionality and formal between-phenotype or between-gene tests were not performed, and only 24 genes were assessed. At the screen threshold, most BBJ genes lacked 80% power for an OR of 1.5, so a non-significant MR result, a PP.H4 below 0.80 or an unestimable comparison does not establish absence of an effect.</w:t>
       </w:r>
     </w:p>
     <w:bookmarkEnd w:id="36"/>
@@ -5094,7 +5094,59 @@
         <w:rPr>
           <w:color w:val="000000"/>
         </w:rPr>
-        <w:t xml:space="preserve">Bahn RS. Graves’ ophthalmopathy. N Engl J Med. 2010;362:726-738. doi:10.1056/nejmra0905750.</w:t>
+        <w:t xml:space="preserve">Bahn RS. Graves’ ophthalmopathy.</w:t>
+      </w:r>
+      <w:r>
+        <w:rPr>
+          <w:color w:val="000000"/>
+        </w:rPr>
+        <w:t xml:space="preserve"> </w:t>
+      </w:r>
+      <w:r>
+        <w:rPr>
+          <w:iCs/>
+          <w:i/>
+          <w:color w:val="000000"/>
+        </w:rPr>
+        <w:t xml:space="preserve">New England Journal of Medicine</w:t>
+      </w:r>
+      <w:r>
+        <w:rPr>
+          <w:color w:val="000000"/>
+        </w:rPr>
+        <w:t xml:space="preserve"> </w:t>
+      </w:r>
+      <w:r>
+        <w:rPr>
+          <w:color w:val="000000"/>
+        </w:rPr>
+        <w:t xml:space="preserve">2010</w:t>
+      </w:r>
+      <w:r>
+        <w:rPr>
+          <w:color w:val="000000"/>
+        </w:rPr>
+        <w:t xml:space="preserve"> </w:t>
+      </w:r>
+      <w:r>
+        <w:rPr>
+          <w:bCs/>
+          <w:b/>
+          <w:color w:val="000000"/>
+        </w:rPr>
+        <w:t xml:space="preserve">362</w:t>
+      </w:r>
+      <w:r>
+        <w:rPr>
+          <w:color w:val="000000"/>
+        </w:rPr>
+        <w:t xml:space="preserve"> </w:t>
+      </w:r>
+      <w:r>
+        <w:rPr>
+          <w:color w:val="000000"/>
+        </w:rPr>
+        <w:t xml:space="preserve">726–738. (https://doi.org/10.1056/NEJMra0905750)</w:t>
       </w:r>
     </w:p>
     <w:p>
@@ -5108,7 +5160,59 @@
         <w:rPr>
           <w:color w:val="000000"/>
         </w:rPr>
-        <w:t xml:space="preserve">Smith TJ, Hegedüs L. Graves’ Disease. N Engl J Med. 2016;375:1552-1565. doi:10.1056/nejmra1510030.</w:t>
+        <w:t xml:space="preserve">Smith TJ &amp; Hegedüs L. Graves’ Disease.</w:t>
+      </w:r>
+      <w:r>
+        <w:rPr>
+          <w:color w:val="000000"/>
+        </w:rPr>
+        <w:t xml:space="preserve"> </w:t>
+      </w:r>
+      <w:r>
+        <w:rPr>
+          <w:iCs/>
+          <w:i/>
+          <w:color w:val="000000"/>
+        </w:rPr>
+        <w:t xml:space="preserve">New England Journal of Medicine</w:t>
+      </w:r>
+      <w:r>
+        <w:rPr>
+          <w:color w:val="000000"/>
+        </w:rPr>
+        <w:t xml:space="preserve"> </w:t>
+      </w:r>
+      <w:r>
+        <w:rPr>
+          <w:color w:val="000000"/>
+        </w:rPr>
+        <w:t xml:space="preserve">2016</w:t>
+      </w:r>
+      <w:r>
+        <w:rPr>
+          <w:color w:val="000000"/>
+        </w:rPr>
+        <w:t xml:space="preserve"> </w:t>
+      </w:r>
+      <w:r>
+        <w:rPr>
+          <w:bCs/>
+          <w:b/>
+          <w:color w:val="000000"/>
+        </w:rPr>
+        <w:t xml:space="preserve">375</w:t>
+      </w:r>
+      <w:r>
+        <w:rPr>
+          <w:color w:val="000000"/>
+        </w:rPr>
+        <w:t xml:space="preserve"> </w:t>
+      </w:r>
+      <w:r>
+        <w:rPr>
+          <w:color w:val="000000"/>
+        </w:rPr>
+        <w:t xml:space="preserve">1552–1565. (https://doi.org/10.1056/NEJMra1510030)</w:t>
       </w:r>
     </w:p>
     <w:p>
@@ -5122,7 +5226,59 @@
         <w:rPr>
           <w:color w:val="000000"/>
         </w:rPr>
-        <w:t xml:space="preserve">Chin YH, Ng CH, Lee MH, Koh JWH, Kiew J, Yang SP, Sundar G, Khoo CM. Prevalence of thyroid eye disease in Graves’ disease: A meta-analysis and systematic review. Clin Endocrinol (Oxf). 2020;93:363-374. doi:10.1111/cen.14296.</w:t>
+        <w:t xml:space="preserve">Chin YH, Ng CH, Lee MH, Koh JWH, Kiew J, Yang SP, Sundar G &amp; Khoo CM. Prevalence of thyroid eye disease in Graves’ disease: A meta-analysis and systematic review.</w:t>
+      </w:r>
+      <w:r>
+        <w:rPr>
+          <w:color w:val="000000"/>
+        </w:rPr>
+        <w:t xml:space="preserve"> </w:t>
+      </w:r>
+      <w:r>
+        <w:rPr>
+          <w:iCs/>
+          <w:i/>
+          <w:color w:val="000000"/>
+        </w:rPr>
+        <w:t xml:space="preserve">Clinical Endocrinology</w:t>
+      </w:r>
+      <w:r>
+        <w:rPr>
+          <w:color w:val="000000"/>
+        </w:rPr>
+        <w:t xml:space="preserve"> </w:t>
+      </w:r>
+      <w:r>
+        <w:rPr>
+          <w:color w:val="000000"/>
+        </w:rPr>
+        <w:t xml:space="preserve">2020</w:t>
+      </w:r>
+      <w:r>
+        <w:rPr>
+          <w:color w:val="000000"/>
+        </w:rPr>
+        <w:t xml:space="preserve"> </w:t>
+      </w:r>
+      <w:r>
+        <w:rPr>
+          <w:bCs/>
+          <w:b/>
+          <w:color w:val="000000"/>
+        </w:rPr>
+        <w:t xml:space="preserve">93</w:t>
+      </w:r>
+      <w:r>
+        <w:rPr>
+          <w:color w:val="000000"/>
+        </w:rPr>
+        <w:t xml:space="preserve"> </w:t>
+      </w:r>
+      <w:r>
+        <w:rPr>
+          <w:color w:val="000000"/>
+        </w:rPr>
+        <w:t xml:space="preserve">363–374. (https://doi.org/10.1111/cen.14296)</w:t>
       </w:r>
     </w:p>
     <w:p>
@@ -5136,7 +5292,99 @@
         <w:rPr>
           <w:color w:val="000000"/>
         </w:rPr>
-        <w:t xml:space="preserve">Brand OJ, Barrett JC, Simmonds MJ, Newby PR, McCabe CJ, Bruce CK, Kysela B, Carr-Smith JD, Brix T, Hunt PJ, et al. Association of the thyroid stimulating hormone receptor gene (TSHR) with Graves’ disease. Hum Mol Genet. 2009;18:1704-1713. doi:10.1093/hmg/ddp087.</w:t>
+        <w:t xml:space="preserve">Brand OJ, Barrett JC, Simmonds MJ, Newby PR, McCabe CJ, Bruce CK, Kysela B, Carr-Smith JD, Brix T, Hunt PJ,</w:t>
+      </w:r>
+      <w:r>
+        <w:rPr>
+          <w:color w:val="000000"/>
+        </w:rPr>
+        <w:t xml:space="preserve"> </w:t>
+      </w:r>
+      <w:r>
+        <w:rPr>
+          <w:iCs/>
+          <w:i/>
+          <w:color w:val="000000"/>
+        </w:rPr>
+        <w:t xml:space="preserve">et al.</w:t>
+      </w:r>
+      <w:r>
+        <w:rPr>
+          <w:color w:val="000000"/>
+        </w:rPr>
+        <w:t xml:space="preserve"> </w:t>
+      </w:r>
+      <w:r>
+        <w:rPr>
+          <w:color w:val="000000"/>
+        </w:rPr>
+        <w:t xml:space="preserve">Association of the thyroid stimulating hormone receptor gene (</w:t>
+      </w:r>
+      <w:r>
+        <w:rPr>
+          <w:iCs/>
+          <w:i/>
+          <w:color w:val="000000"/>
+        </w:rPr>
+        <w:t xml:space="preserve">TSHR</w:t>
+      </w:r>
+      <w:r>
+        <w:rPr>
+          <w:color w:val="000000"/>
+        </w:rPr>
+        <w:t xml:space="preserve">) with Graves’ disease.</w:t>
+      </w:r>
+      <w:r>
+        <w:rPr>
+          <w:color w:val="000000"/>
+        </w:rPr>
+        <w:t xml:space="preserve"> </w:t>
+      </w:r>
+      <w:r>
+        <w:rPr>
+          <w:iCs/>
+          <w:i/>
+          <w:color w:val="000000"/>
+        </w:rPr>
+        <w:t xml:space="preserve">Human Molecular Genetics</w:t>
+      </w:r>
+      <w:r>
+        <w:rPr>
+          <w:color w:val="000000"/>
+        </w:rPr>
+        <w:t xml:space="preserve"> </w:t>
+      </w:r>
+      <w:r>
+        <w:rPr>
+          <w:color w:val="000000"/>
+        </w:rPr>
+        <w:t xml:space="preserve">2009</w:t>
+      </w:r>
+      <w:r>
+        <w:rPr>
+          <w:color w:val="000000"/>
+        </w:rPr>
+        <w:t xml:space="preserve"> </w:t>
+      </w:r>
+      <w:r>
+        <w:rPr>
+          <w:bCs/>
+          <w:b/>
+          <w:color w:val="000000"/>
+        </w:rPr>
+        <w:t xml:space="preserve">18</w:t>
+      </w:r>
+      <w:r>
+        <w:rPr>
+          <w:color w:val="000000"/>
+        </w:rPr>
+        <w:t xml:space="preserve"> </w:t>
+      </w:r>
+      <w:r>
+        <w:rPr>
+          <w:color w:val="000000"/>
+        </w:rPr>
+        <w:t xml:space="preserve">1704–1713. (https://doi.org/10.1093/hmg/ddp087)</w:t>
       </w:r>
     </w:p>
     <w:p>
@@ -5150,7 +5398,85 @@
         <w:rPr>
           <w:color w:val="000000"/>
         </w:rPr>
-        <w:t xml:space="preserve">Chu X, Pan CM, Zhao SX, Liang J, Gao GQ, Zhang XM, Yuan GY, Li CG, Xue LQ, Shen M, et al. A genome-wide association study identifies two new risk loci for Graves’ disease. Nat Genet. 2011;43:897-901. doi:10.1038/ng.898.</w:t>
+        <w:t xml:space="preserve">Chu X, Pan CM, Zhao SX, Liang J, Gao GQ, Zhang XM, Yuan GY, Li CG, Xue LQ, Shen M,</w:t>
+      </w:r>
+      <w:r>
+        <w:rPr>
+          <w:color w:val="000000"/>
+        </w:rPr>
+        <w:t xml:space="preserve"> </w:t>
+      </w:r>
+      <w:r>
+        <w:rPr>
+          <w:iCs/>
+          <w:i/>
+          <w:color w:val="000000"/>
+        </w:rPr>
+        <w:t xml:space="preserve">et al.</w:t>
+      </w:r>
+      <w:r>
+        <w:rPr>
+          <w:color w:val="000000"/>
+        </w:rPr>
+        <w:t xml:space="preserve"> </w:t>
+      </w:r>
+      <w:r>
+        <w:rPr>
+          <w:color w:val="000000"/>
+        </w:rPr>
+        <w:t xml:space="preserve">A genome-wide association study identifies two new risk loci for Graves’ disease.</w:t>
+      </w:r>
+      <w:r>
+        <w:rPr>
+          <w:color w:val="000000"/>
+        </w:rPr>
+        <w:t xml:space="preserve"> </w:t>
+      </w:r>
+      <w:r>
+        <w:rPr>
+          <w:iCs/>
+          <w:i/>
+          <w:color w:val="000000"/>
+        </w:rPr>
+        <w:t xml:space="preserve">Nature Genetics</w:t>
+      </w:r>
+      <w:r>
+        <w:rPr>
+          <w:color w:val="000000"/>
+        </w:rPr>
+        <w:t xml:space="preserve"> </w:t>
+      </w:r>
+      <w:r>
+        <w:rPr>
+          <w:color w:val="000000"/>
+        </w:rPr>
+        <w:t xml:space="preserve">2011</w:t>
+      </w:r>
+      <w:r>
+        <w:rPr>
+          <w:color w:val="000000"/>
+        </w:rPr>
+        <w:t xml:space="preserve"> </w:t>
+      </w:r>
+      <w:r>
+        <w:rPr>
+          <w:bCs/>
+          <w:b/>
+          <w:color w:val="000000"/>
+        </w:rPr>
+        <w:t xml:space="preserve">43</w:t>
+      </w:r>
+      <w:r>
+        <w:rPr>
+          <w:color w:val="000000"/>
+        </w:rPr>
+        <w:t xml:space="preserve"> </w:t>
+      </w:r>
+      <w:r>
+        <w:rPr>
+          <w:color w:val="000000"/>
+        </w:rPr>
+        <w:t xml:space="preserve">897–901. (https://doi.org/10.1038/ng.898)</w:t>
       </w:r>
     </w:p>
     <w:p>
@@ -5164,7 +5490,59 @@
         <w:rPr>
           <w:color w:val="000000"/>
         </w:rPr>
-        <w:t xml:space="preserve">Marinò M, Rotondo Dottore G, Menconi F, Comi S, Cosentino G, Rocchi R, Latrofa F, Figus M, Santini F. Role of genetics and epigenetics in Graves’ orbitopathy. Eur Thyroid J. 2024;13:e240179. doi:10.1530/ETJ-24-0179.</w:t>
+        <w:t xml:space="preserve">Marinò M, Rotondo Dottore G, Menconi F, Comi S, Cosentino G, Rocchi R, Latrofa F, Figus M &amp; Santini F. Role of genetics and epigenetics in Graves’ orbitopathy.</w:t>
+      </w:r>
+      <w:r>
+        <w:rPr>
+          <w:color w:val="000000"/>
+        </w:rPr>
+        <w:t xml:space="preserve"> </w:t>
+      </w:r>
+      <w:r>
+        <w:rPr>
+          <w:iCs/>
+          <w:i/>
+          <w:color w:val="000000"/>
+        </w:rPr>
+        <w:t xml:space="preserve">European Thyroid Journal</w:t>
+      </w:r>
+      <w:r>
+        <w:rPr>
+          <w:color w:val="000000"/>
+        </w:rPr>
+        <w:t xml:space="preserve"> </w:t>
+      </w:r>
+      <w:r>
+        <w:rPr>
+          <w:color w:val="000000"/>
+        </w:rPr>
+        <w:t xml:space="preserve">2024</w:t>
+      </w:r>
+      <w:r>
+        <w:rPr>
+          <w:color w:val="000000"/>
+        </w:rPr>
+        <w:t xml:space="preserve"> </w:t>
+      </w:r>
+      <w:r>
+        <w:rPr>
+          <w:bCs/>
+          <w:b/>
+          <w:color w:val="000000"/>
+        </w:rPr>
+        <w:t xml:space="preserve">13</w:t>
+      </w:r>
+      <w:r>
+        <w:rPr>
+          <w:color w:val="000000"/>
+        </w:rPr>
+        <w:t xml:space="preserve"> </w:t>
+      </w:r>
+      <w:r>
+        <w:rPr>
+          <w:color w:val="000000"/>
+        </w:rPr>
+        <w:t xml:space="preserve">e240179. (https://doi.org/10.1530/ETJ-24-0179)</w:t>
       </w:r>
     </w:p>
     <w:p>
@@ -5178,7 +5556,59 @@
         <w:rPr>
           <w:color w:val="000000"/>
         </w:rPr>
-        <w:t xml:space="preserve">Tsui S, Naik V, Hoa N, Hwang CJ, Afifiyan NF, Sinha Hikim A, Gianoukakis AG, Douglas RS, Smith TJ. Evidence for an association between thyroid-stimulating hormone and insulin-like growth factor 1 receptors: a tale of two antigens implicated in Graves’ disease. J Immunol. 2008;181:4397-4405. doi:10.4049/jimmunol.181.6.4397.</w:t>
+        <w:t xml:space="preserve">Tsui S, Naik V, Hoa N, Hwang CJ, Afifiyan NF, Sinha Hikim A, Gianoukakis AG, Douglas RS &amp; Smith TJ. Evidence for an association between thyroid-stimulating hormone and insulin-like growth factor 1 receptors: a tale of two antigens implicated in Graves’ disease.</w:t>
+      </w:r>
+      <w:r>
+        <w:rPr>
+          <w:color w:val="000000"/>
+        </w:rPr>
+        <w:t xml:space="preserve"> </w:t>
+      </w:r>
+      <w:r>
+        <w:rPr>
+          <w:iCs/>
+          <w:i/>
+          <w:color w:val="000000"/>
+        </w:rPr>
+        <w:t xml:space="preserve">Journal of Immunology</w:t>
+      </w:r>
+      <w:r>
+        <w:rPr>
+          <w:color w:val="000000"/>
+        </w:rPr>
+        <w:t xml:space="preserve"> </w:t>
+      </w:r>
+      <w:r>
+        <w:rPr>
+          <w:color w:val="000000"/>
+        </w:rPr>
+        <w:t xml:space="preserve">2008</w:t>
+      </w:r>
+      <w:r>
+        <w:rPr>
+          <w:color w:val="000000"/>
+        </w:rPr>
+        <w:t xml:space="preserve"> </w:t>
+      </w:r>
+      <w:r>
+        <w:rPr>
+          <w:bCs/>
+          <w:b/>
+          <w:color w:val="000000"/>
+        </w:rPr>
+        <w:t xml:space="preserve">181</w:t>
+      </w:r>
+      <w:r>
+        <w:rPr>
+          <w:color w:val="000000"/>
+        </w:rPr>
+        <w:t xml:space="preserve"> </w:t>
+      </w:r>
+      <w:r>
+        <w:rPr>
+          <w:color w:val="000000"/>
+        </w:rPr>
+        <w:t xml:space="preserve">4397–4405. (https://doi.org/10.4049/jimmunol.181.6.4397)</w:t>
       </w:r>
     </w:p>
     <w:p>
@@ -5192,7 +5622,59 @@
         <w:rPr>
           <w:color w:val="000000"/>
         </w:rPr>
-        <w:t xml:space="preserve">Krieger CC, Boutin A, Jang D, Morgan SJ, Banga JP, Kahaly GJ, Klubo-Gwiezdzinska J, Neumann S, Gershengorn MC. Arrestin-β-1 Physically Scaffolds TSH and IGF1 Receptors to Enable Crosstalk. Endocrinology. 2019;160:1468-1479. doi:10.1210/en.2019-00055.</w:t>
+        <w:t xml:space="preserve">Krieger CC, Boutin A, Jang D, Morgan SJ, Banga JP, Kahaly GJ, Klubo-Gwiezdzinska J, Neumann S &amp; Gershengorn MC. Arrestin-β-1 Physically Scaffolds TSH and IGF1 Receptors to Enable Crosstalk.</w:t>
+      </w:r>
+      <w:r>
+        <w:rPr>
+          <w:color w:val="000000"/>
+        </w:rPr>
+        <w:t xml:space="preserve"> </w:t>
+      </w:r>
+      <w:r>
+        <w:rPr>
+          <w:iCs/>
+          <w:i/>
+          <w:color w:val="000000"/>
+        </w:rPr>
+        <w:t xml:space="preserve">Endocrinology</w:t>
+      </w:r>
+      <w:r>
+        <w:rPr>
+          <w:color w:val="000000"/>
+        </w:rPr>
+        <w:t xml:space="preserve"> </w:t>
+      </w:r>
+      <w:r>
+        <w:rPr>
+          <w:color w:val="000000"/>
+        </w:rPr>
+        <w:t xml:space="preserve">2019</w:t>
+      </w:r>
+      <w:r>
+        <w:rPr>
+          <w:color w:val="000000"/>
+        </w:rPr>
+        <w:t xml:space="preserve"> </w:t>
+      </w:r>
+      <w:r>
+        <w:rPr>
+          <w:bCs/>
+          <w:b/>
+          <w:color w:val="000000"/>
+        </w:rPr>
+        <w:t xml:space="preserve">160</w:t>
+      </w:r>
+      <w:r>
+        <w:rPr>
+          <w:color w:val="000000"/>
+        </w:rPr>
+        <w:t xml:space="preserve"> </w:t>
+      </w:r>
+      <w:r>
+        <w:rPr>
+          <w:color w:val="000000"/>
+        </w:rPr>
+        <w:t xml:space="preserve">1468–1479. (https://doi.org/10.1210/en.2019-00055)</w:t>
       </w:r>
     </w:p>
     <w:p>
@@ -5206,7 +5688,85 @@
         <w:rPr>
           <w:color w:val="000000"/>
         </w:rPr>
-        <w:t xml:space="preserve">Smith TJ, Kahaly GJ, Ezra DG, Fleming JC, Dailey RA, Tang RA, Harris GJ, Antonelli A, Salvi M, Goldberg RA, et al. Teprotumumab for Thyroid-Associated Ophthalmopathy. N Engl J Med. 2017;376:1748-1761. doi:10.1056/NEJMoa1614949.</w:t>
+        <w:t xml:space="preserve">Smith TJ, Kahaly GJ, Ezra DG, Fleming JC, Dailey RA, Tang RA, Harris GJ, Antonelli A, Salvi M, Goldberg RA,</w:t>
+      </w:r>
+      <w:r>
+        <w:rPr>
+          <w:color w:val="000000"/>
+        </w:rPr>
+        <w:t xml:space="preserve"> </w:t>
+      </w:r>
+      <w:r>
+        <w:rPr>
+          <w:iCs/>
+          <w:i/>
+          <w:color w:val="000000"/>
+        </w:rPr>
+        <w:t xml:space="preserve">et al.</w:t>
+      </w:r>
+      <w:r>
+        <w:rPr>
+          <w:color w:val="000000"/>
+        </w:rPr>
+        <w:t xml:space="preserve"> </w:t>
+      </w:r>
+      <w:r>
+        <w:rPr>
+          <w:color w:val="000000"/>
+        </w:rPr>
+        <w:t xml:space="preserve">Teprotumumab for Thyroid-Associated Ophthalmopathy.</w:t>
+      </w:r>
+      <w:r>
+        <w:rPr>
+          <w:color w:val="000000"/>
+        </w:rPr>
+        <w:t xml:space="preserve"> </w:t>
+      </w:r>
+      <w:r>
+        <w:rPr>
+          <w:iCs/>
+          <w:i/>
+          <w:color w:val="000000"/>
+        </w:rPr>
+        <w:t xml:space="preserve">New England Journal of Medicine</w:t>
+      </w:r>
+      <w:r>
+        <w:rPr>
+          <w:color w:val="000000"/>
+        </w:rPr>
+        <w:t xml:space="preserve"> </w:t>
+      </w:r>
+      <w:r>
+        <w:rPr>
+          <w:color w:val="000000"/>
+        </w:rPr>
+        <w:t xml:space="preserve">2017</w:t>
+      </w:r>
+      <w:r>
+        <w:rPr>
+          <w:color w:val="000000"/>
+        </w:rPr>
+        <w:t xml:space="preserve"> </w:t>
+      </w:r>
+      <w:r>
+        <w:rPr>
+          <w:bCs/>
+          <w:b/>
+          <w:color w:val="000000"/>
+        </w:rPr>
+        <w:t xml:space="preserve">376</w:t>
+      </w:r>
+      <w:r>
+        <w:rPr>
+          <w:color w:val="000000"/>
+        </w:rPr>
+        <w:t xml:space="preserve"> </w:t>
+      </w:r>
+      <w:r>
+        <w:rPr>
+          <w:color w:val="000000"/>
+        </w:rPr>
+        <w:t xml:space="preserve">1748–1761. (https://doi.org/10.1056/NEJMoa1614949)</w:t>
       </w:r>
     </w:p>
     <w:p>
@@ -5220,7 +5780,85 @@
         <w:rPr>
           <w:color w:val="000000"/>
         </w:rPr>
-        <w:t xml:space="preserve">Douglas RS, Kahaly GJ, Patel A, Sile S, Thompson EHZ, Perdok R, Fleming JC, Fowler BT, Marcocci C, Marinò M, et al. Teprotumumab for the Treatment of Active Thyroid Eye Disease. N Engl J Med. 2020;382:341-352. doi:10.1056/nejmoa1910434.</w:t>
+        <w:t xml:space="preserve">Douglas RS, Kahaly GJ, Patel A, Sile S, Thompson EHZ, Perdok R, Fleming JC, Fowler BT, Marcocci C, Marinò M,</w:t>
+      </w:r>
+      <w:r>
+        <w:rPr>
+          <w:color w:val="000000"/>
+        </w:rPr>
+        <w:t xml:space="preserve"> </w:t>
+      </w:r>
+      <w:r>
+        <w:rPr>
+          <w:iCs/>
+          <w:i/>
+          <w:color w:val="000000"/>
+        </w:rPr>
+        <w:t xml:space="preserve">et al.</w:t>
+      </w:r>
+      <w:r>
+        <w:rPr>
+          <w:color w:val="000000"/>
+        </w:rPr>
+        <w:t xml:space="preserve"> </w:t>
+      </w:r>
+      <w:r>
+        <w:rPr>
+          <w:color w:val="000000"/>
+        </w:rPr>
+        <w:t xml:space="preserve">Teprotumumab for the Treatment of Active Thyroid Eye Disease.</w:t>
+      </w:r>
+      <w:r>
+        <w:rPr>
+          <w:color w:val="000000"/>
+        </w:rPr>
+        <w:t xml:space="preserve"> </w:t>
+      </w:r>
+      <w:r>
+        <w:rPr>
+          <w:iCs/>
+          <w:i/>
+          <w:color w:val="000000"/>
+        </w:rPr>
+        <w:t xml:space="preserve">New England Journal of Medicine</w:t>
+      </w:r>
+      <w:r>
+        <w:rPr>
+          <w:color w:val="000000"/>
+        </w:rPr>
+        <w:t xml:space="preserve"> </w:t>
+      </w:r>
+      <w:r>
+        <w:rPr>
+          <w:color w:val="000000"/>
+        </w:rPr>
+        <w:t xml:space="preserve">2020</w:t>
+      </w:r>
+      <w:r>
+        <w:rPr>
+          <w:color w:val="000000"/>
+        </w:rPr>
+        <w:t xml:space="preserve"> </w:t>
+      </w:r>
+      <w:r>
+        <w:rPr>
+          <w:bCs/>
+          <w:b/>
+          <w:color w:val="000000"/>
+        </w:rPr>
+        <w:t xml:space="preserve">382</w:t>
+      </w:r>
+      <w:r>
+        <w:rPr>
+          <w:color w:val="000000"/>
+        </w:rPr>
+        <w:t xml:space="preserve"> </w:t>
+      </w:r>
+      <w:r>
+        <w:rPr>
+          <w:color w:val="000000"/>
+        </w:rPr>
+        <w:t xml:space="preserve">341–352. (https://doi.org/10.1056/NEJMoa1910434)</w:t>
       </w:r>
     </w:p>
     <w:p>
@@ -5234,7 +5872,85 @@
         <w:rPr>
           <w:color w:val="000000"/>
         </w:rPr>
-        <w:t xml:space="preserve">Nelson MR, Tipney H, Painter JL, Shen J, Nicoletti P, Shen Y, Floratos A, Sham PC, Li MJ, Wang J, et al. The support of human genetic evidence for approved drug indications. Nat Genet. 2015;47:856-860. doi:10.1038/ng.3314.</w:t>
+        <w:t xml:space="preserve">Nelson MR, Tipney H, Painter JL, Shen J, Nicoletti P, Shen Y, Floratos A, Sham PC, Li MJ, Wang J,</w:t>
+      </w:r>
+      <w:r>
+        <w:rPr>
+          <w:color w:val="000000"/>
+        </w:rPr>
+        <w:t xml:space="preserve"> </w:t>
+      </w:r>
+      <w:r>
+        <w:rPr>
+          <w:iCs/>
+          <w:i/>
+          <w:color w:val="000000"/>
+        </w:rPr>
+        <w:t xml:space="preserve">et al.</w:t>
+      </w:r>
+      <w:r>
+        <w:rPr>
+          <w:color w:val="000000"/>
+        </w:rPr>
+        <w:t xml:space="preserve"> </w:t>
+      </w:r>
+      <w:r>
+        <w:rPr>
+          <w:color w:val="000000"/>
+        </w:rPr>
+        <w:t xml:space="preserve">The support of human genetic evidence for approved drug indications.</w:t>
+      </w:r>
+      <w:r>
+        <w:rPr>
+          <w:color w:val="000000"/>
+        </w:rPr>
+        <w:t xml:space="preserve"> </w:t>
+      </w:r>
+      <w:r>
+        <w:rPr>
+          <w:iCs/>
+          <w:i/>
+          <w:color w:val="000000"/>
+        </w:rPr>
+        <w:t xml:space="preserve">Nature Genetics</w:t>
+      </w:r>
+      <w:r>
+        <w:rPr>
+          <w:color w:val="000000"/>
+        </w:rPr>
+        <w:t xml:space="preserve"> </w:t>
+      </w:r>
+      <w:r>
+        <w:rPr>
+          <w:color w:val="000000"/>
+        </w:rPr>
+        <w:t xml:space="preserve">2015</w:t>
+      </w:r>
+      <w:r>
+        <w:rPr>
+          <w:color w:val="000000"/>
+        </w:rPr>
+        <w:t xml:space="preserve"> </w:t>
+      </w:r>
+      <w:r>
+        <w:rPr>
+          <w:bCs/>
+          <w:b/>
+          <w:color w:val="000000"/>
+        </w:rPr>
+        <w:t xml:space="preserve">47</w:t>
+      </w:r>
+      <w:r>
+        <w:rPr>
+          <w:color w:val="000000"/>
+        </w:rPr>
+        <w:t xml:space="preserve"> </w:t>
+      </w:r>
+      <w:r>
+        <w:rPr>
+          <w:color w:val="000000"/>
+        </w:rPr>
+        <w:t xml:space="preserve">856–860. (https://doi.org/10.1038/ng.3314)</w:t>
       </w:r>
     </w:p>
     <w:p>
@@ -5248,7 +5964,59 @@
         <w:rPr>
           <w:color w:val="000000"/>
         </w:rPr>
-        <w:t xml:space="preserve">Minikel EV, Painter JL, Dong CC, Nelson MR. Refining the impact of genetic evidence on clinical success. Nature. 2024;629:624-629. doi:10.1038/s41586-024-07316-0.</w:t>
+        <w:t xml:space="preserve">Minikel EV, Painter JL, Dong CC &amp; Nelson MR. Refining the impact of genetic evidence on clinical success.</w:t>
+      </w:r>
+      <w:r>
+        <w:rPr>
+          <w:color w:val="000000"/>
+        </w:rPr>
+        <w:t xml:space="preserve"> </w:t>
+      </w:r>
+      <w:r>
+        <w:rPr>
+          <w:iCs/>
+          <w:i/>
+          <w:color w:val="000000"/>
+        </w:rPr>
+        <w:t xml:space="preserve">Nature</w:t>
+      </w:r>
+      <w:r>
+        <w:rPr>
+          <w:color w:val="000000"/>
+        </w:rPr>
+        <w:t xml:space="preserve"> </w:t>
+      </w:r>
+      <w:r>
+        <w:rPr>
+          <w:color w:val="000000"/>
+        </w:rPr>
+        <w:t xml:space="preserve">2024</w:t>
+      </w:r>
+      <w:r>
+        <w:rPr>
+          <w:color w:val="000000"/>
+        </w:rPr>
+        <w:t xml:space="preserve"> </w:t>
+      </w:r>
+      <w:r>
+        <w:rPr>
+          <w:bCs/>
+          <w:b/>
+          <w:color w:val="000000"/>
+        </w:rPr>
+        <w:t xml:space="preserve">629</w:t>
+      </w:r>
+      <w:r>
+        <w:rPr>
+          <w:color w:val="000000"/>
+        </w:rPr>
+        <w:t xml:space="preserve"> </w:t>
+      </w:r>
+      <w:r>
+        <w:rPr>
+          <w:color w:val="000000"/>
+        </w:rPr>
+        <w:t xml:space="preserve">624–629. (https://doi.org/10.1038/s41586-024-07316-0)</w:t>
       </w:r>
     </w:p>
     <w:p>
@@ -5262,7 +6030,85 @@
         <w:rPr>
           <w:color w:val="000000"/>
         </w:rPr>
-        <w:t xml:space="preserve">Sanderson E, Glymour MM, Holmes MV, Kang H, Morrison J, Munafò MR, Palmer T, Schooling CM, Wallace C, Zhao Q, et al. Mendelian randomization. Nat Rev Methods Primers. 2022;2:6. doi:10.1038/s43586-021-00092-5.</w:t>
+        <w:t xml:space="preserve">Sanderson E, Glymour MM, Holmes MV, Kang H, Morrison J, Munafò MR, Palmer T, Schooling CM, Wallace C, Zhao Q,</w:t>
+      </w:r>
+      <w:r>
+        <w:rPr>
+          <w:color w:val="000000"/>
+        </w:rPr>
+        <w:t xml:space="preserve"> </w:t>
+      </w:r>
+      <w:r>
+        <w:rPr>
+          <w:iCs/>
+          <w:i/>
+          <w:color w:val="000000"/>
+        </w:rPr>
+        <w:t xml:space="preserve">et al.</w:t>
+      </w:r>
+      <w:r>
+        <w:rPr>
+          <w:color w:val="000000"/>
+        </w:rPr>
+        <w:t xml:space="preserve"> </w:t>
+      </w:r>
+      <w:r>
+        <w:rPr>
+          <w:color w:val="000000"/>
+        </w:rPr>
+        <w:t xml:space="preserve">Mendelian randomization.</w:t>
+      </w:r>
+      <w:r>
+        <w:rPr>
+          <w:color w:val="000000"/>
+        </w:rPr>
+        <w:t xml:space="preserve"> </w:t>
+      </w:r>
+      <w:r>
+        <w:rPr>
+          <w:iCs/>
+          <w:i/>
+          <w:color w:val="000000"/>
+        </w:rPr>
+        <w:t xml:space="preserve">Nature Reviews Methods Primers</w:t>
+      </w:r>
+      <w:r>
+        <w:rPr>
+          <w:color w:val="000000"/>
+        </w:rPr>
+        <w:t xml:space="preserve"> </w:t>
+      </w:r>
+      <w:r>
+        <w:rPr>
+          <w:color w:val="000000"/>
+        </w:rPr>
+        <w:t xml:space="preserve">2022</w:t>
+      </w:r>
+      <w:r>
+        <w:rPr>
+          <w:color w:val="000000"/>
+        </w:rPr>
+        <w:t xml:space="preserve"> </w:t>
+      </w:r>
+      <w:r>
+        <w:rPr>
+          <w:bCs/>
+          <w:b/>
+          <w:color w:val="000000"/>
+        </w:rPr>
+        <w:t xml:space="preserve">2</w:t>
+      </w:r>
+      <w:r>
+        <w:rPr>
+          <w:color w:val="000000"/>
+        </w:rPr>
+        <w:t xml:space="preserve"> </w:t>
+      </w:r>
+      <w:r>
+        <w:rPr>
+          <w:color w:val="000000"/>
+        </w:rPr>
+        <w:t xml:space="preserve">6. (https://doi.org/10.1038/s43586-021-00092-5)</w:t>
       </w:r>
     </w:p>
     <w:p>
@@ -5276,7 +6122,85 @@
         <w:rPr>
           <w:color w:val="000000"/>
         </w:rPr>
-        <w:t xml:space="preserve">Gill D, Georgakis MK, Walker VM, Schmidt AF, Gkatzionis A, Freitag DF, Finan C, Hingorani AD, Howson JMM, Burgess S, et al. Mendelian randomization for studying the effects of perturbing drug targets. Wellcome Open Res. 2021;6:16. doi:10.12688/wellcomeopenres.16544.2.</w:t>
+        <w:t xml:space="preserve">Gill D, Georgakis MK, Walker VM, Schmidt AF, Gkatzionis A, Freitag DF, Finan C, Hingorani AD, Howson JMM, Burgess S,</w:t>
+      </w:r>
+      <w:r>
+        <w:rPr>
+          <w:color w:val="000000"/>
+        </w:rPr>
+        <w:t xml:space="preserve"> </w:t>
+      </w:r>
+      <w:r>
+        <w:rPr>
+          <w:iCs/>
+          <w:i/>
+          <w:color w:val="000000"/>
+        </w:rPr>
+        <w:t xml:space="preserve">et al.</w:t>
+      </w:r>
+      <w:r>
+        <w:rPr>
+          <w:color w:val="000000"/>
+        </w:rPr>
+        <w:t xml:space="preserve"> </w:t>
+      </w:r>
+      <w:r>
+        <w:rPr>
+          <w:color w:val="000000"/>
+        </w:rPr>
+        <w:t xml:space="preserve">Mendelian randomization for studying the effects of perturbing drug targets.</w:t>
+      </w:r>
+      <w:r>
+        <w:rPr>
+          <w:color w:val="000000"/>
+        </w:rPr>
+        <w:t xml:space="preserve"> </w:t>
+      </w:r>
+      <w:r>
+        <w:rPr>
+          <w:iCs/>
+          <w:i/>
+          <w:color w:val="000000"/>
+        </w:rPr>
+        <w:t xml:space="preserve">Wellcome Open Research</w:t>
+      </w:r>
+      <w:r>
+        <w:rPr>
+          <w:color w:val="000000"/>
+        </w:rPr>
+        <w:t xml:space="preserve"> </w:t>
+      </w:r>
+      <w:r>
+        <w:rPr>
+          <w:color w:val="000000"/>
+        </w:rPr>
+        <w:t xml:space="preserve">2021</w:t>
+      </w:r>
+      <w:r>
+        <w:rPr>
+          <w:color w:val="000000"/>
+        </w:rPr>
+        <w:t xml:space="preserve"> </w:t>
+      </w:r>
+      <w:r>
+        <w:rPr>
+          <w:bCs/>
+          <w:b/>
+          <w:color w:val="000000"/>
+        </w:rPr>
+        <w:t xml:space="preserve">6</w:t>
+      </w:r>
+      <w:r>
+        <w:rPr>
+          <w:color w:val="000000"/>
+        </w:rPr>
+        <w:t xml:space="preserve"> </w:t>
+      </w:r>
+      <w:r>
+        <w:rPr>
+          <w:color w:val="000000"/>
+        </w:rPr>
+        <w:t xml:space="preserve">16. (https://doi.org/10.12688/wellcomeopenres.16544.2)</w:t>
       </w:r>
     </w:p>
     <w:p>
@@ -5290,7 +6214,59 @@
         <w:rPr>
           <w:color w:val="000000"/>
         </w:rPr>
-        <w:t xml:space="preserve">Giambartolomei C, Vukcevic D, Schadt EE, Franke L, Hingorani AD, Wallace C, Plagnol V. Bayesian test for colocalisation between pairs of genetic association studies using summary statistics. PLoS Genet. 2014;10:e1004383. doi:10.1371/journal.pgen.1004383.</w:t>
+        <w:t xml:space="preserve">Giambartolomei C, Vukcevic D, Schadt EE, Franke L, Hingorani AD, Wallace C &amp; Plagnol V. Bayesian test for colocalisation between pairs of genetic association studies using summary statistics.</w:t>
+      </w:r>
+      <w:r>
+        <w:rPr>
+          <w:color w:val="000000"/>
+        </w:rPr>
+        <w:t xml:space="preserve"> </w:t>
+      </w:r>
+      <w:r>
+        <w:rPr>
+          <w:iCs/>
+          <w:i/>
+          <w:color w:val="000000"/>
+        </w:rPr>
+        <w:t xml:space="preserve">PLoS Genetics</w:t>
+      </w:r>
+      <w:r>
+        <w:rPr>
+          <w:color w:val="000000"/>
+        </w:rPr>
+        <w:t xml:space="preserve"> </w:t>
+      </w:r>
+      <w:r>
+        <w:rPr>
+          <w:color w:val="000000"/>
+        </w:rPr>
+        <w:t xml:space="preserve">2014</w:t>
+      </w:r>
+      <w:r>
+        <w:rPr>
+          <w:color w:val="000000"/>
+        </w:rPr>
+        <w:t xml:space="preserve"> </w:t>
+      </w:r>
+      <w:r>
+        <w:rPr>
+          <w:bCs/>
+          <w:b/>
+          <w:color w:val="000000"/>
+        </w:rPr>
+        <w:t xml:space="preserve">10</w:t>
+      </w:r>
+      <w:r>
+        <w:rPr>
+          <w:color w:val="000000"/>
+        </w:rPr>
+        <w:t xml:space="preserve"> </w:t>
+      </w:r>
+      <w:r>
+        <w:rPr>
+          <w:color w:val="000000"/>
+        </w:rPr>
+        <w:t xml:space="preserve">e1004383. (https://doi.org/10.1371/journal.pgen.1004383)</w:t>
       </w:r>
     </w:p>
     <w:p>
@@ -5304,7 +6280,59 @@
         <w:rPr>
           <w:color w:val="000000"/>
         </w:rPr>
-        <w:t xml:space="preserve">Zuber V, Grinberg NF, Gill D, Manipur I, Slob EAW, Patel A, Wallace C, Burgess S. Combining evidence from Mendelian randomization and colocalization: Review and comparison of approaches. Am J Hum Genet. 2022;109:767-782. doi:10.1016/j.ajhg.2022.04.001.</w:t>
+        <w:t xml:space="preserve">Zuber V, Grinberg NF, Gill D, Manipur I, Slob EAW, Patel A, Wallace C &amp; Burgess S. Combining evidence from Mendelian randomization and colocalization: Review and comparison of approaches.</w:t>
+      </w:r>
+      <w:r>
+        <w:rPr>
+          <w:color w:val="000000"/>
+        </w:rPr>
+        <w:t xml:space="preserve"> </w:t>
+      </w:r>
+      <w:r>
+        <w:rPr>
+          <w:iCs/>
+          <w:i/>
+          <w:color w:val="000000"/>
+        </w:rPr>
+        <w:t xml:space="preserve">American Journal of Human Genetics</w:t>
+      </w:r>
+      <w:r>
+        <w:rPr>
+          <w:color w:val="000000"/>
+        </w:rPr>
+        <w:t xml:space="preserve"> </w:t>
+      </w:r>
+      <w:r>
+        <w:rPr>
+          <w:color w:val="000000"/>
+        </w:rPr>
+        <w:t xml:space="preserve">2022</w:t>
+      </w:r>
+      <w:r>
+        <w:rPr>
+          <w:color w:val="000000"/>
+        </w:rPr>
+        <w:t xml:space="preserve"> </w:t>
+      </w:r>
+      <w:r>
+        <w:rPr>
+          <w:bCs/>
+          <w:b/>
+          <w:color w:val="000000"/>
+        </w:rPr>
+        <w:t xml:space="preserve">109</w:t>
+      </w:r>
+      <w:r>
+        <w:rPr>
+          <w:color w:val="000000"/>
+        </w:rPr>
+        <w:t xml:space="preserve"> </w:t>
+      </w:r>
+      <w:r>
+        <w:rPr>
+          <w:color w:val="000000"/>
+        </w:rPr>
+        <w:t xml:space="preserve">767–782. (https://doi.org/10.1016/j.ajhg.2022.04.001)</w:t>
       </w:r>
     </w:p>
     <w:p>
@@ -5318,7 +6346,85 @@
         <w:rPr>
           <w:color w:val="000000"/>
         </w:rPr>
-        <w:t xml:space="preserve">Zheng J, Haberland V, Baird D, Walker V, Haycock PC, Hurle MR, Gutteridge A, Erola P, Liu Y, Luo S, et al. Phenome-wide Mendelian randomization mapping the influence of the plasma proteome on complex diseases. Nat Genet. 2020;52:1122-1131. doi:10.1038/s41588-020-0682-6.</w:t>
+        <w:t xml:space="preserve">Zheng J, Haberland V, Baird D, Walker V, Haycock PC, Hurle MR, Gutteridge A, Erola P, Liu Y, Luo S,</w:t>
+      </w:r>
+      <w:r>
+        <w:rPr>
+          <w:color w:val="000000"/>
+        </w:rPr>
+        <w:t xml:space="preserve"> </w:t>
+      </w:r>
+      <w:r>
+        <w:rPr>
+          <w:iCs/>
+          <w:i/>
+          <w:color w:val="000000"/>
+        </w:rPr>
+        <w:t xml:space="preserve">et al.</w:t>
+      </w:r>
+      <w:r>
+        <w:rPr>
+          <w:color w:val="000000"/>
+        </w:rPr>
+        <w:t xml:space="preserve"> </w:t>
+      </w:r>
+      <w:r>
+        <w:rPr>
+          <w:color w:val="000000"/>
+        </w:rPr>
+        <w:t xml:space="preserve">Phenome-wide Mendelian randomization mapping the influence of the plasma proteome on complex diseases.</w:t>
+      </w:r>
+      <w:r>
+        <w:rPr>
+          <w:color w:val="000000"/>
+        </w:rPr>
+        <w:t xml:space="preserve"> </w:t>
+      </w:r>
+      <w:r>
+        <w:rPr>
+          <w:iCs/>
+          <w:i/>
+          <w:color w:val="000000"/>
+        </w:rPr>
+        <w:t xml:space="preserve">Nature Genetics</w:t>
+      </w:r>
+      <w:r>
+        <w:rPr>
+          <w:color w:val="000000"/>
+        </w:rPr>
+        <w:t xml:space="preserve"> </w:t>
+      </w:r>
+      <w:r>
+        <w:rPr>
+          <w:color w:val="000000"/>
+        </w:rPr>
+        <w:t xml:space="preserve">2020</w:t>
+      </w:r>
+      <w:r>
+        <w:rPr>
+          <w:color w:val="000000"/>
+        </w:rPr>
+        <w:t xml:space="preserve"> </w:t>
+      </w:r>
+      <w:r>
+        <w:rPr>
+          <w:bCs/>
+          <w:b/>
+          <w:color w:val="000000"/>
+        </w:rPr>
+        <w:t xml:space="preserve">52</w:t>
+      </w:r>
+      <w:r>
+        <w:rPr>
+          <w:color w:val="000000"/>
+        </w:rPr>
+        <w:t xml:space="preserve"> </w:t>
+      </w:r>
+      <w:r>
+        <w:rPr>
+          <w:color w:val="000000"/>
+        </w:rPr>
+        <w:t xml:space="preserve">1122–1131. (https://doi.org/10.1038/s41588-020-0682-6)</w:t>
       </w:r>
     </w:p>
     <w:p>
@@ -5332,7 +6438,59 @@
         <w:rPr>
           <w:color w:val="000000"/>
         </w:rPr>
-        <w:t xml:space="preserve">Ji Q, Xu H, Chen H, Chen X, Wang S, Zou J. Pathogenic genes associated with immune-related genes in graves’ disease: a multi-omics Mendelian randomization analysis. Sci Rep. 2025;15:37875. doi:10.1038/s41598-025-21754-4.</w:t>
+        <w:t xml:space="preserve">Ji Q, Xu H, Chen H, Chen X, Wang S &amp; Zou J. Pathogenic genes associated with immune-related genes in graves’ disease: a multi-omics Mendelian randomization analysis.</w:t>
+      </w:r>
+      <w:r>
+        <w:rPr>
+          <w:color w:val="000000"/>
+        </w:rPr>
+        <w:t xml:space="preserve"> </w:t>
+      </w:r>
+      <w:r>
+        <w:rPr>
+          <w:iCs/>
+          <w:i/>
+          <w:color w:val="000000"/>
+        </w:rPr>
+        <w:t xml:space="preserve">Scientific Reports</w:t>
+      </w:r>
+      <w:r>
+        <w:rPr>
+          <w:color w:val="000000"/>
+        </w:rPr>
+        <w:t xml:space="preserve"> </w:t>
+      </w:r>
+      <w:r>
+        <w:rPr>
+          <w:color w:val="000000"/>
+        </w:rPr>
+        <w:t xml:space="preserve">2025</w:t>
+      </w:r>
+      <w:r>
+        <w:rPr>
+          <w:color w:val="000000"/>
+        </w:rPr>
+        <w:t xml:space="preserve"> </w:t>
+      </w:r>
+      <w:r>
+        <w:rPr>
+          <w:bCs/>
+          <w:b/>
+          <w:color w:val="000000"/>
+        </w:rPr>
+        <w:t xml:space="preserve">15</w:t>
+      </w:r>
+      <w:r>
+        <w:rPr>
+          <w:color w:val="000000"/>
+        </w:rPr>
+        <w:t xml:space="preserve"> </w:t>
+      </w:r>
+      <w:r>
+        <w:rPr>
+          <w:color w:val="000000"/>
+        </w:rPr>
+        <w:t xml:space="preserve">37875. (https://doi.org/10.1038/s41598-025-21754-4)</w:t>
       </w:r>
     </w:p>
     <w:p>
@@ -5346,7 +6504,85 @@
         <w:rPr>
           <w:color w:val="000000"/>
         </w:rPr>
-        <w:t xml:space="preserve">Zhang H, Jiang S, Zhu T, Liu Y, Li J, Fang S, Li Y, Sun J, He X, Tong C, et al. Thyroid-stimulating hormone receptor mediates peripheral-central neuroimmune crosstalk in autoimmune thyroid diseases. BMC Med. 2026;24:404. doi:10.1186/s12916-026-04957-y.</w:t>
+        <w:t xml:space="preserve">Zhang H, Jiang S, Zhu T, Liu Y, Li J, Fang S, Li Y, Sun J, He X, Tong C,</w:t>
+      </w:r>
+      <w:r>
+        <w:rPr>
+          <w:color w:val="000000"/>
+        </w:rPr>
+        <w:t xml:space="preserve"> </w:t>
+      </w:r>
+      <w:r>
+        <w:rPr>
+          <w:iCs/>
+          <w:i/>
+          <w:color w:val="000000"/>
+        </w:rPr>
+        <w:t xml:space="preserve">et al.</w:t>
+      </w:r>
+      <w:r>
+        <w:rPr>
+          <w:color w:val="000000"/>
+        </w:rPr>
+        <w:t xml:space="preserve"> </w:t>
+      </w:r>
+      <w:r>
+        <w:rPr>
+          <w:color w:val="000000"/>
+        </w:rPr>
+        <w:t xml:space="preserve">Thyroid-stimulating hormone receptor mediates peripheral-central neuroimmune crosstalk in autoimmune thyroid diseases.</w:t>
+      </w:r>
+      <w:r>
+        <w:rPr>
+          <w:color w:val="000000"/>
+        </w:rPr>
+        <w:t xml:space="preserve"> </w:t>
+      </w:r>
+      <w:r>
+        <w:rPr>
+          <w:iCs/>
+          <w:i/>
+          <w:color w:val="000000"/>
+        </w:rPr>
+        <w:t xml:space="preserve">BMC Medicine</w:t>
+      </w:r>
+      <w:r>
+        <w:rPr>
+          <w:color w:val="000000"/>
+        </w:rPr>
+        <w:t xml:space="preserve"> </w:t>
+      </w:r>
+      <w:r>
+        <w:rPr>
+          <w:color w:val="000000"/>
+        </w:rPr>
+        <w:t xml:space="preserve">2026</w:t>
+      </w:r>
+      <w:r>
+        <w:rPr>
+          <w:color w:val="000000"/>
+        </w:rPr>
+        <w:t xml:space="preserve"> </w:t>
+      </w:r>
+      <w:r>
+        <w:rPr>
+          <w:bCs/>
+          <w:b/>
+          <w:color w:val="000000"/>
+        </w:rPr>
+        <w:t xml:space="preserve">24</w:t>
+      </w:r>
+      <w:r>
+        <w:rPr>
+          <w:color w:val="000000"/>
+        </w:rPr>
+        <w:t xml:space="preserve"> </w:t>
+      </w:r>
+      <w:r>
+        <w:rPr>
+          <w:color w:val="000000"/>
+        </w:rPr>
+        <w:t xml:space="preserve">404. (https://doi.org/10.1186/s12916-026-04957-y)</w:t>
       </w:r>
     </w:p>
     <w:p>
@@ -5360,7 +6596,85 @@
         <w:rPr>
           <w:color w:val="000000"/>
         </w:rPr>
-        <w:t xml:space="preserve">Ke C, Yu Y, Li J, Yu Y, Sun Y, Wang Y, Wang B, Lu Y, Tang M, Wang N, et al. Genetic and Plasma Proteomic Approaches to Identify Therapeutic Targets for Graves’ Disease and Graves’ Ophthalmopathy. Immunotargets Ther. 2025;14:87-98. doi:10.2147/ITT.S494692.</w:t>
+        <w:t xml:space="preserve">Ke C, Yu Y, Li J, Yu Y, Sun Y, Wang Y, Wang B, Lu Y, Tang M, Wang N,</w:t>
+      </w:r>
+      <w:r>
+        <w:rPr>
+          <w:color w:val="000000"/>
+        </w:rPr>
+        <w:t xml:space="preserve"> </w:t>
+      </w:r>
+      <w:r>
+        <w:rPr>
+          <w:iCs/>
+          <w:i/>
+          <w:color w:val="000000"/>
+        </w:rPr>
+        <w:t xml:space="preserve">et al.</w:t>
+      </w:r>
+      <w:r>
+        <w:rPr>
+          <w:color w:val="000000"/>
+        </w:rPr>
+        <w:t xml:space="preserve"> </w:t>
+      </w:r>
+      <w:r>
+        <w:rPr>
+          <w:color w:val="000000"/>
+        </w:rPr>
+        <w:t xml:space="preserve">Genetic and Plasma Proteomic Approaches to Identify Therapeutic Targets for Graves’ Disease and Graves’ Ophthalmopathy.</w:t>
+      </w:r>
+      <w:r>
+        <w:rPr>
+          <w:color w:val="000000"/>
+        </w:rPr>
+        <w:t xml:space="preserve"> </w:t>
+      </w:r>
+      <w:r>
+        <w:rPr>
+          <w:iCs/>
+          <w:i/>
+          <w:color w:val="000000"/>
+        </w:rPr>
+        <w:t xml:space="preserve">ImmunoTargets and Therapy</w:t>
+      </w:r>
+      <w:r>
+        <w:rPr>
+          <w:color w:val="000000"/>
+        </w:rPr>
+        <w:t xml:space="preserve"> </w:t>
+      </w:r>
+      <w:r>
+        <w:rPr>
+          <w:color w:val="000000"/>
+        </w:rPr>
+        <w:t xml:space="preserve">2025</w:t>
+      </w:r>
+      <w:r>
+        <w:rPr>
+          <w:color w:val="000000"/>
+        </w:rPr>
+        <w:t xml:space="preserve"> </w:t>
+      </w:r>
+      <w:r>
+        <w:rPr>
+          <w:bCs/>
+          <w:b/>
+          <w:color w:val="000000"/>
+        </w:rPr>
+        <w:t xml:space="preserve">14</w:t>
+      </w:r>
+      <w:r>
+        <w:rPr>
+          <w:color w:val="000000"/>
+        </w:rPr>
+        <w:t xml:space="preserve"> </w:t>
+      </w:r>
+      <w:r>
+        <w:rPr>
+          <w:color w:val="000000"/>
+        </w:rPr>
+        <w:t xml:space="preserve">87–98. (https://doi.org/10.2147/ITT.S494692)</w:t>
       </w:r>
     </w:p>
     <w:p>
@@ -5374,7 +6688,85 @@
         <w:rPr>
           <w:color w:val="000000"/>
         </w:rPr>
-        <w:t xml:space="preserve">Finan C, Gaulton A, Kruger FA, Lumbers RT, Shah T, Engmann J, Galver L, Kelley R, Karlsson A, Santos R, et al. The druggable genome and support for target identification and validation in drug development. Sci Transl Med. 2017;9:eaag1166. doi:10.1126/scitranslmed.aag1166.</w:t>
+        <w:t xml:space="preserve">Finan C, Gaulton A, Kruger FA, Lumbers RT, Shah T, Engmann J, Galver L, Kelley R, Karlsson A, Santos R,</w:t>
+      </w:r>
+      <w:r>
+        <w:rPr>
+          <w:color w:val="000000"/>
+        </w:rPr>
+        <w:t xml:space="preserve"> </w:t>
+      </w:r>
+      <w:r>
+        <w:rPr>
+          <w:iCs/>
+          <w:i/>
+          <w:color w:val="000000"/>
+        </w:rPr>
+        <w:t xml:space="preserve">et al.</w:t>
+      </w:r>
+      <w:r>
+        <w:rPr>
+          <w:color w:val="000000"/>
+        </w:rPr>
+        <w:t xml:space="preserve"> </w:t>
+      </w:r>
+      <w:r>
+        <w:rPr>
+          <w:color w:val="000000"/>
+        </w:rPr>
+        <w:t xml:space="preserve">The druggable genome and support for target identification and validation in drug development.</w:t>
+      </w:r>
+      <w:r>
+        <w:rPr>
+          <w:color w:val="000000"/>
+        </w:rPr>
+        <w:t xml:space="preserve"> </w:t>
+      </w:r>
+      <w:r>
+        <w:rPr>
+          <w:iCs/>
+          <w:i/>
+          <w:color w:val="000000"/>
+        </w:rPr>
+        <w:t xml:space="preserve">Science Translational Medicine</w:t>
+      </w:r>
+      <w:r>
+        <w:rPr>
+          <w:color w:val="000000"/>
+        </w:rPr>
+        <w:t xml:space="preserve"> </w:t>
+      </w:r>
+      <w:r>
+        <w:rPr>
+          <w:color w:val="000000"/>
+        </w:rPr>
+        <w:t xml:space="preserve">2017</w:t>
+      </w:r>
+      <w:r>
+        <w:rPr>
+          <w:color w:val="000000"/>
+        </w:rPr>
+        <w:t xml:space="preserve"> </w:t>
+      </w:r>
+      <w:r>
+        <w:rPr>
+          <w:bCs/>
+          <w:b/>
+          <w:color w:val="000000"/>
+        </w:rPr>
+        <w:t xml:space="preserve">9</w:t>
+      </w:r>
+      <w:r>
+        <w:rPr>
+          <w:color w:val="000000"/>
+        </w:rPr>
+        <w:t xml:space="preserve"> </w:t>
+      </w:r>
+      <w:r>
+        <w:rPr>
+          <w:color w:val="000000"/>
+        </w:rPr>
+        <w:t xml:space="preserve">eaag1166. (https://doi.org/10.1126/scitranslmed.aag1166)</w:t>
       </w:r>
     </w:p>
     <w:p>
@@ -5388,7 +6780,111 @@
         <w:rPr>
           <w:color w:val="000000"/>
         </w:rPr>
-        <w:t xml:space="preserve">Ueda H, Howson JM, Esposito L, Heward J, Snook H, Chamberlain G, Rainbow DB, Hunter KM, Smith AN, Di Genova G, et al. Association of the T-cell regulatory gene CTLA4 with susceptibility to autoimmune disease. Nature. 2003;423:506-511. doi:10.1038/nature01621.</w:t>
+        <w:t xml:space="preserve">Ueda H, Howson JM, Esposito L, Heward J, Snook H, Chamberlain G, Rainbow DB, Hunter KM, Smith AN, Di Genova G,</w:t>
+      </w:r>
+      <w:r>
+        <w:rPr>
+          <w:color w:val="000000"/>
+        </w:rPr>
+        <w:t xml:space="preserve"> </w:t>
+      </w:r>
+      <w:r>
+        <w:rPr>
+          <w:iCs/>
+          <w:i/>
+          <w:color w:val="000000"/>
+        </w:rPr>
+        <w:t xml:space="preserve">et al.</w:t>
+      </w:r>
+      <w:r>
+        <w:rPr>
+          <w:color w:val="000000"/>
+        </w:rPr>
+        <w:t xml:space="preserve"> </w:t>
+      </w:r>
+      <w:r>
+        <w:rPr>
+          <w:color w:val="000000"/>
+        </w:rPr>
+        <w:t xml:space="preserve">Association of the T-cell regulatory gene</w:t>
+      </w:r>
+      <w:r>
+        <w:rPr>
+          <w:color w:val="000000"/>
+        </w:rPr>
+        <w:t xml:space="preserve"> </w:t>
+      </w:r>
+      <w:r>
+        <w:rPr>
+          <w:iCs/>
+          <w:i/>
+          <w:color w:val="000000"/>
+        </w:rPr>
+        <w:t xml:space="preserve">CTLA4</w:t>
+      </w:r>
+      <w:r>
+        <w:rPr>
+          <w:color w:val="000000"/>
+        </w:rPr>
+        <w:t xml:space="preserve"> </w:t>
+      </w:r>
+      <w:r>
+        <w:rPr>
+          <w:color w:val="000000"/>
+        </w:rPr>
+        <w:t xml:space="preserve">with susceptibility to autoimmune disease.</w:t>
+      </w:r>
+      <w:r>
+        <w:rPr>
+          <w:color w:val="000000"/>
+        </w:rPr>
+        <w:t xml:space="preserve"> </w:t>
+      </w:r>
+      <w:r>
+        <w:rPr>
+          <w:iCs/>
+          <w:i/>
+          <w:color w:val="000000"/>
+        </w:rPr>
+        <w:t xml:space="preserve">Nature</w:t>
+      </w:r>
+      <w:r>
+        <w:rPr>
+          <w:color w:val="000000"/>
+        </w:rPr>
+        <w:t xml:space="preserve"> </w:t>
+      </w:r>
+      <w:r>
+        <w:rPr>
+          <w:color w:val="000000"/>
+        </w:rPr>
+        <w:t xml:space="preserve">2003</w:t>
+      </w:r>
+      <w:r>
+        <w:rPr>
+          <w:color w:val="000000"/>
+        </w:rPr>
+        <w:t xml:space="preserve"> </w:t>
+      </w:r>
+      <w:r>
+        <w:rPr>
+          <w:bCs/>
+          <w:b/>
+          <w:color w:val="000000"/>
+        </w:rPr>
+        <w:t xml:space="preserve">423</w:t>
+      </w:r>
+      <w:r>
+        <w:rPr>
+          <w:color w:val="000000"/>
+        </w:rPr>
+        <w:t xml:space="preserve"> </w:t>
+      </w:r>
+      <w:r>
+        <w:rPr>
+          <w:color w:val="000000"/>
+        </w:rPr>
+        <w:t xml:space="preserve">506–511. (https://doi.org/10.1038/nature01621)</w:t>
       </w:r>
     </w:p>
     <w:p>
@@ -5402,7 +6898,85 @@
         <w:rPr>
           <w:color w:val="000000"/>
         </w:rPr>
-        <w:t xml:space="preserve">Skrivankova VW, Richmond RC, Woolf BAR, Yarmolinsky J, Davies NM, Swanson SA, VanderWeele TJ, Higgins JPT, Timpson NJ, Dimou N, et al. Strengthening the Reporting of Observational Studies in Epidemiology Using Mendelian Randomization: The STROBE-MR Statement. JAMA. 2021;326:1614-1621. doi:10.1001/jama.2021.18236.</w:t>
+        <w:t xml:space="preserve">Skrivankova VW, Richmond RC, Woolf BAR, Yarmolinsky J, Davies NM, Swanson SA, VanderWeele TJ, Higgins JPT, Timpson NJ, Dimou N,</w:t>
+      </w:r>
+      <w:r>
+        <w:rPr>
+          <w:color w:val="000000"/>
+        </w:rPr>
+        <w:t xml:space="preserve"> </w:t>
+      </w:r>
+      <w:r>
+        <w:rPr>
+          <w:iCs/>
+          <w:i/>
+          <w:color w:val="000000"/>
+        </w:rPr>
+        <w:t xml:space="preserve">et al.</w:t>
+      </w:r>
+      <w:r>
+        <w:rPr>
+          <w:color w:val="000000"/>
+        </w:rPr>
+        <w:t xml:space="preserve"> </w:t>
+      </w:r>
+      <w:r>
+        <w:rPr>
+          <w:color w:val="000000"/>
+        </w:rPr>
+        <w:t xml:space="preserve">Strengthening the Reporting of Observational Studies in Epidemiology Using Mendelian Randomization: The STROBE-MR Statement.</w:t>
+      </w:r>
+      <w:r>
+        <w:rPr>
+          <w:color w:val="000000"/>
+        </w:rPr>
+        <w:t xml:space="preserve"> </w:t>
+      </w:r>
+      <w:r>
+        <w:rPr>
+          <w:iCs/>
+          <w:i/>
+          <w:color w:val="000000"/>
+        </w:rPr>
+        <w:t xml:space="preserve">JAMA</w:t>
+      </w:r>
+      <w:r>
+        <w:rPr>
+          <w:color w:val="000000"/>
+        </w:rPr>
+        <w:t xml:space="preserve"> </w:t>
+      </w:r>
+      <w:r>
+        <w:rPr>
+          <w:color w:val="000000"/>
+        </w:rPr>
+        <w:t xml:space="preserve">2021</w:t>
+      </w:r>
+      <w:r>
+        <w:rPr>
+          <w:color w:val="000000"/>
+        </w:rPr>
+        <w:t xml:space="preserve"> </w:t>
+      </w:r>
+      <w:r>
+        <w:rPr>
+          <w:bCs/>
+          <w:b/>
+          <w:color w:val="000000"/>
+        </w:rPr>
+        <w:t xml:space="preserve">326</w:t>
+      </w:r>
+      <w:r>
+        <w:rPr>
+          <w:color w:val="000000"/>
+        </w:rPr>
+        <w:t xml:space="preserve"> </w:t>
+      </w:r>
+      <w:r>
+        <w:rPr>
+          <w:color w:val="000000"/>
+        </w:rPr>
+        <w:t xml:space="preserve">1614–1621. (https://doi.org/10.1001/jama.2021.18236)</w:t>
       </w:r>
     </w:p>
     <w:p>
@@ -5416,7 +6990,85 @@
         <w:rPr>
           <w:color w:val="000000"/>
         </w:rPr>
-        <w:t xml:space="preserve">Võsa U, Claringbould A, Westra HJ, Bonder MJ, Deelen P, Zeng B, Kirsten H, Saha A, Kreuzhuber R, Yazar S, et al. Large-scale cis- and trans-eQTL analyses identify thousands of genetic loci and polygenic scores that regulate blood gene expression. Nat Genet. 2021;53:1300-1310. doi:10.1038/s41588-021-00913-z.</w:t>
+        <w:t xml:space="preserve">Võsa U, Claringbould A, Westra HJ, Bonder MJ, Deelen P, Zeng B, Kirsten H, Saha A, Kreuzhuber R, Yazar S,</w:t>
+      </w:r>
+      <w:r>
+        <w:rPr>
+          <w:color w:val="000000"/>
+        </w:rPr>
+        <w:t xml:space="preserve"> </w:t>
+      </w:r>
+      <w:r>
+        <w:rPr>
+          <w:iCs/>
+          <w:i/>
+          <w:color w:val="000000"/>
+        </w:rPr>
+        <w:t xml:space="preserve">et al.</w:t>
+      </w:r>
+      <w:r>
+        <w:rPr>
+          <w:color w:val="000000"/>
+        </w:rPr>
+        <w:t xml:space="preserve"> </w:t>
+      </w:r>
+      <w:r>
+        <w:rPr>
+          <w:color w:val="000000"/>
+        </w:rPr>
+        <w:t xml:space="preserve">Large-scale cis- and trans-eQTL analyses identify thousands of genetic loci and polygenic scores that regulate blood gene expression.</w:t>
+      </w:r>
+      <w:r>
+        <w:rPr>
+          <w:color w:val="000000"/>
+        </w:rPr>
+        <w:t xml:space="preserve"> </w:t>
+      </w:r>
+      <w:r>
+        <w:rPr>
+          <w:iCs/>
+          <w:i/>
+          <w:color w:val="000000"/>
+        </w:rPr>
+        <w:t xml:space="preserve">Nature Genetics</w:t>
+      </w:r>
+      <w:r>
+        <w:rPr>
+          <w:color w:val="000000"/>
+        </w:rPr>
+        <w:t xml:space="preserve"> </w:t>
+      </w:r>
+      <w:r>
+        <w:rPr>
+          <w:color w:val="000000"/>
+        </w:rPr>
+        <w:t xml:space="preserve">2021</w:t>
+      </w:r>
+      <w:r>
+        <w:rPr>
+          <w:color w:val="000000"/>
+        </w:rPr>
+        <w:t xml:space="preserve"> </w:t>
+      </w:r>
+      <w:r>
+        <w:rPr>
+          <w:bCs/>
+          <w:b/>
+          <w:color w:val="000000"/>
+        </w:rPr>
+        <w:t xml:space="preserve">53</w:t>
+      </w:r>
+      <w:r>
+        <w:rPr>
+          <w:color w:val="000000"/>
+        </w:rPr>
+        <w:t xml:space="preserve"> </w:t>
+      </w:r>
+      <w:r>
+        <w:rPr>
+          <w:color w:val="000000"/>
+        </w:rPr>
+        <w:t xml:space="preserve">1300–1310. (https://doi.org/10.1038/s41588-021-00913-z)</w:t>
       </w:r>
     </w:p>
     <w:p>
@@ -5430,7 +7082,85 @@
         <w:rPr>
           <w:color w:val="000000"/>
         </w:rPr>
-        <w:t xml:space="preserve">Sakaue S, Kanai M, Tanigawa Y, Karjalainen J, Kurki M, Koshiba S, Narita A, Konuma T, Yamamoto K, Akiyama M, et al. A cross-population atlas of genetic associations for 220 human phenotypes. Nat Genet. 2021;53:1415-1424. doi:10.1038/s41588-021-00931-x.</w:t>
+        <w:t xml:space="preserve">Sakaue S, Kanai M, Tanigawa Y, Karjalainen J, Kurki M, Koshiba S, Narita A, Konuma T, Yamamoto K, Akiyama M,</w:t>
+      </w:r>
+      <w:r>
+        <w:rPr>
+          <w:color w:val="000000"/>
+        </w:rPr>
+        <w:t xml:space="preserve"> </w:t>
+      </w:r>
+      <w:r>
+        <w:rPr>
+          <w:iCs/>
+          <w:i/>
+          <w:color w:val="000000"/>
+        </w:rPr>
+        <w:t xml:space="preserve">et al.</w:t>
+      </w:r>
+      <w:r>
+        <w:rPr>
+          <w:color w:val="000000"/>
+        </w:rPr>
+        <w:t xml:space="preserve"> </w:t>
+      </w:r>
+      <w:r>
+        <w:rPr>
+          <w:color w:val="000000"/>
+        </w:rPr>
+        <w:t xml:space="preserve">A cross-population atlas of genetic associations for 220 human phenotypes.</w:t>
+      </w:r>
+      <w:r>
+        <w:rPr>
+          <w:color w:val="000000"/>
+        </w:rPr>
+        <w:t xml:space="preserve"> </w:t>
+      </w:r>
+      <w:r>
+        <w:rPr>
+          <w:iCs/>
+          <w:i/>
+          <w:color w:val="000000"/>
+        </w:rPr>
+        <w:t xml:space="preserve">Nature Genetics</w:t>
+      </w:r>
+      <w:r>
+        <w:rPr>
+          <w:color w:val="000000"/>
+        </w:rPr>
+        <w:t xml:space="preserve"> </w:t>
+      </w:r>
+      <w:r>
+        <w:rPr>
+          <w:color w:val="000000"/>
+        </w:rPr>
+        <w:t xml:space="preserve">2021</w:t>
+      </w:r>
+      <w:r>
+        <w:rPr>
+          <w:color w:val="000000"/>
+        </w:rPr>
+        <w:t xml:space="preserve"> </w:t>
+      </w:r>
+      <w:r>
+        <w:rPr>
+          <w:bCs/>
+          <w:b/>
+          <w:color w:val="000000"/>
+        </w:rPr>
+        <w:t xml:space="preserve">53</w:t>
+      </w:r>
+      <w:r>
+        <w:rPr>
+          <w:color w:val="000000"/>
+        </w:rPr>
+        <w:t xml:space="preserve"> </w:t>
+      </w:r>
+      <w:r>
+        <w:rPr>
+          <w:color w:val="000000"/>
+        </w:rPr>
+        <w:t xml:space="preserve">1415–1424. (https://doi.org/10.1038/s41588-021-00931-x)</w:t>
       </w:r>
     </w:p>
     <w:p>
@@ -5444,7 +7174,59 @@
         <w:rPr>
           <w:color w:val="000000"/>
         </w:rPr>
-        <w:t xml:space="preserve">Dönertaş HM, Fabian DK, Valenzuela MF, Partridge L, Thornton JM. Common genetic associations between age-related diseases. Nat Aging. 2021;1:400-412. doi:10.1038/s43587-021-00051-5.</w:t>
+        <w:t xml:space="preserve">Dönertaş HM, Fabian DK, Valenzuela MF, Partridge L &amp; Thornton JM. Common genetic associations between age-related diseases.</w:t>
+      </w:r>
+      <w:r>
+        <w:rPr>
+          <w:color w:val="000000"/>
+        </w:rPr>
+        <w:t xml:space="preserve"> </w:t>
+      </w:r>
+      <w:r>
+        <w:rPr>
+          <w:iCs/>
+          <w:i/>
+          <w:color w:val="000000"/>
+        </w:rPr>
+        <w:t xml:space="preserve">Nature Aging</w:t>
+      </w:r>
+      <w:r>
+        <w:rPr>
+          <w:color w:val="000000"/>
+        </w:rPr>
+        <w:t xml:space="preserve"> </w:t>
+      </w:r>
+      <w:r>
+        <w:rPr>
+          <w:color w:val="000000"/>
+        </w:rPr>
+        <w:t xml:space="preserve">2021</w:t>
+      </w:r>
+      <w:r>
+        <w:rPr>
+          <w:color w:val="000000"/>
+        </w:rPr>
+        <w:t xml:space="preserve"> </w:t>
+      </w:r>
+      <w:r>
+        <w:rPr>
+          <w:bCs/>
+          <w:b/>
+          <w:color w:val="000000"/>
+        </w:rPr>
+        <w:t xml:space="preserve">1</w:t>
+      </w:r>
+      <w:r>
+        <w:rPr>
+          <w:color w:val="000000"/>
+        </w:rPr>
+        <w:t xml:space="preserve"> </w:t>
+      </w:r>
+      <w:r>
+        <w:rPr>
+          <w:color w:val="000000"/>
+        </w:rPr>
+        <w:t xml:space="preserve">400–412. (https://doi.org/10.1038/s43587-021-00051-5)</w:t>
       </w:r>
     </w:p>
     <w:p>
@@ -5458,7 +7240,85 @@
         <w:rPr>
           <w:color w:val="000000"/>
         </w:rPr>
-        <w:t xml:space="preserve">Kurki MI, Karjalainen J, Palta P, Sipilä TP, Kristiansson K, Donner KM, Reeve MP, Laivuori H, Aavikko M, Kaunisto MA, et al. FinnGen provides genetic insights from a well-phenotyped isolated population. Nature. 2023;613:508-518. doi:10.1038/s41586-022-05473-8.</w:t>
+        <w:t xml:space="preserve">Kurki MI, Karjalainen J, Palta P, Sipilä TP, Kristiansson K, Donner KM, Reeve MP, Laivuori H, Aavikko M, Kaunisto MA,</w:t>
+      </w:r>
+      <w:r>
+        <w:rPr>
+          <w:color w:val="000000"/>
+        </w:rPr>
+        <w:t xml:space="preserve"> </w:t>
+      </w:r>
+      <w:r>
+        <w:rPr>
+          <w:iCs/>
+          <w:i/>
+          <w:color w:val="000000"/>
+        </w:rPr>
+        <w:t xml:space="preserve">et al.</w:t>
+      </w:r>
+      <w:r>
+        <w:rPr>
+          <w:color w:val="000000"/>
+        </w:rPr>
+        <w:t xml:space="preserve"> </w:t>
+      </w:r>
+      <w:r>
+        <w:rPr>
+          <w:color w:val="000000"/>
+        </w:rPr>
+        <w:t xml:space="preserve">FinnGen provides genetic insights from a well-phenotyped isolated population.</w:t>
+      </w:r>
+      <w:r>
+        <w:rPr>
+          <w:color w:val="000000"/>
+        </w:rPr>
+        <w:t xml:space="preserve"> </w:t>
+      </w:r>
+      <w:r>
+        <w:rPr>
+          <w:iCs/>
+          <w:i/>
+          <w:color w:val="000000"/>
+        </w:rPr>
+        <w:t xml:space="preserve">Nature</w:t>
+      </w:r>
+      <w:r>
+        <w:rPr>
+          <w:color w:val="000000"/>
+        </w:rPr>
+        <w:t xml:space="preserve"> </w:t>
+      </w:r>
+      <w:r>
+        <w:rPr>
+          <w:color w:val="000000"/>
+        </w:rPr>
+        <w:t xml:space="preserve">2023</w:t>
+      </w:r>
+      <w:r>
+        <w:rPr>
+          <w:color w:val="000000"/>
+        </w:rPr>
+        <w:t xml:space="preserve"> </w:t>
+      </w:r>
+      <w:r>
+        <w:rPr>
+          <w:bCs/>
+          <w:b/>
+          <w:color w:val="000000"/>
+        </w:rPr>
+        <w:t xml:space="preserve">613</w:t>
+      </w:r>
+      <w:r>
+        <w:rPr>
+          <w:color w:val="000000"/>
+        </w:rPr>
+        <w:t xml:space="preserve"> </w:t>
+      </w:r>
+      <w:r>
+        <w:rPr>
+          <w:color w:val="000000"/>
+        </w:rPr>
+        <w:t xml:space="preserve">508–518. (https://doi.org/10.1038/s41586-022-05473-8)</w:t>
       </w:r>
     </w:p>
     <w:p>
@@ -5472,7 +7332,59 @@
         <w:rPr>
           <w:color w:val="000000"/>
         </w:rPr>
-        <w:t xml:space="preserve">Chang CC, Chow CC, Tellier LC, Vattikuti S, Purcell SM, Lee JJ. Second-generation PLINK: rising to the challenge of larger and richer datasets. Gigascience. 2015;4:7. doi:10.1186/s13742-015-0047-8.</w:t>
+        <w:t xml:space="preserve">Chang CC, Chow CC, Tellier LC, Vattikuti S, Purcell SM &amp; Lee JJ. Second-generation PLINK: rising to the challenge of larger and richer datasets.</w:t>
+      </w:r>
+      <w:r>
+        <w:rPr>
+          <w:color w:val="000000"/>
+        </w:rPr>
+        <w:t xml:space="preserve"> </w:t>
+      </w:r>
+      <w:r>
+        <w:rPr>
+          <w:iCs/>
+          <w:i/>
+          <w:color w:val="000000"/>
+        </w:rPr>
+        <w:t xml:space="preserve">GigaScience</w:t>
+      </w:r>
+      <w:r>
+        <w:rPr>
+          <w:color w:val="000000"/>
+        </w:rPr>
+        <w:t xml:space="preserve"> </w:t>
+      </w:r>
+      <w:r>
+        <w:rPr>
+          <w:color w:val="000000"/>
+        </w:rPr>
+        <w:t xml:space="preserve">2015</w:t>
+      </w:r>
+      <w:r>
+        <w:rPr>
+          <w:color w:val="000000"/>
+        </w:rPr>
+        <w:t xml:space="preserve"> </w:t>
+      </w:r>
+      <w:r>
+        <w:rPr>
+          <w:bCs/>
+          <w:b/>
+          <w:color w:val="000000"/>
+        </w:rPr>
+        <w:t xml:space="preserve">4</w:t>
+      </w:r>
+      <w:r>
+        <w:rPr>
+          <w:color w:val="000000"/>
+        </w:rPr>
+        <w:t xml:space="preserve"> </w:t>
+      </w:r>
+      <w:r>
+        <w:rPr>
+          <w:color w:val="000000"/>
+        </w:rPr>
+        <w:t xml:space="preserve">7. (https://doi.org/10.1186/s13742-015-0047-8)</w:t>
       </w:r>
     </w:p>
     <w:p>
@@ -5486,7 +7398,85 @@
         <w:rPr>
           <w:color w:val="000000"/>
         </w:rPr>
-        <w:t xml:space="preserve">1000 Genomes Project Consortium, Auton A, Brooks LD, Durbin RM, Garrison EP, Kang HM, Korbel JO, Marchini JL, McCarthy S, McVean GA, et al. A global reference for human genetic variation. Nature. 2015;526:68-74. doi:10.1038/nature15393.</w:t>
+        <w:t xml:space="preserve">1000 Genomes Project Consortium, Auton A, Brooks LD, Durbin RM, Garrison EP, Kang HM, Korbel JO, Marchini JL, McCarthy S, McVean GA,</w:t>
+      </w:r>
+      <w:r>
+        <w:rPr>
+          <w:color w:val="000000"/>
+        </w:rPr>
+        <w:t xml:space="preserve"> </w:t>
+      </w:r>
+      <w:r>
+        <w:rPr>
+          <w:iCs/>
+          <w:i/>
+          <w:color w:val="000000"/>
+        </w:rPr>
+        <w:t xml:space="preserve">et al.</w:t>
+      </w:r>
+      <w:r>
+        <w:rPr>
+          <w:color w:val="000000"/>
+        </w:rPr>
+        <w:t xml:space="preserve"> </w:t>
+      </w:r>
+      <w:r>
+        <w:rPr>
+          <w:color w:val="000000"/>
+        </w:rPr>
+        <w:t xml:space="preserve">A global reference for human genetic variation.</w:t>
+      </w:r>
+      <w:r>
+        <w:rPr>
+          <w:color w:val="000000"/>
+        </w:rPr>
+        <w:t xml:space="preserve"> </w:t>
+      </w:r>
+      <w:r>
+        <w:rPr>
+          <w:iCs/>
+          <w:i/>
+          <w:color w:val="000000"/>
+        </w:rPr>
+        <w:t xml:space="preserve">Nature</w:t>
+      </w:r>
+      <w:r>
+        <w:rPr>
+          <w:color w:val="000000"/>
+        </w:rPr>
+        <w:t xml:space="preserve"> </w:t>
+      </w:r>
+      <w:r>
+        <w:rPr>
+          <w:color w:val="000000"/>
+        </w:rPr>
+        <w:t xml:space="preserve">2015</w:t>
+      </w:r>
+      <w:r>
+        <w:rPr>
+          <w:color w:val="000000"/>
+        </w:rPr>
+        <w:t xml:space="preserve"> </w:t>
+      </w:r>
+      <w:r>
+        <w:rPr>
+          <w:bCs/>
+          <w:b/>
+          <w:color w:val="000000"/>
+        </w:rPr>
+        <w:t xml:space="preserve">526</w:t>
+      </w:r>
+      <w:r>
+        <w:rPr>
+          <w:color w:val="000000"/>
+        </w:rPr>
+        <w:t xml:space="preserve"> </w:t>
+      </w:r>
+      <w:r>
+        <w:rPr>
+          <w:color w:val="000000"/>
+        </w:rPr>
+        <w:t xml:space="preserve">68–74. (https://doi.org/10.1038/nature15393)</w:t>
       </w:r>
     </w:p>
     <w:p>
@@ -5500,7 +7490,85 @@
         <w:rPr>
           <w:color w:val="000000"/>
         </w:rPr>
-        <w:t xml:space="preserve">Zhu Z, Zhang F, Hu H, Bakshi A, Robinson MR, Powell JE, Montgomery GW, Goddard ME, Wray NR, Visscher PM, et al. Integration of summary data from GWAS and eQTL studies predicts complex trait gene targets. Nat Genet. 2016;48:481-487. doi:10.1038/ng.3538.</w:t>
+        <w:t xml:space="preserve">Zhu Z, Zhang F, Hu H, Bakshi A, Robinson MR, Powell JE, Montgomery GW, Goddard ME, Wray NR, Visscher PM,</w:t>
+      </w:r>
+      <w:r>
+        <w:rPr>
+          <w:color w:val="000000"/>
+        </w:rPr>
+        <w:t xml:space="preserve"> </w:t>
+      </w:r>
+      <w:r>
+        <w:rPr>
+          <w:iCs/>
+          <w:i/>
+          <w:color w:val="000000"/>
+        </w:rPr>
+        <w:t xml:space="preserve">et al.</w:t>
+      </w:r>
+      <w:r>
+        <w:rPr>
+          <w:color w:val="000000"/>
+        </w:rPr>
+        <w:t xml:space="preserve"> </w:t>
+      </w:r>
+      <w:r>
+        <w:rPr>
+          <w:color w:val="000000"/>
+        </w:rPr>
+        <w:t xml:space="preserve">Integration of summary data from GWAS and eQTL studies predicts complex trait gene targets.</w:t>
+      </w:r>
+      <w:r>
+        <w:rPr>
+          <w:color w:val="000000"/>
+        </w:rPr>
+        <w:t xml:space="preserve"> </w:t>
+      </w:r>
+      <w:r>
+        <w:rPr>
+          <w:iCs/>
+          <w:i/>
+          <w:color w:val="000000"/>
+        </w:rPr>
+        <w:t xml:space="preserve">Nature Genetics</w:t>
+      </w:r>
+      <w:r>
+        <w:rPr>
+          <w:color w:val="000000"/>
+        </w:rPr>
+        <w:t xml:space="preserve"> </w:t>
+      </w:r>
+      <w:r>
+        <w:rPr>
+          <w:color w:val="000000"/>
+        </w:rPr>
+        <w:t xml:space="preserve">2016</w:t>
+      </w:r>
+      <w:r>
+        <w:rPr>
+          <w:color w:val="000000"/>
+        </w:rPr>
+        <w:t xml:space="preserve"> </w:t>
+      </w:r>
+      <w:r>
+        <w:rPr>
+          <w:bCs/>
+          <w:b/>
+          <w:color w:val="000000"/>
+        </w:rPr>
+        <w:t xml:space="preserve">48</w:t>
+      </w:r>
+      <w:r>
+        <w:rPr>
+          <w:color w:val="000000"/>
+        </w:rPr>
+        <w:t xml:space="preserve"> </w:t>
+      </w:r>
+      <w:r>
+        <w:rPr>
+          <w:color w:val="000000"/>
+        </w:rPr>
+        <w:t xml:space="preserve">481–487. (https://doi.org/10.1038/ng.3538)</w:t>
       </w:r>
     </w:p>
     <w:p>
@@ -5514,7 +7582,59 @@
         <w:rPr>
           <w:color w:val="000000"/>
         </w:rPr>
-        <w:t xml:space="preserve">Hemani G, Zheng J, Elsworth B, Wade KH, Haberland V, Baird D, Laurin C, Burgess S, Bowden J, Langdon R, et al. The MR-Base platform supports systematic causal inference across the human phenome. Elife. 2018;7:e34408. doi:10.7554/elife.34408.</w:t>
+        <w:t xml:space="preserve">Lloyd-Jones LR, Robinson MR, Yang J &amp; Visscher PM. Transformation of Summary Statistics from Linear Mixed Model Association on All-or-None Traits to Odds Ratio.</w:t>
+      </w:r>
+      <w:r>
+        <w:rPr>
+          <w:color w:val="000000"/>
+        </w:rPr>
+        <w:t xml:space="preserve"> </w:t>
+      </w:r>
+      <w:r>
+        <w:rPr>
+          <w:iCs/>
+          <w:i/>
+          <w:color w:val="000000"/>
+        </w:rPr>
+        <w:t xml:space="preserve">Genetics</w:t>
+      </w:r>
+      <w:r>
+        <w:rPr>
+          <w:color w:val="000000"/>
+        </w:rPr>
+        <w:t xml:space="preserve"> </w:t>
+      </w:r>
+      <w:r>
+        <w:rPr>
+          <w:color w:val="000000"/>
+        </w:rPr>
+        <w:t xml:space="preserve">2018</w:t>
+      </w:r>
+      <w:r>
+        <w:rPr>
+          <w:color w:val="000000"/>
+        </w:rPr>
+        <w:t xml:space="preserve"> </w:t>
+      </w:r>
+      <w:r>
+        <w:rPr>
+          <w:bCs/>
+          <w:b/>
+          <w:color w:val="000000"/>
+        </w:rPr>
+        <w:t xml:space="preserve">208</w:t>
+      </w:r>
+      <w:r>
+        <w:rPr>
+          <w:color w:val="000000"/>
+        </w:rPr>
+        <w:t xml:space="preserve"> </w:t>
+      </w:r>
+      <w:r>
+        <w:rPr>
+          <w:color w:val="000000"/>
+        </w:rPr>
+        <w:t xml:space="preserve">1397–1408. (https://doi.org/10.1534/genetics.117.300360)</w:t>
       </w:r>
     </w:p>
     <w:p>
@@ -5528,7 +7648,85 @@
         <w:rPr>
           <w:color w:val="000000"/>
         </w:rPr>
-        <w:t xml:space="preserve">Bowden J, Davey Smith G, Burgess S. Mendelian randomization with invalid instruments: effect estimation and bias detection through Egger regression. Int J Epidemiol. 2015;44:512-525. doi:10.1093/ije/dyv080.</w:t>
+        <w:t xml:space="preserve">Hemani G, Zheng J, Elsworth B, Wade KH, Haberland V, Baird D, Laurin C, Burgess S, Bowden J, Langdon R,</w:t>
+      </w:r>
+      <w:r>
+        <w:rPr>
+          <w:color w:val="000000"/>
+        </w:rPr>
+        <w:t xml:space="preserve"> </w:t>
+      </w:r>
+      <w:r>
+        <w:rPr>
+          <w:iCs/>
+          <w:i/>
+          <w:color w:val="000000"/>
+        </w:rPr>
+        <w:t xml:space="preserve">et al.</w:t>
+      </w:r>
+      <w:r>
+        <w:rPr>
+          <w:color w:val="000000"/>
+        </w:rPr>
+        <w:t xml:space="preserve"> </w:t>
+      </w:r>
+      <w:r>
+        <w:rPr>
+          <w:color w:val="000000"/>
+        </w:rPr>
+        <w:t xml:space="preserve">The MR-Base platform supports systematic causal inference across the human phenome.</w:t>
+      </w:r>
+      <w:r>
+        <w:rPr>
+          <w:color w:val="000000"/>
+        </w:rPr>
+        <w:t xml:space="preserve"> </w:t>
+      </w:r>
+      <w:r>
+        <w:rPr>
+          <w:iCs/>
+          <w:i/>
+          <w:color w:val="000000"/>
+        </w:rPr>
+        <w:t xml:space="preserve">eLife</w:t>
+      </w:r>
+      <w:r>
+        <w:rPr>
+          <w:color w:val="000000"/>
+        </w:rPr>
+        <w:t xml:space="preserve"> </w:t>
+      </w:r>
+      <w:r>
+        <w:rPr>
+          <w:color w:val="000000"/>
+        </w:rPr>
+        <w:t xml:space="preserve">2018</w:t>
+      </w:r>
+      <w:r>
+        <w:rPr>
+          <w:color w:val="000000"/>
+        </w:rPr>
+        <w:t xml:space="preserve"> </w:t>
+      </w:r>
+      <w:r>
+        <w:rPr>
+          <w:bCs/>
+          <w:b/>
+          <w:color w:val="000000"/>
+        </w:rPr>
+        <w:t xml:space="preserve">7</w:t>
+      </w:r>
+      <w:r>
+        <w:rPr>
+          <w:color w:val="000000"/>
+        </w:rPr>
+        <w:t xml:space="preserve"> </w:t>
+      </w:r>
+      <w:r>
+        <w:rPr>
+          <w:color w:val="000000"/>
+        </w:rPr>
+        <w:t xml:space="preserve">e34408. (https://doi.org/10.7554/eLife.34408)</w:t>
       </w:r>
     </w:p>
     <w:p>
@@ -5542,7 +7740,59 @@
         <w:rPr>
           <w:color w:val="000000"/>
         </w:rPr>
-        <w:t xml:space="preserve">Bowden J, Davey Smith G, Haycock PC, Burgess S. Consistent Estimation in Mendelian Randomization with Some Invalid Instruments Using a Weighted Median Estimator. Genet Epidemiol. 2016;40:304-314. doi:10.1002/gepi.21965.</w:t>
+        <w:t xml:space="preserve">Bowden J, Davey Smith G &amp; Burgess S. Mendelian randomization with invalid instruments: effect estimation and bias detection through Egger regression.</w:t>
+      </w:r>
+      <w:r>
+        <w:rPr>
+          <w:color w:val="000000"/>
+        </w:rPr>
+        <w:t xml:space="preserve"> </w:t>
+      </w:r>
+      <w:r>
+        <w:rPr>
+          <w:iCs/>
+          <w:i/>
+          <w:color w:val="000000"/>
+        </w:rPr>
+        <w:t xml:space="preserve">International Journal of Epidemiology</w:t>
+      </w:r>
+      <w:r>
+        <w:rPr>
+          <w:color w:val="000000"/>
+        </w:rPr>
+        <w:t xml:space="preserve"> </w:t>
+      </w:r>
+      <w:r>
+        <w:rPr>
+          <w:color w:val="000000"/>
+        </w:rPr>
+        <w:t xml:space="preserve">2015</w:t>
+      </w:r>
+      <w:r>
+        <w:rPr>
+          <w:color w:val="000000"/>
+        </w:rPr>
+        <w:t xml:space="preserve"> </w:t>
+      </w:r>
+      <w:r>
+        <w:rPr>
+          <w:bCs/>
+          <w:b/>
+          <w:color w:val="000000"/>
+        </w:rPr>
+        <w:t xml:space="preserve">44</w:t>
+      </w:r>
+      <w:r>
+        <w:rPr>
+          <w:color w:val="000000"/>
+        </w:rPr>
+        <w:t xml:space="preserve"> </w:t>
+      </w:r>
+      <w:r>
+        <w:rPr>
+          <w:color w:val="000000"/>
+        </w:rPr>
+        <w:t xml:space="preserve">512–525. (https://doi.org/10.1093/ije/dyv080)</w:t>
       </w:r>
     </w:p>
     <w:p>
@@ -5556,7 +7806,59 @@
         <w:rPr>
           <w:color w:val="000000"/>
         </w:rPr>
-        <w:t xml:space="preserve">Wallace C. Eliciting priors and relaxing the single causal variant assumption in colocalisation analyses. PLoS Genet. 2020;16:e1008720. doi:10.1371/journal.pgen.1008720.</w:t>
+        <w:t xml:space="preserve">Bowden J, Davey Smith G, Haycock PC &amp; Burgess S. Consistent Estimation in Mendelian Randomization with Some Invalid Instruments Using a Weighted Median Estimator.</w:t>
+      </w:r>
+      <w:r>
+        <w:rPr>
+          <w:color w:val="000000"/>
+        </w:rPr>
+        <w:t xml:space="preserve"> </w:t>
+      </w:r>
+      <w:r>
+        <w:rPr>
+          <w:iCs/>
+          <w:i/>
+          <w:color w:val="000000"/>
+        </w:rPr>
+        <w:t xml:space="preserve">Genetic Epidemiology</w:t>
+      </w:r>
+      <w:r>
+        <w:rPr>
+          <w:color w:val="000000"/>
+        </w:rPr>
+        <w:t xml:space="preserve"> </w:t>
+      </w:r>
+      <w:r>
+        <w:rPr>
+          <w:color w:val="000000"/>
+        </w:rPr>
+        <w:t xml:space="preserve">2016</w:t>
+      </w:r>
+      <w:r>
+        <w:rPr>
+          <w:color w:val="000000"/>
+        </w:rPr>
+        <w:t xml:space="preserve"> </w:t>
+      </w:r>
+      <w:r>
+        <w:rPr>
+          <w:bCs/>
+          <w:b/>
+          <w:color w:val="000000"/>
+        </w:rPr>
+        <w:t xml:space="preserve">40</w:t>
+      </w:r>
+      <w:r>
+        <w:rPr>
+          <w:color w:val="000000"/>
+        </w:rPr>
+        <w:t xml:space="preserve"> </w:t>
+      </w:r>
+      <w:r>
+        <w:rPr>
+          <w:color w:val="000000"/>
+        </w:rPr>
+        <w:t xml:space="preserve">304–314. (https://doi.org/10.1002/gepi.21965)</w:t>
       </w:r>
     </w:p>
     <w:p>
@@ -5570,7 +7872,59 @@
         <w:rPr>
           <w:color w:val="000000"/>
         </w:rPr>
-        <w:t xml:space="preserve">GTEx Consortium. The GTEx Consortium atlas of genetic regulatory effects across human tissues. Science. 2020;369:1318-1330. doi:10.1126/science.aaz1776.</w:t>
+        <w:t xml:space="preserve">Hartwig FP, Davey Smith G &amp; Bowden J. Robust inference in summary data Mendelian randomization via the zero modal pleiotropy assumption.</w:t>
+      </w:r>
+      <w:r>
+        <w:rPr>
+          <w:color w:val="000000"/>
+        </w:rPr>
+        <w:t xml:space="preserve"> </w:t>
+      </w:r>
+      <w:r>
+        <w:rPr>
+          <w:iCs/>
+          <w:i/>
+          <w:color w:val="000000"/>
+        </w:rPr>
+        <w:t xml:space="preserve">International Journal of Epidemiology</w:t>
+      </w:r>
+      <w:r>
+        <w:rPr>
+          <w:color w:val="000000"/>
+        </w:rPr>
+        <w:t xml:space="preserve"> </w:t>
+      </w:r>
+      <w:r>
+        <w:rPr>
+          <w:color w:val="000000"/>
+        </w:rPr>
+        <w:t xml:space="preserve">2017</w:t>
+      </w:r>
+      <w:r>
+        <w:rPr>
+          <w:color w:val="000000"/>
+        </w:rPr>
+        <w:t xml:space="preserve"> </w:t>
+      </w:r>
+      <w:r>
+        <w:rPr>
+          <w:bCs/>
+          <w:b/>
+          <w:color w:val="000000"/>
+        </w:rPr>
+        <w:t xml:space="preserve">46</w:t>
+      </w:r>
+      <w:r>
+        <w:rPr>
+          <w:color w:val="000000"/>
+        </w:rPr>
+        <w:t xml:space="preserve"> </w:t>
+      </w:r>
+      <w:r>
+        <w:rPr>
+          <w:color w:val="000000"/>
+        </w:rPr>
+        <w:t xml:space="preserve">1985–1998. (https://doi.org/10.1093/ije/dyx102)</w:t>
       </w:r>
     </w:p>
     <w:p>
@@ -5584,7 +7938,85 @@
         <w:rPr>
           <w:color w:val="000000"/>
         </w:rPr>
-        <w:t xml:space="preserve">Colobran R, Armengol Mdel P, Faner R, Gärtner M, Tykocinski LO, Lucas A, Ruiz M, Juan M, Kyewski B, Pujol-Borrell R. Association of an SNP with intrathymic transcription of TSHR and Graves’ disease: a role for defective thymic tolerance. Hum Mol Genet. 2011;20:3415-3423. doi:10.1093/hmg/ddr247.</w:t>
+        <w:t xml:space="preserve">Colobran R, Armengol Mdel P, Faner R, Gärtner M, Tykocinski LO, Lucas A, Ruiz M, Juan M, Kyewski B &amp; Pujol-Borrell R. Association of an SNP with intrathymic transcription of</w:t>
+      </w:r>
+      <w:r>
+        <w:rPr>
+          <w:color w:val="000000"/>
+        </w:rPr>
+        <w:t xml:space="preserve"> </w:t>
+      </w:r>
+      <w:r>
+        <w:rPr>
+          <w:iCs/>
+          <w:i/>
+          <w:color w:val="000000"/>
+        </w:rPr>
+        <w:t xml:space="preserve">TSHR</w:t>
+      </w:r>
+      <w:r>
+        <w:rPr>
+          <w:color w:val="000000"/>
+        </w:rPr>
+        <w:t xml:space="preserve"> </w:t>
+      </w:r>
+      <w:r>
+        <w:rPr>
+          <w:color w:val="000000"/>
+        </w:rPr>
+        <w:t xml:space="preserve">and Graves’ disease: a role for defective thymic tolerance.</w:t>
+      </w:r>
+      <w:r>
+        <w:rPr>
+          <w:color w:val="000000"/>
+        </w:rPr>
+        <w:t xml:space="preserve"> </w:t>
+      </w:r>
+      <w:r>
+        <w:rPr>
+          <w:iCs/>
+          <w:i/>
+          <w:color w:val="000000"/>
+        </w:rPr>
+        <w:t xml:space="preserve">Human Molecular Genetics</w:t>
+      </w:r>
+      <w:r>
+        <w:rPr>
+          <w:color w:val="000000"/>
+        </w:rPr>
+        <w:t xml:space="preserve"> </w:t>
+      </w:r>
+      <w:r>
+        <w:rPr>
+          <w:color w:val="000000"/>
+        </w:rPr>
+        <w:t xml:space="preserve">2011</w:t>
+      </w:r>
+      <w:r>
+        <w:rPr>
+          <w:color w:val="000000"/>
+        </w:rPr>
+        <w:t xml:space="preserve"> </w:t>
+      </w:r>
+      <w:r>
+        <w:rPr>
+          <w:bCs/>
+          <w:b/>
+          <w:color w:val="000000"/>
+        </w:rPr>
+        <w:t xml:space="preserve">20</w:t>
+      </w:r>
+      <w:r>
+        <w:rPr>
+          <w:color w:val="000000"/>
+        </w:rPr>
+        <w:t xml:space="preserve"> </w:t>
+      </w:r>
+      <w:r>
+        <w:rPr>
+          <w:color w:val="000000"/>
+        </w:rPr>
+        <w:t xml:space="preserve">3415–3423. (https://doi.org/10.1093/hmg/ddr247)</w:t>
       </w:r>
     </w:p>
     <w:p>
@@ -5598,7 +8030,85 @@
         <w:rPr>
           <w:color w:val="000000"/>
         </w:rPr>
-        <w:t xml:space="preserve">Marín-Sánchez A, Álvarez-Sierra D, González O, Lucas-Martin A, Sellés-Sánchez A, Rudilla F, Enrich E, Colobran R, Pujol-Borrell R. Regulation of TSHR Expression in the Thyroid and Thymus May Contribute to TSHR Tolerance Failure in Graves’ Disease Patients via Two Distinct Mechanisms. Front Immunol. 2019;10:1695. doi:10.3389/fimmu.2019.01695.</w:t>
+        <w:t xml:space="preserve">Marín-Sánchez A, Álvarez-Sierra D, González O, Lucas-Martin A, Sellés-Sánchez A, Rudilla F, Enrich E, Colobran R &amp; Pujol-Borrell R. Regulation of</w:t>
+      </w:r>
+      <w:r>
+        <w:rPr>
+          <w:color w:val="000000"/>
+        </w:rPr>
+        <w:t xml:space="preserve"> </w:t>
+      </w:r>
+      <w:r>
+        <w:rPr>
+          <w:iCs/>
+          <w:i/>
+          <w:color w:val="000000"/>
+        </w:rPr>
+        <w:t xml:space="preserve">TSHR</w:t>
+      </w:r>
+      <w:r>
+        <w:rPr>
+          <w:color w:val="000000"/>
+        </w:rPr>
+        <w:t xml:space="preserve"> </w:t>
+      </w:r>
+      <w:r>
+        <w:rPr>
+          <w:color w:val="000000"/>
+        </w:rPr>
+        <w:t xml:space="preserve">Expression in the Thyroid and Thymus May Contribute to TSHR Tolerance Failure in Graves’ Disease Patients via Two Distinct Mechanisms.</w:t>
+      </w:r>
+      <w:r>
+        <w:rPr>
+          <w:color w:val="000000"/>
+        </w:rPr>
+        <w:t xml:space="preserve"> </w:t>
+      </w:r>
+      <w:r>
+        <w:rPr>
+          <w:iCs/>
+          <w:i/>
+          <w:color w:val="000000"/>
+        </w:rPr>
+        <w:t xml:space="preserve">Frontiers in Immunology</w:t>
+      </w:r>
+      <w:r>
+        <w:rPr>
+          <w:color w:val="000000"/>
+        </w:rPr>
+        <w:t xml:space="preserve"> </w:t>
+      </w:r>
+      <w:r>
+        <w:rPr>
+          <w:color w:val="000000"/>
+        </w:rPr>
+        <w:t xml:space="preserve">2019</w:t>
+      </w:r>
+      <w:r>
+        <w:rPr>
+          <w:color w:val="000000"/>
+        </w:rPr>
+        <w:t xml:space="preserve"> </w:t>
+      </w:r>
+      <w:r>
+        <w:rPr>
+          <w:bCs/>
+          <w:b/>
+          <w:color w:val="000000"/>
+        </w:rPr>
+        <w:t xml:space="preserve">10</w:t>
+      </w:r>
+      <w:r>
+        <w:rPr>
+          <w:color w:val="000000"/>
+        </w:rPr>
+        <w:t xml:space="preserve"> </w:t>
+      </w:r>
+      <w:r>
+        <w:rPr>
+          <w:color w:val="000000"/>
+        </w:rPr>
+        <w:t xml:space="preserve">1695. (https://doi.org/10.3389/fimmu.2019.01695)</w:t>
       </w:r>
     </w:p>
     <w:p>
@@ -5612,7 +8122,59 @@
         <w:rPr>
           <w:color w:val="000000"/>
         </w:rPr>
-        <w:t xml:space="preserve">Chen CR, Pichurin P, Nagayama Y, Latrofa F, Rapoport B, McLachlan SM. The thyrotropin receptor autoantigen in Graves disease is the culprit as well as the victim. J Clin Invest. 2003;111:1897-1904. doi:10.1172/JCI17069.</w:t>
+        <w:t xml:space="preserve">Wallace C. Eliciting priors and relaxing the single causal variant assumption in colocalisation analyses.</w:t>
+      </w:r>
+      <w:r>
+        <w:rPr>
+          <w:color w:val="000000"/>
+        </w:rPr>
+        <w:t xml:space="preserve"> </w:t>
+      </w:r>
+      <w:r>
+        <w:rPr>
+          <w:iCs/>
+          <w:i/>
+          <w:color w:val="000000"/>
+        </w:rPr>
+        <w:t xml:space="preserve">PLoS Genetics</w:t>
+      </w:r>
+      <w:r>
+        <w:rPr>
+          <w:color w:val="000000"/>
+        </w:rPr>
+        <w:t xml:space="preserve"> </w:t>
+      </w:r>
+      <w:r>
+        <w:rPr>
+          <w:color w:val="000000"/>
+        </w:rPr>
+        <w:t xml:space="preserve">2020</w:t>
+      </w:r>
+      <w:r>
+        <w:rPr>
+          <w:color w:val="000000"/>
+        </w:rPr>
+        <w:t xml:space="preserve"> </w:t>
+      </w:r>
+      <w:r>
+        <w:rPr>
+          <w:bCs/>
+          <w:b/>
+          <w:color w:val="000000"/>
+        </w:rPr>
+        <w:t xml:space="preserve">16</w:t>
+      </w:r>
+      <w:r>
+        <w:rPr>
+          <w:color w:val="000000"/>
+        </w:rPr>
+        <w:t xml:space="preserve"> </w:t>
+      </w:r>
+      <w:r>
+        <w:rPr>
+          <w:color w:val="000000"/>
+        </w:rPr>
+        <w:t xml:space="preserve">e1008720. (https://doi.org/10.1371/journal.pgen.1008720)</w:t>
       </w:r>
     </w:p>
     <w:p>
@@ -5626,7 +8188,59 @@
         <w:rPr>
           <w:color w:val="000000"/>
         </w:rPr>
-        <w:t xml:space="preserve">Berchner-Pfannschmidt U, Moshkelgosha S, Diaz-Cano S, Edelmann B, Görtz GE, Horstmann M, Noble A, Hansen W, Eckstein A, Banga JP. Comparative Assessment of Female Mouse Model of Graves’ Orbitopathy Under Different Environments, Accompanied by Proinflammatory Cytokine and T-Cell Responses to Thyrotropin Hormone Receptor Antigen. Endocrinology. 2016;157:1673-1682. doi:10.1210/en.2015-1829.</w:t>
+        <w:t xml:space="preserve">GTEx Consortium. The GTEx Consortium atlas of genetic regulatory effects across human tissues.</w:t>
+      </w:r>
+      <w:r>
+        <w:rPr>
+          <w:color w:val="000000"/>
+        </w:rPr>
+        <w:t xml:space="preserve"> </w:t>
+      </w:r>
+      <w:r>
+        <w:rPr>
+          <w:iCs/>
+          <w:i/>
+          <w:color w:val="000000"/>
+        </w:rPr>
+        <w:t xml:space="preserve">Science</w:t>
+      </w:r>
+      <w:r>
+        <w:rPr>
+          <w:color w:val="000000"/>
+        </w:rPr>
+        <w:t xml:space="preserve"> </w:t>
+      </w:r>
+      <w:r>
+        <w:rPr>
+          <w:color w:val="000000"/>
+        </w:rPr>
+        <w:t xml:space="preserve">2020</w:t>
+      </w:r>
+      <w:r>
+        <w:rPr>
+          <w:color w:val="000000"/>
+        </w:rPr>
+        <w:t xml:space="preserve"> </w:t>
+      </w:r>
+      <w:r>
+        <w:rPr>
+          <w:bCs/>
+          <w:b/>
+          <w:color w:val="000000"/>
+        </w:rPr>
+        <w:t xml:space="preserve">369</w:t>
+      </w:r>
+      <w:r>
+        <w:rPr>
+          <w:color w:val="000000"/>
+        </w:rPr>
+        <w:t xml:space="preserve"> </w:t>
+      </w:r>
+      <w:r>
+        <w:rPr>
+          <w:color w:val="000000"/>
+        </w:rPr>
+        <w:t xml:space="preserve">1318–1330. (https://doi.org/10.1126/science.aaz1776)</w:t>
       </w:r>
     </w:p>
     <w:p>
@@ -5640,7 +8254,59 @@
         <w:rPr>
           <w:color w:val="000000"/>
         </w:rPr>
-        <w:t xml:space="preserve">Daser A, Gulbins A, Horstmann M, Kalisch J, Nolte I, Hashemi Arani F, Lang S, Mattheis S, Bechrakis NE, Banga JP, et al. TNFα drives disease-specific chemokine networks and orbital tissue remodeling in a preclinical model of thyroid eye disease. Eur Thyroid J. 2026;15:ETJ250407. doi:10.1530/ETJ-25-0407.</w:t>
+        <w:t xml:space="preserve">Chen CR, Pichurin P, Nagayama Y, Latrofa F, Rapoport B &amp; McLachlan SM. The thyrotropin receptor autoantigen in Graves disease is the culprit as well as the victim.</w:t>
+      </w:r>
+      <w:r>
+        <w:rPr>
+          <w:color w:val="000000"/>
+        </w:rPr>
+        <w:t xml:space="preserve"> </w:t>
+      </w:r>
+      <w:r>
+        <w:rPr>
+          <w:iCs/>
+          <w:i/>
+          <w:color w:val="000000"/>
+        </w:rPr>
+        <w:t xml:space="preserve">Journal of Clinical Investigation</w:t>
+      </w:r>
+      <w:r>
+        <w:rPr>
+          <w:color w:val="000000"/>
+        </w:rPr>
+        <w:t xml:space="preserve"> </w:t>
+      </w:r>
+      <w:r>
+        <w:rPr>
+          <w:color w:val="000000"/>
+        </w:rPr>
+        <w:t xml:space="preserve">2003</w:t>
+      </w:r>
+      <w:r>
+        <w:rPr>
+          <w:color w:val="000000"/>
+        </w:rPr>
+        <w:t xml:space="preserve"> </w:t>
+      </w:r>
+      <w:r>
+        <w:rPr>
+          <w:bCs/>
+          <w:b/>
+          <w:color w:val="000000"/>
+        </w:rPr>
+        <w:t xml:space="preserve">111</w:t>
+      </w:r>
+      <w:r>
+        <w:rPr>
+          <w:color w:val="000000"/>
+        </w:rPr>
+        <w:t xml:space="preserve"> </w:t>
+      </w:r>
+      <w:r>
+        <w:rPr>
+          <w:color w:val="000000"/>
+        </w:rPr>
+        <w:t xml:space="preserve">1897–1904. (https://doi.org/10.1172/JCI17069)</w:t>
       </w:r>
     </w:p>
     <w:p>
@@ -5654,7 +8320,59 @@
         <w:rPr>
           <w:color w:val="000000"/>
         </w:rPr>
-        <w:t xml:space="preserve">Eckstein AK, Lösch C, Glowacka D, Schott M, Mann K, Esser J, Morgenthaler NG. Euthyroid and primarily hypothyroid patients develop milder and significantly more asymmetrical Graves ophthalmopathy. Br J Ophthalmol. 2009;93:1052-1056. doi:10.1136/bjo.2007.137265.</w:t>
+        <w:t xml:space="preserve">Berchner-Pfannschmidt U, Moshkelgosha S, Diaz-Cano S, Edelmann B, Görtz GE, Horstmann M, Noble A, Hansen W, Eckstein A &amp; Banga JP. Comparative Assessment of Female Mouse Model of Graves’ Orbitopathy Under Different Environments, Accompanied by Proinflammatory Cytokine and T-Cell Responses to Thyrotropin Hormone Receptor Antigen.</w:t>
+      </w:r>
+      <w:r>
+        <w:rPr>
+          <w:color w:val="000000"/>
+        </w:rPr>
+        <w:t xml:space="preserve"> </w:t>
+      </w:r>
+      <w:r>
+        <w:rPr>
+          <w:iCs/>
+          <w:i/>
+          <w:color w:val="000000"/>
+        </w:rPr>
+        <w:t xml:space="preserve">Endocrinology</w:t>
+      </w:r>
+      <w:r>
+        <w:rPr>
+          <w:color w:val="000000"/>
+        </w:rPr>
+        <w:t xml:space="preserve"> </w:t>
+      </w:r>
+      <w:r>
+        <w:rPr>
+          <w:color w:val="000000"/>
+        </w:rPr>
+        <w:t xml:space="preserve">2016</w:t>
+      </w:r>
+      <w:r>
+        <w:rPr>
+          <w:color w:val="000000"/>
+        </w:rPr>
+        <w:t xml:space="preserve"> </w:t>
+      </w:r>
+      <w:r>
+        <w:rPr>
+          <w:bCs/>
+          <w:b/>
+          <w:color w:val="000000"/>
+        </w:rPr>
+        <w:t xml:space="preserve">157</w:t>
+      </w:r>
+      <w:r>
+        <w:rPr>
+          <w:color w:val="000000"/>
+        </w:rPr>
+        <w:t xml:space="preserve"> </w:t>
+      </w:r>
+      <w:r>
+        <w:rPr>
+          <w:color w:val="000000"/>
+        </w:rPr>
+        <w:t xml:space="preserve">1673–1682. (https://doi.org/10.1210/en.2015-1829)</w:t>
       </w:r>
     </w:p>
     <w:p>
@@ -5668,7 +8386,85 @@
         <w:rPr>
           <w:color w:val="000000"/>
         </w:rPr>
-        <w:t xml:space="preserve">Douglas RS, Couch S, Wester ST, Fowler BT, Liu CY, Subramanian PS, Tang R, Nguyen QT, Maamari RN, Ugradar S, et al. Efficacy and Safety of Teprotumumab in Patients With Thyroid Eye Disease of Long Duration and Low Disease Activity. J Clin Endocrinol Metab. 2024;109:25-35. doi:10.1210/clinem/dgad637.</w:t>
+        <w:t xml:space="preserve">Daser A, Gulbins A, Horstmann M, Kalisch J, Nolte I, Hashemi Arani F, Lang S, Mattheis S, Bechrakis NE, Banga JP,</w:t>
+      </w:r>
+      <w:r>
+        <w:rPr>
+          <w:color w:val="000000"/>
+        </w:rPr>
+        <w:t xml:space="preserve"> </w:t>
+      </w:r>
+      <w:r>
+        <w:rPr>
+          <w:iCs/>
+          <w:i/>
+          <w:color w:val="000000"/>
+        </w:rPr>
+        <w:t xml:space="preserve">et al.</w:t>
+      </w:r>
+      <w:r>
+        <w:rPr>
+          <w:color w:val="000000"/>
+        </w:rPr>
+        <w:t xml:space="preserve"> </w:t>
+      </w:r>
+      <w:r>
+        <w:rPr>
+          <w:color w:val="000000"/>
+        </w:rPr>
+        <w:t xml:space="preserve">TNFα drives disease-specific chemokine networks and orbital tissue remodeling in a preclinical model of thyroid eye disease.</w:t>
+      </w:r>
+      <w:r>
+        <w:rPr>
+          <w:color w:val="000000"/>
+        </w:rPr>
+        <w:t xml:space="preserve"> </w:t>
+      </w:r>
+      <w:r>
+        <w:rPr>
+          <w:iCs/>
+          <w:i/>
+          <w:color w:val="000000"/>
+        </w:rPr>
+        <w:t xml:space="preserve">European Thyroid Journal</w:t>
+      </w:r>
+      <w:r>
+        <w:rPr>
+          <w:color w:val="000000"/>
+        </w:rPr>
+        <w:t xml:space="preserve"> </w:t>
+      </w:r>
+      <w:r>
+        <w:rPr>
+          <w:color w:val="000000"/>
+        </w:rPr>
+        <w:t xml:space="preserve">2026</w:t>
+      </w:r>
+      <w:r>
+        <w:rPr>
+          <w:color w:val="000000"/>
+        </w:rPr>
+        <w:t xml:space="preserve"> </w:t>
+      </w:r>
+      <w:r>
+        <w:rPr>
+          <w:bCs/>
+          <w:b/>
+          <w:color w:val="000000"/>
+        </w:rPr>
+        <w:t xml:space="preserve">15</w:t>
+      </w:r>
+      <w:r>
+        <w:rPr>
+          <w:color w:val="000000"/>
+        </w:rPr>
+        <w:t xml:space="preserve"> </w:t>
+      </w:r>
+      <w:r>
+        <w:rPr>
+          <w:color w:val="000000"/>
+        </w:rPr>
+        <w:t xml:space="preserve">ETJ250407. (https://doi.org/10.1530/ETJ-25-0407)</w:t>
       </w:r>
     </w:p>
     <w:p>
@@ -5682,7 +8478,217 @@
         <w:rPr>
           <w:color w:val="000000"/>
         </w:rPr>
-        <w:t xml:space="preserve">Wallace C. A more accurate method for colocalisation analysis allowing for multiple causal variants. PLoS Genet. 2021;17:e1009440. doi:10.1371/journal.pgen.1009440.</w:t>
+        <w:t xml:space="preserve">Eckstein AK, Lösch C, Glowacka D, Schott M, Mann K, Esser J &amp; Morgenthaler NG. Euthyroid and primarily hypothyroid patients develop milder and significantly more asymmetrical Graves ophthalmopathy.</w:t>
+      </w:r>
+      <w:r>
+        <w:rPr>
+          <w:color w:val="000000"/>
+        </w:rPr>
+        <w:t xml:space="preserve"> </w:t>
+      </w:r>
+      <w:r>
+        <w:rPr>
+          <w:iCs/>
+          <w:i/>
+          <w:color w:val="000000"/>
+        </w:rPr>
+        <w:t xml:space="preserve">British Journal of Ophthalmology</w:t>
+      </w:r>
+      <w:r>
+        <w:rPr>
+          <w:color w:val="000000"/>
+        </w:rPr>
+        <w:t xml:space="preserve"> </w:t>
+      </w:r>
+      <w:r>
+        <w:rPr>
+          <w:color w:val="000000"/>
+        </w:rPr>
+        <w:t xml:space="preserve">2009</w:t>
+      </w:r>
+      <w:r>
+        <w:rPr>
+          <w:color w:val="000000"/>
+        </w:rPr>
+        <w:t xml:space="preserve"> </w:t>
+      </w:r>
+      <w:r>
+        <w:rPr>
+          <w:bCs/>
+          <w:b/>
+          <w:color w:val="000000"/>
+        </w:rPr>
+        <w:t xml:space="preserve">93</w:t>
+      </w:r>
+      <w:r>
+        <w:rPr>
+          <w:color w:val="000000"/>
+        </w:rPr>
+        <w:t xml:space="preserve"> </w:t>
+      </w:r>
+      <w:r>
+        <w:rPr>
+          <w:color w:val="000000"/>
+        </w:rPr>
+        <w:t xml:space="preserve">1052–1056. (https://doi.org/10.1136/bjo.2007.137265)</w:t>
+      </w:r>
+    </w:p>
+    <w:p>
+      <w:pPr>
+        <w:numPr>
+          <w:ilvl w:val="0"/>
+          <w:numId w:val="1001"/>
+        </w:numPr>
+      </w:pPr>
+      <w:r>
+        <w:rPr>
+          <w:color w:val="000000"/>
+        </w:rPr>
+        <w:t xml:space="preserve">Douglas RS, Couch S, Wester ST, Fowler BT, Liu CY, Subramanian PS, Tang R, Nguyen QT, Maamari RN, Ugradar S,</w:t>
+      </w:r>
+      <w:r>
+        <w:rPr>
+          <w:color w:val="000000"/>
+        </w:rPr>
+        <w:t xml:space="preserve"> </w:t>
+      </w:r>
+      <w:r>
+        <w:rPr>
+          <w:iCs/>
+          <w:i/>
+          <w:color w:val="000000"/>
+        </w:rPr>
+        <w:t xml:space="preserve">et al.</w:t>
+      </w:r>
+      <w:r>
+        <w:rPr>
+          <w:color w:val="000000"/>
+        </w:rPr>
+        <w:t xml:space="preserve"> </w:t>
+      </w:r>
+      <w:r>
+        <w:rPr>
+          <w:color w:val="000000"/>
+        </w:rPr>
+        <w:t xml:space="preserve">Efficacy and Safety of Teprotumumab in Patients With Thyroid Eye Disease of Long Duration and Low Disease Activity.</w:t>
+      </w:r>
+      <w:r>
+        <w:rPr>
+          <w:color w:val="000000"/>
+        </w:rPr>
+        <w:t xml:space="preserve"> </w:t>
+      </w:r>
+      <w:r>
+        <w:rPr>
+          <w:iCs/>
+          <w:i/>
+          <w:color w:val="000000"/>
+        </w:rPr>
+        <w:t xml:space="preserve">Journal of Clinical Endocrinology and Metabolism</w:t>
+      </w:r>
+      <w:r>
+        <w:rPr>
+          <w:color w:val="000000"/>
+        </w:rPr>
+        <w:t xml:space="preserve"> </w:t>
+      </w:r>
+      <w:r>
+        <w:rPr>
+          <w:color w:val="000000"/>
+        </w:rPr>
+        <w:t xml:space="preserve">2024</w:t>
+      </w:r>
+      <w:r>
+        <w:rPr>
+          <w:color w:val="000000"/>
+        </w:rPr>
+        <w:t xml:space="preserve"> </w:t>
+      </w:r>
+      <w:r>
+        <w:rPr>
+          <w:bCs/>
+          <w:b/>
+          <w:color w:val="000000"/>
+        </w:rPr>
+        <w:t xml:space="preserve">109</w:t>
+      </w:r>
+      <w:r>
+        <w:rPr>
+          <w:color w:val="000000"/>
+        </w:rPr>
+        <w:t xml:space="preserve"> </w:t>
+      </w:r>
+      <w:r>
+        <w:rPr>
+          <w:color w:val="000000"/>
+        </w:rPr>
+        <w:t xml:space="preserve">25–35. (https://doi.org/10.1210/clinem/dgad637)</w:t>
+      </w:r>
+    </w:p>
+    <w:p>
+      <w:pPr>
+        <w:numPr>
+          <w:ilvl w:val="0"/>
+          <w:numId w:val="1001"/>
+        </w:numPr>
+      </w:pPr>
+      <w:r>
+        <w:rPr>
+          <w:color w:val="000000"/>
+        </w:rPr>
+        <w:t xml:space="preserve">Wallace C. A more accurate method for colocalisation analysis allowing for multiple causal variants.</w:t>
+      </w:r>
+      <w:r>
+        <w:rPr>
+          <w:color w:val="000000"/>
+        </w:rPr>
+        <w:t xml:space="preserve"> </w:t>
+      </w:r>
+      <w:r>
+        <w:rPr>
+          <w:iCs/>
+          <w:i/>
+          <w:color w:val="000000"/>
+        </w:rPr>
+        <w:t xml:space="preserve">PLoS Genetics</w:t>
+      </w:r>
+      <w:r>
+        <w:rPr>
+          <w:color w:val="000000"/>
+        </w:rPr>
+        <w:t xml:space="preserve"> </w:t>
+      </w:r>
+      <w:r>
+        <w:rPr>
+          <w:color w:val="000000"/>
+        </w:rPr>
+        <w:t xml:space="preserve">2021</w:t>
+      </w:r>
+      <w:r>
+        <w:rPr>
+          <w:color w:val="000000"/>
+        </w:rPr>
+        <w:t xml:space="preserve"> </w:t>
+      </w:r>
+      <w:r>
+        <w:rPr>
+          <w:bCs/>
+          <w:b/>
+          <w:color w:val="000000"/>
+        </w:rPr>
+        <w:t xml:space="preserve">17</w:t>
+      </w:r>
+      <w:r>
+        <w:rPr>
+          <w:color w:val="000000"/>
+        </w:rPr>
+        <w:t xml:space="preserve"> </w:t>
+      </w:r>
+      <w:r>
+        <w:rPr>
+          <w:color w:val="000000"/>
+        </w:rPr>
+        <w:t xml:space="preserve">e1009440. (https://doi.org/10.1371/journal.pgen.1009440)</w:t>
       </w:r>
     </w:p>
     <w:bookmarkEnd w:id="40"/>

</xml_diff>

<commit_message>
Rewrite the Abstract to match the revised paper
Author-approved step 8, the last of the review. The Abstract (249 words)
reports the TSHR and IGF1R headline estimates, the colocalization pattern
with its prior sensitivity, the tissue and orbital findings, and ends with
findings and scope only; evaluative comparisons were removed. All locked
items and audit guards hold; the title is unchanged.

Co-Authored-By: Claude Opus 5.5 <noreply@anthropic.com>
Claude-Session: https://claude.ai/code/session_01TiAKffYKtUstdRZFkwtJA9
</commit_message>
<xml_diff>
--- a/submission/candidate_20261011_review/Manuscript.docx
+++ b/submission/candidate_20261011_review/Manuscript.docx
@@ -131,7 +131,7 @@
         <w:rPr>
           <w:color w:val="000000"/>
         </w:rPr>
-        <w:t xml:space="preserve">Thyroid eye disease (TED) can accompany Graves disease (GD), an autoimmune cause of hyperthyroidism. We compared genetic evidence linking blood</w:t>
+        <w:t xml:space="preserve">To compare genetic evidence linking blood</w:t>
       </w:r>
       <w:r>
         <w:rPr>
@@ -183,7 +183,7 @@
         <w:rPr>
           <w:color w:val="000000"/>
         </w:rPr>
-        <w:t xml:space="preserve">expression with susceptibility.</w:t>
+        <w:t xml:space="preserve">expression with Graves disease (GD) and thyroid eye disease (TED).</w:t>
       </w:r>
     </w:p>
     <w:p>
@@ -208,7 +208,7 @@
         <w:rPr>
           <w:color w:val="000000"/>
         </w:rPr>
-        <w:t xml:space="preserve">We screened 2,544 druggable genes using Mendelian randomization (MR). Disease outcomes were Biobank Japan (BBJ) GD, UK Biobank (UKB) hyperthyroidism and overlapping FinnGen GD, Graves ophthalmopathy (GO) and strict GO endpoints. Colocalization tested 24 genes for a shared causal variant. Tissue eQTL and orbital RNA-sequencing (four TED, one control) were supplementary.</w:t>
+        <w:t xml:space="preserve">Mendelian randomization (MR) related blood expression of 2,544 potentially druggable genes to Biobank Japan (BBJ) GD (discovery), UK Biobank (UKB) hyperthyroidism and overlapping FinnGen GD, Graves ophthalmopathy (GO) and strict GO. Colocalization estimated the probability of one shared causal variant. Tissue-specific MR and descriptive orbital RNA sequencing (four inactive TED, one control) were supplementary.</w:t>
       </w:r>
     </w:p>
     <w:p>
@@ -231,9 +231,37 @@
       </w:r>
       <w:r>
         <w:rPr>
-          <w:color w:val="000000"/>
-        </w:rPr>
-        <w:t xml:space="preserve">Thirteen genes passed BBJ discovery (</w:t>
+          <w:iCs/>
+          <w:i/>
+          <w:color w:val="000000"/>
+        </w:rPr>
+        <w:t xml:space="preserve">TSHR</w:t>
+      </w:r>
+      <w:r>
+        <w:rPr>
+          <w:color w:val="000000"/>
+        </w:rPr>
+        <w:t xml:space="preserve">, but not</w:t>
+      </w:r>
+      <w:r>
+        <w:rPr>
+          <w:color w:val="000000"/>
+        </w:rPr>
+        <w:t xml:space="preserve"> </w:t>
+      </w:r>
+      <w:r>
+        <w:rPr>
+          <w:iCs/>
+          <w:i/>
+          <w:color w:val="000000"/>
+        </w:rPr>
+        <w:t xml:space="preserve">IGF1R</w:t>
+      </w:r>
+      <w:r>
+        <w:rPr>
+          <w:color w:val="000000"/>
+        </w:rPr>
+        <w:t xml:space="preserve">, passed the BBJ screen threshold (</w:t>
       </w:r>
       <w:r>
         <w:rPr>
@@ -279,7 +307,7 @@
         <w:rPr>
           <w:color w:val="000000"/>
         </w:rPr>
-        <w:t xml:space="preserve">expression was associated with lower GD odds in BBJ (odds ratio [OR] per approximately one standard deviation 0.12, 95% confidence interval [CI] 0.07–0.21;</w:t>
+        <w:t xml:space="preserve">expression was associated with lower odds in every dataset, including GD in BBJ (odds ratio [OR] per standard deviation 0.12, 95% confidence interval [CI] 0.07–0.21;</w:t>
       </w:r>
       <w:r>
         <w:rPr>
@@ -357,7 +385,33 @@
         <w:rPr>
           <w:color w:val="000000"/>
         </w:rPr>
-        <w:t xml:space="preserve">), concordantly across all five datasets. Shared-variant probability exceeded 0.80 in FinnGen GO and, prior-sensitively, BBJ and strict GO, but UKB (0.226) and FinnGen GD (0.264) favored distinct variants.</w:t>
+        <w:t xml:space="preserve">).</w:t>
+      </w:r>
+      <w:r>
+        <w:rPr>
+          <w:color w:val="000000"/>
+        </w:rPr>
+        <w:t xml:space="preserve"> </w:t>
+      </w:r>
+      <w:r>
+        <w:rPr>
+          <w:iCs/>
+          <w:i/>
+          <w:color w:val="000000"/>
+        </w:rPr>
+        <w:t xml:space="preserve">TSHR</w:t>
+      </w:r>
+      <w:r>
+        <w:rPr>
+          <w:color w:val="000000"/>
+        </w:rPr>
+        <w:t xml:space="preserve"> </w:t>
+      </w:r>
+      <w:r>
+        <w:rPr>
+          <w:color w:val="000000"/>
+        </w:rPr>
+        <w:t xml:space="preserve">shared-variant probability exceeded 0.80 in GO and, though prior-sensitive, in BBJ and strict GO, but was 0.226 (UKB) and 0.264 (FinnGen GD), favoring distinct variants.</w:t>
       </w:r>
       <w:r>
         <w:rPr>
@@ -383,7 +437,7 @@
         <w:rPr>
           <w:color w:val="000000"/>
         </w:rPr>
-        <w:t xml:space="preserve">ORs exceeded 1 but reached</w:t>
+        <w:t xml:space="preserve">ORs all exceeded 1, but only BBJ (OR 1.56, 95% CI 1.07–2.28;</w:t>
       </w:r>
       <w:r>
         <w:rPr>
@@ -409,7 +463,7 @@
         <w:rPr>
           <w:color w:val="000000"/>
         </w:rPr>
-        <w:t xml:space="preserve">&lt; 0.05 only in BBJ (OR 1.56, 95% CI 1.07–2.28;</w:t>
+        <w:t xml:space="preserve">= 0.0212) and UKB had</w:t>
       </w:r>
       <w:r>
         <w:rPr>
@@ -435,7 +489,13 @@
         <w:rPr>
           <w:color w:val="000000"/>
         </w:rPr>
-        <w:t xml:space="preserve">= 0.0212) and UKB (</w:t>
+        <w:t xml:space="preserve">&lt; 0.05; the most precise, FinnGen GD, was OR 1.07 (95% CI 0.86–1.33;</w:t>
+      </w:r>
+      <w:r>
+        <w:rPr>
+          <w:color w:val="000000"/>
+        </w:rPr>
+        <w:t xml:space="preserve"> </w:t>
       </w:r>
       <w:r>
         <w:rPr>
@@ -455,7 +515,7 @@
         <w:rPr>
           <w:color w:val="000000"/>
         </w:rPr>
-        <w:t xml:space="preserve">= 0.0117); the most precise estimate, FinnGen GD, was OR 1.07 (95% CI 0.86–1.33). Single-variant tissue estimates added no independent evidence. Mean orbital</w:t>
+        <w:t xml:space="preserve">= 0.539). Single-variant tissue estimates added no independent evidence. Mean orbital</w:t>
       </w:r>
       <w:r>
         <w:rPr>
@@ -532,7 +592,7 @@
         <w:rPr>
           <w:color w:val="000000"/>
         </w:rPr>
-        <w:t xml:space="preserve">Association evidence was stronger for</w:t>
+        <w:t xml:space="preserve">Genetically proxied blood</w:t>
       </w:r>
       <w:r>
         <w:rPr>
@@ -558,7 +618,7 @@
         <w:rPr>
           <w:color w:val="000000"/>
         </w:rPr>
-        <w:t xml:space="preserve">than</w:t>
+        <w:t xml:space="preserve">expression was inversely associated with every outcome; distinct-variant patterns in UKB and FinnGen GD leave expression-mediated causality unproven.</w:t>
       </w:r>
       <w:r>
         <w:rPr>
@@ -578,33 +638,13 @@
         <w:rPr>
           <w:color w:val="000000"/>
         </w:rPr>
-        <w:t xml:space="preserve">, but absent colocalization in UKB and FinnGen GD leaves expression-mediated causality unproven. Population-controlled data cannot isolate TED susceptibility within GD; weaker</w:t>
-      </w:r>
-      <w:r>
-        <w:rPr>
-          <w:color w:val="000000"/>
-        </w:rPr>
-        <w:t xml:space="preserve"> </w:t>
-      </w:r>
-      <w:r>
-        <w:rPr>
-          <w:iCs/>
-          <w:i/>
-          <w:color w:val="000000"/>
-        </w:rPr>
-        <w:t xml:space="preserve">IGF1R</w:t>
-      </w:r>
-      <w:r>
-        <w:rPr>
-          <w:color w:val="000000"/>
-        </w:rPr>
-        <w:t xml:space="preserve"> </w:t>
-      </w:r>
-      <w:r>
-        <w:rPr>
-          <w:color w:val="000000"/>
-        </w:rPr>
-        <w:t xml:space="preserve">evidence does not argue against IGF-1R–targeted treatment.</w:t>
+        <w:t xml:space="preserve"> </w:t>
+      </w:r>
+      <w:r>
+        <w:rPr>
+          <w:color w:val="000000"/>
+        </w:rPr>
+        <w:t xml:space="preserve">susceptibility findings do not argue against IGF-1R–targeted treatment. Population-controlled data cannot isolate TED susceptibility within GD.</w:t>
       </w:r>
     </w:p>
     <w:p>

</xml_diff>